<commit_message>
docs: segunda parte con matriz RACI, capturas del sistema y diagramas editables
</commit_message>
<xml_diff>
--- a/docs/Segunda parte/Actividad 2 - Segunda parte - Documento técnico.docx
+++ b/docs/Segunda parte/Actividad 2 - Segunda parte - Documento técnico.docx
@@ -189,17 +189,17 @@
     </w:p>
     <w:p>
       <w:r>
-        <w:t>Una tienda que vende productos necesita saber qué tiene, cuánto le queda y qué salió con cada venta. Si la existencia registrada no coincide con la real, se venden productos que no hay o no se piden a tiempo los que se están acabando. El caso de estudio es un sistema de control de inventario que registra productos, consulta existencias y actualiza las cantidades con cada venta.</w:t>
+        <w:t>Una tienda necesita saber qué mercancía tiene, cuánto le queda y qué salió con cada venta. Si la existencia registrada no coincide con la real, se ofrecen artículos agotados o no se piden a tiempo los que están por acabarse. El caso de estudio es un sistema de control de inventario que registra productos, consulta existencias y actualiza las cantidades al vender.</w:t>
       </w:r>
     </w:p>
     <w:p>
       <w:r>
-        <w:t>Trabajamos sobre el sistema de inventario que el equipo ya tiene (PHP 8, API JSON y archivo de datos JSON). Escribimos cinco requisitos funcionales, el plan de pruebas, diez casos clasificados por nivel, la bitácora de ejecución con el porcentaje de aprobación, dos defectos documentados, el plan para repetir las pruebas al corregirlos y el flujo de integración continua en GitHub Actions.</w:t>
+        <w:t>Trabajamos sobre el sistema que el equipo ya tiene (PHP 8, API JSON y archivo de datos JSON). Escribimos cinco requisitos funcionales, el plan de pruebas, diez casos clasificados por nivel, la bitácora con el porcentaje de aprobación, dos defectos documentados, la propuesta para repetir las pruebas al corregirlos y el flujo de integración continua en GitHub Actions.</w:t>
       </w:r>
     </w:p>
     <w:p>
       <w:r>
-        <w:t>Seguimos un enfoque DevOps: las pruebas están automatizadas con PHPUnit y corren solas cada vez que alguien sube un cambio al repositorio, de modo que un error se detecta antes de integrarse y no cuando ya está en uso. Los resultados de este documento salen de ejecuciones reales del sistema, no de datos simulados.</w:t>
+        <w:t>Seguimos un enfoque DevOps: las pruebas están automatizadas con PHPUnit y se ejecutan cada vez que alguien sube un cambio al repositorio, así un error se detecta antes de integrarse y no cuando el sistema ya está en uso. Los resultados que presentamos provienen de ejecuciones reales, no de datos simulados.</w:t>
       </w:r>
     </w:p>
     <w:p>
@@ -250,6 +250,21 @@
     <w:p>
       <w:pPr>
         <w:pStyle w:val="Listaconvietas"/>
+        <w:spacing w:after="40"/>
+      </w:pPr>
+      <w:r>
+        <w:rPr>
+          <w:b/>
+        </w:rPr>
+        <w:t xml:space="preserve">Diagramas editables: </w:t>
+      </w:r>
+      <w:r>
+        <w:t>Diagramas - Segunda parte.pptx (niveles, matriz RACI, trazabilidad, gráfica de aprobación, ciclo de re-pruebas y flujos de CI)</w:t>
+      </w:r>
+    </w:p>
+    <w:p>
+      <w:pPr>
+        <w:pStyle w:val="Listaconvietas"/>
       </w:pPr>
       <w:r>
         <w:rPr>
@@ -277,7 +292,7 @@
     </w:p>
     <w:p>
       <w:r>
-        <w:t>Los requisitos funcionales indican las operaciones que el sistema debe hacer para cubrir lo que necesitan sus usuarios. Cada uno lleva un criterio de aceptación que se puede comprobar con una prueba.</w:t>
+        <w:t>Los requisitos funcionales indican las operaciones que el sistema debe realizar para cubrir las necesidades de sus usuarios. Cada uno lleva un criterio de aceptación que se puede comprobar con una prueba.</w:t>
       </w:r>
     </w:p>
     <w:tbl>
@@ -762,7 +777,7 @@
         <w:t xml:space="preserve">Relación entre requisitos y pruebas: </w:t>
       </w:r>
       <w:r>
-        <w:t>cada requisito tiene al menos un caso de prueba que comprueba su cumplimiento (trazabilidad de requisitos). La matriz muestra qué casos cubren cada requisito; todos quedan cubiertos por dos casos o más.</w:t>
+        <w:t>cada requisito tiene al menos un caso de prueba que verifica su cumplimiento; a esta relación se le llama trazabilidad. La matriz indica qué casos cubren cada requisito: todos tienen dos o más.</w:t>
       </w:r>
     </w:p>
     <w:tbl>
@@ -1087,6 +1102,13 @@
                 <w:sz w:val="18"/>
               </w:rPr>
               <w:br/>
+            </w:r>
+            <w:r>
+              <w:rPr>
+                <w:b/>
+                <w:color w:val="FFFFFF"/>
+                <w:sz w:val="18"/>
+              </w:rPr>
               <w:t>10</w:t>
             </w:r>
           </w:p>
@@ -1909,7 +1931,7 @@
     </w:p>
     <w:p>
       <w:r>
-        <w:t>Comprobar que el sistema de control de inventario registra productos, consulta existencias, valida los datos que recibe y actualiza las cantidades con cada venta y cada entrada según RF-01 a RF-05, sin dejar el inventario en un estado incorrecto cuando una operación se rechaza.</w:t>
+        <w:t>Comprobar que el sistema registra productos, consulta existencias, valida los datos que recibe y actualiza las cantidades con cada venta y cada entrada según RF-01 a RF-05, sin dejar el inventario en un estado incorrecto cuando rechaza una operación.</w:t>
       </w:r>
     </w:p>
     <w:p>
@@ -2861,7 +2883,1626 @@
         <w:rPr>
           <w:i/>
         </w:rPr>
-        <w:t>Nota: somos un equipo pequeño y algunas personas tienen más de un rol. Quien corrige un defecto no es quien lo verifica: Pablo corrige y Chuina repite las pruebas.</w:t>
+        <w:t>Nota: somos un equipo pequeño y algunas personas cumplen más de un rol. Para conservar la revisión, la persona que corrige un defecto no lo verifica: Pablo hace la corrección y Chuina repite las pruebas.</w:t>
+      </w:r>
+    </w:p>
+    <w:p>
+      <w:pPr>
+        <w:keepNext/>
+        <w:spacing w:after="40"/>
+      </w:pPr>
+      <w:r>
+        <w:rPr>
+          <w:b/>
+        </w:rPr>
+        <w:t>Matriz RACI</w:t>
+      </w:r>
+    </w:p>
+    <w:p>
+      <w:r>
+        <w:t>La matriz indica, para cada actividad de pruebas, quién la realiza (R), quién la aprueba y rinde cuentas (A), a quién se consulta antes de decidir (C) y a quién se informa del resultado (I). Cada actividad tiene una sola A.</w:t>
+      </w:r>
+    </w:p>
+    <w:tbl>
+      <w:tblPr>
+        <w:tblStyle w:val="Tablaconcuadrcula"/>
+        <w:tblW w:w="0" w:type="auto"/>
+        <w:jc w:val="center"/>
+        <w:tblLayout w:type="fixed"/>
+        <w:tblLook w:val="04A0" w:firstRow="1" w:lastRow="0" w:firstColumn="1" w:lastColumn="0" w:noHBand="0" w:noVBand="1"/>
+      </w:tblPr>
+      <w:tblGrid>
+        <w:gridCol w:w="3175"/>
+        <w:gridCol w:w="1247"/>
+        <w:gridCol w:w="1247"/>
+        <w:gridCol w:w="1247"/>
+        <w:gridCol w:w="1247"/>
+        <w:gridCol w:w="1247"/>
+      </w:tblGrid>
+      <w:tr>
+        <w:trPr>
+          <w:cantSplit/>
+          <w:tblHeader/>
+          <w:jc w:val="center"/>
+        </w:trPr>
+        <w:tc>
+          <w:tcPr>
+            <w:tcW w:w="3175" w:type="dxa"/>
+            <w:shd w:val="clear" w:color="auto" w:fill="1F4E8C"/>
+          </w:tcPr>
+          <w:p>
+            <w:pPr>
+              <w:keepNext/>
+            </w:pPr>
+            <w:r>
+              <w:rPr>
+                <w:b/>
+                <w:color w:val="FFFFFF"/>
+                <w:sz w:val="18"/>
+              </w:rPr>
+              <w:t>Actividad</w:t>
+            </w:r>
+          </w:p>
+        </w:tc>
+        <w:tc>
+          <w:tcPr>
+            <w:tcW w:w="1247" w:type="dxa"/>
+            <w:shd w:val="clear" w:color="auto" w:fill="1F4E8C"/>
+          </w:tcPr>
+          <w:p>
+            <w:pPr>
+              <w:keepNext/>
+              <w:jc w:val="center"/>
+            </w:pPr>
+            <w:r>
+              <w:rPr>
+                <w:b/>
+                <w:color w:val="FFFFFF"/>
+                <w:sz w:val="18"/>
+              </w:rPr>
+              <w:t>Emily</w:t>
+            </w:r>
+            <w:r>
+              <w:rPr>
+                <w:b/>
+                <w:color w:val="FFFFFF"/>
+                <w:sz w:val="18"/>
+              </w:rPr>
+              <w:br/>
+              <w:t>Gestora</w:t>
+            </w:r>
+          </w:p>
+        </w:tc>
+        <w:tc>
+          <w:tcPr>
+            <w:tcW w:w="1247" w:type="dxa"/>
+            <w:shd w:val="clear" w:color="auto" w:fill="1F4E8C"/>
+          </w:tcPr>
+          <w:p>
+            <w:pPr>
+              <w:keepNext/>
+              <w:jc w:val="center"/>
+            </w:pPr>
+            <w:r>
+              <w:rPr>
+                <w:b/>
+                <w:color w:val="FFFFFF"/>
+                <w:sz w:val="18"/>
+              </w:rPr>
+              <w:t>Chuina</w:t>
+            </w:r>
+            <w:r>
+              <w:rPr>
+                <w:b/>
+                <w:color w:val="FFFFFF"/>
+                <w:sz w:val="18"/>
+              </w:rPr>
+              <w:br/>
+              <w:t>Analista/QA</w:t>
+            </w:r>
+          </w:p>
+        </w:tc>
+        <w:tc>
+          <w:tcPr>
+            <w:tcW w:w="1247" w:type="dxa"/>
+            <w:shd w:val="clear" w:color="auto" w:fill="1F4E8C"/>
+          </w:tcPr>
+          <w:p>
+            <w:pPr>
+              <w:keepNext/>
+              <w:jc w:val="center"/>
+            </w:pPr>
+            <w:r>
+              <w:rPr>
+                <w:b/>
+                <w:color w:val="FFFFFF"/>
+                <w:sz w:val="18"/>
+              </w:rPr>
+              <w:t>Pablo</w:t>
+            </w:r>
+            <w:r>
+              <w:rPr>
+                <w:b/>
+                <w:color w:val="FFFFFF"/>
+                <w:sz w:val="18"/>
+              </w:rPr>
+              <w:br/>
+              <w:t>Dev/DevOps</w:t>
+            </w:r>
+          </w:p>
+        </w:tc>
+        <w:tc>
+          <w:tcPr>
+            <w:tcW w:w="1247" w:type="dxa"/>
+            <w:shd w:val="clear" w:color="auto" w:fill="1F4E8C"/>
+          </w:tcPr>
+          <w:p>
+            <w:pPr>
+              <w:keepNext/>
+              <w:jc w:val="center"/>
+            </w:pPr>
+            <w:r>
+              <w:rPr>
+                <w:b/>
+                <w:color w:val="FFFFFF"/>
+                <w:sz w:val="18"/>
+              </w:rPr>
+              <w:t>Emmanuel</w:t>
+            </w:r>
+            <w:r>
+              <w:rPr>
+                <w:b/>
+                <w:color w:val="FFFFFF"/>
+                <w:sz w:val="18"/>
+              </w:rPr>
+              <w:br/>
+              <w:t>Diseñador</w:t>
+            </w:r>
+          </w:p>
+        </w:tc>
+        <w:tc>
+          <w:tcPr>
+            <w:tcW w:w="1247" w:type="dxa"/>
+            <w:shd w:val="clear" w:color="auto" w:fill="1F4E8C"/>
+          </w:tcPr>
+          <w:p>
+            <w:pPr>
+              <w:keepNext/>
+              <w:jc w:val="center"/>
+            </w:pPr>
+            <w:r>
+              <w:rPr>
+                <w:b/>
+                <w:color w:val="FFFFFF"/>
+                <w:sz w:val="18"/>
+              </w:rPr>
+              <w:t>Ana</w:t>
+            </w:r>
+            <w:r>
+              <w:rPr>
+                <w:b/>
+                <w:color w:val="FFFFFF"/>
+                <w:sz w:val="18"/>
+              </w:rPr>
+              <w:br/>
+              <w:t>Cliente</w:t>
+            </w:r>
+          </w:p>
+        </w:tc>
+      </w:tr>
+      <w:tr>
+        <w:trPr>
+          <w:cantSplit/>
+          <w:jc w:val="center"/>
+        </w:trPr>
+        <w:tc>
+          <w:tcPr>
+            <w:tcW w:w="3175" w:type="dxa"/>
+          </w:tcPr>
+          <w:p>
+            <w:pPr>
+              <w:keepNext/>
+              <w:spacing w:after="20"/>
+            </w:pPr>
+            <w:r>
+              <w:rPr>
+                <w:b/>
+                <w:sz w:val="18"/>
+              </w:rPr>
+              <w:t>Redactar los requisitos funcionales</w:t>
+            </w:r>
+          </w:p>
+        </w:tc>
+        <w:tc>
+          <w:tcPr>
+            <w:tcW w:w="1247" w:type="dxa"/>
+            <w:shd w:val="clear" w:color="auto" w:fill="E3F4EA"/>
+          </w:tcPr>
+          <w:p>
+            <w:pPr>
+              <w:keepNext/>
+              <w:spacing w:after="20"/>
+              <w:jc w:val="center"/>
+            </w:pPr>
+            <w:r>
+              <w:rPr>
+                <w:sz w:val="18"/>
+              </w:rPr>
+              <w:t>A</w:t>
+            </w:r>
+          </w:p>
+        </w:tc>
+        <w:tc>
+          <w:tcPr>
+            <w:tcW w:w="1247" w:type="dxa"/>
+            <w:shd w:val="clear" w:color="auto" w:fill="E8F0FB"/>
+          </w:tcPr>
+          <w:p>
+            <w:pPr>
+              <w:keepNext/>
+              <w:spacing w:after="20"/>
+              <w:jc w:val="center"/>
+            </w:pPr>
+            <w:r>
+              <w:rPr>
+                <w:sz w:val="18"/>
+              </w:rPr>
+              <w:t>R</w:t>
+            </w:r>
+          </w:p>
+        </w:tc>
+        <w:tc>
+          <w:tcPr>
+            <w:tcW w:w="1247" w:type="dxa"/>
+            <w:shd w:val="clear" w:color="auto" w:fill="FFF4D6"/>
+          </w:tcPr>
+          <w:p>
+            <w:pPr>
+              <w:keepNext/>
+              <w:spacing w:after="20"/>
+              <w:jc w:val="center"/>
+            </w:pPr>
+            <w:r>
+              <w:rPr>
+                <w:sz w:val="18"/>
+              </w:rPr>
+              <w:t>C</w:t>
+            </w:r>
+          </w:p>
+        </w:tc>
+        <w:tc>
+          <w:tcPr>
+            <w:tcW w:w="1247" w:type="dxa"/>
+          </w:tcPr>
+          <w:p>
+            <w:pPr>
+              <w:keepNext/>
+              <w:spacing w:after="20"/>
+              <w:jc w:val="center"/>
+            </w:pPr>
+            <w:r>
+              <w:rPr>
+                <w:sz w:val="18"/>
+              </w:rPr>
+              <w:t>I</w:t>
+            </w:r>
+          </w:p>
+        </w:tc>
+        <w:tc>
+          <w:tcPr>
+            <w:tcW w:w="1247" w:type="dxa"/>
+            <w:shd w:val="clear" w:color="auto" w:fill="FFF4D6"/>
+          </w:tcPr>
+          <w:p>
+            <w:pPr>
+              <w:keepNext/>
+              <w:spacing w:after="20"/>
+              <w:jc w:val="center"/>
+            </w:pPr>
+            <w:r>
+              <w:rPr>
+                <w:sz w:val="18"/>
+              </w:rPr>
+              <w:t>C</w:t>
+            </w:r>
+          </w:p>
+        </w:tc>
+      </w:tr>
+      <w:tr>
+        <w:trPr>
+          <w:cantSplit/>
+          <w:jc w:val="center"/>
+        </w:trPr>
+        <w:tc>
+          <w:tcPr>
+            <w:tcW w:w="3175" w:type="dxa"/>
+          </w:tcPr>
+          <w:p>
+            <w:pPr>
+              <w:keepNext/>
+              <w:spacing w:after="20"/>
+            </w:pPr>
+            <w:r>
+              <w:rPr>
+                <w:b/>
+                <w:sz w:val="18"/>
+              </w:rPr>
+              <w:t>Elaborar el plan de pruebas</w:t>
+            </w:r>
+          </w:p>
+        </w:tc>
+        <w:tc>
+          <w:tcPr>
+            <w:tcW w:w="1247" w:type="dxa"/>
+            <w:shd w:val="clear" w:color="auto" w:fill="E3F4EA"/>
+          </w:tcPr>
+          <w:p>
+            <w:pPr>
+              <w:keepNext/>
+              <w:spacing w:after="20"/>
+              <w:jc w:val="center"/>
+            </w:pPr>
+            <w:r>
+              <w:rPr>
+                <w:sz w:val="18"/>
+              </w:rPr>
+              <w:t>A</w:t>
+            </w:r>
+          </w:p>
+        </w:tc>
+        <w:tc>
+          <w:tcPr>
+            <w:tcW w:w="1247" w:type="dxa"/>
+            <w:shd w:val="clear" w:color="auto" w:fill="E8F0FB"/>
+          </w:tcPr>
+          <w:p>
+            <w:pPr>
+              <w:keepNext/>
+              <w:spacing w:after="20"/>
+              <w:jc w:val="center"/>
+            </w:pPr>
+            <w:r>
+              <w:rPr>
+                <w:sz w:val="18"/>
+              </w:rPr>
+              <w:t>R</w:t>
+            </w:r>
+          </w:p>
+        </w:tc>
+        <w:tc>
+          <w:tcPr>
+            <w:tcW w:w="1247" w:type="dxa"/>
+            <w:shd w:val="clear" w:color="auto" w:fill="FFF4D6"/>
+          </w:tcPr>
+          <w:p>
+            <w:pPr>
+              <w:keepNext/>
+              <w:spacing w:after="20"/>
+              <w:jc w:val="center"/>
+            </w:pPr>
+            <w:r>
+              <w:rPr>
+                <w:sz w:val="18"/>
+              </w:rPr>
+              <w:t>C</w:t>
+            </w:r>
+          </w:p>
+        </w:tc>
+        <w:tc>
+          <w:tcPr>
+            <w:tcW w:w="1247" w:type="dxa"/>
+          </w:tcPr>
+          <w:p>
+            <w:pPr>
+              <w:keepNext/>
+              <w:spacing w:after="20"/>
+              <w:jc w:val="center"/>
+            </w:pPr>
+            <w:r>
+              <w:rPr>
+                <w:sz w:val="18"/>
+              </w:rPr>
+              <w:t>I</w:t>
+            </w:r>
+          </w:p>
+        </w:tc>
+        <w:tc>
+          <w:tcPr>
+            <w:tcW w:w="1247" w:type="dxa"/>
+          </w:tcPr>
+          <w:p>
+            <w:pPr>
+              <w:keepNext/>
+              <w:spacing w:after="20"/>
+              <w:jc w:val="center"/>
+            </w:pPr>
+            <w:r>
+              <w:rPr>
+                <w:sz w:val="18"/>
+              </w:rPr>
+              <w:t>I</w:t>
+            </w:r>
+          </w:p>
+        </w:tc>
+      </w:tr>
+      <w:tr>
+        <w:trPr>
+          <w:cantSplit/>
+          <w:jc w:val="center"/>
+        </w:trPr>
+        <w:tc>
+          <w:tcPr>
+            <w:tcW w:w="3175" w:type="dxa"/>
+          </w:tcPr>
+          <w:p>
+            <w:pPr>
+              <w:keepNext/>
+              <w:spacing w:after="20"/>
+            </w:pPr>
+            <w:r>
+              <w:rPr>
+                <w:b/>
+                <w:sz w:val="18"/>
+              </w:rPr>
+              <w:t>Diseñar los casos de prueba</w:t>
+            </w:r>
+          </w:p>
+        </w:tc>
+        <w:tc>
+          <w:tcPr>
+            <w:tcW w:w="1247" w:type="dxa"/>
+            <w:shd w:val="clear" w:color="auto" w:fill="E3F4EA"/>
+          </w:tcPr>
+          <w:p>
+            <w:pPr>
+              <w:keepNext/>
+              <w:spacing w:after="20"/>
+              <w:jc w:val="center"/>
+            </w:pPr>
+            <w:r>
+              <w:rPr>
+                <w:sz w:val="18"/>
+              </w:rPr>
+              <w:t>A</w:t>
+            </w:r>
+          </w:p>
+        </w:tc>
+        <w:tc>
+          <w:tcPr>
+            <w:tcW w:w="1247" w:type="dxa"/>
+            <w:shd w:val="clear" w:color="auto" w:fill="E8F0FB"/>
+          </w:tcPr>
+          <w:p>
+            <w:pPr>
+              <w:keepNext/>
+              <w:spacing w:after="20"/>
+              <w:jc w:val="center"/>
+            </w:pPr>
+            <w:r>
+              <w:rPr>
+                <w:sz w:val="18"/>
+              </w:rPr>
+              <w:t>R</w:t>
+            </w:r>
+          </w:p>
+        </w:tc>
+        <w:tc>
+          <w:tcPr>
+            <w:tcW w:w="1247" w:type="dxa"/>
+            <w:shd w:val="clear" w:color="auto" w:fill="FFF4D6"/>
+          </w:tcPr>
+          <w:p>
+            <w:pPr>
+              <w:keepNext/>
+              <w:spacing w:after="20"/>
+              <w:jc w:val="center"/>
+            </w:pPr>
+            <w:r>
+              <w:rPr>
+                <w:sz w:val="18"/>
+              </w:rPr>
+              <w:t>C</w:t>
+            </w:r>
+          </w:p>
+        </w:tc>
+        <w:tc>
+          <w:tcPr>
+            <w:tcW w:w="1247" w:type="dxa"/>
+          </w:tcPr>
+          <w:p>
+            <w:pPr>
+              <w:keepNext/>
+              <w:spacing w:after="20"/>
+              <w:jc w:val="center"/>
+            </w:pPr>
+            <w:r>
+              <w:rPr>
+                <w:sz w:val="18"/>
+              </w:rPr>
+              <w:t>I</w:t>
+            </w:r>
+          </w:p>
+        </w:tc>
+        <w:tc>
+          <w:tcPr>
+            <w:tcW w:w="1247" w:type="dxa"/>
+            <w:shd w:val="clear" w:color="auto" w:fill="FFF4D6"/>
+          </w:tcPr>
+          <w:p>
+            <w:pPr>
+              <w:keepNext/>
+              <w:spacing w:after="20"/>
+              <w:jc w:val="center"/>
+            </w:pPr>
+            <w:r>
+              <w:rPr>
+                <w:sz w:val="18"/>
+              </w:rPr>
+              <w:t>C</w:t>
+            </w:r>
+          </w:p>
+        </w:tc>
+      </w:tr>
+      <w:tr>
+        <w:trPr>
+          <w:cantSplit/>
+          <w:jc w:val="center"/>
+        </w:trPr>
+        <w:tc>
+          <w:tcPr>
+            <w:tcW w:w="3175" w:type="dxa"/>
+          </w:tcPr>
+          <w:p>
+            <w:pPr>
+              <w:keepNext/>
+              <w:spacing w:after="20"/>
+            </w:pPr>
+            <w:r>
+              <w:rPr>
+                <w:b/>
+                <w:sz w:val="18"/>
+              </w:rPr>
+              <w:t>Automatizar las pruebas</w:t>
+            </w:r>
+          </w:p>
+        </w:tc>
+        <w:tc>
+          <w:tcPr>
+            <w:tcW w:w="1247" w:type="dxa"/>
+            <w:shd w:val="clear" w:color="auto" w:fill="E3F4EA"/>
+          </w:tcPr>
+          <w:p>
+            <w:pPr>
+              <w:keepNext/>
+              <w:spacing w:after="20"/>
+              <w:jc w:val="center"/>
+            </w:pPr>
+            <w:r>
+              <w:rPr>
+                <w:sz w:val="18"/>
+              </w:rPr>
+              <w:t>A</w:t>
+            </w:r>
+          </w:p>
+        </w:tc>
+        <w:tc>
+          <w:tcPr>
+            <w:tcW w:w="1247" w:type="dxa"/>
+            <w:shd w:val="clear" w:color="auto" w:fill="FFF4D6"/>
+          </w:tcPr>
+          <w:p>
+            <w:pPr>
+              <w:keepNext/>
+              <w:spacing w:after="20"/>
+              <w:jc w:val="center"/>
+            </w:pPr>
+            <w:r>
+              <w:rPr>
+                <w:sz w:val="18"/>
+              </w:rPr>
+              <w:t>C</w:t>
+            </w:r>
+          </w:p>
+        </w:tc>
+        <w:tc>
+          <w:tcPr>
+            <w:tcW w:w="1247" w:type="dxa"/>
+            <w:shd w:val="clear" w:color="auto" w:fill="E8F0FB"/>
+          </w:tcPr>
+          <w:p>
+            <w:pPr>
+              <w:keepNext/>
+              <w:spacing w:after="20"/>
+              <w:jc w:val="center"/>
+            </w:pPr>
+            <w:r>
+              <w:rPr>
+                <w:sz w:val="18"/>
+              </w:rPr>
+              <w:t>R</w:t>
+            </w:r>
+          </w:p>
+        </w:tc>
+        <w:tc>
+          <w:tcPr>
+            <w:tcW w:w="1247" w:type="dxa"/>
+          </w:tcPr>
+          <w:p>
+            <w:pPr>
+              <w:keepNext/>
+              <w:spacing w:after="20"/>
+              <w:jc w:val="center"/>
+            </w:pPr>
+            <w:r>
+              <w:rPr>
+                <w:sz w:val="18"/>
+              </w:rPr>
+              <w:t>I</w:t>
+            </w:r>
+          </w:p>
+        </w:tc>
+        <w:tc>
+          <w:tcPr>
+            <w:tcW w:w="1247" w:type="dxa"/>
+          </w:tcPr>
+          <w:p>
+            <w:pPr>
+              <w:keepNext/>
+              <w:spacing w:after="20"/>
+              <w:jc w:val="center"/>
+            </w:pPr>
+            <w:r>
+              <w:rPr>
+                <w:sz w:val="18"/>
+              </w:rPr>
+              <w:t>I</w:t>
+            </w:r>
+          </w:p>
+        </w:tc>
+      </w:tr>
+      <w:tr>
+        <w:trPr>
+          <w:cantSplit/>
+          <w:jc w:val="center"/>
+        </w:trPr>
+        <w:tc>
+          <w:tcPr>
+            <w:tcW w:w="3175" w:type="dxa"/>
+          </w:tcPr>
+          <w:p>
+            <w:pPr>
+              <w:keepNext/>
+              <w:spacing w:after="20"/>
+            </w:pPr>
+            <w:r>
+              <w:rPr>
+                <w:b/>
+                <w:sz w:val="18"/>
+              </w:rPr>
+              <w:t>Ejecutar las pruebas y registrar resultados</w:t>
+            </w:r>
+          </w:p>
+        </w:tc>
+        <w:tc>
+          <w:tcPr>
+            <w:tcW w:w="1247" w:type="dxa"/>
+            <w:shd w:val="clear" w:color="auto" w:fill="E3F4EA"/>
+          </w:tcPr>
+          <w:p>
+            <w:pPr>
+              <w:keepNext/>
+              <w:spacing w:after="20"/>
+              <w:jc w:val="center"/>
+            </w:pPr>
+            <w:r>
+              <w:rPr>
+                <w:sz w:val="18"/>
+              </w:rPr>
+              <w:t>A</w:t>
+            </w:r>
+          </w:p>
+        </w:tc>
+        <w:tc>
+          <w:tcPr>
+            <w:tcW w:w="1247" w:type="dxa"/>
+            <w:shd w:val="clear" w:color="auto" w:fill="E8F0FB"/>
+          </w:tcPr>
+          <w:p>
+            <w:pPr>
+              <w:keepNext/>
+              <w:spacing w:after="20"/>
+              <w:jc w:val="center"/>
+            </w:pPr>
+            <w:r>
+              <w:rPr>
+                <w:sz w:val="18"/>
+              </w:rPr>
+              <w:t>R</w:t>
+            </w:r>
+          </w:p>
+        </w:tc>
+        <w:tc>
+          <w:tcPr>
+            <w:tcW w:w="1247" w:type="dxa"/>
+          </w:tcPr>
+          <w:p>
+            <w:pPr>
+              <w:keepNext/>
+              <w:spacing w:after="20"/>
+              <w:jc w:val="center"/>
+            </w:pPr>
+            <w:r>
+              <w:rPr>
+                <w:sz w:val="18"/>
+              </w:rPr>
+              <w:t>I</w:t>
+            </w:r>
+          </w:p>
+        </w:tc>
+        <w:tc>
+          <w:tcPr>
+            <w:tcW w:w="1247" w:type="dxa"/>
+          </w:tcPr>
+          <w:p>
+            <w:pPr>
+              <w:keepNext/>
+              <w:spacing w:after="20"/>
+              <w:jc w:val="center"/>
+            </w:pPr>
+            <w:r>
+              <w:rPr>
+                <w:sz w:val="18"/>
+              </w:rPr>
+              <w:t>I</w:t>
+            </w:r>
+          </w:p>
+        </w:tc>
+        <w:tc>
+          <w:tcPr>
+            <w:tcW w:w="1247" w:type="dxa"/>
+          </w:tcPr>
+          <w:p>
+            <w:pPr>
+              <w:keepNext/>
+              <w:spacing w:after="20"/>
+              <w:jc w:val="center"/>
+            </w:pPr>
+            <w:r>
+              <w:rPr>
+                <w:sz w:val="18"/>
+              </w:rPr>
+              <w:t>I</w:t>
+            </w:r>
+          </w:p>
+        </w:tc>
+      </w:tr>
+      <w:tr>
+        <w:trPr>
+          <w:cantSplit/>
+          <w:jc w:val="center"/>
+        </w:trPr>
+        <w:tc>
+          <w:tcPr>
+            <w:tcW w:w="3175" w:type="dxa"/>
+          </w:tcPr>
+          <w:p>
+            <w:pPr>
+              <w:keepNext/>
+              <w:spacing w:after="20"/>
+            </w:pPr>
+            <w:r>
+              <w:rPr>
+                <w:b/>
+                <w:sz w:val="18"/>
+              </w:rPr>
+              <w:t>Registrar y priorizar defectos</w:t>
+            </w:r>
+          </w:p>
+        </w:tc>
+        <w:tc>
+          <w:tcPr>
+            <w:tcW w:w="1247" w:type="dxa"/>
+            <w:shd w:val="clear" w:color="auto" w:fill="E3F4EA"/>
+          </w:tcPr>
+          <w:p>
+            <w:pPr>
+              <w:keepNext/>
+              <w:spacing w:after="20"/>
+              <w:jc w:val="center"/>
+            </w:pPr>
+            <w:r>
+              <w:rPr>
+                <w:sz w:val="18"/>
+              </w:rPr>
+              <w:t>A</w:t>
+            </w:r>
+          </w:p>
+        </w:tc>
+        <w:tc>
+          <w:tcPr>
+            <w:tcW w:w="1247" w:type="dxa"/>
+            <w:shd w:val="clear" w:color="auto" w:fill="E8F0FB"/>
+          </w:tcPr>
+          <w:p>
+            <w:pPr>
+              <w:keepNext/>
+              <w:spacing w:after="20"/>
+              <w:jc w:val="center"/>
+            </w:pPr>
+            <w:r>
+              <w:rPr>
+                <w:sz w:val="18"/>
+              </w:rPr>
+              <w:t>R</w:t>
+            </w:r>
+          </w:p>
+        </w:tc>
+        <w:tc>
+          <w:tcPr>
+            <w:tcW w:w="1247" w:type="dxa"/>
+            <w:shd w:val="clear" w:color="auto" w:fill="FFF4D6"/>
+          </w:tcPr>
+          <w:p>
+            <w:pPr>
+              <w:keepNext/>
+              <w:spacing w:after="20"/>
+              <w:jc w:val="center"/>
+            </w:pPr>
+            <w:r>
+              <w:rPr>
+                <w:sz w:val="18"/>
+              </w:rPr>
+              <w:t>C</w:t>
+            </w:r>
+          </w:p>
+        </w:tc>
+        <w:tc>
+          <w:tcPr>
+            <w:tcW w:w="1247" w:type="dxa"/>
+            <w:shd w:val="clear" w:color="auto" w:fill="FFF4D6"/>
+          </w:tcPr>
+          <w:p>
+            <w:pPr>
+              <w:keepNext/>
+              <w:spacing w:after="20"/>
+              <w:jc w:val="center"/>
+            </w:pPr>
+            <w:r>
+              <w:rPr>
+                <w:sz w:val="18"/>
+              </w:rPr>
+              <w:t>C</w:t>
+            </w:r>
+          </w:p>
+        </w:tc>
+        <w:tc>
+          <w:tcPr>
+            <w:tcW w:w="1247" w:type="dxa"/>
+          </w:tcPr>
+          <w:p>
+            <w:pPr>
+              <w:keepNext/>
+              <w:spacing w:after="20"/>
+              <w:jc w:val="center"/>
+            </w:pPr>
+            <w:r>
+              <w:rPr>
+                <w:sz w:val="18"/>
+              </w:rPr>
+              <w:t>I</w:t>
+            </w:r>
+          </w:p>
+        </w:tc>
+      </w:tr>
+      <w:tr>
+        <w:trPr>
+          <w:cantSplit/>
+          <w:jc w:val="center"/>
+        </w:trPr>
+        <w:tc>
+          <w:tcPr>
+            <w:tcW w:w="3175" w:type="dxa"/>
+          </w:tcPr>
+          <w:p>
+            <w:pPr>
+              <w:keepNext/>
+              <w:spacing w:after="20"/>
+            </w:pPr>
+            <w:r>
+              <w:rPr>
+                <w:b/>
+                <w:sz w:val="18"/>
+              </w:rPr>
+              <w:t>Corregir defectos</w:t>
+            </w:r>
+          </w:p>
+        </w:tc>
+        <w:tc>
+          <w:tcPr>
+            <w:tcW w:w="1247" w:type="dxa"/>
+            <w:shd w:val="clear" w:color="auto" w:fill="E3F4EA"/>
+          </w:tcPr>
+          <w:p>
+            <w:pPr>
+              <w:keepNext/>
+              <w:spacing w:after="20"/>
+              <w:jc w:val="center"/>
+            </w:pPr>
+            <w:r>
+              <w:rPr>
+                <w:sz w:val="18"/>
+              </w:rPr>
+              <w:t>A</w:t>
+            </w:r>
+          </w:p>
+        </w:tc>
+        <w:tc>
+          <w:tcPr>
+            <w:tcW w:w="1247" w:type="dxa"/>
+            <w:shd w:val="clear" w:color="auto" w:fill="FFF4D6"/>
+          </w:tcPr>
+          <w:p>
+            <w:pPr>
+              <w:keepNext/>
+              <w:spacing w:after="20"/>
+              <w:jc w:val="center"/>
+            </w:pPr>
+            <w:r>
+              <w:rPr>
+                <w:sz w:val="18"/>
+              </w:rPr>
+              <w:t>C</w:t>
+            </w:r>
+          </w:p>
+        </w:tc>
+        <w:tc>
+          <w:tcPr>
+            <w:tcW w:w="1247" w:type="dxa"/>
+            <w:shd w:val="clear" w:color="auto" w:fill="E8F0FB"/>
+          </w:tcPr>
+          <w:p>
+            <w:pPr>
+              <w:keepNext/>
+              <w:spacing w:after="20"/>
+              <w:jc w:val="center"/>
+            </w:pPr>
+            <w:r>
+              <w:rPr>
+                <w:sz w:val="18"/>
+              </w:rPr>
+              <w:t>R</w:t>
+            </w:r>
+          </w:p>
+        </w:tc>
+        <w:tc>
+          <w:tcPr>
+            <w:tcW w:w="1247" w:type="dxa"/>
+          </w:tcPr>
+          <w:p>
+            <w:pPr>
+              <w:keepNext/>
+              <w:spacing w:after="20"/>
+              <w:jc w:val="center"/>
+            </w:pPr>
+            <w:r>
+              <w:rPr>
+                <w:sz w:val="18"/>
+              </w:rPr>
+              <w:t>I</w:t>
+            </w:r>
+          </w:p>
+        </w:tc>
+        <w:tc>
+          <w:tcPr>
+            <w:tcW w:w="1247" w:type="dxa"/>
+          </w:tcPr>
+          <w:p>
+            <w:pPr>
+              <w:keepNext/>
+              <w:spacing w:after="20"/>
+              <w:jc w:val="center"/>
+            </w:pPr>
+            <w:r>
+              <w:rPr>
+                <w:sz w:val="18"/>
+              </w:rPr>
+              <w:t>I</w:t>
+            </w:r>
+          </w:p>
+        </w:tc>
+      </w:tr>
+      <w:tr>
+        <w:trPr>
+          <w:cantSplit/>
+          <w:jc w:val="center"/>
+        </w:trPr>
+        <w:tc>
+          <w:tcPr>
+            <w:tcW w:w="3175" w:type="dxa"/>
+          </w:tcPr>
+          <w:p>
+            <w:pPr>
+              <w:keepNext/>
+              <w:spacing w:after="20"/>
+            </w:pPr>
+            <w:r>
+              <w:rPr>
+                <w:b/>
+                <w:sz w:val="18"/>
+              </w:rPr>
+              <w:t>Repetir pruebas y regresión</w:t>
+            </w:r>
+          </w:p>
+        </w:tc>
+        <w:tc>
+          <w:tcPr>
+            <w:tcW w:w="1247" w:type="dxa"/>
+            <w:shd w:val="clear" w:color="auto" w:fill="E3F4EA"/>
+          </w:tcPr>
+          <w:p>
+            <w:pPr>
+              <w:keepNext/>
+              <w:spacing w:after="20"/>
+              <w:jc w:val="center"/>
+            </w:pPr>
+            <w:r>
+              <w:rPr>
+                <w:sz w:val="18"/>
+              </w:rPr>
+              <w:t>A</w:t>
+            </w:r>
+          </w:p>
+        </w:tc>
+        <w:tc>
+          <w:tcPr>
+            <w:tcW w:w="1247" w:type="dxa"/>
+            <w:shd w:val="clear" w:color="auto" w:fill="E8F0FB"/>
+          </w:tcPr>
+          <w:p>
+            <w:pPr>
+              <w:keepNext/>
+              <w:spacing w:after="20"/>
+              <w:jc w:val="center"/>
+            </w:pPr>
+            <w:r>
+              <w:rPr>
+                <w:sz w:val="18"/>
+              </w:rPr>
+              <w:t>R</w:t>
+            </w:r>
+          </w:p>
+        </w:tc>
+        <w:tc>
+          <w:tcPr>
+            <w:tcW w:w="1247" w:type="dxa"/>
+            <w:shd w:val="clear" w:color="auto" w:fill="FFF4D6"/>
+          </w:tcPr>
+          <w:p>
+            <w:pPr>
+              <w:keepNext/>
+              <w:spacing w:after="20"/>
+              <w:jc w:val="center"/>
+            </w:pPr>
+            <w:r>
+              <w:rPr>
+                <w:sz w:val="18"/>
+              </w:rPr>
+              <w:t>C</w:t>
+            </w:r>
+          </w:p>
+        </w:tc>
+        <w:tc>
+          <w:tcPr>
+            <w:tcW w:w="1247" w:type="dxa"/>
+          </w:tcPr>
+          <w:p>
+            <w:pPr>
+              <w:keepNext/>
+              <w:spacing w:after="20"/>
+              <w:jc w:val="center"/>
+            </w:pPr>
+            <w:r>
+              <w:rPr>
+                <w:sz w:val="18"/>
+              </w:rPr>
+              <w:t>I</w:t>
+            </w:r>
+          </w:p>
+        </w:tc>
+        <w:tc>
+          <w:tcPr>
+            <w:tcW w:w="1247" w:type="dxa"/>
+          </w:tcPr>
+          <w:p>
+            <w:pPr>
+              <w:keepNext/>
+              <w:spacing w:after="20"/>
+              <w:jc w:val="center"/>
+            </w:pPr>
+            <w:r>
+              <w:rPr>
+                <w:sz w:val="18"/>
+              </w:rPr>
+              <w:t>I</w:t>
+            </w:r>
+          </w:p>
+        </w:tc>
+      </w:tr>
+      <w:tr>
+        <w:trPr>
+          <w:cantSplit/>
+          <w:jc w:val="center"/>
+        </w:trPr>
+        <w:tc>
+          <w:tcPr>
+            <w:tcW w:w="3175" w:type="dxa"/>
+          </w:tcPr>
+          <w:p>
+            <w:pPr>
+              <w:keepNext/>
+              <w:spacing w:after="20"/>
+            </w:pPr>
+            <w:r>
+              <w:rPr>
+                <w:b/>
+                <w:sz w:val="18"/>
+              </w:rPr>
+              <w:t>Configurar el CI y la protección de ramas</w:t>
+            </w:r>
+          </w:p>
+        </w:tc>
+        <w:tc>
+          <w:tcPr>
+            <w:tcW w:w="1247" w:type="dxa"/>
+            <w:shd w:val="clear" w:color="auto" w:fill="E3F4EA"/>
+          </w:tcPr>
+          <w:p>
+            <w:pPr>
+              <w:keepNext/>
+              <w:spacing w:after="20"/>
+              <w:jc w:val="center"/>
+            </w:pPr>
+            <w:r>
+              <w:rPr>
+                <w:sz w:val="18"/>
+              </w:rPr>
+              <w:t>A</w:t>
+            </w:r>
+          </w:p>
+        </w:tc>
+        <w:tc>
+          <w:tcPr>
+            <w:tcW w:w="1247" w:type="dxa"/>
+          </w:tcPr>
+          <w:p>
+            <w:pPr>
+              <w:keepNext/>
+              <w:spacing w:after="20"/>
+              <w:jc w:val="center"/>
+            </w:pPr>
+            <w:r>
+              <w:rPr>
+                <w:sz w:val="18"/>
+              </w:rPr>
+              <w:t>I</w:t>
+            </w:r>
+          </w:p>
+        </w:tc>
+        <w:tc>
+          <w:tcPr>
+            <w:tcW w:w="1247" w:type="dxa"/>
+            <w:shd w:val="clear" w:color="auto" w:fill="E8F0FB"/>
+          </w:tcPr>
+          <w:p>
+            <w:pPr>
+              <w:keepNext/>
+              <w:spacing w:after="20"/>
+              <w:jc w:val="center"/>
+            </w:pPr>
+            <w:r>
+              <w:rPr>
+                <w:sz w:val="18"/>
+              </w:rPr>
+              <w:t>R</w:t>
+            </w:r>
+          </w:p>
+        </w:tc>
+        <w:tc>
+          <w:tcPr>
+            <w:tcW w:w="1247" w:type="dxa"/>
+          </w:tcPr>
+          <w:p>
+            <w:pPr>
+              <w:keepNext/>
+              <w:spacing w:after="20"/>
+              <w:jc w:val="center"/>
+            </w:pPr>
+            <w:r>
+              <w:rPr>
+                <w:sz w:val="18"/>
+              </w:rPr>
+              <w:t>I</w:t>
+            </w:r>
+          </w:p>
+        </w:tc>
+        <w:tc>
+          <w:tcPr>
+            <w:tcW w:w="1247" w:type="dxa"/>
+          </w:tcPr>
+          <w:p>
+            <w:pPr>
+              <w:keepNext/>
+              <w:spacing w:after="20"/>
+              <w:jc w:val="center"/>
+            </w:pPr>
+            <w:r>
+              <w:rPr>
+                <w:sz w:val="18"/>
+              </w:rPr>
+              <w:t>I</w:t>
+            </w:r>
+          </w:p>
+        </w:tc>
+      </w:tr>
+      <w:tr>
+        <w:trPr>
+          <w:cantSplit/>
+          <w:jc w:val="center"/>
+        </w:trPr>
+        <w:tc>
+          <w:tcPr>
+            <w:tcW w:w="3175" w:type="dxa"/>
+          </w:tcPr>
+          <w:p>
+            <w:pPr>
+              <w:keepNext/>
+              <w:spacing w:after="20"/>
+            </w:pPr>
+            <w:r>
+              <w:rPr>
+                <w:b/>
+                <w:sz w:val="18"/>
+              </w:rPr>
+              <w:t>Revisar los mensajes de error</w:t>
+            </w:r>
+          </w:p>
+        </w:tc>
+        <w:tc>
+          <w:tcPr>
+            <w:tcW w:w="1247" w:type="dxa"/>
+            <w:shd w:val="clear" w:color="auto" w:fill="E3F4EA"/>
+          </w:tcPr>
+          <w:p>
+            <w:pPr>
+              <w:keepNext/>
+              <w:spacing w:after="20"/>
+              <w:jc w:val="center"/>
+            </w:pPr>
+            <w:r>
+              <w:rPr>
+                <w:sz w:val="18"/>
+              </w:rPr>
+              <w:t>A</w:t>
+            </w:r>
+          </w:p>
+        </w:tc>
+        <w:tc>
+          <w:tcPr>
+            <w:tcW w:w="1247" w:type="dxa"/>
+            <w:shd w:val="clear" w:color="auto" w:fill="FFF4D6"/>
+          </w:tcPr>
+          <w:p>
+            <w:pPr>
+              <w:keepNext/>
+              <w:spacing w:after="20"/>
+              <w:jc w:val="center"/>
+            </w:pPr>
+            <w:r>
+              <w:rPr>
+                <w:sz w:val="18"/>
+              </w:rPr>
+              <w:t>C</w:t>
+            </w:r>
+          </w:p>
+        </w:tc>
+        <w:tc>
+          <w:tcPr>
+            <w:tcW w:w="1247" w:type="dxa"/>
+            <w:shd w:val="clear" w:color="auto" w:fill="FFF4D6"/>
+          </w:tcPr>
+          <w:p>
+            <w:pPr>
+              <w:keepNext/>
+              <w:spacing w:after="20"/>
+              <w:jc w:val="center"/>
+            </w:pPr>
+            <w:r>
+              <w:rPr>
+                <w:sz w:val="18"/>
+              </w:rPr>
+              <w:t>C</w:t>
+            </w:r>
+          </w:p>
+        </w:tc>
+        <w:tc>
+          <w:tcPr>
+            <w:tcW w:w="1247" w:type="dxa"/>
+            <w:shd w:val="clear" w:color="auto" w:fill="E8F0FB"/>
+          </w:tcPr>
+          <w:p>
+            <w:pPr>
+              <w:keepNext/>
+              <w:spacing w:after="20"/>
+              <w:jc w:val="center"/>
+            </w:pPr>
+            <w:r>
+              <w:rPr>
+                <w:sz w:val="18"/>
+              </w:rPr>
+              <w:t>R</w:t>
+            </w:r>
+          </w:p>
+        </w:tc>
+        <w:tc>
+          <w:tcPr>
+            <w:tcW w:w="1247" w:type="dxa"/>
+          </w:tcPr>
+          <w:p>
+            <w:pPr>
+              <w:keepNext/>
+              <w:spacing w:after="20"/>
+              <w:jc w:val="center"/>
+            </w:pPr>
+            <w:r>
+              <w:rPr>
+                <w:sz w:val="18"/>
+              </w:rPr>
+              <w:t>I</w:t>
+            </w:r>
+          </w:p>
+        </w:tc>
+      </w:tr>
+      <w:tr>
+        <w:trPr>
+          <w:cantSplit/>
+          <w:jc w:val="center"/>
+        </w:trPr>
+        <w:tc>
+          <w:tcPr>
+            <w:tcW w:w="3175" w:type="dxa"/>
+          </w:tcPr>
+          <w:p>
+            <w:pPr>
+              <w:keepNext/>
+              <w:spacing w:after="20"/>
+            </w:pPr>
+            <w:r>
+              <w:rPr>
+                <w:b/>
+                <w:sz w:val="18"/>
+              </w:rPr>
+              <w:t>Validar los escenarios de aceptación</w:t>
+            </w:r>
+          </w:p>
+        </w:tc>
+        <w:tc>
+          <w:tcPr>
+            <w:tcW w:w="1247" w:type="dxa"/>
+          </w:tcPr>
+          <w:p>
+            <w:pPr>
+              <w:keepNext/>
+              <w:spacing w:after="20"/>
+              <w:jc w:val="center"/>
+            </w:pPr>
+            <w:r>
+              <w:rPr>
+                <w:sz w:val="18"/>
+              </w:rPr>
+              <w:t>I</w:t>
+            </w:r>
+          </w:p>
+        </w:tc>
+        <w:tc>
+          <w:tcPr>
+            <w:tcW w:w="1247" w:type="dxa"/>
+            <w:shd w:val="clear" w:color="auto" w:fill="E8F0FB"/>
+          </w:tcPr>
+          <w:p>
+            <w:pPr>
+              <w:keepNext/>
+              <w:spacing w:after="20"/>
+              <w:jc w:val="center"/>
+            </w:pPr>
+            <w:r>
+              <w:rPr>
+                <w:sz w:val="18"/>
+              </w:rPr>
+              <w:t>R</w:t>
+            </w:r>
+          </w:p>
+        </w:tc>
+        <w:tc>
+          <w:tcPr>
+            <w:tcW w:w="1247" w:type="dxa"/>
+          </w:tcPr>
+          <w:p>
+            <w:pPr>
+              <w:keepNext/>
+              <w:spacing w:after="20"/>
+              <w:jc w:val="center"/>
+            </w:pPr>
+            <w:r>
+              <w:rPr>
+                <w:sz w:val="18"/>
+              </w:rPr>
+              <w:t>I</w:t>
+            </w:r>
+          </w:p>
+        </w:tc>
+        <w:tc>
+          <w:tcPr>
+            <w:tcW w:w="1247" w:type="dxa"/>
+          </w:tcPr>
+          <w:p>
+            <w:pPr>
+              <w:keepNext/>
+              <w:spacing w:after="20"/>
+              <w:jc w:val="center"/>
+            </w:pPr>
+            <w:r>
+              <w:rPr>
+                <w:sz w:val="18"/>
+              </w:rPr>
+              <w:t>I</w:t>
+            </w:r>
+          </w:p>
+        </w:tc>
+        <w:tc>
+          <w:tcPr>
+            <w:tcW w:w="1247" w:type="dxa"/>
+            <w:shd w:val="clear" w:color="auto" w:fill="E3F4EA"/>
+          </w:tcPr>
+          <w:p>
+            <w:pPr>
+              <w:keepNext/>
+              <w:spacing w:after="20"/>
+              <w:jc w:val="center"/>
+            </w:pPr>
+            <w:r>
+              <w:rPr>
+                <w:sz w:val="18"/>
+              </w:rPr>
+              <w:t>A</w:t>
+            </w:r>
+          </w:p>
+        </w:tc>
+      </w:tr>
+      <w:tr>
+        <w:trPr>
+          <w:cantSplit/>
+          <w:jc w:val="center"/>
+        </w:trPr>
+        <w:tc>
+          <w:tcPr>
+            <w:tcW w:w="3175" w:type="dxa"/>
+          </w:tcPr>
+          <w:p>
+            <w:pPr>
+              <w:spacing w:after="20"/>
+            </w:pPr>
+            <w:r>
+              <w:rPr>
+                <w:b/>
+                <w:sz w:val="18"/>
+              </w:rPr>
+              <w:t>Aprobar el Pull Request e integrar</w:t>
+            </w:r>
+          </w:p>
+        </w:tc>
+        <w:tc>
+          <w:tcPr>
+            <w:tcW w:w="1247" w:type="dxa"/>
+            <w:shd w:val="clear" w:color="auto" w:fill="E3F4EA"/>
+          </w:tcPr>
+          <w:p>
+            <w:pPr>
+              <w:spacing w:after="20"/>
+              <w:jc w:val="center"/>
+            </w:pPr>
+            <w:r>
+              <w:rPr>
+                <w:sz w:val="18"/>
+              </w:rPr>
+              <w:t>R/A</w:t>
+            </w:r>
+          </w:p>
+        </w:tc>
+        <w:tc>
+          <w:tcPr>
+            <w:tcW w:w="1247" w:type="dxa"/>
+            <w:shd w:val="clear" w:color="auto" w:fill="FFF4D6"/>
+          </w:tcPr>
+          <w:p>
+            <w:pPr>
+              <w:spacing w:after="20"/>
+              <w:jc w:val="center"/>
+            </w:pPr>
+            <w:r>
+              <w:rPr>
+                <w:sz w:val="18"/>
+              </w:rPr>
+              <w:t>C</w:t>
+            </w:r>
+          </w:p>
+        </w:tc>
+        <w:tc>
+          <w:tcPr>
+            <w:tcW w:w="1247" w:type="dxa"/>
+            <w:shd w:val="clear" w:color="auto" w:fill="FFF4D6"/>
+          </w:tcPr>
+          <w:p>
+            <w:pPr>
+              <w:spacing w:after="20"/>
+              <w:jc w:val="center"/>
+            </w:pPr>
+            <w:r>
+              <w:rPr>
+                <w:sz w:val="18"/>
+              </w:rPr>
+              <w:t>C</w:t>
+            </w:r>
+          </w:p>
+        </w:tc>
+        <w:tc>
+          <w:tcPr>
+            <w:tcW w:w="1247" w:type="dxa"/>
+          </w:tcPr>
+          <w:p>
+            <w:pPr>
+              <w:spacing w:after="20"/>
+              <w:jc w:val="center"/>
+            </w:pPr>
+            <w:r>
+              <w:rPr>
+                <w:sz w:val="18"/>
+              </w:rPr>
+              <w:t>I</w:t>
+            </w:r>
+          </w:p>
+        </w:tc>
+        <w:tc>
+          <w:tcPr>
+            <w:tcW w:w="1247" w:type="dxa"/>
+          </w:tcPr>
+          <w:p>
+            <w:pPr>
+              <w:spacing w:after="20"/>
+              <w:jc w:val="center"/>
+            </w:pPr>
+            <w:r>
+              <w:rPr>
+                <w:sz w:val="18"/>
+              </w:rPr>
+              <w:t>I</w:t>
+            </w:r>
+          </w:p>
+        </w:tc>
+      </w:tr>
+    </w:tbl>
+    <w:p>
+      <w:pPr>
+        <w:spacing w:after="40"/>
+      </w:pPr>
+    </w:p>
+    <w:p>
+      <w:r>
+        <w:rPr>
+          <w:i/>
+          <w:color w:val="5D6575"/>
+          <w:sz w:val="18"/>
+        </w:rPr>
+        <w:t>R = Responsable · A = Aprueba · C = Consultado · I = Informado. Versión editable: Diagramas - Segunda parte.pptx, diapositiva 2.</w:t>
       </w:r>
     </w:p>
     <w:p>
@@ -2936,6 +4577,7 @@
         <w:spacing w:after="40"/>
       </w:pPr>
       <w:r>
+        <w:lastRenderedPageBreak/>
         <w:t>Los diez casos planificados se ejecutaron.</w:t>
       </w:r>
     </w:p>
@@ -2985,7 +4627,7 @@
     </w:p>
     <w:p>
       <w:r>
-        <w:t>Diseñamos diez casos (la práctica pide al menos seis). Cada uno está automatizado y lleva su ID en el nombre de la prueba, así el reporte y GitHub Actions muestran el mismo ID que este documento.</w:t>
+        <w:t>Diseñamos diez casos (la práctica pide al menos seis). Cada uno está automatizado y lleva su ID en el nombre de la prueba, por lo que el reporte y GitHub Actions muestran la misma clave que este documento.</w:t>
       </w:r>
     </w:p>
     <w:p>
@@ -2993,7 +4635,6 @@
         <w:pStyle w:val="Ttulo3"/>
       </w:pPr>
       <w:r>
-        <w:lastRenderedPageBreak/>
         <w:t>Caso de prueba CP-01: Registro correcto de producto</w:t>
       </w:r>
     </w:p>
@@ -3746,6 +5387,7 @@
         <w:pStyle w:val="Ttulo3"/>
       </w:pPr>
       <w:r>
+        <w:lastRenderedPageBreak/>
         <w:t>Caso de prueba CP-03: Venta con existencia suficiente</w:t>
       </w:r>
     </w:p>
@@ -4110,7 +5752,6 @@
         <w:pStyle w:val="Ttulo3"/>
       </w:pPr>
       <w:r>
-        <w:lastRenderedPageBreak/>
         <w:t>Caso de prueba CP-04: Venta con existencia insuficiente</w:t>
       </w:r>
     </w:p>
@@ -4839,6 +6480,7 @@
         <w:pStyle w:val="Ttulo3"/>
       </w:pPr>
       <w:r>
+        <w:lastRenderedPageBreak/>
         <w:t>Caso de prueba CP-06: Venta rechazada no modifica el archivo</w:t>
       </w:r>
     </w:p>
@@ -5331,7 +6973,7 @@
               <w:rPr>
                 <w:sz w:val="20"/>
               </w:rPr>
-              <w:t>Comprobar el sistema completo respondiendo por HTTP.</w:t>
+              <w:t>Comprobar que el sistema completo responde correctamente por HTTP.</w:t>
             </w:r>
           </w:p>
         </w:tc>
@@ -5931,6 +7573,7 @@
         <w:pStyle w:val="Ttulo3"/>
       </w:pPr>
       <w:r>
+        <w:lastRenderedPageBreak/>
         <w:t>Caso de prueba CP-09: Cierre del día con resurtido</w:t>
       </w:r>
     </w:p>
@@ -6059,7 +7702,7 @@
               <w:rPr>
                 <w:sz w:val="20"/>
               </w:rPr>
-              <w:t>Comprobar que la cliente sabe qué pedir al cierre del día.</w:t>
+              <w:t>Comprobar que el reporte le indica a la cliente qué pedir al cierre del día.</w:t>
             </w:r>
           </w:p>
         </w:tc>
@@ -6647,6 +8290,7 @@
         <w:pStyle w:val="Ttulo1"/>
       </w:pPr>
       <w:r>
+        <w:lastRenderedPageBreak/>
         <w:t>4. Clasificación de los casos de prueba</w:t>
       </w:r>
     </w:p>
@@ -6660,8 +8304,8 @@
           <w:noProof/>
         </w:rPr>
         <w:drawing>
-          <wp:inline distT="0" distB="0" distL="0" distR="0" wp14:anchorId="5E10D56C" wp14:editId="46D86A13">
-            <wp:extent cx="5220000" cy="2936250"/>
+          <wp:inline distT="0" distB="0" distL="0" distR="0" wp14:anchorId="5E9FDA59" wp14:editId="35887820">
+            <wp:extent cx="5580000" cy="3138750"/>
             <wp:effectExtent l="0" t="0" r="0" b="0"/>
             <wp:docPr id="1" name="Picture 1"/>
             <wp:cNvGraphicFramePr>
@@ -6671,7 +8315,7 @@
               <a:graphicData uri="http://schemas.openxmlformats.org/drawingml/2006/picture">
                 <pic:pic xmlns:pic="http://schemas.openxmlformats.org/drawingml/2006/picture">
                   <pic:nvPicPr>
-                    <pic:cNvPr id="0" name="diagrama-niveles.png"/>
+                    <pic:cNvPr id="0" name="sp-diag-niveles.png"/>
                     <pic:cNvPicPr/>
                   </pic:nvPicPr>
                   <pic:blipFill>
@@ -6683,7 +8327,7 @@
                   <pic:spPr>
                     <a:xfrm>
                       <a:off x="0" y="0"/>
-                      <a:ext cx="5220000" cy="2936250"/>
+                      <a:ext cx="5580000" cy="3138750"/>
                     </a:xfrm>
                     <a:prstGeom prst="rect">
                       <a:avLst/>
@@ -7379,7 +9023,7 @@
     </w:p>
     <w:p>
       <w:r>
-        <w:t>Para documentar la ejecución usamos una bitácora de pruebas. A diferencia del ejemplo de clase, los resultados no son simulados: ejecutamos las cuatro suites con scripts/ejecutar-pruebas.php el 30 de octubre de 2026 (Windows NT 10.0, PHP 8.4.27, PHPUnit 11.5.56, versión fc95f31 del repositorio).</w:t>
+        <w:t>Registramos la ejecución en una bitácora de pruebas. Las cuatro suites se ejecutaron con scripts/ejecutar-pruebas.php el 30 de octubre de 2026 (Windows NT 10.0, PHP 8.4.27, PHPUnit 11.5.56, versión 185cafb del repositorio).</w:t>
       </w:r>
     </w:p>
     <w:p>
@@ -7407,12 +9051,6 @@
           <w:sz w:val="17"/>
         </w:rPr>
         <w:br/>
-      </w:r>
-      <w:r>
-        <w:rPr>
-          <w:rFonts w:ascii="Consolas" w:eastAsia="Consolas" w:hAnsi="Consolas"/>
-          <w:sz w:val="17"/>
-        </w:rPr>
         <w:t>composer regresion     # rondas 2 a 4: DEF-01 y DEF-02 inyectados y código corregido</w:t>
       </w:r>
     </w:p>
@@ -7553,6 +9191,7 @@
                 <w:b/>
                 <w:sz w:val="18"/>
               </w:rPr>
+              <w:lastRenderedPageBreak/>
               <w:t>CP-01</w:t>
             </w:r>
           </w:p>
@@ -7618,7 +9257,7 @@
               <w:rPr>
                 <w:sz w:val="18"/>
               </w:rPr>
-              <w:t>0.009 s</w:t>
+              <w:t>0.008 s</w:t>
             </w:r>
           </w:p>
         </w:tc>
@@ -7705,7 +9344,7 @@
               <w:rPr>
                 <w:sz w:val="18"/>
               </w:rPr>
-              <w:t>0.000 s</w:t>
+              <w:t>0.001 s</w:t>
             </w:r>
           </w:p>
         </w:tc>
@@ -7792,7 +9431,7 @@
               <w:rPr>
                 <w:sz w:val="18"/>
               </w:rPr>
-              <w:t>0.000 s</w:t>
+              <w:t>0.001 s</w:t>
             </w:r>
           </w:p>
         </w:tc>
@@ -7966,7 +9605,7 @@
               <w:rPr>
                 <w:sz w:val="18"/>
               </w:rPr>
-              <w:t>0.012 s</w:t>
+              <w:t>0.009 s</w:t>
             </w:r>
           </w:p>
         </w:tc>
@@ -8140,7 +9779,7 @@
               <w:rPr>
                 <w:sz w:val="18"/>
               </w:rPr>
-              <w:t>0.877 s</w:t>
+              <w:t>0.889 s</w:t>
             </w:r>
           </w:p>
         </w:tc>
@@ -8227,7 +9866,7 @@
               <w:rPr>
                 <w:sz w:val="18"/>
               </w:rPr>
-              <w:t>0.861 s</w:t>
+              <w:t>0.865 s</w:t>
             </w:r>
           </w:p>
         </w:tc>
@@ -8314,7 +9953,7 @@
               <w:rPr>
                 <w:sz w:val="18"/>
               </w:rPr>
-              <w:t>0.923 s</w:t>
+              <w:t>0.880 s</w:t>
             </w:r>
           </w:p>
         </w:tc>
@@ -8401,7 +10040,7 @@
               <w:rPr>
                 <w:sz w:val="18"/>
               </w:rPr>
-              <w:t>0.875 s</w:t>
+              <w:t>0.872 s</w:t>
             </w:r>
           </w:p>
         </w:tc>
@@ -8426,7 +10065,7 @@
     </w:p>
     <w:p>
       <w:r>
-        <w:t>El script scripts/simular-defectos.php provoca DEF-01 y DEF-02 (sección 6) en una copia de src/, corre los diez casos contra esa copia y al final los vuelve a correr con el código corregido. El código original no se modifica.</w:t>
+        <w:t>El script scripts/simular-defectos.php introduce DEF-01 y DEF-02 (sección 6) en una copia de src/, ejecuta los diez casos sobre esa copia y repite la ronda con el código corregido. Los archivos originales no se modifican.</w:t>
       </w:r>
     </w:p>
     <w:tbl>
@@ -8789,8 +10428,9 @@
         <w:rPr>
           <w:noProof/>
         </w:rPr>
+        <w:lastRenderedPageBreak/>
         <w:drawing>
-          <wp:inline distT="0" distB="0" distL="0" distR="0" wp14:anchorId="776A2C92" wp14:editId="3F3CDCCB">
+          <wp:inline distT="0" distB="0" distL="0" distR="0" wp14:anchorId="4F753DC3" wp14:editId="5FCF4F62">
             <wp:extent cx="5580000" cy="3138750"/>
             <wp:effectExtent l="0" t="0" r="0" b="0"/>
             <wp:docPr id="2" name="Picture 2"/>
@@ -8801,7 +10441,7 @@
               <a:graphicData uri="http://schemas.openxmlformats.org/drawingml/2006/picture">
                 <pic:pic xmlns:pic="http://schemas.openxmlformats.org/drawingml/2006/picture">
                   <pic:nvPicPr>
-                    <pic:cNvPr id="0" name="captura-ejecucion-pruebas.png"/>
+                    <pic:cNvPr id="0" name="sp-ejecucion-pruebas.png"/>
                     <pic:cNvPicPr/>
                   </pic:nvPicPr>
                   <pic:blipFill>
@@ -8836,7 +10476,7 @@
           <w:color w:val="5D6575"/>
           <w:sz w:val="18"/>
         </w:rPr>
-        <w:t>Figura 2. Ejecución de la ronda 1 en Windows Terminal.</w:t>
+        <w:t>Figura 2. Ejecución de la ronda 1 con composer evidencia (30 de octubre de 2026).</w:t>
       </w:r>
     </w:p>
     <w:p>
@@ -8849,7 +10489,7 @@
           <w:noProof/>
         </w:rPr>
         <w:drawing>
-          <wp:inline distT="0" distB="0" distL="0" distR="0" wp14:anchorId="1CEF260C" wp14:editId="1D936D15">
+          <wp:inline distT="0" distB="0" distL="0" distR="0" wp14:anchorId="2F2551DF" wp14:editId="45C2A7BC">
             <wp:extent cx="5580000" cy="3138750"/>
             <wp:effectExtent l="0" t="0" r="0" b="0"/>
             <wp:docPr id="3" name="Picture 3"/>
@@ -8860,7 +10500,7 @@
               <a:graphicData uri="http://schemas.openxmlformats.org/drawingml/2006/picture">
                 <pic:pic xmlns:pic="http://schemas.openxmlformats.org/drawingml/2006/picture">
                   <pic:nvPicPr>
-                    <pic:cNvPr id="0" name="captura-regresion-defectos.png"/>
+                    <pic:cNvPr id="0" name="sp-reporte-html.png"/>
                     <pic:cNvPicPr/>
                   </pic:nvPicPr>
                   <pic:blipFill>
@@ -8895,7 +10535,67 @@
           <w:color w:val="5D6575"/>
           <w:sz w:val="18"/>
         </w:rPr>
-        <w:t>Figura 3. Rondas de regresión con DEF-01 y DEF-02 inyectados y con el código corregido.</w:t>
+        <w:t>Figura 3. Reporte de la ronda 1 generado en evidencias/reporte-pruebas.html.</w:t>
+      </w:r>
+    </w:p>
+    <w:p>
+      <w:pPr>
+        <w:keepNext/>
+        <w:jc w:val="center"/>
+      </w:pPr>
+      <w:r>
+        <w:rPr>
+          <w:noProof/>
+        </w:rPr>
+        <w:lastRenderedPageBreak/>
+        <w:drawing>
+          <wp:inline distT="0" distB="0" distL="0" distR="0" wp14:anchorId="57A9BB53" wp14:editId="25844BCD">
+            <wp:extent cx="5580000" cy="3138750"/>
+            <wp:effectExtent l="0" t="0" r="0" b="0"/>
+            <wp:docPr id="4" name="Picture 4"/>
+            <wp:cNvGraphicFramePr>
+              <a:graphicFrameLocks xmlns:a="http://schemas.openxmlformats.org/drawingml/2006/main" noChangeAspect="1"/>
+            </wp:cNvGraphicFramePr>
+            <a:graphic xmlns:a="http://schemas.openxmlformats.org/drawingml/2006/main">
+              <a:graphicData uri="http://schemas.openxmlformats.org/drawingml/2006/picture">
+                <pic:pic xmlns:pic="http://schemas.openxmlformats.org/drawingml/2006/picture">
+                  <pic:nvPicPr>
+                    <pic:cNvPr id="0" name="sp-regresion.png"/>
+                    <pic:cNvPicPr/>
+                  </pic:nvPicPr>
+                  <pic:blipFill>
+                    <a:blip r:embed="rId10"/>
+                    <a:stretch>
+                      <a:fillRect/>
+                    </a:stretch>
+                  </pic:blipFill>
+                  <pic:spPr>
+                    <a:xfrm>
+                      <a:off x="0" y="0"/>
+                      <a:ext cx="5580000" cy="3138750"/>
+                    </a:xfrm>
+                    <a:prstGeom prst="rect">
+                      <a:avLst/>
+                    </a:prstGeom>
+                  </pic:spPr>
+                </pic:pic>
+              </a:graphicData>
+            </a:graphic>
+          </wp:inline>
+        </w:drawing>
+      </w:r>
+    </w:p>
+    <w:p>
+      <w:pPr>
+        <w:jc w:val="center"/>
+      </w:pPr>
+      <w:r>
+        <w:rPr>
+          <w:i/>
+          <w:color w:val="5D6575"/>
+          <w:sz w:val="18"/>
+        </w:rPr>
+        <w:t>Figura 4. Rondas 2 a 4 con composer regresion: DEF-01 y DEF-02 inyectados y código corregido.</w:t>
       </w:r>
     </w:p>
     <w:p>
@@ -9500,10 +11200,10 @@
           <w:noProof/>
         </w:rPr>
         <w:drawing>
-          <wp:inline distT="0" distB="0" distL="0" distR="0" wp14:anchorId="3BCC867C" wp14:editId="3050244E">
-            <wp:extent cx="5580000" cy="2650500"/>
+          <wp:inline distT="0" distB="0" distL="0" distR="0" wp14:anchorId="5F5CB97C" wp14:editId="0344A4DD">
+            <wp:extent cx="5580000" cy="3138750"/>
             <wp:effectExtent l="0" t="0" r="0" b="0"/>
-            <wp:docPr id="4" name="Picture 4"/>
+            <wp:docPr id="5" name="Picture 5"/>
             <wp:cNvGraphicFramePr>
               <a:graphicFrameLocks xmlns:a="http://schemas.openxmlformats.org/drawingml/2006/main" noChangeAspect="1"/>
             </wp:cNvGraphicFramePr>
@@ -9511,11 +11211,11 @@
               <a:graphicData uri="http://schemas.openxmlformats.org/drawingml/2006/picture">
                 <pic:pic xmlns:pic="http://schemas.openxmlformats.org/drawingml/2006/picture">
                   <pic:nvPicPr>
-                    <pic:cNvPr id="0" name="grafica-aprobacion.png"/>
+                    <pic:cNvPr id="0" name="sp-diag-aprobacion.png"/>
                     <pic:cNvPicPr/>
                   </pic:nvPicPr>
                   <pic:blipFill>
-                    <a:blip r:embed="rId10"/>
+                    <a:blip r:embed="rId11"/>
                     <a:stretch>
                       <a:fillRect/>
                     </a:stretch>
@@ -9523,7 +11223,7 @@
                   <pic:spPr>
                     <a:xfrm>
                       <a:off x="0" y="0"/>
-                      <a:ext cx="5580000" cy="2650500"/>
+                      <a:ext cx="5580000" cy="3138750"/>
                     </a:xfrm>
                     <a:prstGeom prst="rect">
                       <a:avLst/>
@@ -9546,7 +11246,7 @@
           <w:color w:val="5D6575"/>
           <w:sz w:val="18"/>
         </w:rPr>
-        <w:t>Figura 4. Porcentaje de casos aprobados en cada ronda.</w:t>
+        <w:t>Figura 5. Porcentaje de casos aprobados en cada ronda.</w:t>
       </w:r>
     </w:p>
     <w:p>
@@ -9554,13 +11254,574 @@
         <w:rPr>
           <w:b/>
         </w:rPr>
+        <w:lastRenderedPageBreak/>
         <w:t xml:space="preserve">Interpretación. </w:t>
       </w:r>
       <w:r>
-        <w:t>Con el código actual pasan los diez casos (100 %), así que se cumple el criterio de salida. Cuando inyectamos DEF-01 la aprobación baja a 70 %: fallan CP-04, CP-06 y CP-08, que prueban la misma regla (no vender más de lo que hay) en tres niveles distintos. Con DEF-02 baja a 90 %, porque solo CP-09 revisa el resurtido. Que falle precisamente el caso que cubre el requisito afectado indica que las pruebas detectan los errores donde deben. El 90 % de la ronda 3 muestra un riesgo: un porcentaje alto no basta par</w:t>
+        <w:t>Con el código actual pasan los diez casos (100 %) y se cumple el criterio de salida. Con DEF-01 la aprobación cae a 70 %: fallan CP-04, CP-06 y CP-08, que prueban la misma regla (no vender más de lo que hay) en tres niveles distintos. Con DEF-02 queda en 90 %, ya que solo CP-09 revisa el resurtido. En ambas rondas fallan justo las pruebas ligadas al requisito afectado, lo que confirma que detectan el error en el lugar correcto. Ese 90 % deja ver un riesgo: un porcentaje alto no basta para liberar, porque la</w:t>
       </w:r>
       <w:r>
-        <w:t>a liberar, ya que el caso fallido corresponde a un defecto de prioridad media que provocaría faltantes en la tienda. Con el código corregido la aprobación regresa a 100 %.</w:t>
+        <w:t xml:space="preserve"> prueba fallida corresponde a un defecto de prioridad media que provocaría faltantes en la tienda. Al corregir el código, la aprobación vuelve a 100 %.</w:t>
+      </w:r>
+    </w:p>
+    <w:p>
+      <w:pPr>
+        <w:pStyle w:val="Ttulo2"/>
+      </w:pPr>
+      <w:r>
+        <w:t>5.3 Sistema en ejecución</w:t>
+      </w:r>
+    </w:p>
+    <w:p>
+      <w:r>
+        <w:t>Levantamos el sistema con php -S y lo usamos por HTTP con el producto del ejemplo de clase (TEC-020, Teclado USB, $250.00, 20 piezas). La Figura 6 muestra el alta, la consulta, una venta válida y tres operaciones que el sistema rechaza: vender 50 piezas cuando hay 16, vender una cantidad negativa y registrar un código repetido.</w:t>
+      </w:r>
+    </w:p>
+    <w:p>
+      <w:pPr>
+        <w:keepNext/>
+        <w:jc w:val="center"/>
+      </w:pPr>
+      <w:r>
+        <w:rPr>
+          <w:noProof/>
+        </w:rPr>
+        <w:drawing>
+          <wp:inline distT="0" distB="0" distL="0" distR="0" wp14:anchorId="7B756B74" wp14:editId="62A831AF">
+            <wp:extent cx="5580000" cy="3138750"/>
+            <wp:effectExtent l="0" t="0" r="0" b="0"/>
+            <wp:docPr id="6" name="Picture 6"/>
+            <wp:cNvGraphicFramePr>
+              <a:graphicFrameLocks xmlns:a="http://schemas.openxmlformats.org/drawingml/2006/main" noChangeAspect="1"/>
+            </wp:cNvGraphicFramePr>
+            <a:graphic xmlns:a="http://schemas.openxmlformats.org/drawingml/2006/main">
+              <a:graphicData uri="http://schemas.openxmlformats.org/drawingml/2006/picture">
+                <pic:pic xmlns:pic="http://schemas.openxmlformats.org/drawingml/2006/picture">
+                  <pic:nvPicPr>
+                    <pic:cNvPr id="0" name="sp-sistema-terminal.png"/>
+                    <pic:cNvPicPr/>
+                  </pic:nvPicPr>
+                  <pic:blipFill>
+                    <a:blip r:embed="rId12"/>
+                    <a:stretch>
+                      <a:fillRect/>
+                    </a:stretch>
+                  </pic:blipFill>
+                  <pic:spPr>
+                    <a:xfrm>
+                      <a:off x="0" y="0"/>
+                      <a:ext cx="5580000" cy="3138750"/>
+                    </a:xfrm>
+                    <a:prstGeom prst="rect">
+                      <a:avLst/>
+                    </a:prstGeom>
+                  </pic:spPr>
+                </pic:pic>
+              </a:graphicData>
+            </a:graphic>
+          </wp:inline>
+        </w:drawing>
+      </w:r>
+    </w:p>
+    <w:p>
+      <w:pPr>
+        <w:jc w:val="center"/>
+      </w:pPr>
+      <w:r>
+        <w:rPr>
+          <w:i/>
+          <w:color w:val="5D6575"/>
+          <w:sz w:val="18"/>
+        </w:rPr>
+        <w:t>Figura 6. Peticiones al sistema en ejecución y sus respuestas (201, 422 y 409).</w:t>
+      </w:r>
+    </w:p>
+    <w:tbl>
+      <w:tblPr>
+        <w:tblStyle w:val="Tablaconcuadrcula"/>
+        <w:tblW w:w="0" w:type="auto"/>
+        <w:jc w:val="center"/>
+        <w:tblLayout w:type="fixed"/>
+        <w:tblLook w:val="04A0" w:firstRow="1" w:lastRow="0" w:firstColumn="1" w:lastColumn="0" w:noHBand="0" w:noVBand="1"/>
+      </w:tblPr>
+      <w:tblGrid>
+        <w:gridCol w:w="2835"/>
+        <w:gridCol w:w="4762"/>
+        <w:gridCol w:w="1814"/>
+      </w:tblGrid>
+      <w:tr>
+        <w:trPr>
+          <w:cantSplit/>
+          <w:tblHeader/>
+          <w:jc w:val="center"/>
+        </w:trPr>
+        <w:tc>
+          <w:tcPr>
+            <w:tcW w:w="2835" w:type="dxa"/>
+            <w:shd w:val="clear" w:color="auto" w:fill="1F4E8C"/>
+          </w:tcPr>
+          <w:p>
+            <w:pPr>
+              <w:keepNext/>
+            </w:pPr>
+            <w:r>
+              <w:rPr>
+                <w:b/>
+                <w:color w:val="FFFFFF"/>
+                <w:sz w:val="19"/>
+              </w:rPr>
+              <w:t>Operación</w:t>
+            </w:r>
+          </w:p>
+        </w:tc>
+        <w:tc>
+          <w:tcPr>
+            <w:tcW w:w="4762" w:type="dxa"/>
+            <w:shd w:val="clear" w:color="auto" w:fill="1F4E8C"/>
+          </w:tcPr>
+          <w:p>
+            <w:pPr>
+              <w:keepNext/>
+            </w:pPr>
+            <w:r>
+              <w:rPr>
+                <w:b/>
+                <w:color w:val="FFFFFF"/>
+                <w:sz w:val="19"/>
+              </w:rPr>
+              <w:t>Respuesta</w:t>
+            </w:r>
+          </w:p>
+        </w:tc>
+        <w:tc>
+          <w:tcPr>
+            <w:tcW w:w="1814" w:type="dxa"/>
+            <w:shd w:val="clear" w:color="auto" w:fill="1F4E8C"/>
+          </w:tcPr>
+          <w:p>
+            <w:pPr>
+              <w:keepNext/>
+            </w:pPr>
+            <w:r>
+              <w:rPr>
+                <w:b/>
+                <w:color w:val="FFFFFF"/>
+                <w:sz w:val="19"/>
+              </w:rPr>
+              <w:t>Caso relacionado</w:t>
+            </w:r>
+          </w:p>
+        </w:tc>
+      </w:tr>
+      <w:tr>
+        <w:trPr>
+          <w:cantSplit/>
+          <w:jc w:val="center"/>
+        </w:trPr>
+        <w:tc>
+          <w:tcPr>
+            <w:tcW w:w="2835" w:type="dxa"/>
+          </w:tcPr>
+          <w:p>
+            <w:pPr>
+              <w:keepNext/>
+              <w:spacing w:after="20"/>
+            </w:pPr>
+            <w:r>
+              <w:rPr>
+                <w:b/>
+                <w:sz w:val="19"/>
+              </w:rPr>
+              <w:t>Alta de TEC-020 con 20 piezas</w:t>
+            </w:r>
+          </w:p>
+        </w:tc>
+        <w:tc>
+          <w:tcPr>
+            <w:tcW w:w="4762" w:type="dxa"/>
+          </w:tcPr>
+          <w:p>
+            <w:pPr>
+              <w:keepNext/>
+              <w:spacing w:after="20"/>
+            </w:pPr>
+            <w:r>
+              <w:rPr>
+                <w:sz w:val="19"/>
+              </w:rPr>
+              <w:t>201 · producto registrado</w:t>
+            </w:r>
+          </w:p>
+        </w:tc>
+        <w:tc>
+          <w:tcPr>
+            <w:tcW w:w="1814" w:type="dxa"/>
+          </w:tcPr>
+          <w:p>
+            <w:pPr>
+              <w:keepNext/>
+              <w:spacing w:after="20"/>
+            </w:pPr>
+            <w:r>
+              <w:rPr>
+                <w:sz w:val="19"/>
+              </w:rPr>
+              <w:t>CP-01, CP-07</w:t>
+            </w:r>
+          </w:p>
+        </w:tc>
+      </w:tr>
+      <w:tr>
+        <w:trPr>
+          <w:cantSplit/>
+          <w:jc w:val="center"/>
+        </w:trPr>
+        <w:tc>
+          <w:tcPr>
+            <w:tcW w:w="2835" w:type="dxa"/>
+          </w:tcPr>
+          <w:p>
+            <w:pPr>
+              <w:keepNext/>
+              <w:spacing w:after="20"/>
+            </w:pPr>
+            <w:r>
+              <w:rPr>
+                <w:b/>
+                <w:sz w:val="19"/>
+              </w:rPr>
+              <w:t>Consulta de «tec-020» en minúsculas</w:t>
+            </w:r>
+          </w:p>
+        </w:tc>
+        <w:tc>
+          <w:tcPr>
+            <w:tcW w:w="4762" w:type="dxa"/>
+          </w:tcPr>
+          <w:p>
+            <w:pPr>
+              <w:keepNext/>
+              <w:spacing w:after="20"/>
+            </w:pPr>
+            <w:r>
+              <w:rPr>
+                <w:sz w:val="19"/>
+              </w:rPr>
+              <w:t>200 · existencia 20</w:t>
+            </w:r>
+          </w:p>
+        </w:tc>
+        <w:tc>
+          <w:tcPr>
+            <w:tcW w:w="1814" w:type="dxa"/>
+          </w:tcPr>
+          <w:p>
+            <w:pPr>
+              <w:keepNext/>
+              <w:spacing w:after="20"/>
+            </w:pPr>
+            <w:r>
+              <w:rPr>
+                <w:sz w:val="19"/>
+              </w:rPr>
+              <w:t>CP-07</w:t>
+            </w:r>
+          </w:p>
+        </w:tc>
+      </w:tr>
+      <w:tr>
+        <w:trPr>
+          <w:cantSplit/>
+          <w:jc w:val="center"/>
+        </w:trPr>
+        <w:tc>
+          <w:tcPr>
+            <w:tcW w:w="2835" w:type="dxa"/>
+          </w:tcPr>
+          <w:p>
+            <w:pPr>
+              <w:keepNext/>
+              <w:spacing w:after="20"/>
+            </w:pPr>
+            <w:r>
+              <w:rPr>
+                <w:b/>
+                <w:sz w:val="19"/>
+              </w:rPr>
+              <w:t>Venta de 4 piezas</w:t>
+            </w:r>
+          </w:p>
+        </w:tc>
+        <w:tc>
+          <w:tcPr>
+            <w:tcW w:w="4762" w:type="dxa"/>
+          </w:tcPr>
+          <w:p>
+            <w:pPr>
+              <w:keepNext/>
+              <w:spacing w:after="20"/>
+            </w:pPr>
+            <w:r>
+              <w:rPr>
+                <w:sz w:val="19"/>
+              </w:rPr>
+              <w:t>201 · existencia resultante 16</w:t>
+            </w:r>
+          </w:p>
+        </w:tc>
+        <w:tc>
+          <w:tcPr>
+            <w:tcW w:w="1814" w:type="dxa"/>
+          </w:tcPr>
+          <w:p>
+            <w:pPr>
+              <w:keepNext/>
+              <w:spacing w:after="20"/>
+            </w:pPr>
+            <w:r>
+              <w:rPr>
+                <w:sz w:val="19"/>
+              </w:rPr>
+              <w:t>CP-03, CP-07</w:t>
+            </w:r>
+          </w:p>
+        </w:tc>
+      </w:tr>
+      <w:tr>
+        <w:trPr>
+          <w:cantSplit/>
+          <w:jc w:val="center"/>
+        </w:trPr>
+        <w:tc>
+          <w:tcPr>
+            <w:tcW w:w="2835" w:type="dxa"/>
+          </w:tcPr>
+          <w:p>
+            <w:pPr>
+              <w:keepNext/>
+              <w:spacing w:after="20"/>
+            </w:pPr>
+            <w:r>
+              <w:rPr>
+                <w:b/>
+                <w:sz w:val="19"/>
+              </w:rPr>
+              <w:t>Venta de 50 piezas</w:t>
+            </w:r>
+          </w:p>
+        </w:tc>
+        <w:tc>
+          <w:tcPr>
+            <w:tcW w:w="4762" w:type="dxa"/>
+          </w:tcPr>
+          <w:p>
+            <w:pPr>
+              <w:keepNext/>
+              <w:spacing w:after="20"/>
+            </w:pPr>
+            <w:r>
+              <w:rPr>
+                <w:sz w:val="19"/>
+              </w:rPr>
+              <w:t>422 · «Existencia insuficiente de TEC-020: hay 16 y se pidieron 50.»</w:t>
+            </w:r>
+          </w:p>
+        </w:tc>
+        <w:tc>
+          <w:tcPr>
+            <w:tcW w:w="1814" w:type="dxa"/>
+          </w:tcPr>
+          <w:p>
+            <w:pPr>
+              <w:keepNext/>
+              <w:spacing w:after="20"/>
+            </w:pPr>
+            <w:r>
+              <w:rPr>
+                <w:sz w:val="19"/>
+              </w:rPr>
+              <w:t>CP-04, CP-08</w:t>
+            </w:r>
+          </w:p>
+        </w:tc>
+      </w:tr>
+      <w:tr>
+        <w:trPr>
+          <w:cantSplit/>
+          <w:jc w:val="center"/>
+        </w:trPr>
+        <w:tc>
+          <w:tcPr>
+            <w:tcW w:w="2835" w:type="dxa"/>
+          </w:tcPr>
+          <w:p>
+            <w:pPr>
+              <w:keepNext/>
+              <w:spacing w:after="20"/>
+            </w:pPr>
+            <w:r>
+              <w:rPr>
+                <w:b/>
+                <w:sz w:val="19"/>
+              </w:rPr>
+              <w:t>Venta de −2 piezas</w:t>
+            </w:r>
+          </w:p>
+        </w:tc>
+        <w:tc>
+          <w:tcPr>
+            <w:tcW w:w="4762" w:type="dxa"/>
+          </w:tcPr>
+          <w:p>
+            <w:pPr>
+              <w:keepNext/>
+              <w:spacing w:after="20"/>
+            </w:pPr>
+            <w:r>
+              <w:rPr>
+                <w:sz w:val="19"/>
+              </w:rPr>
+              <w:t>422 · «La cantidad debe ser un número entero mayor que cero.»</w:t>
+            </w:r>
+          </w:p>
+        </w:tc>
+        <w:tc>
+          <w:tcPr>
+            <w:tcW w:w="1814" w:type="dxa"/>
+          </w:tcPr>
+          <w:p>
+            <w:pPr>
+              <w:keepNext/>
+              <w:spacing w:after="20"/>
+            </w:pPr>
+            <w:r>
+              <w:rPr>
+                <w:sz w:val="19"/>
+              </w:rPr>
+              <w:t>CP-08</w:t>
+            </w:r>
+          </w:p>
+        </w:tc>
+      </w:tr>
+      <w:tr>
+        <w:trPr>
+          <w:cantSplit/>
+          <w:jc w:val="center"/>
+        </w:trPr>
+        <w:tc>
+          <w:tcPr>
+            <w:tcW w:w="2835" w:type="dxa"/>
+          </w:tcPr>
+          <w:p>
+            <w:pPr>
+              <w:spacing w:after="20"/>
+            </w:pPr>
+            <w:r>
+              <w:rPr>
+                <w:b/>
+                <w:sz w:val="19"/>
+              </w:rPr>
+              <w:t>Alta repetida de «tec-020»</w:t>
+            </w:r>
+          </w:p>
+        </w:tc>
+        <w:tc>
+          <w:tcPr>
+            <w:tcW w:w="4762" w:type="dxa"/>
+          </w:tcPr>
+          <w:p>
+            <w:pPr>
+              <w:spacing w:after="20"/>
+            </w:pPr>
+            <w:r>
+              <w:rPr>
+                <w:sz w:val="19"/>
+              </w:rPr>
+              <w:t>409 · «Ya existe un producto con el código TEC-020.»</w:t>
+            </w:r>
+          </w:p>
+        </w:tc>
+        <w:tc>
+          <w:tcPr>
+            <w:tcW w:w="1814" w:type="dxa"/>
+          </w:tcPr>
+          <w:p>
+            <w:pPr>
+              <w:spacing w:after="20"/>
+            </w:pPr>
+            <w:r>
+              <w:rPr>
+                <w:sz w:val="19"/>
+              </w:rPr>
+              <w:t>CP-02</w:t>
+            </w:r>
+          </w:p>
+        </w:tc>
+      </w:tr>
+    </w:tbl>
+    <w:p>
+      <w:pPr>
+        <w:spacing w:after="40"/>
+      </w:pPr>
+    </w:p>
+    <w:p>
+      <w:pPr>
+        <w:keepNext/>
+        <w:jc w:val="center"/>
+      </w:pPr>
+      <w:r>
+        <w:rPr>
+          <w:noProof/>
+        </w:rPr>
+        <w:lastRenderedPageBreak/>
+        <w:drawing>
+          <wp:inline distT="0" distB="0" distL="0" distR="0" wp14:anchorId="6986F0BF" wp14:editId="78CEB7FC">
+            <wp:extent cx="5580000" cy="3138750"/>
+            <wp:effectExtent l="0" t="0" r="0" b="0"/>
+            <wp:docPr id="7" name="Picture 7"/>
+            <wp:cNvGraphicFramePr>
+              <a:graphicFrameLocks xmlns:a="http://schemas.openxmlformats.org/drawingml/2006/main" noChangeAspect="1"/>
+            </wp:cNvGraphicFramePr>
+            <a:graphic xmlns:a="http://schemas.openxmlformats.org/drawingml/2006/main">
+              <a:graphicData uri="http://schemas.openxmlformats.org/drawingml/2006/picture">
+                <pic:pic xmlns:pic="http://schemas.openxmlformats.org/drawingml/2006/picture">
+                  <pic:nvPicPr>
+                    <pic:cNvPr id="0" name="sp-sistema-reporte.png"/>
+                    <pic:cNvPicPr/>
+                  </pic:nvPicPr>
+                  <pic:blipFill>
+                    <a:blip r:embed="rId13"/>
+                    <a:stretch>
+                      <a:fillRect/>
+                    </a:stretch>
+                  </pic:blipFill>
+                  <pic:spPr>
+                    <a:xfrm>
+                      <a:off x="0" y="0"/>
+                      <a:ext cx="5580000" cy="3138750"/>
+                    </a:xfrm>
+                    <a:prstGeom prst="rect">
+                      <a:avLst/>
+                    </a:prstGeom>
+                  </pic:spPr>
+                </pic:pic>
+              </a:graphicData>
+            </a:graphic>
+          </wp:inline>
+        </w:drawing>
+      </w:r>
+    </w:p>
+    <w:p>
+      <w:pPr>
+        <w:jc w:val="center"/>
+      </w:pPr>
+      <w:r>
+        <w:rPr>
+          <w:i/>
+          <w:color w:val="5D6575"/>
+          <w:sz w:val="18"/>
+        </w:rPr>
+        <w:t>Figura 7. Reporte de inventario (/api/reporte) con los productos por resurtir.</w:t>
       </w:r>
     </w:p>
     <w:p>
@@ -9573,7 +11834,7 @@
     </w:p>
     <w:p>
       <w:r>
-        <w:t>Documentamos dos defectos hipotéticos. Para que la evidencia esperada no quede en suposición, los provocamos en una copia del código con scripts/simular-defectos.php (rondas 2 y 3 de la sección 5.1).</w:t>
+        <w:t>Documentamos dos defectos hipotéticos. Para contar con evidencia real y no solo esperada, los reprodujimos en una copia del código (rondas 2 y 3 de la sección 5.1).</w:t>
       </w:r>
     </w:p>
     <w:p>
@@ -9620,6 +11881,7 @@
                 <w:b/>
                 <w:sz w:val="20"/>
               </w:rPr>
+              <w:lastRenderedPageBreak/>
               <w:t>Descripción</w:t>
             </w:r>
           </w:p>
@@ -9637,7 +11899,7 @@
               <w:rPr>
                 <w:sz w:val="20"/>
               </w:rPr>
-              <w:t>Al registrar una venta con una cantidad mayor a la existencia, el sistema la acepta, responde 201 y la existencia queda en negativo. La causa sería que Inventario::registrarSalida deja de comparar la cantidad con la existencia.</w:t>
+              <w:t>Al registrar una venta mayor a la existencia disponible, el sistema la acepta, responde 201 y deja el inventario en negativo. La causa sería que Inventario::registrarSalida deja de comparar la cantidad pedida con lo disponible.</w:t>
             </w:r>
           </w:p>
         </w:tc>
@@ -10177,7 +12439,7 @@
               <w:rPr>
                 <w:sz w:val="20"/>
               </w:rPr>
-              <w:t>El reporte solo lista para resurtir los productos con existencia menor a su stock mínimo y deja fuera los que quedan exactamente en el mínimo. La causa sería que Producto::bajoStockMinimo usa &lt; en lugar de &lt;=.</w:t>
+              <w:t>El reporte solo marca para resurtir los productos por debajo de su stock mínimo y omite los que quedan exactamente en ese límite. La causa sería que Producto::bajoStockMinimo usa &lt; en lugar de &lt;=.</w:t>
             </w:r>
           </w:p>
         </w:tc>
@@ -10972,10 +13234,10 @@
           <w:noProof/>
         </w:rPr>
         <w:drawing>
-          <wp:inline distT="0" distB="0" distL="0" distR="0" wp14:anchorId="0D8D9556" wp14:editId="0BA6C549">
-            <wp:extent cx="5220000" cy="2936250"/>
+          <wp:inline distT="0" distB="0" distL="0" distR="0" wp14:anchorId="2D752E44" wp14:editId="037CB9F4">
+            <wp:extent cx="5580000" cy="3138750"/>
             <wp:effectExtent l="0" t="0" r="0" b="0"/>
-            <wp:docPr id="5" name="Picture 5"/>
+            <wp:docPr id="8" name="Picture 8"/>
             <wp:cNvGraphicFramePr>
               <a:graphicFrameLocks xmlns:a="http://schemas.openxmlformats.org/drawingml/2006/main" noChangeAspect="1"/>
             </wp:cNvGraphicFramePr>
@@ -10983,11 +13245,11 @@
               <a:graphicData uri="http://schemas.openxmlformats.org/drawingml/2006/picture">
                 <pic:pic xmlns:pic="http://schemas.openxmlformats.org/drawingml/2006/picture">
                   <pic:nvPicPr>
-                    <pic:cNvPr id="0" name="diagrama-regresion.png"/>
+                    <pic:cNvPr id="0" name="sp-diag-regresion.png"/>
                     <pic:cNvPicPr/>
                   </pic:nvPicPr>
                   <pic:blipFill>
-                    <a:blip r:embed="rId11"/>
+                    <a:blip r:embed="rId14"/>
                     <a:stretch>
                       <a:fillRect/>
                     </a:stretch>
@@ -10995,7 +13257,7 @@
                   <pic:spPr>
                     <a:xfrm>
                       <a:off x="0" y="0"/>
-                      <a:ext cx="5220000" cy="2936250"/>
+                      <a:ext cx="5580000" cy="3138750"/>
                     </a:xfrm>
                     <a:prstGeom prst="rect">
                       <a:avLst/>
@@ -11018,7 +13280,7 @@
           <w:color w:val="5D6575"/>
           <w:sz w:val="18"/>
         </w:rPr>
-        <w:t>Figura 5. Ciclo para repetir las pruebas al corregir un defecto.</w:t>
+        <w:t>Figura 8. Ciclo para repetir las pruebas al corregir un defecto.</w:t>
       </w:r>
     </w:p>
     <w:p>
@@ -11063,7 +13325,7 @@
         <w:t xml:space="preserve">Prueba de repetición. </w:t>
       </w:r>
       <w:r>
-        <w:t>Se corre solo el caso que falló para confirmar la corrección.</w:t>
+        <w:t>Se ejecuta solo el caso que falló para confirmar la corrección.</w:t>
       </w:r>
     </w:p>
     <w:p>
@@ -11078,7 +13340,7 @@
         <w:t xml:space="preserve">Regresión. </w:t>
       </w:r>
       <w:r>
-        <w:t>Al abrir el Pull Request, GitHub Actions corre los diez casos y el job que inyecta DEF-01 y DEF-02.</w:t>
+        <w:t>Al abrir el Pull Request, GitHub Actions ejecuta los diez casos y el job que inyecta DEF-01 y DEF-02.</w:t>
       </w:r>
     </w:p>
     <w:p>
@@ -11118,6 +13380,7 @@
         <w:spacing w:after="40"/>
       </w:pPr>
       <w:r>
+        <w:lastRenderedPageBreak/>
         <w:t>CP-01 y CP-02, para verificar que se siguen registrando productos válidos y rechazando duplicados.</w:t>
       </w:r>
     </w:p>
@@ -11362,7 +13625,7 @@
               <w:rPr>
                 <w:sz w:val="19"/>
               </w:rPr>
-              <w:t>Commit fc95f31 (rama main)</w:t>
+              <w:t>Commit 185cafb (rama main)</w:t>
             </w:r>
           </w:p>
         </w:tc>
@@ -11379,7 +13642,7 @@
               <w:rPr>
                 <w:sz w:val="19"/>
               </w:rPr>
-              <w:t>Commit fc95f31 (rama main)</w:t>
+              <w:t>Commit 185cafb (rama main)</w:t>
             </w:r>
           </w:p>
         </w:tc>
@@ -11594,7 +13857,7 @@
               <w:rPr>
                 <w:sz w:val="19"/>
               </w:rPr>
-              <w:t>evidencias/regresion/DEF-01 y corregido (JUnit), Figura 3, ejecución del CI</w:t>
+              <w:t>evidencias/regresion/DEF-01 y corregido (JUnit), Figuras 4 y 6, ejecución del CI</w:t>
             </w:r>
           </w:p>
         </w:tc>
@@ -11611,7 +13874,7 @@
               <w:rPr>
                 <w:sz w:val="19"/>
               </w:rPr>
-              <w:t>evidencias/regresion/DEF-02 y corregido (JUnit), Figura 3, ejecución del CI</w:t>
+              <w:t>evidencias/regresion/DEF-02 y corregido (JUnit), Figura 4, ejecución del CI</w:t>
             </w:r>
           </w:p>
         </w:tc>
@@ -11703,7 +13966,7 @@
         </w:rPr>
         <w:t xml:space="preserve">Repositorio: </w:t>
       </w:r>
-      <w:hyperlink r:id="rId12">
+      <w:hyperlink r:id="rId15">
         <w:r>
           <w:rPr>
             <w:color w:val="1F4E8C"/>
@@ -11723,7 +13986,7 @@
         </w:rPr>
         <w:t xml:space="preserve">Ejecución del CI: </w:t>
       </w:r>
-      <w:hyperlink r:id="rId13">
+      <w:hyperlink r:id="rId16">
         <w:r>
           <w:rPr>
             <w:color w:val="1F4E8C"/>
@@ -12181,11 +14444,12 @@
         <w:rPr>
           <w:noProof/>
         </w:rPr>
+        <w:lastRenderedPageBreak/>
         <w:drawing>
-          <wp:inline distT="0" distB="0" distL="0" distR="0" wp14:anchorId="17EB281C" wp14:editId="336E828E">
+          <wp:inline distT="0" distB="0" distL="0" distR="0" wp14:anchorId="62F6718C" wp14:editId="236EF2A2">
             <wp:extent cx="5580000" cy="3138750"/>
             <wp:effectExtent l="0" t="0" r="0" b="0"/>
-            <wp:docPr id="6" name="Picture 6"/>
+            <wp:docPr id="9" name="Picture 9"/>
             <wp:cNvGraphicFramePr>
               <a:graphicFrameLocks xmlns:a="http://schemas.openxmlformats.org/drawingml/2006/main" noChangeAspect="1"/>
             </wp:cNvGraphicFramePr>
@@ -12193,11 +14457,11 @@
               <a:graphicData uri="http://schemas.openxmlformats.org/drawingml/2006/picture">
                 <pic:pic xmlns:pic="http://schemas.openxmlformats.org/drawingml/2006/picture">
                   <pic:nvPicPr>
-                    <pic:cNvPr id="0" name="diagrama-ci.png"/>
+                    <pic:cNvPr id="0" name="sp-diag-flujo.png"/>
                     <pic:cNvPicPr/>
                   </pic:nvPicPr>
                   <pic:blipFill>
-                    <a:blip r:embed="rId14"/>
+                    <a:blip r:embed="rId17"/>
                     <a:stretch>
                       <a:fillRect/>
                     </a:stretch>
@@ -12228,7 +14492,7 @@
           <w:color w:val="5D6575"/>
           <w:sz w:val="18"/>
         </w:rPr>
-        <w:t>Figura 6. Jobs del pipeline y orden de ejecución.</w:t>
+        <w:t>Figura 9. Flujo de trabajo: del cambio en el código a la integración (pasos 1 a 5A/5B).</w:t>
       </w:r>
     </w:p>
     <w:p>
@@ -12241,10 +14505,10 @@
           <w:noProof/>
         </w:rPr>
         <w:drawing>
-          <wp:inline distT="0" distB="0" distL="0" distR="0" wp14:anchorId="319346E5" wp14:editId="7A1399B4">
+          <wp:inline distT="0" distB="0" distL="0" distR="0" wp14:anchorId="725F0478" wp14:editId="423B64B5">
             <wp:extent cx="5580000" cy="3138750"/>
             <wp:effectExtent l="0" t="0" r="0" b="0"/>
-            <wp:docPr id="7" name="Picture 7"/>
+            <wp:docPr id="10" name="Picture 10"/>
             <wp:cNvGraphicFramePr>
               <a:graphicFrameLocks xmlns:a="http://schemas.openxmlformats.org/drawingml/2006/main" noChangeAspect="1"/>
             </wp:cNvGraphicFramePr>
@@ -12252,11 +14516,11 @@
               <a:graphicData uri="http://schemas.openxmlformats.org/drawingml/2006/picture">
                 <pic:pic xmlns:pic="http://schemas.openxmlformats.org/drawingml/2006/picture">
                   <pic:nvPicPr>
-                    <pic:cNvPr id="0" name="captura-github-actions.png"/>
+                    <pic:cNvPr id="0" name="sp-diag-ci.png"/>
                     <pic:cNvPicPr/>
                   </pic:nvPicPr>
                   <pic:blipFill>
-                    <a:blip r:embed="rId15"/>
+                    <a:blip r:embed="rId18"/>
                     <a:stretch>
                       <a:fillRect/>
                     </a:stretch>
@@ -12287,7 +14551,67 @@
           <w:color w:val="5D6575"/>
           <w:sz w:val="18"/>
         </w:rPr>
-        <w:t>Figura 7. Ejecución del CI en GitHub Actions.</w:t>
+        <w:t>Figura 10. Jobs del pipeline y orden de ejecución.</w:t>
+      </w:r>
+    </w:p>
+    <w:p>
+      <w:pPr>
+        <w:keepNext/>
+        <w:jc w:val="center"/>
+      </w:pPr>
+      <w:r>
+        <w:rPr>
+          <w:noProof/>
+        </w:rPr>
+        <w:lastRenderedPageBreak/>
+        <w:drawing>
+          <wp:inline distT="0" distB="0" distL="0" distR="0" wp14:anchorId="7B9349FE" wp14:editId="5C8A9819">
+            <wp:extent cx="5580000" cy="3138750"/>
+            <wp:effectExtent l="0" t="0" r="0" b="0"/>
+            <wp:docPr id="11" name="Picture 11"/>
+            <wp:cNvGraphicFramePr>
+              <a:graphicFrameLocks xmlns:a="http://schemas.openxmlformats.org/drawingml/2006/main" noChangeAspect="1"/>
+            </wp:cNvGraphicFramePr>
+            <a:graphic xmlns:a="http://schemas.openxmlformats.org/drawingml/2006/main">
+              <a:graphicData uri="http://schemas.openxmlformats.org/drawingml/2006/picture">
+                <pic:pic xmlns:pic="http://schemas.openxmlformats.org/drawingml/2006/picture">
+                  <pic:nvPicPr>
+                    <pic:cNvPr id="0" name="sp-github-actions.png"/>
+                    <pic:cNvPicPr/>
+                  </pic:nvPicPr>
+                  <pic:blipFill>
+                    <a:blip r:embed="rId19"/>
+                    <a:stretch>
+                      <a:fillRect/>
+                    </a:stretch>
+                  </pic:blipFill>
+                  <pic:spPr>
+                    <a:xfrm>
+                      <a:off x="0" y="0"/>
+                      <a:ext cx="5580000" cy="3138750"/>
+                    </a:xfrm>
+                    <a:prstGeom prst="rect">
+                      <a:avLst/>
+                    </a:prstGeom>
+                  </pic:spPr>
+                </pic:pic>
+              </a:graphicData>
+            </a:graphic>
+          </wp:inline>
+        </w:drawing>
+      </w:r>
+    </w:p>
+    <w:p>
+      <w:pPr>
+        <w:jc w:val="center"/>
+      </w:pPr>
+      <w:r>
+        <w:rPr>
+          <w:i/>
+          <w:color w:val="5D6575"/>
+          <w:sz w:val="18"/>
+        </w:rPr>
+        <w:t>Figura 11. Ejecución del CI en GitHub Actions con los 8 jobs en verde.</w:t>
       </w:r>
     </w:p>
     <w:p>
@@ -12417,6 +14741,12 @@
           <w:sz w:val="17"/>
         </w:rPr>
         <w:br/>
+      </w:r>
+      <w:r>
+        <w:rPr>
+          <w:rFonts w:ascii="Consolas" w:eastAsia="Consolas" w:hAnsi="Consolas"/>
+          <w:sz w:val="17"/>
+        </w:rPr>
         <w:t xml:space="preserve">  cancel-in-progress: true</w:t>
       </w:r>
       <w:r>
@@ -12479,12 +14809,6 @@
           <w:sz w:val="17"/>
         </w:rPr>
         <w:br/>
-      </w:r>
-      <w:r>
-        <w:rPr>
-          <w:rFonts w:ascii="Consolas" w:eastAsia="Consolas" w:hAnsi="Consolas"/>
-          <w:sz w:val="17"/>
-        </w:rPr>
         <w:t xml:space="preserve">    runs-on: ubuntu-latest</w:t>
       </w:r>
       <w:r>
@@ -12579,6 +14903,7 @@
           <w:rFonts w:ascii="Consolas" w:eastAsia="Consolas" w:hAnsi="Consolas"/>
           <w:sz w:val="17"/>
         </w:rPr>
+        <w:lastRenderedPageBreak/>
         <w:br/>
         <w:t xml:space="preserve">      - name: CP-01 a CP-04</w:t>
       </w:r>
@@ -12603,6 +14928,12 @@
           <w:sz w:val="17"/>
         </w:rPr>
         <w:br/>
+      </w:r>
+      <w:r>
+        <w:rPr>
+          <w:rFonts w:ascii="Consolas" w:eastAsia="Consolas" w:hAnsi="Consolas"/>
+          <w:sz w:val="17"/>
+        </w:rPr>
         <w:t xml:space="preserve">      - uses: actions/upload-artifact@v4</w:t>
       </w:r>
       <w:r>
@@ -12635,12 +14966,6 @@
           <w:sz w:val="17"/>
         </w:rPr>
         <w:br/>
-      </w:r>
-      <w:r>
-        <w:rPr>
-          <w:rFonts w:ascii="Consolas" w:eastAsia="Consolas" w:hAnsi="Consolas"/>
-          <w:sz w:val="17"/>
-        </w:rPr>
         <w:t xml:space="preserve">          path: evidencias/junit-Unitarias.xml</w:t>
       </w:r>
     </w:p>
@@ -13580,7 +15905,7 @@
               <w:rPr>
                 <w:sz w:val="19"/>
               </w:rPr>
-              <w:t>Antes de pasar a main se corren los escenarios de aceptación y la regresión nocturna.</w:t>
+              <w:t>Antes de pasar a main se ejecutan los escenarios de aceptación y la regresión nocturna.</w:t>
             </w:r>
           </w:p>
         </w:tc>
@@ -13601,17 +15926,18 @@
     </w:p>
     <w:p>
       <w:r>
-        <w:t>Escribimos cinco requisitos con criterios que se pueden comprobar y cada uno quedó cubierto por dos casos o más. Los diez casos están automatizados en cuatro niveles y la ronda 1 terminó con 10 de 10 aprobados.</w:t>
+        <w:t>Escribimos cinco requisitos con criterios verificables, y cada uno quedó cubierto por al menos dos casos. Las diez pruebas están automatizadas en cuatro niveles y la ronda 1 terminó con todas aprobadas.</w:t>
       </w:r>
     </w:p>
     <w:p>
       <w:r>
-        <w:t>Al inyectar los defectos comprobamos que las pruebas sirven: DEF-01 hizo fallar tres casos de tres niveles distintos y DEF-02 hizo fallar CP-09. El 90 % de la ronda 3 nos enseñó que el porcentaje de aprobación se interpreta junto con la prioridad del caso que falla, no solo como número.</w:t>
+        <w:t>Al inyectar los defectos comprobamos que las pruebas los detectan: DEF-01 provocó fallos en tres niveles distintos y DEF-02 en CP-09. La ronda 3 mostró que el porcentaje de aprobación debe leerse junto con la prioridad de lo que falla: un 90 % puede esconder un defecto que afecta a la tienda.</w:t>
       </w:r>
     </w:p>
     <w:p>
       <w:r>
-        <w:t>Con el flujo de GitHub Actions las pruebas corren solas en cada push y Pull Request, en tres versiones de PHP, y un cambio que rompe una regla no se puede integrar. La siguiente mejora sería agregar las pruebas de la interfaz con Playwright al mismo flujo.</w:t>
+        <w:lastRenderedPageBreak/>
+        <w:t>GitHub Actions ejecuta las pruebas en cada push y Pull Request, en tres versiones de PHP, y bloquea la integración de cualquier cambio que rompa una regla. Como siguiente mejora proponemos sumar al flujo las pruebas de la interfaz con Playwright.</w:t>
       </w:r>
     </w:p>
     <w:p>
@@ -14158,31 +16484,31 @@
       </w:rPr>
     </w:lvl>
   </w:abstractNum>
-  <w:num w:numId="1" w16cid:durableId="1301837091">
+  <w:num w:numId="1" w16cid:durableId="895091717">
     <w:abstractNumId w:val="8"/>
   </w:num>
-  <w:num w:numId="2" w16cid:durableId="1210611494">
+  <w:num w:numId="2" w16cid:durableId="1918709715">
     <w:abstractNumId w:val="6"/>
   </w:num>
-  <w:num w:numId="3" w16cid:durableId="1998916934">
+  <w:num w:numId="3" w16cid:durableId="197278182">
     <w:abstractNumId w:val="5"/>
   </w:num>
-  <w:num w:numId="4" w16cid:durableId="1999645960">
+  <w:num w:numId="4" w16cid:durableId="1547258248">
     <w:abstractNumId w:val="4"/>
   </w:num>
-  <w:num w:numId="5" w16cid:durableId="1504197649">
+  <w:num w:numId="5" w16cid:durableId="574902589">
     <w:abstractNumId w:val="7"/>
   </w:num>
-  <w:num w:numId="6" w16cid:durableId="84768092">
+  <w:num w:numId="6" w16cid:durableId="2121954694">
     <w:abstractNumId w:val="3"/>
   </w:num>
-  <w:num w:numId="7" w16cid:durableId="510679891">
+  <w:num w:numId="7" w16cid:durableId="1128627217">
     <w:abstractNumId w:val="2"/>
   </w:num>
-  <w:num w:numId="8" w16cid:durableId="2002196745">
+  <w:num w:numId="8" w16cid:durableId="1814829048">
     <w:abstractNumId w:val="1"/>
   </w:num>
-  <w:num w:numId="9" w16cid:durableId="1923635372">
+  <w:num w:numId="9" w16cid:durableId="1559245953">
     <w:abstractNumId w:val="0"/>
   </w:num>
 </w:numbering>

</xml_diff>

<commit_message>
docs: figura 7 con formato y texto de ramas protegidas acorde a GitHub
</commit_message>
<xml_diff>
--- a/docs/Segunda parte/Actividad 2 - Segunda parte - Documento técnico.docx
+++ b/docs/Segunda parte/Actividad 2 - Segunda parte - Documento técnico.docx
@@ -2210,7 +2210,7 @@
               <w:rPr>
                 <w:sz w:val="19"/>
               </w:rPr>
-              <w:t>Git y repositorio público en GitHub con ramas main, develop, feature/** y fix/**.</w:t>
+              <w:t>Git y repositorio público en GitHub. Las ramas main y develop están protegidas; el trabajo se hace en ramas feature/** o fix/** y entra por Pull Request.</w:t>
             </w:r>
           </w:p>
         </w:tc>
@@ -8304,7 +8304,7 @@
           <w:noProof/>
         </w:rPr>
         <w:drawing>
-          <wp:inline distT="0" distB="0" distL="0" distR="0" wp14:anchorId="5E9FDA59" wp14:editId="35887820">
+          <wp:inline distT="0" distB="0" distL="0" distR="0" wp14:anchorId="6E701E02" wp14:editId="5E3C12B5">
             <wp:extent cx="5580000" cy="3138750"/>
             <wp:effectExtent l="0" t="0" r="0" b="0"/>
             <wp:docPr id="1" name="Picture 1"/>
@@ -9023,7 +9023,7 @@
     </w:p>
     <w:p>
       <w:r>
-        <w:t>Registramos la ejecución en una bitácora de pruebas. Las cuatro suites se ejecutaron con scripts/ejecutar-pruebas.php el 30 de octubre de 2026 (Windows NT 10.0, PHP 8.4.27, PHPUnit 11.5.56, versión 185cafb del repositorio).</w:t>
+        <w:t>Registramos la ejecución en una bitácora de pruebas. Las cuatro suites se ejecutaron con scripts/ejecutar-pruebas.php el 30 de octubre de 2026 (Windows NT 10.0, PHP 8.4.27, PHPUnit 11.5.56, versión e00ff60 del repositorio).</w:t>
       </w:r>
     </w:p>
     <w:p>
@@ -10430,7 +10430,7 @@
         </w:rPr>
         <w:lastRenderedPageBreak/>
         <w:drawing>
-          <wp:inline distT="0" distB="0" distL="0" distR="0" wp14:anchorId="4F753DC3" wp14:editId="5FCF4F62">
+          <wp:inline distT="0" distB="0" distL="0" distR="0" wp14:anchorId="41A69DD1" wp14:editId="300142A1">
             <wp:extent cx="5580000" cy="3138750"/>
             <wp:effectExtent l="0" t="0" r="0" b="0"/>
             <wp:docPr id="2" name="Picture 2"/>
@@ -10489,7 +10489,7 @@
           <w:noProof/>
         </w:rPr>
         <w:drawing>
-          <wp:inline distT="0" distB="0" distL="0" distR="0" wp14:anchorId="2F2551DF" wp14:editId="45C2A7BC">
+          <wp:inline distT="0" distB="0" distL="0" distR="0" wp14:anchorId="3B65DCF3" wp14:editId="4DDA3489">
             <wp:extent cx="5580000" cy="3138750"/>
             <wp:effectExtent l="0" t="0" r="0" b="0"/>
             <wp:docPr id="3" name="Picture 3"/>
@@ -10549,7 +10549,7 @@
         </w:rPr>
         <w:lastRenderedPageBreak/>
         <w:drawing>
-          <wp:inline distT="0" distB="0" distL="0" distR="0" wp14:anchorId="57A9BB53" wp14:editId="25844BCD">
+          <wp:inline distT="0" distB="0" distL="0" distR="0" wp14:anchorId="471E58F1" wp14:editId="7246E1FA">
             <wp:extent cx="5580000" cy="3138750"/>
             <wp:effectExtent l="0" t="0" r="0" b="0"/>
             <wp:docPr id="4" name="Picture 4"/>
@@ -11200,7 +11200,7 @@
           <w:noProof/>
         </w:rPr>
         <w:drawing>
-          <wp:inline distT="0" distB="0" distL="0" distR="0" wp14:anchorId="5F5CB97C" wp14:editId="0344A4DD">
+          <wp:inline distT="0" distB="0" distL="0" distR="0" wp14:anchorId="24581827" wp14:editId="62A34C09">
             <wp:extent cx="5580000" cy="3138750"/>
             <wp:effectExtent l="0" t="0" r="0" b="0"/>
             <wp:docPr id="5" name="Picture 5"/>
@@ -11287,7 +11287,7 @@
           <w:noProof/>
         </w:rPr>
         <w:drawing>
-          <wp:inline distT="0" distB="0" distL="0" distR="0" wp14:anchorId="7B756B74" wp14:editId="62A831AF">
+          <wp:inline distT="0" distB="0" distL="0" distR="0" wp14:anchorId="2DA8D421" wp14:editId="40DECE2E">
             <wp:extent cx="5580000" cy="3138750"/>
             <wp:effectExtent l="0" t="0" r="0" b="0"/>
             <wp:docPr id="6" name="Picture 6"/>
@@ -11775,7 +11775,7 @@
         </w:rPr>
         <w:lastRenderedPageBreak/>
         <w:drawing>
-          <wp:inline distT="0" distB="0" distL="0" distR="0" wp14:anchorId="6986F0BF" wp14:editId="78CEB7FC">
+          <wp:inline distT="0" distB="0" distL="0" distR="0" wp14:anchorId="3E988C88" wp14:editId="7D5424BB">
             <wp:extent cx="5580000" cy="3138750"/>
             <wp:effectExtent l="0" t="0" r="0" b="0"/>
             <wp:docPr id="7" name="Picture 7"/>
@@ -11821,7 +11821,7 @@
           <w:color w:val="5D6575"/>
           <w:sz w:val="18"/>
         </w:rPr>
-        <w:t>Figura 7. Reporte de inventario (/api/reporte) con los productos por resurtir.</w:t>
+        <w:t>Figura 7. Reporte de inventario (/api/reporte) con los datos de la Figura 6: totales, productos por resurtir (ACC-002, COM-003 y LAP-002) y datos de cada producto.</w:t>
       </w:r>
     </w:p>
     <w:p>
@@ -13234,7 +13234,7 @@
           <w:noProof/>
         </w:rPr>
         <w:drawing>
-          <wp:inline distT="0" distB="0" distL="0" distR="0" wp14:anchorId="2D752E44" wp14:editId="037CB9F4">
+          <wp:inline distT="0" distB="0" distL="0" distR="0" wp14:anchorId="20120648" wp14:editId="6E87C4CE">
             <wp:extent cx="5580000" cy="3138750"/>
             <wp:effectExtent l="0" t="0" r="0" b="0"/>
             <wp:docPr id="8" name="Picture 8"/>
@@ -13355,7 +13355,7 @@
         <w:t xml:space="preserve">Cierre. </w:t>
       </w:r>
       <w:r>
-        <w:t>Con todo en verde, Emily aprueba el Pull Request y el defecto pasa a Cerrado.</w:t>
+        <w:t>Con todo en verde, Emily revisa el Pull Request, se integra y el defecto pasa a Cerrado.</w:t>
       </w:r>
     </w:p>
     <w:p>
@@ -13625,7 +13625,7 @@
               <w:rPr>
                 <w:sz w:val="19"/>
               </w:rPr>
-              <w:t>Commit 185cafb (rama main)</w:t>
+              <w:t>Commit e00ff60 (rama main)</w:t>
             </w:r>
           </w:p>
         </w:tc>
@@ -13642,7 +13642,7 @@
               <w:rPr>
                 <w:sz w:val="19"/>
               </w:rPr>
-              <w:t>Commit 185cafb (rama main)</w:t>
+              <w:t>Commit e00ff60 (rama main)</w:t>
             </w:r>
           </w:p>
         </w:tc>
@@ -14001,9 +14001,38 @@
     </w:p>
     <w:p>
       <w:pPr>
+        <w:pStyle w:val="Listaconvietas"/>
+      </w:pPr>
+      <w:r>
+        <w:rPr>
+          <w:b/>
+        </w:rPr>
+        <w:t xml:space="preserve">Pull Requests: </w:t>
+      </w:r>
+      <w:hyperlink r:id="rId17">
+        <w:r>
+          <w:rPr>
+            <w:color w:val="1F4E8C"/>
+            <w:u w:val="single"/>
+          </w:rPr>
+          <w:t>https://github.com/azharsonix/sistema-inventario-actividad-2/pulls?q=is%3Apr</w:t>
+        </w:r>
+      </w:hyperlink>
+      <w:r>
+        <w:t xml:space="preserve"> (historial de integraciones hacia develop y main)</w:t>
+      </w:r>
+    </w:p>
+    <w:p>
+      <w:r>
+        <w:t>La protección de ramas se activó el 30 de octubre de 2026. Desde ese día los cambios, incluido este documento, entran por Pull Request.</w:t>
+      </w:r>
+    </w:p>
+    <w:p>
+      <w:pPr>
         <w:pStyle w:val="Ttulo2"/>
       </w:pPr>
       <w:r>
+        <w:lastRenderedPageBreak/>
         <w:t>8.1 Flujo de trabajo</w:t>
       </w:r>
     </w:p>
@@ -14195,7 +14224,7 @@
               <w:rPr>
                 <w:sz w:val="19"/>
               </w:rPr>
-              <w:t>git commit y git push; abre un Pull Request hacia develop o main.</w:t>
+              <w:t>git commit y git push de la rama; se abre un Pull Request hacia develop y, de develop, otro hacia main.</w:t>
             </w:r>
           </w:p>
         </w:tc>
@@ -14369,7 +14398,7 @@
               <w:rPr>
                 <w:sz w:val="19"/>
               </w:rPr>
-              <w:t>Checks en verde; con una revisión aprobada se hace merge.</w:t>
+              <w:t>Con los 7 checks requeridos en verde, GitHub habilita el merge del PR.</w:t>
             </w:r>
           </w:p>
         </w:tc>
@@ -14424,7 +14453,7 @@
               <w:rPr>
                 <w:sz w:val="19"/>
               </w:rPr>
-              <w:t>El PR queda bloqueado; GitHub avisa por correo y el JUnit queda como artefacto.</w:t>
+              <w:t>GitHub bloquea el merge del PR y avisa por correo al autor; el JUnit queda como artefacto.</w:t>
             </w:r>
           </w:p>
         </w:tc>
@@ -14444,9 +14473,8 @@
         <w:rPr>
           <w:noProof/>
         </w:rPr>
-        <w:lastRenderedPageBreak/>
         <w:drawing>
-          <wp:inline distT="0" distB="0" distL="0" distR="0" wp14:anchorId="62F6718C" wp14:editId="236EF2A2">
+          <wp:inline distT="0" distB="0" distL="0" distR="0" wp14:anchorId="69960C11" wp14:editId="3C59E47B">
             <wp:extent cx="5580000" cy="3138750"/>
             <wp:effectExtent l="0" t="0" r="0" b="0"/>
             <wp:docPr id="9" name="Picture 9"/>
@@ -14461,7 +14489,7 @@
                     <pic:cNvPicPr/>
                   </pic:nvPicPr>
                   <pic:blipFill>
-                    <a:blip r:embed="rId17"/>
+                    <a:blip r:embed="rId18"/>
                     <a:stretch>
                       <a:fillRect/>
                     </a:stretch>
@@ -14504,8 +14532,9 @@
         <w:rPr>
           <w:noProof/>
         </w:rPr>
+        <w:lastRenderedPageBreak/>
         <w:drawing>
-          <wp:inline distT="0" distB="0" distL="0" distR="0" wp14:anchorId="725F0478" wp14:editId="423B64B5">
+          <wp:inline distT="0" distB="0" distL="0" distR="0" wp14:anchorId="5F9F29A2" wp14:editId="780D1BB7">
             <wp:extent cx="5580000" cy="3138750"/>
             <wp:effectExtent l="0" t="0" r="0" b="0"/>
             <wp:docPr id="10" name="Picture 10"/>
@@ -14520,7 +14549,7 @@
                     <pic:cNvPicPr/>
                   </pic:nvPicPr>
                   <pic:blipFill>
-                    <a:blip r:embed="rId18"/>
+                    <a:blip r:embed="rId19"/>
                     <a:stretch>
                       <a:fillRect/>
                     </a:stretch>
@@ -14563,9 +14592,8 @@
         <w:rPr>
           <w:noProof/>
         </w:rPr>
-        <w:lastRenderedPageBreak/>
         <w:drawing>
-          <wp:inline distT="0" distB="0" distL="0" distR="0" wp14:anchorId="7B9349FE" wp14:editId="5C8A9819">
+          <wp:inline distT="0" distB="0" distL="0" distR="0" wp14:anchorId="29ED42F4" wp14:editId="0E2E4DB4">
             <wp:extent cx="5580000" cy="3138750"/>
             <wp:effectExtent l="0" t="0" r="0" b="0"/>
             <wp:docPr id="11" name="Picture 11"/>
@@ -14580,7 +14608,7 @@
                     <pic:cNvPicPr/>
                   </pic:nvPicPr>
                   <pic:blipFill>
-                    <a:blip r:embed="rId19"/>
+                    <a:blip r:embed="rId20"/>
                     <a:stretch>
                       <a:fillRect/>
                     </a:stretch>
@@ -14702,6 +14730,13 @@
           <w:sz w:val="17"/>
         </w:rPr>
         <w:br/>
+      </w:r>
+      <w:r>
+        <w:rPr>
+          <w:rFonts w:ascii="Consolas" w:eastAsia="Consolas" w:hAnsi="Consolas"/>
+          <w:sz w:val="17"/>
+        </w:rPr>
+        <w:lastRenderedPageBreak/>
         <w:t xml:space="preserve">    - cron: "0 7 * * *" # 01:00 en Campeche (UTC-6)</w:t>
       </w:r>
       <w:r>
@@ -14741,12 +14776,6 @@
           <w:sz w:val="17"/>
         </w:rPr>
         <w:br/>
-      </w:r>
-      <w:r>
-        <w:rPr>
-          <w:rFonts w:ascii="Consolas" w:eastAsia="Consolas" w:hAnsi="Consolas"/>
-          <w:sz w:val="17"/>
-        </w:rPr>
         <w:t xml:space="preserve">  cancel-in-progress: true</w:t>
       </w:r>
       <w:r>
@@ -14809,6 +14838,12 @@
           <w:sz w:val="17"/>
         </w:rPr>
         <w:br/>
+      </w:r>
+      <w:r>
+        <w:rPr>
+          <w:rFonts w:ascii="Consolas" w:eastAsia="Consolas" w:hAnsi="Consolas"/>
+          <w:sz w:val="17"/>
+        </w:rPr>
         <w:t xml:space="preserve">    runs-on: ubuntu-latest</w:t>
       </w:r>
       <w:r>
@@ -14903,7 +14938,6 @@
           <w:rFonts w:ascii="Consolas" w:eastAsia="Consolas" w:hAnsi="Consolas"/>
           <w:sz w:val="17"/>
         </w:rPr>
-        <w:lastRenderedPageBreak/>
         <w:br/>
         <w:t xml:space="preserve">      - name: CP-01 a CP-04</w:t>
       </w:r>
@@ -14928,12 +14962,6 @@
           <w:sz w:val="17"/>
         </w:rPr>
         <w:br/>
-      </w:r>
-      <w:r>
-        <w:rPr>
-          <w:rFonts w:ascii="Consolas" w:eastAsia="Consolas" w:hAnsi="Consolas"/>
-          <w:sz w:val="17"/>
-        </w:rPr>
         <w:t xml:space="preserve">      - uses: actions/upload-artifact@v4</w:t>
       </w:r>
       <w:r>
@@ -14966,6 +14994,12 @@
           <w:sz w:val="17"/>
         </w:rPr>
         <w:br/>
+      </w:r>
+      <w:r>
+        <w:rPr>
+          <w:rFonts w:ascii="Consolas" w:eastAsia="Consolas" w:hAnsi="Consolas"/>
+          <w:sz w:val="17"/>
+        </w:rPr>
         <w:t xml:space="preserve">          path: evidencias/junit-Unitarias.xml</w:t>
       </w:r>
     </w:p>
@@ -15606,6 +15640,7 @@
         <w:pStyle w:val="Ttulo2"/>
       </w:pPr>
       <w:r>
+        <w:lastRenderedPageBreak/>
         <w:t>8.4 Condiciones para aprobar la integración</w:t>
       </w:r>
     </w:p>
@@ -15702,7 +15737,7 @@
               <w:rPr>
                 <w:sz w:val="19"/>
               </w:rPr>
-              <w:t>Protección de ramas en main y develop: los checks Unitarias, Integración, Sistema, Aceptación y Regresión deben estar en verde.</w:t>
+              <w:t>Protección de ramas activa en main y develop: GitHub no permite el merge si falla alguno de los 7 checks (Unitarias en PHP 8.2, 8.3 y 8.4, Integración, Sistema, Aceptación y Regresión DEF).</w:t>
             </w:r>
           </w:p>
         </w:tc>
@@ -15743,7 +15778,7 @@
               <w:rPr>
                 <w:sz w:val="19"/>
               </w:rPr>
-              <w:t>No se permite push directo; se pide una revisión aprobada (Emily).</w:t>
+              <w:t>No se permite push directo a main ni a develop, tampoco al administrador; todo entra por Pull Request. GitHub no exige una aprobación porque el repositorio está en una sola cuenta; según la matriz RACI, la revisión le corresponde a Emily.</w:t>
             </w:r>
           </w:p>
         </w:tc>
@@ -15905,7 +15940,7 @@
               <w:rPr>
                 <w:sz w:val="19"/>
               </w:rPr>
-              <w:t>Antes de pasar a main se ejecutan los escenarios de aceptación y la regresión nocturna.</w:t>
+              <w:t>El PR de develop hacia main vuelve a ejecutar los 7 checks, incluidos los escenarios de aceptación y la regresión DEF; la suite completa se repite cada noche.</w:t>
             </w:r>
           </w:p>
         </w:tc>
@@ -15936,7 +15971,6 @@
     </w:p>
     <w:p>
       <w:r>
-        <w:lastRenderedPageBreak/>
         <w:t>GitHub Actions ejecuta las pruebas en cada push y Pull Request, en tres versiones de PHP, y bloquea la integración de cualquier cambio que rompa una regla. Como siguiente mejora proponemos sumar al flujo las pruebas de la interfaz con Playwright.</w:t>
       </w:r>
     </w:p>
@@ -16262,6 +16296,7 @@
         <w:pStyle w:val="Ttulo2"/>
       </w:pPr>
       <w:r>
+        <w:lastRenderedPageBreak/>
         <w:t>Referencias</w:t>
       </w:r>
     </w:p>
@@ -16484,31 +16519,31 @@
       </w:rPr>
     </w:lvl>
   </w:abstractNum>
-  <w:num w:numId="1" w16cid:durableId="895091717">
+  <w:num w:numId="1" w16cid:durableId="2133087022">
     <w:abstractNumId w:val="8"/>
   </w:num>
-  <w:num w:numId="2" w16cid:durableId="1918709715">
+  <w:num w:numId="2" w16cid:durableId="1862626413">
     <w:abstractNumId w:val="6"/>
   </w:num>
-  <w:num w:numId="3" w16cid:durableId="197278182">
+  <w:num w:numId="3" w16cid:durableId="915435417">
     <w:abstractNumId w:val="5"/>
   </w:num>
-  <w:num w:numId="4" w16cid:durableId="1547258248">
+  <w:num w:numId="4" w16cid:durableId="664746998">
     <w:abstractNumId w:val="4"/>
   </w:num>
-  <w:num w:numId="5" w16cid:durableId="574902589">
+  <w:num w:numId="5" w16cid:durableId="183634089">
     <w:abstractNumId w:val="7"/>
   </w:num>
-  <w:num w:numId="6" w16cid:durableId="2121954694">
+  <w:num w:numId="6" w16cid:durableId="2140028817">
     <w:abstractNumId w:val="3"/>
   </w:num>
-  <w:num w:numId="7" w16cid:durableId="1128627217">
+  <w:num w:numId="7" w16cid:durableId="1778023176">
     <w:abstractNumId w:val="2"/>
   </w:num>
-  <w:num w:numId="8" w16cid:durableId="1814829048">
+  <w:num w:numId="8" w16cid:durableId="319697523">
     <w:abstractNumId w:val="1"/>
   </w:num>
-  <w:num w:numId="9" w16cid:durableId="1559245953">
+  <w:num w:numId="9" w16cid:durableId="1632516906">
     <w:abstractNumId w:val="0"/>
   </w:num>
 </w:numbering>

</xml_diff>

<commit_message>
docs: corrige incongruencias de la segunda parte (nombres de casos, trazabilidad, frecuencias del CI y evidencia de DEF-01)
</commit_message>
<xml_diff>
--- a/docs/Segunda parte/Actividad 2 - Segunda parte - Documento técnico.docx
+++ b/docs/Segunda parte/Actividad 2 - Segunda parte - Documento técnico.docx
@@ -777,7 +777,7 @@
         <w:t xml:space="preserve">Relación entre requisitos y pruebas: </w:t>
       </w:r>
       <w:r>
-        <w:t>cada requisito tiene al menos un caso de prueba que verifica su cumplimiento; a esta relación se le llama trazabilidad. La matriz indica qué casos cubren cada requisito: todos tienen dos o más.</w:t>
+        <w:t>cada requisito tiene al menos un caso de prueba que verifica su cumplimiento; a esta relación se le llama trazabilidad. La matriz indica qué casos cubren cada requisito: RF-01, RF-02 y RF-03 tienen dos o más; RF-04 y RF-05 tienen uno cada uno.</w:t>
       </w:r>
     </w:p>
     <w:tbl>
@@ -1102,13 +1102,6 @@
                 <w:sz w:val="18"/>
               </w:rPr>
               <w:br/>
-            </w:r>
-            <w:r>
-              <w:rPr>
-                <w:b/>
-                <w:color w:val="FFFFFF"/>
-                <w:sz w:val="18"/>
-              </w:rPr>
               <w:t>10</w:t>
             </w:r>
           </w:p>
@@ -4577,7 +4570,6 @@
         <w:spacing w:after="40"/>
       </w:pPr>
       <w:r>
-        <w:lastRenderedPageBreak/>
         <w:t>Los diez casos planificados se ejecutaron.</w:t>
       </w:r>
     </w:p>
@@ -5071,7 +5063,7 @@
               <w:rPr>
                 <w:sz w:val="20"/>
               </w:rPr>
-              <w:t>CP-02 – Validación de datos (unitaria)</w:t>
+              <w:t>CP-02 – Código duplicado (unitaria)</w:t>
             </w:r>
           </w:p>
         </w:tc>
@@ -5387,7 +5379,6 @@
         <w:pStyle w:val="Ttulo3"/>
       </w:pPr>
       <w:r>
-        <w:lastRenderedPageBreak/>
         <w:t>Caso de prueba CP-03: Venta con existencia suficiente</w:t>
       </w:r>
     </w:p>
@@ -6480,7 +6471,6 @@
         <w:pStyle w:val="Ttulo3"/>
       </w:pPr>
       <w:r>
-        <w:lastRenderedPageBreak/>
         <w:t>Caso de prueba CP-06: Venta rechazada no modifica el archivo</w:t>
       </w:r>
     </w:p>
@@ -6529,7 +6519,7 @@
               <w:rPr>
                 <w:sz w:val="20"/>
               </w:rPr>
-              <w:t>CP-06 – Consistencia de datos (integración)</w:t>
+              <w:t>CP-06 – Archivo sin cambios (integración)</w:t>
             </w:r>
           </w:p>
         </w:tc>
@@ -7573,7 +7563,6 @@
         <w:pStyle w:val="Ttulo3"/>
       </w:pPr>
       <w:r>
-        <w:lastRenderedPageBreak/>
         <w:t>Caso de prueba CP-09: Cierre del día con resurtido</w:t>
       </w:r>
     </w:p>
@@ -7622,7 +7611,7 @@
               <w:rPr>
                 <w:sz w:val="20"/>
               </w:rPr>
-              <w:t>CP-09 – Escenario de la cliente (aceptación)</w:t>
+              <w:t>CP-09 – Cierre del día (aceptación)</w:t>
             </w:r>
           </w:p>
         </w:tc>
@@ -7974,7 +7963,7 @@
               <w:rPr>
                 <w:sz w:val="20"/>
               </w:rPr>
-              <w:t>CP-10 – Escenario de la cliente (aceptación)</w:t>
+              <w:t>CP-10 – Llegada de mercancía (aceptación)</w:t>
             </w:r>
           </w:p>
         </w:tc>
@@ -8290,7 +8279,6 @@
         <w:pStyle w:val="Ttulo1"/>
       </w:pPr>
       <w:r>
-        <w:lastRenderedPageBreak/>
         <w:t>4. Clasificación de los casos de prueba</w:t>
       </w:r>
     </w:p>
@@ -8304,7 +8292,7 @@
           <w:noProof/>
         </w:rPr>
         <w:drawing>
-          <wp:inline distT="0" distB="0" distL="0" distR="0" wp14:anchorId="6E701E02" wp14:editId="5E3C12B5">
+          <wp:inline distT="0" distB="0" distL="0" distR="0" wp14:anchorId="690D4395" wp14:editId="3CE694A1">
             <wp:extent cx="5580000" cy="3138750"/>
             <wp:effectExtent l="0" t="0" r="0" b="0"/>
             <wp:docPr id="1" name="Picture 1"/>
@@ -9023,7 +9011,7 @@
     </w:p>
     <w:p>
       <w:r>
-        <w:t>Registramos la ejecución en una bitácora de pruebas. Las cuatro suites se ejecutaron con scripts/ejecutar-pruebas.php el 30 de octubre de 2026 (Windows NT 10.0, PHP 8.4.27, PHPUnit 11.5.56, versión e00ff60 del repositorio).</w:t>
+        <w:t>Registramos la ejecución en una bitácora de pruebas. Las cuatro suites se ejecutaron con scripts/ejecutar-pruebas.php el 30 de octubre de 2026 (Windows NT 10.0, PHP 8.4.27, PHPUnit 11.5.56, versión 4a0075f del repositorio).</w:t>
       </w:r>
     </w:p>
     <w:p>
@@ -9191,7 +9179,6 @@
                 <w:b/>
                 <w:sz w:val="18"/>
               </w:rPr>
-              <w:lastRenderedPageBreak/>
               <w:t>CP-01</w:t>
             </w:r>
           </w:p>
@@ -10428,9 +10415,8 @@
         <w:rPr>
           <w:noProof/>
         </w:rPr>
-        <w:lastRenderedPageBreak/>
         <w:drawing>
-          <wp:inline distT="0" distB="0" distL="0" distR="0" wp14:anchorId="41A69DD1" wp14:editId="300142A1">
+          <wp:inline distT="0" distB="0" distL="0" distR="0" wp14:anchorId="74E0B4BC" wp14:editId="6B827EBD">
             <wp:extent cx="5580000" cy="3138750"/>
             <wp:effectExtent l="0" t="0" r="0" b="0"/>
             <wp:docPr id="2" name="Picture 2"/>
@@ -10489,7 +10475,7 @@
           <w:noProof/>
         </w:rPr>
         <w:drawing>
-          <wp:inline distT="0" distB="0" distL="0" distR="0" wp14:anchorId="3B65DCF3" wp14:editId="4DDA3489">
+          <wp:inline distT="0" distB="0" distL="0" distR="0" wp14:anchorId="08450EFA" wp14:editId="5C5C391A">
             <wp:extent cx="5580000" cy="3138750"/>
             <wp:effectExtent l="0" t="0" r="0" b="0"/>
             <wp:docPr id="3" name="Picture 3"/>
@@ -10547,9 +10533,8 @@
         <w:rPr>
           <w:noProof/>
         </w:rPr>
-        <w:lastRenderedPageBreak/>
         <w:drawing>
-          <wp:inline distT="0" distB="0" distL="0" distR="0" wp14:anchorId="471E58F1" wp14:editId="7246E1FA">
+          <wp:inline distT="0" distB="0" distL="0" distR="0" wp14:anchorId="590781B2" wp14:editId="10076F0C">
             <wp:extent cx="5580000" cy="3138750"/>
             <wp:effectExtent l="0" t="0" r="0" b="0"/>
             <wp:docPr id="4" name="Picture 4"/>
@@ -11200,7 +11185,7 @@
           <w:noProof/>
         </w:rPr>
         <w:drawing>
-          <wp:inline distT="0" distB="0" distL="0" distR="0" wp14:anchorId="24581827" wp14:editId="62A34C09">
+          <wp:inline distT="0" distB="0" distL="0" distR="0" wp14:anchorId="083BC99F" wp14:editId="78B29D51">
             <wp:extent cx="5580000" cy="3138750"/>
             <wp:effectExtent l="0" t="0" r="0" b="0"/>
             <wp:docPr id="5" name="Picture 5"/>
@@ -11254,7 +11239,6 @@
         <w:rPr>
           <w:b/>
         </w:rPr>
-        <w:lastRenderedPageBreak/>
         <w:t xml:space="preserve">Interpretación. </w:t>
       </w:r>
       <w:r>
@@ -11287,7 +11271,7 @@
           <w:noProof/>
         </w:rPr>
         <w:drawing>
-          <wp:inline distT="0" distB="0" distL="0" distR="0" wp14:anchorId="2DA8D421" wp14:editId="40DECE2E">
+          <wp:inline distT="0" distB="0" distL="0" distR="0" wp14:anchorId="774A3458" wp14:editId="74C700FD">
             <wp:extent cx="5580000" cy="3138750"/>
             <wp:effectExtent l="0" t="0" r="0" b="0"/>
             <wp:docPr id="6" name="Picture 6"/>
@@ -11773,9 +11757,8 @@
         <w:rPr>
           <w:noProof/>
         </w:rPr>
-        <w:lastRenderedPageBreak/>
         <w:drawing>
-          <wp:inline distT="0" distB="0" distL="0" distR="0" wp14:anchorId="3E988C88" wp14:editId="7D5424BB">
+          <wp:inline distT="0" distB="0" distL="0" distR="0" wp14:anchorId="117DCED7" wp14:editId="2274DB5C">
             <wp:extent cx="5580000" cy="3138750"/>
             <wp:effectExtent l="0" t="0" r="0" b="0"/>
             <wp:docPr id="7" name="Picture 7"/>
@@ -11881,7 +11864,6 @@
                 <w:b/>
                 <w:sz w:val="20"/>
               </w:rPr>
-              <w:lastRenderedPageBreak/>
               <w:t>Descripción</w:t>
             </w:r>
           </w:p>
@@ -12267,7 +12249,7 @@
               <w:rPr>
                 <w:sz w:val="20"/>
               </w:rPr>
-              <w:t>Job «Unitarias» en rojo en GitHub Actions y el Pull Request bloqueado.</w:t>
+              <w:t>Jobs «Unitarias», «Integración» y «Sistema» en rojo en GitHub Actions y el Pull Request bloqueado.</w:t>
             </w:r>
           </w:p>
         </w:tc>
@@ -13234,7 +13216,7 @@
           <w:noProof/>
         </w:rPr>
         <w:drawing>
-          <wp:inline distT="0" distB="0" distL="0" distR="0" wp14:anchorId="20120648" wp14:editId="6E87C4CE">
+          <wp:inline distT="0" distB="0" distL="0" distR="0" wp14:anchorId="7810164F" wp14:editId="1C34D641">
             <wp:extent cx="5580000" cy="3138750"/>
             <wp:effectExtent l="0" t="0" r="0" b="0"/>
             <wp:docPr id="8" name="Picture 8"/>
@@ -13380,7 +13362,6 @@
         <w:spacing w:after="40"/>
       </w:pPr>
       <w:r>
-        <w:lastRenderedPageBreak/>
         <w:t>CP-01 y CP-02, para verificar que se siguen registrando productos válidos y rechazando duplicados.</w:t>
       </w:r>
     </w:p>
@@ -13625,7 +13606,7 @@
               <w:rPr>
                 <w:sz w:val="19"/>
               </w:rPr>
-              <w:t>Commit e00ff60 (rama main)</w:t>
+              <w:t>Commit 4a0075f (rama main)</w:t>
             </w:r>
           </w:p>
         </w:tc>
@@ -13642,7 +13623,7 @@
               <w:rPr>
                 <w:sz w:val="19"/>
               </w:rPr>
-              <w:t>Commit e00ff60 (rama main)</w:t>
+              <w:t>Commit 4a0075f (rama main)</w:t>
             </w:r>
           </w:p>
         </w:tc>
@@ -14032,7 +14013,6 @@
         <w:pStyle w:val="Ttulo2"/>
       </w:pPr>
       <w:r>
-        <w:lastRenderedPageBreak/>
         <w:t>8.1 Flujo de trabajo</w:t>
       </w:r>
     </w:p>
@@ -14474,7 +14454,7 @@
           <w:noProof/>
         </w:rPr>
         <w:drawing>
-          <wp:inline distT="0" distB="0" distL="0" distR="0" wp14:anchorId="69960C11" wp14:editId="3C59E47B">
+          <wp:inline distT="0" distB="0" distL="0" distR="0" wp14:anchorId="320C3157" wp14:editId="18CD9326">
             <wp:extent cx="5580000" cy="3138750"/>
             <wp:effectExtent l="0" t="0" r="0" b="0"/>
             <wp:docPr id="9" name="Picture 9"/>
@@ -14532,9 +14512,8 @@
         <w:rPr>
           <w:noProof/>
         </w:rPr>
-        <w:lastRenderedPageBreak/>
         <w:drawing>
-          <wp:inline distT="0" distB="0" distL="0" distR="0" wp14:anchorId="5F9F29A2" wp14:editId="780D1BB7">
+          <wp:inline distT="0" distB="0" distL="0" distR="0" wp14:anchorId="2192E9A8" wp14:editId="1C1A8523">
             <wp:extent cx="5580000" cy="3138750"/>
             <wp:effectExtent l="0" t="0" r="0" b="0"/>
             <wp:docPr id="10" name="Picture 10"/>
@@ -14593,7 +14572,7 @@
           <w:noProof/>
         </w:rPr>
         <w:drawing>
-          <wp:inline distT="0" distB="0" distL="0" distR="0" wp14:anchorId="29ED42F4" wp14:editId="0E2E4DB4">
+          <wp:inline distT="0" distB="0" distL="0" distR="0" wp14:anchorId="40723E8C" wp14:editId="79D6487D">
             <wp:extent cx="5580000" cy="3138750"/>
             <wp:effectExtent l="0" t="0" r="0" b="0"/>
             <wp:docPr id="11" name="Picture 11"/>
@@ -14730,13 +14709,6 @@
           <w:sz w:val="17"/>
         </w:rPr>
         <w:br/>
-      </w:r>
-      <w:r>
-        <w:rPr>
-          <w:rFonts w:ascii="Consolas" w:eastAsia="Consolas" w:hAnsi="Consolas"/>
-          <w:sz w:val="17"/>
-        </w:rPr>
-        <w:lastRenderedPageBreak/>
         <w:t xml:space="preserve">    - cron: "0 7 * * *" # 01:00 en Campeche (UTC-6)</w:t>
       </w:r>
       <w:r>
@@ -15461,7 +15433,7 @@
               <w:rPr>
                 <w:sz w:val="19"/>
               </w:rPr>
-              <w:t>En cada Pull Request a main</w:t>
+              <w:t>En cada push y Pull Request</w:t>
             </w:r>
           </w:p>
         </w:tc>
@@ -15536,7 +15508,7 @@
               <w:rPr>
                 <w:sz w:val="19"/>
               </w:rPr>
-              <w:t>En cada Pull Request</w:t>
+              <w:t>En cada push y Pull Request</w:t>
             </w:r>
           </w:p>
         </w:tc>
@@ -15640,7 +15612,6 @@
         <w:pStyle w:val="Ttulo2"/>
       </w:pPr>
       <w:r>
-        <w:lastRenderedPageBreak/>
         <w:t>8.4 Condiciones para aprobar la integración</w:t>
       </w:r>
     </w:p>
@@ -15961,7 +15932,7 @@
     </w:p>
     <w:p>
       <w:r>
-        <w:t>Escribimos cinco requisitos con criterios verificables, y cada uno quedó cubierto por al menos dos casos. Las diez pruebas están automatizadas en cuatro niveles y la ronda 1 terminó con todas aprobadas.</w:t>
+        <w:t>Escribimos cinco requisitos con criterios verificables, y cada uno quedó cubierto por al menos un caso. Las diez pruebas están automatizadas en cuatro niveles y la ronda 1 terminó con todas aprobadas.</w:t>
       </w:r>
     </w:p>
     <w:p>
@@ -16296,7 +16267,6 @@
         <w:pStyle w:val="Ttulo2"/>
       </w:pPr>
       <w:r>
-        <w:lastRenderedPageBreak/>
         <w:t>Referencias</w:t>
       </w:r>
     </w:p>
@@ -16519,31 +16489,31 @@
       </w:rPr>
     </w:lvl>
   </w:abstractNum>
-  <w:num w:numId="1" w16cid:durableId="2133087022">
+  <w:num w:numId="1" w16cid:durableId="1523057209">
     <w:abstractNumId w:val="8"/>
   </w:num>
-  <w:num w:numId="2" w16cid:durableId="1862626413">
+  <w:num w:numId="2" w16cid:durableId="1870333752">
     <w:abstractNumId w:val="6"/>
   </w:num>
-  <w:num w:numId="3" w16cid:durableId="915435417">
+  <w:num w:numId="3" w16cid:durableId="1319185677">
     <w:abstractNumId w:val="5"/>
   </w:num>
-  <w:num w:numId="4" w16cid:durableId="664746998">
+  <w:num w:numId="4" w16cid:durableId="896553435">
     <w:abstractNumId w:val="4"/>
   </w:num>
-  <w:num w:numId="5" w16cid:durableId="183634089">
+  <w:num w:numId="5" w16cid:durableId="1816489737">
     <w:abstractNumId w:val="7"/>
   </w:num>
-  <w:num w:numId="6" w16cid:durableId="2140028817">
+  <w:num w:numId="6" w16cid:durableId="444271303">
     <w:abstractNumId w:val="3"/>
   </w:num>
-  <w:num w:numId="7" w16cid:durableId="1778023176">
+  <w:num w:numId="7" w16cid:durableId="40323840">
     <w:abstractNumId w:val="2"/>
   </w:num>
-  <w:num w:numId="8" w16cid:durableId="319697523">
+  <w:num w:numId="8" w16cid:durableId="1427730599">
     <w:abstractNumId w:val="1"/>
   </w:num>
-  <w:num w:numId="9" w16cid:durableId="1632516906">
+  <w:num w:numId="9" w16cid:durableId="1751072804">
     <w:abstractNumId w:val="0"/>
   </w:num>
 </w:numbering>

</xml_diff>

<commit_message>
docs: ortografía de la segunda parte (niveles de prueba con acento en recursos)
</commit_message>
<xml_diff>
--- a/docs/Segunda parte/Actividad 2 - Segunda parte - Documento técnico.docx
+++ b/docs/Segunda parte/Actividad 2 - Segunda parte - Documento técnico.docx
@@ -2244,7 +2244,7 @@
               <w:rPr>
                 <w:sz w:val="19"/>
               </w:rPr>
-              <w:t>PHPUnit 11.5.56 con Composer; cuatro suites: Unitarias, Integracion, Sistema y Aceptacion.</w:t>
+              <w:t>PHPUnit 11.5.56 con Composer; cuatro suites, una por nivel: unitarias, de integración, de sistema y de aceptación.</w:t>
             </w:r>
           </w:p>
         </w:tc>
@@ -8292,7 +8292,7 @@
           <w:noProof/>
         </w:rPr>
         <w:drawing>
-          <wp:inline distT="0" distB="0" distL="0" distR="0" wp14:anchorId="7AA9BA04" wp14:editId="5C5220DD">
+          <wp:inline distT="0" distB="0" distL="0" distR="0" wp14:anchorId="660B753A" wp14:editId="609D1772">
             <wp:extent cx="5580000" cy="3138750"/>
             <wp:effectExtent l="0" t="0" r="0" b="0"/>
             <wp:docPr id="1" name="Picture 1"/>
@@ -9011,7 +9011,7 @@
     </w:p>
     <w:p>
       <w:r>
-        <w:t>Registramos la ejecución en una bitácora de pruebas. Las cuatro suites se ejecutaron con scripts/ejecutar-pruebas.php el 30 de octubre de 2026 (Windows NT 10.0, PHP 8.4.27, PHPUnit 11.5.56, versión e61385c del repositorio).</w:t>
+        <w:t>Registramos la ejecución en una bitácora de pruebas. Las cuatro suites se ejecutaron con scripts/ejecutar-pruebas.php el 30 de octubre de 2026 (Windows NT 10.0, PHP 8.4.27, PHPUnit 11.5.56, versión 5068771 del repositorio).</w:t>
       </w:r>
     </w:p>
     <w:p>
@@ -10416,7 +10416,7 @@
           <w:noProof/>
         </w:rPr>
         <w:drawing>
-          <wp:inline distT="0" distB="0" distL="0" distR="0" wp14:anchorId="55C3B066" wp14:editId="4F532B65">
+          <wp:inline distT="0" distB="0" distL="0" distR="0" wp14:anchorId="05996767" wp14:editId="69209EFA">
             <wp:extent cx="5580000" cy="3138750"/>
             <wp:effectExtent l="0" t="0" r="0" b="0"/>
             <wp:docPr id="2" name="Picture 2"/>
@@ -10475,7 +10475,7 @@
           <w:noProof/>
         </w:rPr>
         <w:drawing>
-          <wp:inline distT="0" distB="0" distL="0" distR="0" wp14:anchorId="44B4A293" wp14:editId="60CDB5EB">
+          <wp:inline distT="0" distB="0" distL="0" distR="0" wp14:anchorId="237FBE61" wp14:editId="76B755BE">
             <wp:extent cx="5580000" cy="3138750"/>
             <wp:effectExtent l="0" t="0" r="0" b="0"/>
             <wp:docPr id="3" name="Picture 3"/>
@@ -10534,7 +10534,7 @@
           <w:noProof/>
         </w:rPr>
         <w:drawing>
-          <wp:inline distT="0" distB="0" distL="0" distR="0" wp14:anchorId="4EC8F460" wp14:editId="0E53F852">
+          <wp:inline distT="0" distB="0" distL="0" distR="0" wp14:anchorId="7261574D" wp14:editId="1B5F19CA">
             <wp:extent cx="5580000" cy="3138750"/>
             <wp:effectExtent l="0" t="0" r="0" b="0"/>
             <wp:docPr id="4" name="Picture 4"/>
@@ -11185,7 +11185,7 @@
           <w:noProof/>
         </w:rPr>
         <w:drawing>
-          <wp:inline distT="0" distB="0" distL="0" distR="0" wp14:anchorId="466A156A" wp14:editId="6EC4631D">
+          <wp:inline distT="0" distB="0" distL="0" distR="0" wp14:anchorId="2A6D14C1" wp14:editId="35C1F6B2">
             <wp:extent cx="5580000" cy="3138750"/>
             <wp:effectExtent l="0" t="0" r="0" b="0"/>
             <wp:docPr id="5" name="Picture 5"/>
@@ -11271,7 +11271,7 @@
           <w:noProof/>
         </w:rPr>
         <w:drawing>
-          <wp:inline distT="0" distB="0" distL="0" distR="0" wp14:anchorId="7F1B470B" wp14:editId="54816668">
+          <wp:inline distT="0" distB="0" distL="0" distR="0" wp14:anchorId="6D21E88C" wp14:editId="48E3338D">
             <wp:extent cx="5580000" cy="3138750"/>
             <wp:effectExtent l="0" t="0" r="0" b="0"/>
             <wp:docPr id="6" name="Picture 6"/>
@@ -11758,7 +11758,7 @@
           <w:noProof/>
         </w:rPr>
         <w:drawing>
-          <wp:inline distT="0" distB="0" distL="0" distR="0" wp14:anchorId="034295E7" wp14:editId="2C7D6489">
+          <wp:inline distT="0" distB="0" distL="0" distR="0" wp14:anchorId="4F3D8941" wp14:editId="06C76513">
             <wp:extent cx="5580000" cy="3138750"/>
             <wp:effectExtent l="0" t="0" r="0" b="0"/>
             <wp:docPr id="7" name="Picture 7"/>
@@ -13216,7 +13216,7 @@
           <w:noProof/>
         </w:rPr>
         <w:drawing>
-          <wp:inline distT="0" distB="0" distL="0" distR="0" wp14:anchorId="6186964A" wp14:editId="03408069">
+          <wp:inline distT="0" distB="0" distL="0" distR="0" wp14:anchorId="2A7D30F1" wp14:editId="1FCB5961">
             <wp:extent cx="5580000" cy="3138750"/>
             <wp:effectExtent l="0" t="0" r="0" b="0"/>
             <wp:docPr id="8" name="Picture 8"/>
@@ -13606,7 +13606,7 @@
               <w:rPr>
                 <w:sz w:val="19"/>
               </w:rPr>
-              <w:t>Commit e61385c (rama main)</w:t>
+              <w:t>Commit 5068771 (rama main)</w:t>
             </w:r>
           </w:p>
         </w:tc>
@@ -13623,7 +13623,7 @@
               <w:rPr>
                 <w:sz w:val="19"/>
               </w:rPr>
-              <w:t>Commit e61385c (rama main)</w:t>
+              <w:t>Commit 5068771 (rama main)</w:t>
             </w:r>
           </w:p>
         </w:tc>
@@ -14454,7 +14454,7 @@
           <w:noProof/>
         </w:rPr>
         <w:drawing>
-          <wp:inline distT="0" distB="0" distL="0" distR="0" wp14:anchorId="5C8AE25B" wp14:editId="571AAF53">
+          <wp:inline distT="0" distB="0" distL="0" distR="0" wp14:anchorId="5730B12F" wp14:editId="020A34D7">
             <wp:extent cx="5580000" cy="3138750"/>
             <wp:effectExtent l="0" t="0" r="0" b="0"/>
             <wp:docPr id="9" name="Picture 9"/>
@@ -14513,7 +14513,7 @@
           <w:noProof/>
         </w:rPr>
         <w:drawing>
-          <wp:inline distT="0" distB="0" distL="0" distR="0" wp14:anchorId="35C4F412" wp14:editId="5FD4261C">
+          <wp:inline distT="0" distB="0" distL="0" distR="0" wp14:anchorId="5C99CAA2" wp14:editId="12FFA157">
             <wp:extent cx="5580000" cy="3138750"/>
             <wp:effectExtent l="0" t="0" r="0" b="0"/>
             <wp:docPr id="10" name="Picture 10"/>
@@ -14572,7 +14572,7 @@
           <w:noProof/>
         </w:rPr>
         <w:drawing>
-          <wp:inline distT="0" distB="0" distL="0" distR="0" wp14:anchorId="68C6FCA0" wp14:editId="34D67B04">
+          <wp:inline distT="0" distB="0" distL="0" distR="0" wp14:anchorId="73DD5414" wp14:editId="0CEF7C6E">
             <wp:extent cx="5580000" cy="3138750"/>
             <wp:effectExtent l="0" t="0" r="0" b="0"/>
             <wp:docPr id="11" name="Picture 11"/>
@@ -16489,31 +16489,31 @@
       </w:rPr>
     </w:lvl>
   </w:abstractNum>
-  <w:num w:numId="1" w16cid:durableId="1068839628">
+  <w:num w:numId="1" w16cid:durableId="113866692">
     <w:abstractNumId w:val="8"/>
   </w:num>
-  <w:num w:numId="2" w16cid:durableId="1929382675">
+  <w:num w:numId="2" w16cid:durableId="992173121">
     <w:abstractNumId w:val="6"/>
   </w:num>
-  <w:num w:numId="3" w16cid:durableId="981158317">
+  <w:num w:numId="3" w16cid:durableId="2004893293">
     <w:abstractNumId w:val="5"/>
   </w:num>
-  <w:num w:numId="4" w16cid:durableId="205071592">
+  <w:num w:numId="4" w16cid:durableId="1229459788">
     <w:abstractNumId w:val="4"/>
   </w:num>
-  <w:num w:numId="5" w16cid:durableId="850947445">
+  <w:num w:numId="5" w16cid:durableId="753169254">
     <w:abstractNumId w:val="7"/>
   </w:num>
-  <w:num w:numId="6" w16cid:durableId="672146770">
+  <w:num w:numId="6" w16cid:durableId="456678761">
     <w:abstractNumId w:val="3"/>
   </w:num>
-  <w:num w:numId="7" w16cid:durableId="765424126">
+  <w:num w:numId="7" w16cid:durableId="1818108997">
     <w:abstractNumId w:val="2"/>
   </w:num>
-  <w:num w:numId="8" w16cid:durableId="1927306250">
+  <w:num w:numId="8" w16cid:durableId="2080250563">
     <w:abstractNumId w:val="1"/>
   </w:num>
-  <w:num w:numId="9" w16cid:durableId="1999962174">
+  <w:num w:numId="9" w16cid:durableId="1913276362">
     <w:abstractNumId w:val="0"/>
   </w:num>
 </w:numbering>

</xml_diff>

<commit_message>
docs: segunda parte con 13 casos, gráficas de cobertura, niveles y tiempos, y capturas del sistema en ejecución
</commit_message>
<xml_diff>
--- a/docs/Segunda parte/Actividad 2 - Segunda parte - Documento técnico.docx
+++ b/docs/Segunda parte/Actividad 2 - Segunda parte - Documento técnico.docx
@@ -170,7 +170,7 @@
         <w:rPr>
           <w:sz w:val="21"/>
         </w:rPr>
-        <w:t>San Francisco de Campeche, Campeche · 30 de octubre de 2026</w:t>
+        <w:t>San Francisco de Campeche, Campeche · 31 de octubre de 2026</w:t>
       </w:r>
     </w:p>
     <w:p>
@@ -194,7 +194,7 @@
     </w:p>
     <w:p>
       <w:r>
-        <w:t>Trabajamos sobre el sistema que el equipo ya tiene (PHP 8, API JSON y archivo de datos JSON). Escribimos cinco requisitos funcionales, el plan de pruebas, diez casos clasificados por nivel, la bitácora con el porcentaje de aprobación, dos defectos documentados, la propuesta para repetir las pruebas al corregirlos y el flujo de integración continua en GitHub Actions.</w:t>
+        <w:t>Trabajamos sobre el sistema que el equipo ya tiene (PHP 8, API JSON y archivo de datos JSON). Escribimos cinco requisitos funcionales, el plan de pruebas, trece casos clasificados por nivel, la bitácora con el porcentaje de aprobación, dos defectos documentados, la propuesta para repetir las pruebas al corregirlos y el flujo de integración continua en GitHub Actions.</w:t>
       </w:r>
     </w:p>
     <w:p>
@@ -259,7 +259,7 @@
         <w:t xml:space="preserve">Diagramas editables: </w:t>
       </w:r>
       <w:r>
-        <w:t>Diagramas - Segunda parte.pptx (niveles, matriz RACI, trazabilidad, gráfica de aprobación, ciclo de re-pruebas y flujos de CI)</w:t>
+        <w:t>Diagramas - Segunda parte.pptx (niveles, matriz RACI, trazabilidad, ciclo de re-pruebas, flujos de CI y las gráficas de aprobación, cobertura, casos por nivel y tiempos)</w:t>
       </w:r>
     </w:p>
     <w:p>
@@ -777,7 +777,7 @@
         <w:t xml:space="preserve">Relación entre requisitos y pruebas: </w:t>
       </w:r>
       <w:r>
-        <w:t>cada requisito tiene al menos un caso de prueba que verifica su cumplimiento; a esta relación se le llama trazabilidad. La matriz indica qué casos cubren cada requisito: RF-01, RF-02 y RF-03 tienen dos o más; RF-04 y RF-05 tienen uno cada uno.</w:t>
+        <w:t>cada requisito tiene al menos un caso de prueba que verifica su cumplimiento; a esta relación se le llama trazabilidad. La matriz indica qué casos cubren cada requisito: RF-01 y RF-02 tienen cuatro, RF-03 seis, RF-04 dos y RF-05 uno (Figura 1).</w:t>
       </w:r>
     </w:p>
     <w:tbl>
@@ -788,17 +788,20 @@
         <w:tblLook w:val="04A0" w:firstRow="1" w:lastRow="0" w:firstColumn="1" w:lastColumn="0" w:noHBand="0" w:noVBand="1"/>
       </w:tblPr>
       <w:tblGrid>
-        <w:gridCol w:w="886"/>
-        <w:gridCol w:w="886"/>
-        <w:gridCol w:w="886"/>
-        <w:gridCol w:w="886"/>
-        <w:gridCol w:w="886"/>
-        <w:gridCol w:w="886"/>
-        <w:gridCol w:w="886"/>
-        <w:gridCol w:w="886"/>
-        <w:gridCol w:w="886"/>
-        <w:gridCol w:w="886"/>
-        <w:gridCol w:w="886"/>
+        <w:gridCol w:w="696"/>
+        <w:gridCol w:w="696"/>
+        <w:gridCol w:w="696"/>
+        <w:gridCol w:w="696"/>
+        <w:gridCol w:w="696"/>
+        <w:gridCol w:w="696"/>
+        <w:gridCol w:w="696"/>
+        <w:gridCol w:w="696"/>
+        <w:gridCol w:w="696"/>
+        <w:gridCol w:w="696"/>
+        <w:gridCol w:w="696"/>
+        <w:gridCol w:w="696"/>
+        <w:gridCol w:w="696"/>
+        <w:gridCol w:w="696"/>
       </w:tblGrid>
       <w:tr>
         <w:trPr>
@@ -808,7 +811,7 @@
         </w:trPr>
         <w:tc>
           <w:tcPr>
-            <w:tcW w:w="886" w:type="dxa"/>
+            <w:tcW w:w="696" w:type="dxa"/>
             <w:shd w:val="clear" w:color="auto" w:fill="1F4E8C"/>
           </w:tcPr>
           <w:p>
@@ -828,7 +831,7 @@
         </w:tc>
         <w:tc>
           <w:tcPr>
-            <w:tcW w:w="886" w:type="dxa"/>
+            <w:tcW w:w="696" w:type="dxa"/>
             <w:shd w:val="clear" w:color="auto" w:fill="1F4E8C"/>
           </w:tcPr>
           <w:p>
@@ -856,7 +859,7 @@
         </w:tc>
         <w:tc>
           <w:tcPr>
-            <w:tcW w:w="886" w:type="dxa"/>
+            <w:tcW w:w="696" w:type="dxa"/>
             <w:shd w:val="clear" w:color="auto" w:fill="1F4E8C"/>
           </w:tcPr>
           <w:p>
@@ -884,7 +887,7 @@
         </w:tc>
         <w:tc>
           <w:tcPr>
-            <w:tcW w:w="886" w:type="dxa"/>
+            <w:tcW w:w="696" w:type="dxa"/>
             <w:shd w:val="clear" w:color="auto" w:fill="1F4E8C"/>
           </w:tcPr>
           <w:p>
@@ -912,7 +915,7 @@
         </w:tc>
         <w:tc>
           <w:tcPr>
-            <w:tcW w:w="886" w:type="dxa"/>
+            <w:tcW w:w="696" w:type="dxa"/>
             <w:shd w:val="clear" w:color="auto" w:fill="1F4E8C"/>
           </w:tcPr>
           <w:p>
@@ -940,7 +943,7 @@
         </w:tc>
         <w:tc>
           <w:tcPr>
-            <w:tcW w:w="886" w:type="dxa"/>
+            <w:tcW w:w="696" w:type="dxa"/>
             <w:shd w:val="clear" w:color="auto" w:fill="1F4E8C"/>
           </w:tcPr>
           <w:p>
@@ -968,7 +971,7 @@
         </w:tc>
         <w:tc>
           <w:tcPr>
-            <w:tcW w:w="886" w:type="dxa"/>
+            <w:tcW w:w="696" w:type="dxa"/>
             <w:shd w:val="clear" w:color="auto" w:fill="1F4E8C"/>
           </w:tcPr>
           <w:p>
@@ -996,7 +999,7 @@
         </w:tc>
         <w:tc>
           <w:tcPr>
-            <w:tcW w:w="886" w:type="dxa"/>
+            <w:tcW w:w="696" w:type="dxa"/>
             <w:shd w:val="clear" w:color="auto" w:fill="1F4E8C"/>
           </w:tcPr>
           <w:p>
@@ -1024,7 +1027,7 @@
         </w:tc>
         <w:tc>
           <w:tcPr>
-            <w:tcW w:w="886" w:type="dxa"/>
+            <w:tcW w:w="696" w:type="dxa"/>
             <w:shd w:val="clear" w:color="auto" w:fill="1F4E8C"/>
           </w:tcPr>
           <w:p>
@@ -1052,7 +1055,7 @@
         </w:tc>
         <w:tc>
           <w:tcPr>
-            <w:tcW w:w="886" w:type="dxa"/>
+            <w:tcW w:w="696" w:type="dxa"/>
             <w:shd w:val="clear" w:color="auto" w:fill="1F4E8C"/>
           </w:tcPr>
           <w:p>
@@ -1080,7 +1083,7 @@
         </w:tc>
         <w:tc>
           <w:tcPr>
-            <w:tcW w:w="886" w:type="dxa"/>
+            <w:tcW w:w="696" w:type="dxa"/>
             <w:shd w:val="clear" w:color="auto" w:fill="1F4E8C"/>
           </w:tcPr>
           <w:p>
@@ -1103,6 +1106,90 @@
               </w:rPr>
               <w:br/>
               <w:t>10</w:t>
+            </w:r>
+          </w:p>
+        </w:tc>
+        <w:tc>
+          <w:tcPr>
+            <w:tcW w:w="696" w:type="dxa"/>
+            <w:shd w:val="clear" w:color="auto" w:fill="1F4E8C"/>
+          </w:tcPr>
+          <w:p>
+            <w:pPr>
+              <w:keepNext/>
+            </w:pPr>
+            <w:r>
+              <w:rPr>
+                <w:b/>
+                <w:color w:val="FFFFFF"/>
+                <w:sz w:val="18"/>
+              </w:rPr>
+              <w:t>CP</w:t>
+            </w:r>
+            <w:r>
+              <w:rPr>
+                <w:b/>
+                <w:color w:val="FFFFFF"/>
+                <w:sz w:val="18"/>
+              </w:rPr>
+              <w:br/>
+              <w:t>11</w:t>
+            </w:r>
+          </w:p>
+        </w:tc>
+        <w:tc>
+          <w:tcPr>
+            <w:tcW w:w="696" w:type="dxa"/>
+            <w:shd w:val="clear" w:color="auto" w:fill="1F4E8C"/>
+          </w:tcPr>
+          <w:p>
+            <w:pPr>
+              <w:keepNext/>
+            </w:pPr>
+            <w:r>
+              <w:rPr>
+                <w:b/>
+                <w:color w:val="FFFFFF"/>
+                <w:sz w:val="18"/>
+              </w:rPr>
+              <w:t>CP</w:t>
+            </w:r>
+            <w:r>
+              <w:rPr>
+                <w:b/>
+                <w:color w:val="FFFFFF"/>
+                <w:sz w:val="18"/>
+              </w:rPr>
+              <w:br/>
+              <w:t>12</w:t>
+            </w:r>
+          </w:p>
+        </w:tc>
+        <w:tc>
+          <w:tcPr>
+            <w:tcW w:w="696" w:type="dxa"/>
+            <w:shd w:val="clear" w:color="auto" w:fill="1F4E8C"/>
+          </w:tcPr>
+          <w:p>
+            <w:pPr>
+              <w:keepNext/>
+            </w:pPr>
+            <w:r>
+              <w:rPr>
+                <w:b/>
+                <w:color w:val="FFFFFF"/>
+                <w:sz w:val="18"/>
+              </w:rPr>
+              <w:t>CP</w:t>
+            </w:r>
+            <w:r>
+              <w:rPr>
+                <w:b/>
+                <w:color w:val="FFFFFF"/>
+                <w:sz w:val="18"/>
+              </w:rPr>
+              <w:br/>
+              <w:t>13</w:t>
             </w:r>
           </w:p>
         </w:tc>
@@ -1114,7 +1201,7 @@
         </w:trPr>
         <w:tc>
           <w:tcPr>
-            <w:tcW w:w="886" w:type="dxa"/>
+            <w:tcW w:w="696" w:type="dxa"/>
           </w:tcPr>
           <w:p>
             <w:pPr>
@@ -1132,7 +1219,7 @@
         </w:tc>
         <w:tc>
           <w:tcPr>
-            <w:tcW w:w="886" w:type="dxa"/>
+            <w:tcW w:w="696" w:type="dxa"/>
           </w:tcPr>
           <w:p>
             <w:pPr>
@@ -1150,7 +1237,7 @@
         </w:tc>
         <w:tc>
           <w:tcPr>
-            <w:tcW w:w="886" w:type="dxa"/>
+            <w:tcW w:w="696" w:type="dxa"/>
           </w:tcPr>
           <w:p>
             <w:pPr>
@@ -1168,7 +1255,7 @@
         </w:tc>
         <w:tc>
           <w:tcPr>
-            <w:tcW w:w="886" w:type="dxa"/>
+            <w:tcW w:w="696" w:type="dxa"/>
           </w:tcPr>
           <w:p>
             <w:pPr>
@@ -1180,7 +1267,7 @@
         </w:tc>
         <w:tc>
           <w:tcPr>
-            <w:tcW w:w="886" w:type="dxa"/>
+            <w:tcW w:w="696" w:type="dxa"/>
           </w:tcPr>
           <w:p>
             <w:pPr>
@@ -1192,7 +1279,7 @@
         </w:tc>
         <w:tc>
           <w:tcPr>
-            <w:tcW w:w="886" w:type="dxa"/>
+            <w:tcW w:w="696" w:type="dxa"/>
           </w:tcPr>
           <w:p>
             <w:pPr>
@@ -1204,7 +1291,7 @@
         </w:tc>
         <w:tc>
           <w:tcPr>
-            <w:tcW w:w="886" w:type="dxa"/>
+            <w:tcW w:w="696" w:type="dxa"/>
           </w:tcPr>
           <w:p>
             <w:pPr>
@@ -1216,7 +1303,7 @@
         </w:tc>
         <w:tc>
           <w:tcPr>
-            <w:tcW w:w="886" w:type="dxa"/>
+            <w:tcW w:w="696" w:type="dxa"/>
           </w:tcPr>
           <w:p>
             <w:pPr>
@@ -1234,7 +1321,7 @@
         </w:tc>
         <w:tc>
           <w:tcPr>
-            <w:tcW w:w="886" w:type="dxa"/>
+            <w:tcW w:w="696" w:type="dxa"/>
           </w:tcPr>
           <w:p>
             <w:pPr>
@@ -1246,7 +1333,7 @@
         </w:tc>
         <w:tc>
           <w:tcPr>
-            <w:tcW w:w="886" w:type="dxa"/>
+            <w:tcW w:w="696" w:type="dxa"/>
           </w:tcPr>
           <w:p>
             <w:pPr>
@@ -1258,7 +1345,49 @@
         </w:tc>
         <w:tc>
           <w:tcPr>
-            <w:tcW w:w="886" w:type="dxa"/>
+            <w:tcW w:w="696" w:type="dxa"/>
+          </w:tcPr>
+          <w:p>
+            <w:pPr>
+              <w:keepNext/>
+              <w:spacing w:after="20"/>
+              <w:jc w:val="center"/>
+            </w:pPr>
+          </w:p>
+        </w:tc>
+        <w:tc>
+          <w:tcPr>
+            <w:tcW w:w="696" w:type="dxa"/>
+          </w:tcPr>
+          <w:p>
+            <w:pPr>
+              <w:keepNext/>
+              <w:spacing w:after="20"/>
+              <w:jc w:val="center"/>
+            </w:pPr>
+          </w:p>
+        </w:tc>
+        <w:tc>
+          <w:tcPr>
+            <w:tcW w:w="696" w:type="dxa"/>
+          </w:tcPr>
+          <w:p>
+            <w:pPr>
+              <w:keepNext/>
+              <w:spacing w:after="20"/>
+              <w:jc w:val="center"/>
+            </w:pPr>
+            <w:r>
+              <w:rPr>
+                <w:sz w:val="18"/>
+              </w:rPr>
+              <w:t>✔</w:t>
+            </w:r>
+          </w:p>
+        </w:tc>
+        <w:tc>
+          <w:tcPr>
+            <w:tcW w:w="696" w:type="dxa"/>
           </w:tcPr>
           <w:p>
             <w:pPr>
@@ -1276,7 +1405,7 @@
         </w:trPr>
         <w:tc>
           <w:tcPr>
-            <w:tcW w:w="886" w:type="dxa"/>
+            <w:tcW w:w="696" w:type="dxa"/>
           </w:tcPr>
           <w:p>
             <w:pPr>
@@ -1294,7 +1423,7 @@
         </w:tc>
         <w:tc>
           <w:tcPr>
-            <w:tcW w:w="886" w:type="dxa"/>
+            <w:tcW w:w="696" w:type="dxa"/>
           </w:tcPr>
           <w:p>
             <w:pPr>
@@ -1306,7 +1435,7 @@
         </w:tc>
         <w:tc>
           <w:tcPr>
-            <w:tcW w:w="886" w:type="dxa"/>
+            <w:tcW w:w="696" w:type="dxa"/>
           </w:tcPr>
           <w:p>
             <w:pPr>
@@ -1318,7 +1447,7 @@
         </w:tc>
         <w:tc>
           <w:tcPr>
-            <w:tcW w:w="886" w:type="dxa"/>
+            <w:tcW w:w="696" w:type="dxa"/>
           </w:tcPr>
           <w:p>
             <w:pPr>
@@ -1330,7 +1459,7 @@
         </w:tc>
         <w:tc>
           <w:tcPr>
-            <w:tcW w:w="886" w:type="dxa"/>
+            <w:tcW w:w="696" w:type="dxa"/>
           </w:tcPr>
           <w:p>
             <w:pPr>
@@ -1342,7 +1471,7 @@
         </w:tc>
         <w:tc>
           <w:tcPr>
-            <w:tcW w:w="886" w:type="dxa"/>
+            <w:tcW w:w="696" w:type="dxa"/>
           </w:tcPr>
           <w:p>
             <w:pPr>
@@ -1360,7 +1489,7 @@
         </w:tc>
         <w:tc>
           <w:tcPr>
-            <w:tcW w:w="886" w:type="dxa"/>
+            <w:tcW w:w="696" w:type="dxa"/>
           </w:tcPr>
           <w:p>
             <w:pPr>
@@ -1372,7 +1501,7 @@
         </w:tc>
         <w:tc>
           <w:tcPr>
-            <w:tcW w:w="886" w:type="dxa"/>
+            <w:tcW w:w="696" w:type="dxa"/>
           </w:tcPr>
           <w:p>
             <w:pPr>
@@ -1390,7 +1519,7 @@
         </w:tc>
         <w:tc>
           <w:tcPr>
-            <w:tcW w:w="886" w:type="dxa"/>
+            <w:tcW w:w="696" w:type="dxa"/>
           </w:tcPr>
           <w:p>
             <w:pPr>
@@ -1402,7 +1531,7 @@
         </w:tc>
         <w:tc>
           <w:tcPr>
-            <w:tcW w:w="886" w:type="dxa"/>
+            <w:tcW w:w="696" w:type="dxa"/>
           </w:tcPr>
           <w:p>
             <w:pPr>
@@ -1414,7 +1543,7 @@
         </w:tc>
         <w:tc>
           <w:tcPr>
-            <w:tcW w:w="886" w:type="dxa"/>
+            <w:tcW w:w="696" w:type="dxa"/>
           </w:tcPr>
           <w:p>
             <w:pPr>
@@ -1428,6 +1557,48 @@
               </w:rPr>
               <w:t>✔</w:t>
             </w:r>
+          </w:p>
+        </w:tc>
+        <w:tc>
+          <w:tcPr>
+            <w:tcW w:w="696" w:type="dxa"/>
+          </w:tcPr>
+          <w:p>
+            <w:pPr>
+              <w:keepNext/>
+              <w:spacing w:after="20"/>
+              <w:jc w:val="center"/>
+            </w:pPr>
+            <w:r>
+              <w:rPr>
+                <w:sz w:val="18"/>
+              </w:rPr>
+              <w:t>✔</w:t>
+            </w:r>
+          </w:p>
+        </w:tc>
+        <w:tc>
+          <w:tcPr>
+            <w:tcW w:w="696" w:type="dxa"/>
+          </w:tcPr>
+          <w:p>
+            <w:pPr>
+              <w:keepNext/>
+              <w:spacing w:after="20"/>
+              <w:jc w:val="center"/>
+            </w:pPr>
+          </w:p>
+        </w:tc>
+        <w:tc>
+          <w:tcPr>
+            <w:tcW w:w="696" w:type="dxa"/>
+          </w:tcPr>
+          <w:p>
+            <w:pPr>
+              <w:keepNext/>
+              <w:spacing w:after="20"/>
+              <w:jc w:val="center"/>
+            </w:pPr>
           </w:p>
         </w:tc>
       </w:tr>
@@ -1438,7 +1609,7 @@
         </w:trPr>
         <w:tc>
           <w:tcPr>
-            <w:tcW w:w="886" w:type="dxa"/>
+            <w:tcW w:w="696" w:type="dxa"/>
           </w:tcPr>
           <w:p>
             <w:pPr>
@@ -1456,7 +1627,7 @@
         </w:tc>
         <w:tc>
           <w:tcPr>
-            <w:tcW w:w="886" w:type="dxa"/>
+            <w:tcW w:w="696" w:type="dxa"/>
           </w:tcPr>
           <w:p>
             <w:pPr>
@@ -1468,7 +1639,7 @@
         </w:tc>
         <w:tc>
           <w:tcPr>
-            <w:tcW w:w="886" w:type="dxa"/>
+            <w:tcW w:w="696" w:type="dxa"/>
           </w:tcPr>
           <w:p>
             <w:pPr>
@@ -1480,7 +1651,7 @@
         </w:tc>
         <w:tc>
           <w:tcPr>
-            <w:tcW w:w="886" w:type="dxa"/>
+            <w:tcW w:w="696" w:type="dxa"/>
           </w:tcPr>
           <w:p>
             <w:pPr>
@@ -1498,7 +1669,7 @@
         </w:tc>
         <w:tc>
           <w:tcPr>
-            <w:tcW w:w="886" w:type="dxa"/>
+            <w:tcW w:w="696" w:type="dxa"/>
           </w:tcPr>
           <w:p>
             <w:pPr>
@@ -1516,7 +1687,7 @@
         </w:tc>
         <w:tc>
           <w:tcPr>
-            <w:tcW w:w="886" w:type="dxa"/>
+            <w:tcW w:w="696" w:type="dxa"/>
           </w:tcPr>
           <w:p>
             <w:pPr>
@@ -1534,7 +1705,7 @@
         </w:tc>
         <w:tc>
           <w:tcPr>
-            <w:tcW w:w="886" w:type="dxa"/>
+            <w:tcW w:w="696" w:type="dxa"/>
           </w:tcPr>
           <w:p>
             <w:pPr>
@@ -1552,7 +1723,7 @@
         </w:tc>
         <w:tc>
           <w:tcPr>
-            <w:tcW w:w="886" w:type="dxa"/>
+            <w:tcW w:w="696" w:type="dxa"/>
           </w:tcPr>
           <w:p>
             <w:pPr>
@@ -1570,7 +1741,7 @@
         </w:tc>
         <w:tc>
           <w:tcPr>
-            <w:tcW w:w="886" w:type="dxa"/>
+            <w:tcW w:w="696" w:type="dxa"/>
           </w:tcPr>
           <w:p>
             <w:pPr>
@@ -1588,7 +1759,7 @@
         </w:tc>
         <w:tc>
           <w:tcPr>
-            <w:tcW w:w="886" w:type="dxa"/>
+            <w:tcW w:w="696" w:type="dxa"/>
           </w:tcPr>
           <w:p>
             <w:pPr>
@@ -1600,7 +1771,43 @@
         </w:tc>
         <w:tc>
           <w:tcPr>
-            <w:tcW w:w="886" w:type="dxa"/>
+            <w:tcW w:w="696" w:type="dxa"/>
+          </w:tcPr>
+          <w:p>
+            <w:pPr>
+              <w:keepNext/>
+              <w:spacing w:after="20"/>
+              <w:jc w:val="center"/>
+            </w:pPr>
+          </w:p>
+        </w:tc>
+        <w:tc>
+          <w:tcPr>
+            <w:tcW w:w="696" w:type="dxa"/>
+          </w:tcPr>
+          <w:p>
+            <w:pPr>
+              <w:keepNext/>
+              <w:spacing w:after="20"/>
+              <w:jc w:val="center"/>
+            </w:pPr>
+          </w:p>
+        </w:tc>
+        <w:tc>
+          <w:tcPr>
+            <w:tcW w:w="696" w:type="dxa"/>
+          </w:tcPr>
+          <w:p>
+            <w:pPr>
+              <w:keepNext/>
+              <w:spacing w:after="20"/>
+              <w:jc w:val="center"/>
+            </w:pPr>
+          </w:p>
+        </w:tc>
+        <w:tc>
+          <w:tcPr>
+            <w:tcW w:w="696" w:type="dxa"/>
           </w:tcPr>
           <w:p>
             <w:pPr>
@@ -1618,7 +1825,7 @@
         </w:trPr>
         <w:tc>
           <w:tcPr>
-            <w:tcW w:w="886" w:type="dxa"/>
+            <w:tcW w:w="696" w:type="dxa"/>
           </w:tcPr>
           <w:p>
             <w:pPr>
@@ -1636,7 +1843,7 @@
         </w:tc>
         <w:tc>
           <w:tcPr>
-            <w:tcW w:w="886" w:type="dxa"/>
+            <w:tcW w:w="696" w:type="dxa"/>
           </w:tcPr>
           <w:p>
             <w:pPr>
@@ -1648,7 +1855,7 @@
         </w:tc>
         <w:tc>
           <w:tcPr>
-            <w:tcW w:w="886" w:type="dxa"/>
+            <w:tcW w:w="696" w:type="dxa"/>
           </w:tcPr>
           <w:p>
             <w:pPr>
@@ -1660,7 +1867,7 @@
         </w:tc>
         <w:tc>
           <w:tcPr>
-            <w:tcW w:w="886" w:type="dxa"/>
+            <w:tcW w:w="696" w:type="dxa"/>
           </w:tcPr>
           <w:p>
             <w:pPr>
@@ -1672,7 +1879,7 @@
         </w:tc>
         <w:tc>
           <w:tcPr>
-            <w:tcW w:w="886" w:type="dxa"/>
+            <w:tcW w:w="696" w:type="dxa"/>
           </w:tcPr>
           <w:p>
             <w:pPr>
@@ -1684,7 +1891,7 @@
         </w:tc>
         <w:tc>
           <w:tcPr>
-            <w:tcW w:w="886" w:type="dxa"/>
+            <w:tcW w:w="696" w:type="dxa"/>
           </w:tcPr>
           <w:p>
             <w:pPr>
@@ -1696,7 +1903,7 @@
         </w:tc>
         <w:tc>
           <w:tcPr>
-            <w:tcW w:w="886" w:type="dxa"/>
+            <w:tcW w:w="696" w:type="dxa"/>
           </w:tcPr>
           <w:p>
             <w:pPr>
@@ -1708,7 +1915,7 @@
         </w:tc>
         <w:tc>
           <w:tcPr>
-            <w:tcW w:w="886" w:type="dxa"/>
+            <w:tcW w:w="696" w:type="dxa"/>
           </w:tcPr>
           <w:p>
             <w:pPr>
@@ -1720,7 +1927,7 @@
         </w:tc>
         <w:tc>
           <w:tcPr>
-            <w:tcW w:w="886" w:type="dxa"/>
+            <w:tcW w:w="696" w:type="dxa"/>
           </w:tcPr>
           <w:p>
             <w:pPr>
@@ -1732,7 +1939,7 @@
         </w:tc>
         <w:tc>
           <w:tcPr>
-            <w:tcW w:w="886" w:type="dxa"/>
+            <w:tcW w:w="696" w:type="dxa"/>
           </w:tcPr>
           <w:p>
             <w:pPr>
@@ -1744,7 +1951,49 @@
         </w:tc>
         <w:tc>
           <w:tcPr>
-            <w:tcW w:w="886" w:type="dxa"/>
+            <w:tcW w:w="696" w:type="dxa"/>
+          </w:tcPr>
+          <w:p>
+            <w:pPr>
+              <w:keepNext/>
+              <w:spacing w:after="20"/>
+              <w:jc w:val="center"/>
+            </w:pPr>
+            <w:r>
+              <w:rPr>
+                <w:sz w:val="18"/>
+              </w:rPr>
+              <w:t>✔</w:t>
+            </w:r>
+          </w:p>
+        </w:tc>
+        <w:tc>
+          <w:tcPr>
+            <w:tcW w:w="696" w:type="dxa"/>
+          </w:tcPr>
+          <w:p>
+            <w:pPr>
+              <w:keepNext/>
+              <w:spacing w:after="20"/>
+              <w:jc w:val="center"/>
+            </w:pPr>
+          </w:p>
+        </w:tc>
+        <w:tc>
+          <w:tcPr>
+            <w:tcW w:w="696" w:type="dxa"/>
+          </w:tcPr>
+          <w:p>
+            <w:pPr>
+              <w:keepNext/>
+              <w:spacing w:after="20"/>
+              <w:jc w:val="center"/>
+            </w:pPr>
+          </w:p>
+        </w:tc>
+        <w:tc>
+          <w:tcPr>
+            <w:tcW w:w="696" w:type="dxa"/>
           </w:tcPr>
           <w:p>
             <w:pPr>
@@ -1768,7 +2017,7 @@
         </w:trPr>
         <w:tc>
           <w:tcPr>
-            <w:tcW w:w="886" w:type="dxa"/>
+            <w:tcW w:w="696" w:type="dxa"/>
           </w:tcPr>
           <w:p>
             <w:pPr>
@@ -1785,7 +2034,7 @@
         </w:tc>
         <w:tc>
           <w:tcPr>
-            <w:tcW w:w="886" w:type="dxa"/>
+            <w:tcW w:w="696" w:type="dxa"/>
           </w:tcPr>
           <w:p>
             <w:pPr>
@@ -1796,7 +2045,7 @@
         </w:tc>
         <w:tc>
           <w:tcPr>
-            <w:tcW w:w="886" w:type="dxa"/>
+            <w:tcW w:w="696" w:type="dxa"/>
           </w:tcPr>
           <w:p>
             <w:pPr>
@@ -1807,7 +2056,7 @@
         </w:tc>
         <w:tc>
           <w:tcPr>
-            <w:tcW w:w="886" w:type="dxa"/>
+            <w:tcW w:w="696" w:type="dxa"/>
           </w:tcPr>
           <w:p>
             <w:pPr>
@@ -1818,7 +2067,7 @@
         </w:tc>
         <w:tc>
           <w:tcPr>
-            <w:tcW w:w="886" w:type="dxa"/>
+            <w:tcW w:w="696" w:type="dxa"/>
           </w:tcPr>
           <w:p>
             <w:pPr>
@@ -1829,7 +2078,7 @@
         </w:tc>
         <w:tc>
           <w:tcPr>
-            <w:tcW w:w="886" w:type="dxa"/>
+            <w:tcW w:w="696" w:type="dxa"/>
           </w:tcPr>
           <w:p>
             <w:pPr>
@@ -1840,7 +2089,7 @@
         </w:tc>
         <w:tc>
           <w:tcPr>
-            <w:tcW w:w="886" w:type="dxa"/>
+            <w:tcW w:w="696" w:type="dxa"/>
           </w:tcPr>
           <w:p>
             <w:pPr>
@@ -1851,7 +2100,7 @@
         </w:tc>
         <w:tc>
           <w:tcPr>
-            <w:tcW w:w="886" w:type="dxa"/>
+            <w:tcW w:w="696" w:type="dxa"/>
           </w:tcPr>
           <w:p>
             <w:pPr>
@@ -1862,7 +2111,7 @@
         </w:tc>
         <w:tc>
           <w:tcPr>
-            <w:tcW w:w="886" w:type="dxa"/>
+            <w:tcW w:w="696" w:type="dxa"/>
           </w:tcPr>
           <w:p>
             <w:pPr>
@@ -1873,7 +2122,7 @@
         </w:tc>
         <w:tc>
           <w:tcPr>
-            <w:tcW w:w="886" w:type="dxa"/>
+            <w:tcW w:w="696" w:type="dxa"/>
           </w:tcPr>
           <w:p>
             <w:pPr>
@@ -1890,7 +2139,40 @@
         </w:tc>
         <w:tc>
           <w:tcPr>
-            <w:tcW w:w="886" w:type="dxa"/>
+            <w:tcW w:w="696" w:type="dxa"/>
+          </w:tcPr>
+          <w:p>
+            <w:pPr>
+              <w:spacing w:after="20"/>
+              <w:jc w:val="center"/>
+            </w:pPr>
+          </w:p>
+        </w:tc>
+        <w:tc>
+          <w:tcPr>
+            <w:tcW w:w="696" w:type="dxa"/>
+          </w:tcPr>
+          <w:p>
+            <w:pPr>
+              <w:spacing w:after="20"/>
+              <w:jc w:val="center"/>
+            </w:pPr>
+          </w:p>
+        </w:tc>
+        <w:tc>
+          <w:tcPr>
+            <w:tcW w:w="696" w:type="dxa"/>
+          </w:tcPr>
+          <w:p>
+            <w:pPr>
+              <w:spacing w:after="20"/>
+              <w:jc w:val="center"/>
+            </w:pPr>
+          </w:p>
+        </w:tc>
+        <w:tc>
+          <w:tcPr>
+            <w:tcW w:w="696" w:type="dxa"/>
           </w:tcPr>
           <w:p>
             <w:pPr>
@@ -1905,6 +2187,65 @@
       <w:pPr>
         <w:spacing w:after="40"/>
       </w:pPr>
+    </w:p>
+    <w:p>
+      <w:pPr>
+        <w:keepNext/>
+        <w:jc w:val="center"/>
+      </w:pPr>
+      <w:r>
+        <w:rPr>
+          <w:noProof/>
+        </w:rPr>
+        <w:drawing>
+          <wp:inline distT="0" distB="0" distL="0" distR="0" wp14:anchorId="22CFB850" wp14:editId="15DE8758">
+            <wp:extent cx="5580000" cy="3138750"/>
+            <wp:effectExtent l="0" t="0" r="0" b="0"/>
+            <wp:docPr id="1" name="Picture 1"/>
+            <wp:cNvGraphicFramePr>
+              <a:graphicFrameLocks xmlns:a="http://schemas.openxmlformats.org/drawingml/2006/main" noChangeAspect="1"/>
+            </wp:cNvGraphicFramePr>
+            <a:graphic xmlns:a="http://schemas.openxmlformats.org/drawingml/2006/main">
+              <a:graphicData uri="http://schemas.openxmlformats.org/drawingml/2006/picture">
+                <pic:pic xmlns:pic="http://schemas.openxmlformats.org/drawingml/2006/picture">
+                  <pic:nvPicPr>
+                    <pic:cNvPr id="0" name="sp-graf-cobertura.png"/>
+                    <pic:cNvPicPr/>
+                  </pic:nvPicPr>
+                  <pic:blipFill>
+                    <a:blip r:embed="rId7"/>
+                    <a:stretch>
+                      <a:fillRect/>
+                    </a:stretch>
+                  </pic:blipFill>
+                  <pic:spPr>
+                    <a:xfrm>
+                      <a:off x="0" y="0"/>
+                      <a:ext cx="5580000" cy="3138750"/>
+                    </a:xfrm>
+                    <a:prstGeom prst="rect">
+                      <a:avLst/>
+                    </a:prstGeom>
+                  </pic:spPr>
+                </pic:pic>
+              </a:graphicData>
+            </a:graphic>
+          </wp:inline>
+        </w:drawing>
+      </w:r>
+    </w:p>
+    <w:p>
+      <w:pPr>
+        <w:jc w:val="center"/>
+      </w:pPr>
+      <w:r>
+        <w:rPr>
+          <w:i/>
+          <w:color w:val="5D6575"/>
+          <w:sz w:val="18"/>
+        </w:rPr>
+        <w:t>Figura 1. Número de casos de prueba que cubren cada requisito.</w:t>
+      </w:r>
     </w:p>
     <w:p>
       <w:pPr>
@@ -2326,7 +2667,7 @@
               <w:rPr>
                 <w:sz w:val="19"/>
               </w:rPr>
-              <w:t>Productos ficticios (LAP-001, MOU-010, TEC-005, ACC-002, RED-001) con distintos precios, existencias y mínimos. Cada prueba crea su archivo JSON temporal y lo borra cuando acaba.</w:t>
+              <w:t>Productos ficticios (LAP-001, MOU-010, TEC-005, TEC-020, ACC-002, RED-001) con distintos precios, existencias y mínimos. Cada prueba crea su archivo JSON temporal y lo borra cuando acaba.</w:t>
             </w:r>
           </w:p>
         </w:tc>
@@ -2381,7 +2722,6 @@
         <w:pStyle w:val="Ttulo2"/>
       </w:pPr>
       <w:r>
-        <w:lastRenderedPageBreak/>
         <w:t>2.4 Responsables</w:t>
       </w:r>
     </w:p>
@@ -4570,7 +4910,7 @@
         <w:spacing w:after="40"/>
       </w:pPr>
       <w:r>
-        <w:t>Los diez casos planificados se ejecutaron.</w:t>
+        <w:t>Los trece casos planificados se ejecutaron.</w:t>
       </w:r>
     </w:p>
     <w:p>
@@ -4619,7 +4959,7 @@
     </w:p>
     <w:p>
       <w:r>
-        <w:t>Diseñamos diez casos (la práctica pide al menos seis). Cada uno está automatizado y lleva su ID en el nombre de la prueba, por lo que el reporte y GitHub Actions muestran la misma clave que este documento.</w:t>
+        <w:t>Diseñamos trece casos (la práctica pide al menos seis). Cada uno está automatizado y lleva su ID en el nombre de la prueba, por lo que el reporte y GitHub Actions muestran la misma clave que este documento.</w:t>
       </w:r>
     </w:p>
     <w:p>
@@ -8276,6 +8616,1110 @@
     </w:p>
     <w:p>
       <w:pPr>
+        <w:pStyle w:val="Ttulo3"/>
+      </w:pPr>
+      <w:r>
+        <w:t>Caso de prueba CP-11: Consulta de producto inexistente</w:t>
+      </w:r>
+    </w:p>
+    <w:tbl>
+      <w:tblPr>
+        <w:tblStyle w:val="Tablaconcuadrcula"/>
+        <w:tblW w:w="0" w:type="auto"/>
+        <w:tblLook w:val="04A0" w:firstRow="1" w:lastRow="0" w:firstColumn="1" w:lastColumn="0" w:noHBand="0" w:noVBand="1"/>
+      </w:tblPr>
+      <w:tblGrid>
+        <w:gridCol w:w="2154"/>
+        <w:gridCol w:w="7257"/>
+      </w:tblGrid>
+      <w:tr>
+        <w:trPr>
+          <w:cantSplit/>
+        </w:trPr>
+        <w:tc>
+          <w:tcPr>
+            <w:tcW w:w="2154" w:type="dxa"/>
+            <w:shd w:val="clear" w:color="auto" w:fill="E8F0FB"/>
+          </w:tcPr>
+          <w:p>
+            <w:pPr>
+              <w:keepNext/>
+            </w:pPr>
+            <w:r>
+              <w:rPr>
+                <w:b/>
+                <w:sz w:val="20"/>
+              </w:rPr>
+              <w:t>Caso</w:t>
+            </w:r>
+          </w:p>
+        </w:tc>
+        <w:tc>
+          <w:tcPr>
+            <w:tcW w:w="7257" w:type="dxa"/>
+          </w:tcPr>
+          <w:p>
+            <w:pPr>
+              <w:keepNext/>
+              <w:spacing w:after="20"/>
+            </w:pPr>
+            <w:r>
+              <w:rPr>
+                <w:sz w:val="20"/>
+              </w:rPr>
+              <w:t>CP-11 – Producto no encontrado (sistema)</w:t>
+            </w:r>
+          </w:p>
+        </w:tc>
+      </w:tr>
+      <w:tr>
+        <w:trPr>
+          <w:cantSplit/>
+        </w:trPr>
+        <w:tc>
+          <w:tcPr>
+            <w:tcW w:w="2154" w:type="dxa"/>
+            <w:shd w:val="clear" w:color="auto" w:fill="E8F0FB"/>
+          </w:tcPr>
+          <w:p>
+            <w:pPr>
+              <w:keepNext/>
+            </w:pPr>
+            <w:r>
+              <w:rPr>
+                <w:b/>
+                <w:sz w:val="20"/>
+              </w:rPr>
+              <w:t>Requisito asociado</w:t>
+            </w:r>
+          </w:p>
+        </w:tc>
+        <w:tc>
+          <w:tcPr>
+            <w:tcW w:w="7257" w:type="dxa"/>
+          </w:tcPr>
+          <w:p>
+            <w:pPr>
+              <w:keepNext/>
+              <w:spacing w:after="20"/>
+            </w:pPr>
+            <w:r>
+              <w:rPr>
+                <w:sz w:val="20"/>
+              </w:rPr>
+              <w:t>RF-02</w:t>
+            </w:r>
+          </w:p>
+        </w:tc>
+      </w:tr>
+      <w:tr>
+        <w:trPr>
+          <w:cantSplit/>
+        </w:trPr>
+        <w:tc>
+          <w:tcPr>
+            <w:tcW w:w="2154" w:type="dxa"/>
+            <w:shd w:val="clear" w:color="auto" w:fill="E8F0FB"/>
+          </w:tcPr>
+          <w:p>
+            <w:pPr>
+              <w:keepNext/>
+            </w:pPr>
+            <w:r>
+              <w:rPr>
+                <w:b/>
+                <w:sz w:val="20"/>
+              </w:rPr>
+              <w:t>Objetivo</w:t>
+            </w:r>
+          </w:p>
+        </w:tc>
+        <w:tc>
+          <w:tcPr>
+            <w:tcW w:w="7257" w:type="dxa"/>
+          </w:tcPr>
+          <w:p>
+            <w:pPr>
+              <w:keepNext/>
+              <w:spacing w:after="20"/>
+            </w:pPr>
+            <w:r>
+              <w:rPr>
+                <w:sz w:val="20"/>
+              </w:rPr>
+              <w:t>Comprobar que al consultar un código que no existe el sistema responde 404 con un mensaje claro.</w:t>
+            </w:r>
+          </w:p>
+        </w:tc>
+      </w:tr>
+      <w:tr>
+        <w:trPr>
+          <w:cantSplit/>
+        </w:trPr>
+        <w:tc>
+          <w:tcPr>
+            <w:tcW w:w="2154" w:type="dxa"/>
+            <w:shd w:val="clear" w:color="auto" w:fill="E8F0FB"/>
+          </w:tcPr>
+          <w:p>
+            <w:pPr>
+              <w:keepNext/>
+            </w:pPr>
+            <w:r>
+              <w:rPr>
+                <w:b/>
+                <w:sz w:val="20"/>
+              </w:rPr>
+              <w:t>Precondición</w:t>
+            </w:r>
+          </w:p>
+        </w:tc>
+        <w:tc>
+          <w:tcPr>
+            <w:tcW w:w="7257" w:type="dxa"/>
+          </w:tcPr>
+          <w:p>
+            <w:pPr>
+              <w:keepNext/>
+              <w:spacing w:after="20"/>
+            </w:pPr>
+            <w:r>
+              <w:rPr>
+                <w:sz w:val="20"/>
+              </w:rPr>
+              <w:t>Servidor de pruebas en ejecución con LAP-001.</w:t>
+            </w:r>
+          </w:p>
+        </w:tc>
+      </w:tr>
+      <w:tr>
+        <w:trPr>
+          <w:cantSplit/>
+        </w:trPr>
+        <w:tc>
+          <w:tcPr>
+            <w:tcW w:w="2154" w:type="dxa"/>
+            <w:shd w:val="clear" w:color="auto" w:fill="E8F0FB"/>
+          </w:tcPr>
+          <w:p>
+            <w:pPr>
+              <w:keepNext/>
+            </w:pPr>
+            <w:r>
+              <w:rPr>
+                <w:b/>
+                <w:sz w:val="20"/>
+              </w:rPr>
+              <w:t>Datos de entrada</w:t>
+            </w:r>
+          </w:p>
+        </w:tc>
+        <w:tc>
+          <w:tcPr>
+            <w:tcW w:w="7257" w:type="dxa"/>
+          </w:tcPr>
+          <w:p>
+            <w:pPr>
+              <w:keepNext/>
+              <w:spacing w:after="20"/>
+            </w:pPr>
+            <w:r>
+              <w:rPr>
+                <w:sz w:val="20"/>
+              </w:rPr>
+              <w:t>Código: «xyz-999».</w:t>
+            </w:r>
+          </w:p>
+        </w:tc>
+      </w:tr>
+      <w:tr>
+        <w:trPr>
+          <w:cantSplit/>
+        </w:trPr>
+        <w:tc>
+          <w:tcPr>
+            <w:tcW w:w="2154" w:type="dxa"/>
+            <w:shd w:val="clear" w:color="auto" w:fill="E8F0FB"/>
+          </w:tcPr>
+          <w:p>
+            <w:pPr>
+              <w:keepNext/>
+            </w:pPr>
+            <w:r>
+              <w:rPr>
+                <w:b/>
+                <w:sz w:val="20"/>
+              </w:rPr>
+              <w:t>Procedimiento</w:t>
+            </w:r>
+          </w:p>
+        </w:tc>
+        <w:tc>
+          <w:tcPr>
+            <w:tcW w:w="7257" w:type="dxa"/>
+          </w:tcPr>
+          <w:p>
+            <w:pPr>
+              <w:keepNext/>
+              <w:spacing w:after="20"/>
+            </w:pPr>
+            <w:r>
+              <w:rPr>
+                <w:sz w:val="20"/>
+              </w:rPr>
+              <w:t>1. GET /api/productos/xyz-999.</w:t>
+            </w:r>
+          </w:p>
+          <w:p>
+            <w:pPr>
+              <w:keepNext/>
+              <w:spacing w:after="20"/>
+            </w:pPr>
+            <w:r>
+              <w:rPr>
+                <w:sz w:val="20"/>
+              </w:rPr>
+              <w:t>2. Revisar el código de respuesta y el mensaje.</w:t>
+            </w:r>
+          </w:p>
+          <w:p>
+            <w:pPr>
+              <w:keepNext/>
+              <w:spacing w:after="20"/>
+            </w:pPr>
+            <w:r>
+              <w:rPr>
+                <w:sz w:val="20"/>
+              </w:rPr>
+              <w:t>3. GET /api/productos.</w:t>
+            </w:r>
+          </w:p>
+        </w:tc>
+      </w:tr>
+      <w:tr>
+        <w:trPr>
+          <w:cantSplit/>
+        </w:trPr>
+        <w:tc>
+          <w:tcPr>
+            <w:tcW w:w="2154" w:type="dxa"/>
+            <w:shd w:val="clear" w:color="auto" w:fill="E8F0FB"/>
+          </w:tcPr>
+          <w:p>
+            <w:pPr>
+              <w:keepNext/>
+            </w:pPr>
+            <w:r>
+              <w:rPr>
+                <w:b/>
+                <w:sz w:val="20"/>
+              </w:rPr>
+              <w:t>Resultado esperado</w:t>
+            </w:r>
+          </w:p>
+        </w:tc>
+        <w:tc>
+          <w:tcPr>
+            <w:tcW w:w="7257" w:type="dxa"/>
+          </w:tcPr>
+          <w:p>
+            <w:pPr>
+              <w:keepNext/>
+              <w:spacing w:after="20"/>
+            </w:pPr>
+            <w:r>
+              <w:rPr>
+                <w:sz w:val="20"/>
+              </w:rPr>
+              <w:t>Respuesta 404 «No existe un producto con el código XYZ-999.»; el inventario sigue con solo LAP-001.</w:t>
+            </w:r>
+          </w:p>
+        </w:tc>
+      </w:tr>
+      <w:tr>
+        <w:trPr>
+          <w:cantSplit/>
+        </w:trPr>
+        <w:tc>
+          <w:tcPr>
+            <w:tcW w:w="2154" w:type="dxa"/>
+            <w:shd w:val="clear" w:color="auto" w:fill="E8F0FB"/>
+          </w:tcPr>
+          <w:p>
+            <w:r>
+              <w:rPr>
+                <w:b/>
+                <w:sz w:val="20"/>
+              </w:rPr>
+              <w:t>Prueba automatizada</w:t>
+            </w:r>
+          </w:p>
+        </w:tc>
+        <w:tc>
+          <w:tcPr>
+            <w:tcW w:w="7257" w:type="dxa"/>
+          </w:tcPr>
+          <w:p>
+            <w:pPr>
+              <w:spacing w:after="20"/>
+            </w:pPr>
+            <w:r>
+              <w:rPr>
+                <w:sz w:val="20"/>
+              </w:rPr>
+              <w:t>tests/Sistema/ConsultaHttpTest.php</w:t>
+            </w:r>
+          </w:p>
+        </w:tc>
+      </w:tr>
+    </w:tbl>
+    <w:p>
+      <w:pPr>
+        <w:spacing w:after="40"/>
+      </w:pPr>
+    </w:p>
+    <w:p>
+      <w:pPr>
+        <w:pStyle w:val="Ttulo3"/>
+      </w:pPr>
+      <w:r>
+        <w:t>Caso de prueba CP-12: Rechazo de datos inválidos en el registro</w:t>
+      </w:r>
+    </w:p>
+    <w:tbl>
+      <w:tblPr>
+        <w:tblStyle w:val="Tablaconcuadrcula"/>
+        <w:tblW w:w="0" w:type="auto"/>
+        <w:tblLook w:val="04A0" w:firstRow="1" w:lastRow="0" w:firstColumn="1" w:lastColumn="0" w:noHBand="0" w:noVBand="1"/>
+      </w:tblPr>
+      <w:tblGrid>
+        <w:gridCol w:w="2154"/>
+        <w:gridCol w:w="7257"/>
+      </w:tblGrid>
+      <w:tr>
+        <w:trPr>
+          <w:cantSplit/>
+        </w:trPr>
+        <w:tc>
+          <w:tcPr>
+            <w:tcW w:w="2154" w:type="dxa"/>
+            <w:shd w:val="clear" w:color="auto" w:fill="E8F0FB"/>
+          </w:tcPr>
+          <w:p>
+            <w:pPr>
+              <w:keepNext/>
+            </w:pPr>
+            <w:r>
+              <w:rPr>
+                <w:b/>
+                <w:sz w:val="20"/>
+              </w:rPr>
+              <w:t>Caso</w:t>
+            </w:r>
+          </w:p>
+        </w:tc>
+        <w:tc>
+          <w:tcPr>
+            <w:tcW w:w="7257" w:type="dxa"/>
+          </w:tcPr>
+          <w:p>
+            <w:pPr>
+              <w:keepNext/>
+              <w:spacing w:after="20"/>
+            </w:pPr>
+            <w:r>
+              <w:rPr>
+                <w:sz w:val="20"/>
+              </w:rPr>
+              <w:t>CP-12 – Validación de datos (unitaria)</w:t>
+            </w:r>
+          </w:p>
+        </w:tc>
+      </w:tr>
+      <w:tr>
+        <w:trPr>
+          <w:cantSplit/>
+        </w:trPr>
+        <w:tc>
+          <w:tcPr>
+            <w:tcW w:w="2154" w:type="dxa"/>
+            <w:shd w:val="clear" w:color="auto" w:fill="E8F0FB"/>
+          </w:tcPr>
+          <w:p>
+            <w:pPr>
+              <w:keepNext/>
+            </w:pPr>
+            <w:r>
+              <w:rPr>
+                <w:b/>
+                <w:sz w:val="20"/>
+              </w:rPr>
+              <w:t>Requisito asociado</w:t>
+            </w:r>
+          </w:p>
+        </w:tc>
+        <w:tc>
+          <w:tcPr>
+            <w:tcW w:w="7257" w:type="dxa"/>
+          </w:tcPr>
+          <w:p>
+            <w:pPr>
+              <w:keepNext/>
+              <w:spacing w:after="20"/>
+            </w:pPr>
+            <w:r>
+              <w:rPr>
+                <w:sz w:val="20"/>
+              </w:rPr>
+              <w:t>RF-01</w:t>
+            </w:r>
+          </w:p>
+        </w:tc>
+      </w:tr>
+      <w:tr>
+        <w:trPr>
+          <w:cantSplit/>
+        </w:trPr>
+        <w:tc>
+          <w:tcPr>
+            <w:tcW w:w="2154" w:type="dxa"/>
+            <w:shd w:val="clear" w:color="auto" w:fill="E8F0FB"/>
+          </w:tcPr>
+          <w:p>
+            <w:pPr>
+              <w:keepNext/>
+            </w:pPr>
+            <w:r>
+              <w:rPr>
+                <w:b/>
+                <w:sz w:val="20"/>
+              </w:rPr>
+              <w:t>Objetivo</w:t>
+            </w:r>
+          </w:p>
+        </w:tc>
+        <w:tc>
+          <w:tcPr>
+            <w:tcW w:w="7257" w:type="dxa"/>
+          </w:tcPr>
+          <w:p>
+            <w:pPr>
+              <w:keepNext/>
+              <w:spacing w:after="20"/>
+            </w:pPr>
+            <w:r>
+              <w:rPr>
+                <w:sz w:val="20"/>
+              </w:rPr>
+              <w:t>Comprobar que el sistema rechaza datos incompletos o inválidos y no guarda el producto.</w:t>
+            </w:r>
+          </w:p>
+        </w:tc>
+      </w:tr>
+      <w:tr>
+        <w:trPr>
+          <w:cantSplit/>
+        </w:trPr>
+        <w:tc>
+          <w:tcPr>
+            <w:tcW w:w="2154" w:type="dxa"/>
+            <w:shd w:val="clear" w:color="auto" w:fill="E8F0FB"/>
+          </w:tcPr>
+          <w:p>
+            <w:pPr>
+              <w:keepNext/>
+            </w:pPr>
+            <w:r>
+              <w:rPr>
+                <w:b/>
+                <w:sz w:val="20"/>
+              </w:rPr>
+              <w:t>Precondición</w:t>
+            </w:r>
+          </w:p>
+        </w:tc>
+        <w:tc>
+          <w:tcPr>
+            <w:tcW w:w="7257" w:type="dxa"/>
+          </w:tcPr>
+          <w:p>
+            <w:pPr>
+              <w:keepNext/>
+              <w:spacing w:after="20"/>
+            </w:pPr>
+            <w:r>
+              <w:rPr>
+                <w:sz w:val="20"/>
+              </w:rPr>
+              <w:t>El inventario está vacío.</w:t>
+            </w:r>
+          </w:p>
+        </w:tc>
+      </w:tr>
+      <w:tr>
+        <w:trPr>
+          <w:cantSplit/>
+        </w:trPr>
+        <w:tc>
+          <w:tcPr>
+            <w:tcW w:w="2154" w:type="dxa"/>
+            <w:shd w:val="clear" w:color="auto" w:fill="E8F0FB"/>
+          </w:tcPr>
+          <w:p>
+            <w:pPr>
+              <w:keepNext/>
+            </w:pPr>
+            <w:r>
+              <w:rPr>
+                <w:b/>
+                <w:sz w:val="20"/>
+              </w:rPr>
+              <w:t>Datos de entrada</w:t>
+            </w:r>
+          </w:p>
+        </w:tc>
+        <w:tc>
+          <w:tcPr>
+            <w:tcW w:w="7257" w:type="dxa"/>
+          </w:tcPr>
+          <w:p>
+            <w:pPr>
+              <w:keepNext/>
+              <w:spacing w:after="20"/>
+            </w:pPr>
+            <w:r>
+              <w:rPr>
+                <w:sz w:val="20"/>
+              </w:rPr>
+              <w:t>TEC-020 con nombre vacío · con precio −250 · con existencia −5</w:t>
+            </w:r>
+          </w:p>
+          <w:p>
+            <w:pPr>
+              <w:keepNext/>
+              <w:spacing w:after="20"/>
+            </w:pPr>
+            <w:r>
+              <w:rPr>
+                <w:sz w:val="20"/>
+              </w:rPr>
+              <w:t>Código «T#1» (con un carácter no permitido)</w:t>
+            </w:r>
+          </w:p>
+        </w:tc>
+      </w:tr>
+      <w:tr>
+        <w:trPr>
+          <w:cantSplit/>
+        </w:trPr>
+        <w:tc>
+          <w:tcPr>
+            <w:tcW w:w="2154" w:type="dxa"/>
+            <w:shd w:val="clear" w:color="auto" w:fill="E8F0FB"/>
+          </w:tcPr>
+          <w:p>
+            <w:pPr>
+              <w:keepNext/>
+            </w:pPr>
+            <w:r>
+              <w:rPr>
+                <w:b/>
+                <w:sz w:val="20"/>
+              </w:rPr>
+              <w:t>Procedimiento</w:t>
+            </w:r>
+          </w:p>
+        </w:tc>
+        <w:tc>
+          <w:tcPr>
+            <w:tcW w:w="7257" w:type="dxa"/>
+          </w:tcPr>
+          <w:p>
+            <w:pPr>
+              <w:keepNext/>
+              <w:spacing w:after="20"/>
+            </w:pPr>
+            <w:r>
+              <w:rPr>
+                <w:sz w:val="20"/>
+              </w:rPr>
+              <w:t>1. Intentar registrar cada producto.</w:t>
+            </w:r>
+          </w:p>
+          <w:p>
+            <w:pPr>
+              <w:keepNext/>
+              <w:spacing w:after="20"/>
+            </w:pPr>
+            <w:r>
+              <w:rPr>
+                <w:sz w:val="20"/>
+              </w:rPr>
+              <w:t>2. Revisar el mensaje de cada intento.</w:t>
+            </w:r>
+          </w:p>
+          <w:p>
+            <w:pPr>
+              <w:keepNext/>
+              <w:spacing w:after="20"/>
+            </w:pPr>
+            <w:r>
+              <w:rPr>
+                <w:sz w:val="20"/>
+              </w:rPr>
+              <w:t>3. Contar los productos.</w:t>
+            </w:r>
+          </w:p>
+        </w:tc>
+      </w:tr>
+      <w:tr>
+        <w:trPr>
+          <w:cantSplit/>
+        </w:trPr>
+        <w:tc>
+          <w:tcPr>
+            <w:tcW w:w="2154" w:type="dxa"/>
+            <w:shd w:val="clear" w:color="auto" w:fill="E8F0FB"/>
+          </w:tcPr>
+          <w:p>
+            <w:pPr>
+              <w:keepNext/>
+            </w:pPr>
+            <w:r>
+              <w:rPr>
+                <w:b/>
+                <w:sz w:val="20"/>
+              </w:rPr>
+              <w:t>Resultado esperado</w:t>
+            </w:r>
+          </w:p>
+        </w:tc>
+        <w:tc>
+          <w:tcPr>
+            <w:tcW w:w="7257" w:type="dxa"/>
+          </w:tcPr>
+          <w:p>
+            <w:pPr>
+              <w:keepNext/>
+              <w:spacing w:after="20"/>
+            </w:pPr>
+            <w:r>
+              <w:rPr>
+                <w:sz w:val="20"/>
+              </w:rPr>
+              <w:t>Cuatro errores: «El nombre del producto es obligatorio.», «El precio no puede ser negativo.», «La existencia y el stock mínimo no pueden ser negativos.» y el del formato del código. El inventario sigue vacío.</w:t>
+            </w:r>
+          </w:p>
+        </w:tc>
+      </w:tr>
+      <w:tr>
+        <w:trPr>
+          <w:cantSplit/>
+        </w:trPr>
+        <w:tc>
+          <w:tcPr>
+            <w:tcW w:w="2154" w:type="dxa"/>
+            <w:shd w:val="clear" w:color="auto" w:fill="E8F0FB"/>
+          </w:tcPr>
+          <w:p>
+            <w:r>
+              <w:rPr>
+                <w:b/>
+                <w:sz w:val="20"/>
+              </w:rPr>
+              <w:t>Prueba automatizada</w:t>
+            </w:r>
+          </w:p>
+        </w:tc>
+        <w:tc>
+          <w:tcPr>
+            <w:tcW w:w="7257" w:type="dxa"/>
+          </w:tcPr>
+          <w:p>
+            <w:pPr>
+              <w:spacing w:after="20"/>
+            </w:pPr>
+            <w:r>
+              <w:rPr>
+                <w:sz w:val="20"/>
+              </w:rPr>
+              <w:t>tests/Unitarias/RegistroProductoTest.php</w:t>
+            </w:r>
+          </w:p>
+        </w:tc>
+      </w:tr>
+    </w:tbl>
+    <w:p>
+      <w:pPr>
+        <w:spacing w:after="40"/>
+      </w:pPr>
+    </w:p>
+    <w:p>
+      <w:pPr>
+        <w:pStyle w:val="Ttulo3"/>
+      </w:pPr>
+      <w:r>
+        <w:t>Caso de prueba CP-13: Persistencia de una entrada de mercancía</w:t>
+      </w:r>
+    </w:p>
+    <w:tbl>
+      <w:tblPr>
+        <w:tblStyle w:val="Tablaconcuadrcula"/>
+        <w:tblW w:w="0" w:type="auto"/>
+        <w:tblLook w:val="04A0" w:firstRow="1" w:lastRow="0" w:firstColumn="1" w:lastColumn="0" w:noHBand="0" w:noVBand="1"/>
+      </w:tblPr>
+      <w:tblGrid>
+        <w:gridCol w:w="2154"/>
+        <w:gridCol w:w="7257"/>
+      </w:tblGrid>
+      <w:tr>
+        <w:trPr>
+          <w:cantSplit/>
+        </w:trPr>
+        <w:tc>
+          <w:tcPr>
+            <w:tcW w:w="2154" w:type="dxa"/>
+            <w:shd w:val="clear" w:color="auto" w:fill="E8F0FB"/>
+          </w:tcPr>
+          <w:p>
+            <w:pPr>
+              <w:keepNext/>
+            </w:pPr>
+            <w:r>
+              <w:rPr>
+                <w:b/>
+                <w:sz w:val="20"/>
+              </w:rPr>
+              <w:t>Caso</w:t>
+            </w:r>
+          </w:p>
+        </w:tc>
+        <w:tc>
+          <w:tcPr>
+            <w:tcW w:w="7257" w:type="dxa"/>
+          </w:tcPr>
+          <w:p>
+            <w:pPr>
+              <w:keepNext/>
+              <w:spacing w:after="20"/>
+            </w:pPr>
+            <w:r>
+              <w:rPr>
+                <w:sz w:val="20"/>
+              </w:rPr>
+              <w:t>CP-13 – Entrada guardada (integración)</w:t>
+            </w:r>
+          </w:p>
+        </w:tc>
+      </w:tr>
+      <w:tr>
+        <w:trPr>
+          <w:cantSplit/>
+        </w:trPr>
+        <w:tc>
+          <w:tcPr>
+            <w:tcW w:w="2154" w:type="dxa"/>
+            <w:shd w:val="clear" w:color="auto" w:fill="E8F0FB"/>
+          </w:tcPr>
+          <w:p>
+            <w:pPr>
+              <w:keepNext/>
+            </w:pPr>
+            <w:r>
+              <w:rPr>
+                <w:b/>
+                <w:sz w:val="20"/>
+              </w:rPr>
+              <w:t>Requisito asociado</w:t>
+            </w:r>
+          </w:p>
+        </w:tc>
+        <w:tc>
+          <w:tcPr>
+            <w:tcW w:w="7257" w:type="dxa"/>
+          </w:tcPr>
+          <w:p>
+            <w:pPr>
+              <w:keepNext/>
+              <w:spacing w:after="20"/>
+            </w:pPr>
+            <w:r>
+              <w:rPr>
+                <w:sz w:val="20"/>
+              </w:rPr>
+              <w:t>RF-04</w:t>
+            </w:r>
+          </w:p>
+        </w:tc>
+      </w:tr>
+      <w:tr>
+        <w:trPr>
+          <w:cantSplit/>
+        </w:trPr>
+        <w:tc>
+          <w:tcPr>
+            <w:tcW w:w="2154" w:type="dxa"/>
+            <w:shd w:val="clear" w:color="auto" w:fill="E8F0FB"/>
+          </w:tcPr>
+          <w:p>
+            <w:pPr>
+              <w:keepNext/>
+            </w:pPr>
+            <w:r>
+              <w:rPr>
+                <w:b/>
+                <w:sz w:val="20"/>
+              </w:rPr>
+              <w:t>Objetivo</w:t>
+            </w:r>
+          </w:p>
+        </w:tc>
+        <w:tc>
+          <w:tcPr>
+            <w:tcW w:w="7257" w:type="dxa"/>
+          </w:tcPr>
+          <w:p>
+            <w:pPr>
+              <w:keepNext/>
+              <w:spacing w:after="20"/>
+            </w:pPr>
+            <w:r>
+              <w:rPr>
+                <w:sz w:val="20"/>
+              </w:rPr>
+              <w:t>Comprobar que una entrada suma a la existencia y queda guardada en el archivo y en el historial.</w:t>
+            </w:r>
+          </w:p>
+        </w:tc>
+      </w:tr>
+      <w:tr>
+        <w:trPr>
+          <w:cantSplit/>
+        </w:trPr>
+        <w:tc>
+          <w:tcPr>
+            <w:tcW w:w="2154" w:type="dxa"/>
+            <w:shd w:val="clear" w:color="auto" w:fill="E8F0FB"/>
+          </w:tcPr>
+          <w:p>
+            <w:pPr>
+              <w:keepNext/>
+            </w:pPr>
+            <w:r>
+              <w:rPr>
+                <w:b/>
+                <w:sz w:val="20"/>
+              </w:rPr>
+              <w:t>Precondición</w:t>
+            </w:r>
+          </w:p>
+        </w:tc>
+        <w:tc>
+          <w:tcPr>
+            <w:tcW w:w="7257" w:type="dxa"/>
+          </w:tcPr>
+          <w:p>
+            <w:pPr>
+              <w:keepNext/>
+              <w:spacing w:after="20"/>
+            </w:pPr>
+            <w:r>
+              <w:rPr>
+                <w:sz w:val="20"/>
+              </w:rPr>
+              <w:t>Archivo JSON con LAP-001 (10).</w:t>
+            </w:r>
+          </w:p>
+        </w:tc>
+      </w:tr>
+      <w:tr>
+        <w:trPr>
+          <w:cantSplit/>
+        </w:trPr>
+        <w:tc>
+          <w:tcPr>
+            <w:tcW w:w="2154" w:type="dxa"/>
+            <w:shd w:val="clear" w:color="auto" w:fill="E8F0FB"/>
+          </w:tcPr>
+          <w:p>
+            <w:pPr>
+              <w:keepNext/>
+            </w:pPr>
+            <w:r>
+              <w:rPr>
+                <w:b/>
+                <w:sz w:val="20"/>
+              </w:rPr>
+              <w:t>Datos de entrada</w:t>
+            </w:r>
+          </w:p>
+        </w:tc>
+        <w:tc>
+          <w:tcPr>
+            <w:tcW w:w="7257" w:type="dxa"/>
+          </w:tcPr>
+          <w:p>
+            <w:pPr>
+              <w:keepNext/>
+              <w:spacing w:after="20"/>
+            </w:pPr>
+            <w:r>
+              <w:rPr>
+                <w:sz w:val="20"/>
+              </w:rPr>
+              <w:t>Entrada de 15 piezas de LAP-001.</w:t>
+            </w:r>
+          </w:p>
+        </w:tc>
+      </w:tr>
+      <w:tr>
+        <w:trPr>
+          <w:cantSplit/>
+        </w:trPr>
+        <w:tc>
+          <w:tcPr>
+            <w:tcW w:w="2154" w:type="dxa"/>
+            <w:shd w:val="clear" w:color="auto" w:fill="E8F0FB"/>
+          </w:tcPr>
+          <w:p>
+            <w:pPr>
+              <w:keepNext/>
+            </w:pPr>
+            <w:r>
+              <w:rPr>
+                <w:b/>
+                <w:sz w:val="20"/>
+              </w:rPr>
+              <w:t>Procedimiento</w:t>
+            </w:r>
+          </w:p>
+        </w:tc>
+        <w:tc>
+          <w:tcPr>
+            <w:tcW w:w="7257" w:type="dxa"/>
+          </w:tcPr>
+          <w:p>
+            <w:pPr>
+              <w:keepNext/>
+              <w:spacing w:after="20"/>
+            </w:pPr>
+            <w:r>
+              <w:rPr>
+                <w:sz w:val="20"/>
+              </w:rPr>
+              <w:t>1. Registrar la entrada con el repositorio.</w:t>
+            </w:r>
+          </w:p>
+          <w:p>
+            <w:pPr>
+              <w:keepNext/>
+              <w:spacing w:after="20"/>
+            </w:pPr>
+            <w:r>
+              <w:rPr>
+                <w:sz w:val="20"/>
+              </w:rPr>
+              <w:t>2. Abrir el mismo archivo con un repositorio nuevo.</w:t>
+            </w:r>
+          </w:p>
+          <w:p>
+            <w:pPr>
+              <w:keepNext/>
+              <w:spacing w:after="20"/>
+            </w:pPr>
+            <w:r>
+              <w:rPr>
+                <w:sz w:val="20"/>
+              </w:rPr>
+              <w:t>3. Consultar existencia y movimientos.</w:t>
+            </w:r>
+          </w:p>
+        </w:tc>
+      </w:tr>
+      <w:tr>
+        <w:trPr>
+          <w:cantSplit/>
+        </w:trPr>
+        <w:tc>
+          <w:tcPr>
+            <w:tcW w:w="2154" w:type="dxa"/>
+            <w:shd w:val="clear" w:color="auto" w:fill="E8F0FB"/>
+          </w:tcPr>
+          <w:p>
+            <w:pPr>
+              <w:keepNext/>
+            </w:pPr>
+            <w:r>
+              <w:rPr>
+                <w:b/>
+                <w:sz w:val="20"/>
+              </w:rPr>
+              <w:t>Resultado esperado</w:t>
+            </w:r>
+          </w:p>
+        </w:tc>
+        <w:tc>
+          <w:tcPr>
+            <w:tcW w:w="7257" w:type="dxa"/>
+          </w:tcPr>
+          <w:p>
+            <w:pPr>
+              <w:keepNext/>
+              <w:spacing w:after="20"/>
+            </w:pPr>
+            <w:r>
+              <w:rPr>
+                <w:sz w:val="20"/>
+              </w:rPr>
+              <w:t>LAP-001: 25; un movimiento de entrada con cantidad 15, existencia resultante 25 y motivo «Compra a proveedor».</w:t>
+            </w:r>
+          </w:p>
+        </w:tc>
+      </w:tr>
+      <w:tr>
+        <w:trPr>
+          <w:cantSplit/>
+        </w:trPr>
+        <w:tc>
+          <w:tcPr>
+            <w:tcW w:w="2154" w:type="dxa"/>
+            <w:shd w:val="clear" w:color="auto" w:fill="E8F0FB"/>
+          </w:tcPr>
+          <w:p>
+            <w:r>
+              <w:rPr>
+                <w:b/>
+                <w:sz w:val="20"/>
+              </w:rPr>
+              <w:t>Prueba automatizada</w:t>
+            </w:r>
+          </w:p>
+        </w:tc>
+        <w:tc>
+          <w:tcPr>
+            <w:tcW w:w="7257" w:type="dxa"/>
+          </w:tcPr>
+          <w:p>
+            <w:pPr>
+              <w:spacing w:after="20"/>
+            </w:pPr>
+            <w:r>
+              <w:rPr>
+                <w:sz w:val="20"/>
+              </w:rPr>
+              <w:t>tests/Integracion/EntradaPersistidaTest.php</w:t>
+            </w:r>
+          </w:p>
+        </w:tc>
+      </w:tr>
+    </w:tbl>
+    <w:p>
+      <w:pPr>
+        <w:spacing w:after="40"/>
+      </w:pPr>
+    </w:p>
+    <w:p>
+      <w:pPr>
         <w:pStyle w:val="Ttulo1"/>
       </w:pPr>
       <w:r>
@@ -8292,10 +9736,10 @@
           <w:noProof/>
         </w:rPr>
         <w:drawing>
-          <wp:inline distT="0" distB="0" distL="0" distR="0" wp14:anchorId="660B753A" wp14:editId="609D1772">
+          <wp:inline distT="0" distB="0" distL="0" distR="0" wp14:anchorId="14FAE9E0" wp14:editId="78EB04F9">
             <wp:extent cx="5580000" cy="3138750"/>
             <wp:effectExtent l="0" t="0" r="0" b="0"/>
-            <wp:docPr id="1" name="Picture 1"/>
+            <wp:docPr id="2" name="Picture 2"/>
             <wp:cNvGraphicFramePr>
               <a:graphicFrameLocks xmlns:a="http://schemas.openxmlformats.org/drawingml/2006/main" noChangeAspect="1"/>
             </wp:cNvGraphicFramePr>
@@ -8307,7 +9751,7 @@
                     <pic:cNvPicPr/>
                   </pic:nvPicPr>
                   <pic:blipFill>
-                    <a:blip r:embed="rId7"/>
+                    <a:blip r:embed="rId8"/>
                     <a:stretch>
                       <a:fillRect/>
                     </a:stretch>
@@ -8338,7 +9782,7 @@
           <w:color w:val="5D6575"/>
           <w:sz w:val="18"/>
         </w:rPr>
-        <w:t>Figura 1. Niveles de prueba y casos de cada uno.</w:t>
+        <w:t>Figura 2. Niveles de prueba y casos de cada uno.</w:t>
       </w:r>
     </w:p>
     <w:tbl>
@@ -8951,6 +10395,7 @@
           </w:tcPr>
           <w:p>
             <w:pPr>
+              <w:keepNext/>
               <w:spacing w:after="20"/>
             </w:pPr>
             <w:r>
@@ -8968,6 +10413,7 @@
           </w:tcPr>
           <w:p>
             <w:pPr>
+              <w:keepNext/>
               <w:spacing w:after="20"/>
             </w:pPr>
             <w:r>
@@ -8984,6 +10430,7 @@
           </w:tcPr>
           <w:p>
             <w:pPr>
+              <w:keepNext/>
               <w:spacing w:after="20"/>
             </w:pPr>
             <w:r>
@@ -8991,6 +10438,177 @@
                 <w:sz w:val="19"/>
               </w:rPr>
               <w:t>Escenario real de la cliente (llegada de mercancía y venta en mostrador).</w:t>
+            </w:r>
+          </w:p>
+        </w:tc>
+      </w:tr>
+      <w:tr>
+        <w:trPr>
+          <w:cantSplit/>
+          <w:jc w:val="center"/>
+        </w:trPr>
+        <w:tc>
+          <w:tcPr>
+            <w:tcW w:w="907" w:type="dxa"/>
+          </w:tcPr>
+          <w:p>
+            <w:pPr>
+              <w:keepNext/>
+              <w:spacing w:after="20"/>
+            </w:pPr>
+            <w:r>
+              <w:rPr>
+                <w:b/>
+                <w:sz w:val="19"/>
+              </w:rPr>
+              <w:t>CP-11</w:t>
+            </w:r>
+          </w:p>
+        </w:tc>
+        <w:tc>
+          <w:tcPr>
+            <w:tcW w:w="1587" w:type="dxa"/>
+          </w:tcPr>
+          <w:p>
+            <w:pPr>
+              <w:keepNext/>
+              <w:spacing w:after="20"/>
+            </w:pPr>
+            <w:r>
+              <w:rPr>
+                <w:sz w:val="19"/>
+              </w:rPr>
+              <w:t>Sistema</w:t>
+            </w:r>
+          </w:p>
+        </w:tc>
+        <w:tc>
+          <w:tcPr>
+            <w:tcW w:w="6917" w:type="dxa"/>
+          </w:tcPr>
+          <w:p>
+            <w:pPr>
+              <w:keepNext/>
+              <w:spacing w:after="20"/>
+            </w:pPr>
+            <w:r>
+              <w:rPr>
+                <w:sz w:val="19"/>
+              </w:rPr>
+              <w:t>Prueba por HTTP la consulta de un código que no existe: ruta, código 404 y mensaje.</w:t>
+            </w:r>
+          </w:p>
+        </w:tc>
+      </w:tr>
+      <w:tr>
+        <w:trPr>
+          <w:cantSplit/>
+          <w:jc w:val="center"/>
+        </w:trPr>
+        <w:tc>
+          <w:tcPr>
+            <w:tcW w:w="907" w:type="dxa"/>
+          </w:tcPr>
+          <w:p>
+            <w:pPr>
+              <w:keepNext/>
+              <w:spacing w:after="20"/>
+            </w:pPr>
+            <w:r>
+              <w:rPr>
+                <w:b/>
+                <w:sz w:val="19"/>
+              </w:rPr>
+              <w:t>CP-12</w:t>
+            </w:r>
+          </w:p>
+        </w:tc>
+        <w:tc>
+          <w:tcPr>
+            <w:tcW w:w="1587" w:type="dxa"/>
+          </w:tcPr>
+          <w:p>
+            <w:pPr>
+              <w:keepNext/>
+              <w:spacing w:after="20"/>
+            </w:pPr>
+            <w:r>
+              <w:rPr>
+                <w:sz w:val="19"/>
+              </w:rPr>
+              <w:t>Unitaria</w:t>
+            </w:r>
+          </w:p>
+        </w:tc>
+        <w:tc>
+          <w:tcPr>
+            <w:tcW w:w="6917" w:type="dxa"/>
+          </w:tcPr>
+          <w:p>
+            <w:pPr>
+              <w:keepNext/>
+              <w:spacing w:after="20"/>
+            </w:pPr>
+            <w:r>
+              <w:rPr>
+                <w:sz w:val="19"/>
+              </w:rPr>
+              <w:t>Revisa las reglas de validación de la clase Producto (nombre, precio, existencia y formato del código).</w:t>
+            </w:r>
+          </w:p>
+        </w:tc>
+      </w:tr>
+      <w:tr>
+        <w:trPr>
+          <w:cantSplit/>
+          <w:jc w:val="center"/>
+        </w:trPr>
+        <w:tc>
+          <w:tcPr>
+            <w:tcW w:w="907" w:type="dxa"/>
+          </w:tcPr>
+          <w:p>
+            <w:pPr>
+              <w:spacing w:after="20"/>
+            </w:pPr>
+            <w:r>
+              <w:rPr>
+                <w:b/>
+                <w:sz w:val="19"/>
+              </w:rPr>
+              <w:t>CP-13</w:t>
+            </w:r>
+          </w:p>
+        </w:tc>
+        <w:tc>
+          <w:tcPr>
+            <w:tcW w:w="1587" w:type="dxa"/>
+          </w:tcPr>
+          <w:p>
+            <w:pPr>
+              <w:spacing w:after="20"/>
+            </w:pPr>
+            <w:r>
+              <w:rPr>
+                <w:sz w:val="19"/>
+              </w:rPr>
+              <w:t>Integración</w:t>
+            </w:r>
+          </w:p>
+        </w:tc>
+        <w:tc>
+          <w:tcPr>
+            <w:tcW w:w="6917" w:type="dxa"/>
+          </w:tcPr>
+          <w:p>
+            <w:pPr>
+              <w:spacing w:after="20"/>
+            </w:pPr>
+            <w:r>
+              <w:rPr>
+                <w:sz w:val="19"/>
+              </w:rPr>
+              <w:t>Junta Inventario, RepositorioInventario y el archivo JSON: la entrada se guarda y se vuelve a leer.</w:t>
             </w:r>
           </w:p>
         </w:tc>
@@ -9000,6 +10618,65 @@
       <w:pPr>
         <w:spacing w:after="40"/>
       </w:pPr>
+    </w:p>
+    <w:p>
+      <w:pPr>
+        <w:keepNext/>
+        <w:jc w:val="center"/>
+      </w:pPr>
+      <w:r>
+        <w:rPr>
+          <w:noProof/>
+        </w:rPr>
+        <w:drawing>
+          <wp:inline distT="0" distB="0" distL="0" distR="0" wp14:anchorId="6B2AB30D" wp14:editId="6023D775">
+            <wp:extent cx="5580000" cy="3138750"/>
+            <wp:effectExtent l="0" t="0" r="0" b="0"/>
+            <wp:docPr id="3" name="Picture 3"/>
+            <wp:cNvGraphicFramePr>
+              <a:graphicFrameLocks xmlns:a="http://schemas.openxmlformats.org/drawingml/2006/main" noChangeAspect="1"/>
+            </wp:cNvGraphicFramePr>
+            <a:graphic xmlns:a="http://schemas.openxmlformats.org/drawingml/2006/main">
+              <a:graphicData uri="http://schemas.openxmlformats.org/drawingml/2006/picture">
+                <pic:pic xmlns:pic="http://schemas.openxmlformats.org/drawingml/2006/picture">
+                  <pic:nvPicPr>
+                    <pic:cNvPr id="0" name="sp-graf-niveles.png"/>
+                    <pic:cNvPicPr/>
+                  </pic:nvPicPr>
+                  <pic:blipFill>
+                    <a:blip r:embed="rId9"/>
+                    <a:stretch>
+                      <a:fillRect/>
+                    </a:stretch>
+                  </pic:blipFill>
+                  <pic:spPr>
+                    <a:xfrm>
+                      <a:off x="0" y="0"/>
+                      <a:ext cx="5580000" cy="3138750"/>
+                    </a:xfrm>
+                    <a:prstGeom prst="rect">
+                      <a:avLst/>
+                    </a:prstGeom>
+                  </pic:spPr>
+                </pic:pic>
+              </a:graphicData>
+            </a:graphic>
+          </wp:inline>
+        </w:drawing>
+      </w:r>
+    </w:p>
+    <w:p>
+      <w:pPr>
+        <w:jc w:val="center"/>
+      </w:pPr>
+      <w:r>
+        <w:rPr>
+          <w:i/>
+          <w:color w:val="5D6575"/>
+          <w:sz w:val="18"/>
+        </w:rPr>
+        <w:t>Figura 3. Casos de prueba por nivel.</w:t>
+      </w:r>
     </w:p>
     <w:p>
       <w:pPr>
@@ -9011,7 +10688,7 @@
     </w:p>
     <w:p>
       <w:r>
-        <w:t>Registramos la ejecución en una bitácora de pruebas. Las cuatro suites se ejecutaron con scripts/ejecutar-pruebas.php el 30 de octubre de 2026 (Windows NT 10.0, PHP 8.4.27, PHPUnit 11.5.56, versión 5068771 del repositorio).</w:t>
+        <w:t>Registramos la ejecución en una bitácora de pruebas. Las cuatro suites se ejecutaron con scripts/ejecutar-pruebas.php el 31 de octubre de 2026 (Windows NT 10.0, PHP 8.4.27, PHPUnit 11.5.56, versión 1dba0bd del repositorio).</w:t>
       </w:r>
     </w:p>
     <w:p>
@@ -9031,7 +10708,13 @@
           <w:sz w:val="17"/>
         </w:rPr>
         <w:br/>
-        <w:t>composer evidencia     # ronda 1: los 10 casos con el código actual</w:t>
+      </w:r>
+      <w:r>
+        <w:rPr>
+          <w:rFonts w:ascii="Consolas" w:eastAsia="Consolas" w:hAnsi="Consolas"/>
+          <w:sz w:val="17"/>
+        </w:rPr>
+        <w:t>composer evidencia     # ronda 1: los 13 casos con el código actual</w:t>
       </w:r>
       <w:r>
         <w:rPr>
@@ -9244,7 +10927,7 @@
               <w:rPr>
                 <w:sz w:val="18"/>
               </w:rPr>
-              <w:t>0.008 s</w:t>
+              <w:t>0.004 s</w:t>
             </w:r>
           </w:p>
         </w:tc>
@@ -9331,7 +11014,7 @@
               <w:rPr>
                 <w:sz w:val="18"/>
               </w:rPr>
-              <w:t>0.001 s</w:t>
+              <w:t>0.000 s</w:t>
             </w:r>
           </w:p>
         </w:tc>
@@ -9418,7 +11101,7 @@
               <w:rPr>
                 <w:sz w:val="18"/>
               </w:rPr>
-              <w:t>0.001 s</w:t>
+              <w:t>0.000 s</w:t>
             </w:r>
           </w:p>
         </w:tc>
@@ -9505,7 +11188,7 @@
               <w:rPr>
                 <w:sz w:val="18"/>
               </w:rPr>
-              <w:t>0.001 s</w:t>
+              <w:t>0.000 s</w:t>
             </w:r>
           </w:p>
         </w:tc>
@@ -9592,7 +11275,7 @@
               <w:rPr>
                 <w:sz w:val="18"/>
               </w:rPr>
-              <w:t>0.009 s</w:t>
+              <w:t>0.001 s</w:t>
             </w:r>
           </w:p>
         </w:tc>
@@ -9679,7 +11362,7 @@
               <w:rPr>
                 <w:sz w:val="18"/>
               </w:rPr>
-              <w:t>0.002 s</w:t>
+              <w:t>0.001 s</w:t>
             </w:r>
           </w:p>
         </w:tc>
@@ -9766,7 +11449,7 @@
               <w:rPr>
                 <w:sz w:val="18"/>
               </w:rPr>
-              <w:t>0.889 s</w:t>
+              <w:t>0.906 s</w:t>
             </w:r>
           </w:p>
         </w:tc>
@@ -9853,7 +11536,7 @@
               <w:rPr>
                 <w:sz w:val="18"/>
               </w:rPr>
-              <w:t>0.865 s</w:t>
+              <w:t>0.938 s</w:t>
             </w:r>
           </w:p>
         </w:tc>
@@ -9940,7 +11623,7 @@
               <w:rPr>
                 <w:sz w:val="18"/>
               </w:rPr>
-              <w:t>0.880 s</w:t>
+              <w:t>0.930 s</w:t>
             </w:r>
           </w:p>
         </w:tc>
@@ -10027,7 +11710,268 @@
               <w:rPr>
                 <w:sz w:val="18"/>
               </w:rPr>
-              <w:t>0.872 s</w:t>
+              <w:t>0.920 s</w:t>
+            </w:r>
+          </w:p>
+        </w:tc>
+      </w:tr>
+      <w:tr>
+        <w:trPr>
+          <w:jc w:val="center"/>
+        </w:trPr>
+        <w:tc>
+          <w:tcPr>
+            <w:tcW w:w="794" w:type="dxa"/>
+          </w:tcPr>
+          <w:p>
+            <w:pPr>
+              <w:spacing w:after="20"/>
+            </w:pPr>
+            <w:r>
+              <w:rPr>
+                <w:b/>
+                <w:sz w:val="18"/>
+              </w:rPr>
+              <w:t>CP-11</w:t>
+            </w:r>
+          </w:p>
+        </w:tc>
+        <w:tc>
+          <w:tcPr>
+            <w:tcW w:w="2154" w:type="dxa"/>
+          </w:tcPr>
+          <w:p>
+            <w:pPr>
+              <w:spacing w:after="20"/>
+            </w:pPr>
+            <w:r>
+              <w:rPr>
+                <w:sz w:val="18"/>
+              </w:rPr>
+              <w:t>Producto no encontrado (404)</w:t>
+            </w:r>
+          </w:p>
+        </w:tc>
+        <w:tc>
+          <w:tcPr>
+            <w:tcW w:w="4535" w:type="dxa"/>
+          </w:tcPr>
+          <w:p>
+            <w:pPr>
+              <w:spacing w:after="20"/>
+            </w:pPr>
+            <w:r>
+              <w:rPr>
+                <w:sz w:val="18"/>
+              </w:rPr>
+              <w:t>404 «No existe un producto con el código XYZ-999.»; el inventario sigue con LAP-001.</w:t>
+            </w:r>
+          </w:p>
+        </w:tc>
+        <w:tc>
+          <w:tcPr>
+            <w:tcW w:w="1077" w:type="dxa"/>
+            <w:shd w:val="clear" w:color="auto" w:fill="E3F4EA"/>
+          </w:tcPr>
+          <w:p>
+            <w:pPr>
+              <w:spacing w:after="20"/>
+            </w:pPr>
+            <w:r>
+              <w:rPr>
+                <w:sz w:val="18"/>
+              </w:rPr>
+              <w:t>Aprobado</w:t>
+            </w:r>
+          </w:p>
+        </w:tc>
+        <w:tc>
+          <w:tcPr>
+            <w:tcW w:w="850" w:type="dxa"/>
+          </w:tcPr>
+          <w:p>
+            <w:pPr>
+              <w:spacing w:after="20"/>
+            </w:pPr>
+            <w:r>
+              <w:rPr>
+                <w:sz w:val="18"/>
+              </w:rPr>
+              <w:t>0.893 s</w:t>
+            </w:r>
+          </w:p>
+        </w:tc>
+      </w:tr>
+      <w:tr>
+        <w:trPr>
+          <w:jc w:val="center"/>
+        </w:trPr>
+        <w:tc>
+          <w:tcPr>
+            <w:tcW w:w="794" w:type="dxa"/>
+          </w:tcPr>
+          <w:p>
+            <w:pPr>
+              <w:spacing w:after="20"/>
+            </w:pPr>
+            <w:r>
+              <w:rPr>
+                <w:b/>
+                <w:sz w:val="18"/>
+              </w:rPr>
+              <w:t>CP-12</w:t>
+            </w:r>
+          </w:p>
+        </w:tc>
+        <w:tc>
+          <w:tcPr>
+            <w:tcW w:w="2154" w:type="dxa"/>
+          </w:tcPr>
+          <w:p>
+            <w:pPr>
+              <w:spacing w:after="20"/>
+            </w:pPr>
+            <w:r>
+              <w:rPr>
+                <w:sz w:val="18"/>
+              </w:rPr>
+              <w:t>Datos inválidos rechazados</w:t>
+            </w:r>
+          </w:p>
+        </w:tc>
+        <w:tc>
+          <w:tcPr>
+            <w:tcW w:w="4535" w:type="dxa"/>
+          </w:tcPr>
+          <w:p>
+            <w:pPr>
+              <w:spacing w:after="20"/>
+            </w:pPr>
+            <w:r>
+              <w:rPr>
+                <w:sz w:val="18"/>
+              </w:rPr>
+              <w:t>Cuatro errores con el mensaje esperado; inventario con 0 productos.</w:t>
+            </w:r>
+          </w:p>
+        </w:tc>
+        <w:tc>
+          <w:tcPr>
+            <w:tcW w:w="1077" w:type="dxa"/>
+            <w:shd w:val="clear" w:color="auto" w:fill="E3F4EA"/>
+          </w:tcPr>
+          <w:p>
+            <w:pPr>
+              <w:spacing w:after="20"/>
+            </w:pPr>
+            <w:r>
+              <w:rPr>
+                <w:sz w:val="18"/>
+              </w:rPr>
+              <w:t>Aprobado</w:t>
+            </w:r>
+          </w:p>
+        </w:tc>
+        <w:tc>
+          <w:tcPr>
+            <w:tcW w:w="850" w:type="dxa"/>
+          </w:tcPr>
+          <w:p>
+            <w:pPr>
+              <w:spacing w:after="20"/>
+            </w:pPr>
+            <w:r>
+              <w:rPr>
+                <w:sz w:val="18"/>
+              </w:rPr>
+              <w:t>0.000 s</w:t>
+            </w:r>
+          </w:p>
+        </w:tc>
+      </w:tr>
+      <w:tr>
+        <w:trPr>
+          <w:jc w:val="center"/>
+        </w:trPr>
+        <w:tc>
+          <w:tcPr>
+            <w:tcW w:w="794" w:type="dxa"/>
+          </w:tcPr>
+          <w:p>
+            <w:pPr>
+              <w:spacing w:after="20"/>
+            </w:pPr>
+            <w:r>
+              <w:rPr>
+                <w:b/>
+                <w:sz w:val="18"/>
+              </w:rPr>
+              <w:t>CP-13</w:t>
+            </w:r>
+          </w:p>
+        </w:tc>
+        <w:tc>
+          <w:tcPr>
+            <w:tcW w:w="2154" w:type="dxa"/>
+          </w:tcPr>
+          <w:p>
+            <w:pPr>
+              <w:spacing w:after="20"/>
+            </w:pPr>
+            <w:r>
+              <w:rPr>
+                <w:sz w:val="18"/>
+              </w:rPr>
+              <w:t>Entrada guardada en el archivo</w:t>
+            </w:r>
+          </w:p>
+        </w:tc>
+        <w:tc>
+          <w:tcPr>
+            <w:tcW w:w="4535" w:type="dxa"/>
+          </w:tcPr>
+          <w:p>
+            <w:pPr>
+              <w:spacing w:after="20"/>
+            </w:pPr>
+            <w:r>
+              <w:rPr>
+                <w:sz w:val="18"/>
+              </w:rPr>
+              <w:t>Al abrir el archivo otra vez: LAP-001 25; 1 movimiento de entrada de 15, resultante 25, motivo Compra a proveedor.</w:t>
+            </w:r>
+          </w:p>
+        </w:tc>
+        <w:tc>
+          <w:tcPr>
+            <w:tcW w:w="1077" w:type="dxa"/>
+            <w:shd w:val="clear" w:color="auto" w:fill="E3F4EA"/>
+          </w:tcPr>
+          <w:p>
+            <w:pPr>
+              <w:spacing w:after="20"/>
+            </w:pPr>
+            <w:r>
+              <w:rPr>
+                <w:sz w:val="18"/>
+              </w:rPr>
+              <w:t>Aprobado</w:t>
+            </w:r>
+          </w:p>
+        </w:tc>
+        <w:tc>
+          <w:tcPr>
+            <w:tcW w:w="850" w:type="dxa"/>
+          </w:tcPr>
+          <w:p>
+            <w:pPr>
+              <w:spacing w:after="20"/>
+            </w:pPr>
+            <w:r>
+              <w:rPr>
+                <w:sz w:val="18"/>
+              </w:rPr>
+              <w:t>0.007 s</w:t>
             </w:r>
           </w:p>
         </w:tc>
@@ -10052,7 +11996,7 @@
     </w:p>
     <w:p>
       <w:r>
-        <w:t>El script scripts/simular-defectos.php introduce DEF-01 y DEF-02 (sección 6) en una copia de src/, ejecuta los diez casos sobre esa copia y repite la ronda con el código corregido. Los archivos originales no se modifican.</w:t>
+        <w:t>El script scripts/simular-defectos.php introduce DEF-01 y DEF-02 (sección 6) en una copia de src/, ejecuta los trece casos sobre esa copia y repite la ronda con el código corregido. Los archivos originales no se modifican.</w:t>
       </w:r>
     </w:p>
     <w:tbl>
@@ -10247,7 +12191,7 @@
               <w:rPr>
                 <w:sz w:val="18"/>
               </w:rPr>
-              <w:t>Fallido (7 de 10)</w:t>
+              <w:t>Fallido (10 de 13)</w:t>
             </w:r>
           </w:p>
         </w:tc>
@@ -10323,7 +12267,7 @@
               <w:rPr>
                 <w:sz w:val="18"/>
               </w:rPr>
-              <w:t>Fallido (9 de 10)</w:t>
+              <w:t>Fallido (12 de 13)</w:t>
             </w:r>
           </w:p>
         </w:tc>
@@ -10378,7 +12322,7 @@
               <w:rPr>
                 <w:sz w:val="18"/>
               </w:rPr>
-              <w:t>Los diez casos pasan.</w:t>
+              <w:t>Los trece casos pasan.</w:t>
             </w:r>
           </w:p>
         </w:tc>
@@ -10395,7 +12339,7 @@
               <w:rPr>
                 <w:sz w:val="18"/>
               </w:rPr>
-              <w:t>Aprobado (10 de 10)</w:t>
+              <w:t>Aprobado (13 de 13)</w:t>
             </w:r>
           </w:p>
         </w:tc>
@@ -10416,125 +12360,7 @@
           <w:noProof/>
         </w:rPr>
         <w:drawing>
-          <wp:inline distT="0" distB="0" distL="0" distR="0" wp14:anchorId="05996767" wp14:editId="69209EFA">
-            <wp:extent cx="5580000" cy="3138750"/>
-            <wp:effectExtent l="0" t="0" r="0" b="0"/>
-            <wp:docPr id="2" name="Picture 2"/>
-            <wp:cNvGraphicFramePr>
-              <a:graphicFrameLocks xmlns:a="http://schemas.openxmlformats.org/drawingml/2006/main" noChangeAspect="1"/>
-            </wp:cNvGraphicFramePr>
-            <a:graphic xmlns:a="http://schemas.openxmlformats.org/drawingml/2006/main">
-              <a:graphicData uri="http://schemas.openxmlformats.org/drawingml/2006/picture">
-                <pic:pic xmlns:pic="http://schemas.openxmlformats.org/drawingml/2006/picture">
-                  <pic:nvPicPr>
-                    <pic:cNvPr id="0" name="sp-ejecucion-pruebas.png"/>
-                    <pic:cNvPicPr/>
-                  </pic:nvPicPr>
-                  <pic:blipFill>
-                    <a:blip r:embed="rId8"/>
-                    <a:stretch>
-                      <a:fillRect/>
-                    </a:stretch>
-                  </pic:blipFill>
-                  <pic:spPr>
-                    <a:xfrm>
-                      <a:off x="0" y="0"/>
-                      <a:ext cx="5580000" cy="3138750"/>
-                    </a:xfrm>
-                    <a:prstGeom prst="rect">
-                      <a:avLst/>
-                    </a:prstGeom>
-                  </pic:spPr>
-                </pic:pic>
-              </a:graphicData>
-            </a:graphic>
-          </wp:inline>
-        </w:drawing>
-      </w:r>
-    </w:p>
-    <w:p>
-      <w:pPr>
-        <w:jc w:val="center"/>
-      </w:pPr>
-      <w:r>
-        <w:rPr>
-          <w:i/>
-          <w:color w:val="5D6575"/>
-          <w:sz w:val="18"/>
-        </w:rPr>
-        <w:t>Figura 2. Ejecución de la ronda 1 con composer evidencia (30 de octubre de 2026).</w:t>
-      </w:r>
-    </w:p>
-    <w:p>
-      <w:pPr>
-        <w:keepNext/>
-        <w:jc w:val="center"/>
-      </w:pPr>
-      <w:r>
-        <w:rPr>
-          <w:noProof/>
-        </w:rPr>
-        <w:drawing>
-          <wp:inline distT="0" distB="0" distL="0" distR="0" wp14:anchorId="237FBE61" wp14:editId="76B755BE">
-            <wp:extent cx="5580000" cy="3138750"/>
-            <wp:effectExtent l="0" t="0" r="0" b="0"/>
-            <wp:docPr id="3" name="Picture 3"/>
-            <wp:cNvGraphicFramePr>
-              <a:graphicFrameLocks xmlns:a="http://schemas.openxmlformats.org/drawingml/2006/main" noChangeAspect="1"/>
-            </wp:cNvGraphicFramePr>
-            <a:graphic xmlns:a="http://schemas.openxmlformats.org/drawingml/2006/main">
-              <a:graphicData uri="http://schemas.openxmlformats.org/drawingml/2006/picture">
-                <pic:pic xmlns:pic="http://schemas.openxmlformats.org/drawingml/2006/picture">
-                  <pic:nvPicPr>
-                    <pic:cNvPr id="0" name="sp-reporte-html.png"/>
-                    <pic:cNvPicPr/>
-                  </pic:nvPicPr>
-                  <pic:blipFill>
-                    <a:blip r:embed="rId9"/>
-                    <a:stretch>
-                      <a:fillRect/>
-                    </a:stretch>
-                  </pic:blipFill>
-                  <pic:spPr>
-                    <a:xfrm>
-                      <a:off x="0" y="0"/>
-                      <a:ext cx="5580000" cy="3138750"/>
-                    </a:xfrm>
-                    <a:prstGeom prst="rect">
-                      <a:avLst/>
-                    </a:prstGeom>
-                  </pic:spPr>
-                </pic:pic>
-              </a:graphicData>
-            </a:graphic>
-          </wp:inline>
-        </w:drawing>
-      </w:r>
-    </w:p>
-    <w:p>
-      <w:pPr>
-        <w:jc w:val="center"/>
-      </w:pPr>
-      <w:r>
-        <w:rPr>
-          <w:i/>
-          <w:color w:val="5D6575"/>
-          <w:sz w:val="18"/>
-        </w:rPr>
-        <w:t>Figura 3. Reporte de la ronda 1 generado en evidencias/reporte-pruebas.html.</w:t>
-      </w:r>
-    </w:p>
-    <w:p>
-      <w:pPr>
-        <w:keepNext/>
-        <w:jc w:val="center"/>
-      </w:pPr>
-      <w:r>
-        <w:rPr>
-          <w:noProof/>
-        </w:rPr>
-        <w:drawing>
-          <wp:inline distT="0" distB="0" distL="0" distR="0" wp14:anchorId="7261574D" wp14:editId="1B5F19CA">
+          <wp:inline distT="0" distB="0" distL="0" distR="0" wp14:anchorId="5A0D8655" wp14:editId="53E75B1F">
             <wp:extent cx="5580000" cy="3138750"/>
             <wp:effectExtent l="0" t="0" r="0" b="0"/>
             <wp:docPr id="4" name="Picture 4"/>
@@ -10545,7 +12371,7 @@
               <a:graphicData uri="http://schemas.openxmlformats.org/drawingml/2006/picture">
                 <pic:pic xmlns:pic="http://schemas.openxmlformats.org/drawingml/2006/picture">
                   <pic:nvPicPr>
-                    <pic:cNvPr id="0" name="sp-regresion.png"/>
+                    <pic:cNvPr id="0" name="sp-ejecucion-pruebas.png"/>
                     <pic:cNvPicPr/>
                   </pic:nvPicPr>
                   <pic:blipFill>
@@ -10580,7 +12406,189 @@
           <w:color w:val="5D6575"/>
           <w:sz w:val="18"/>
         </w:rPr>
-        <w:t>Figura 4. Rondas 2 a 4 con composer regresion: DEF-01 y DEF-02 inyectados y código corregido.</w:t>
+        <w:t>Figura 4. Ejecución de la ronda 1 con composer evidencia (31 de octubre de 2026).</w:t>
+      </w:r>
+    </w:p>
+    <w:p>
+      <w:pPr>
+        <w:keepNext/>
+        <w:jc w:val="center"/>
+      </w:pPr>
+      <w:r>
+        <w:rPr>
+          <w:noProof/>
+        </w:rPr>
+        <w:drawing>
+          <wp:inline distT="0" distB="0" distL="0" distR="0" wp14:anchorId="6D9F91D8" wp14:editId="1DAB06A7">
+            <wp:extent cx="5580000" cy="3138750"/>
+            <wp:effectExtent l="0" t="0" r="0" b="0"/>
+            <wp:docPr id="5" name="Picture 5"/>
+            <wp:cNvGraphicFramePr>
+              <a:graphicFrameLocks xmlns:a="http://schemas.openxmlformats.org/drawingml/2006/main" noChangeAspect="1"/>
+            </wp:cNvGraphicFramePr>
+            <a:graphic xmlns:a="http://schemas.openxmlformats.org/drawingml/2006/main">
+              <a:graphicData uri="http://schemas.openxmlformats.org/drawingml/2006/picture">
+                <pic:pic xmlns:pic="http://schemas.openxmlformats.org/drawingml/2006/picture">
+                  <pic:nvPicPr>
+                    <pic:cNvPr id="0" name="sp-reporte-html.png"/>
+                    <pic:cNvPicPr/>
+                  </pic:nvPicPr>
+                  <pic:blipFill>
+                    <a:blip r:embed="rId11"/>
+                    <a:stretch>
+                      <a:fillRect/>
+                    </a:stretch>
+                  </pic:blipFill>
+                  <pic:spPr>
+                    <a:xfrm>
+                      <a:off x="0" y="0"/>
+                      <a:ext cx="5580000" cy="3138750"/>
+                    </a:xfrm>
+                    <a:prstGeom prst="rect">
+                      <a:avLst/>
+                    </a:prstGeom>
+                  </pic:spPr>
+                </pic:pic>
+              </a:graphicData>
+            </a:graphic>
+          </wp:inline>
+        </w:drawing>
+      </w:r>
+    </w:p>
+    <w:p>
+      <w:pPr>
+        <w:jc w:val="center"/>
+      </w:pPr>
+      <w:r>
+        <w:rPr>
+          <w:i/>
+          <w:color w:val="5D6575"/>
+          <w:sz w:val="18"/>
+        </w:rPr>
+        <w:t>Figura 5. Reporte de la ronda 1 generado en evidencias/reporte-pruebas.html.</w:t>
+      </w:r>
+    </w:p>
+    <w:p>
+      <w:pPr>
+        <w:keepNext/>
+        <w:jc w:val="center"/>
+      </w:pPr>
+      <w:r>
+        <w:rPr>
+          <w:noProof/>
+        </w:rPr>
+        <w:drawing>
+          <wp:inline distT="0" distB="0" distL="0" distR="0" wp14:anchorId="452AFFD2" wp14:editId="1DA4FC40">
+            <wp:extent cx="5580000" cy="3138750"/>
+            <wp:effectExtent l="0" t="0" r="0" b="0"/>
+            <wp:docPr id="6" name="Picture 6"/>
+            <wp:cNvGraphicFramePr>
+              <a:graphicFrameLocks xmlns:a="http://schemas.openxmlformats.org/drawingml/2006/main" noChangeAspect="1"/>
+            </wp:cNvGraphicFramePr>
+            <a:graphic xmlns:a="http://schemas.openxmlformats.org/drawingml/2006/main">
+              <a:graphicData uri="http://schemas.openxmlformats.org/drawingml/2006/picture">
+                <pic:pic xmlns:pic="http://schemas.openxmlformats.org/drawingml/2006/picture">
+                  <pic:nvPicPr>
+                    <pic:cNvPr id="0" name="sp-regresion.png"/>
+                    <pic:cNvPicPr/>
+                  </pic:nvPicPr>
+                  <pic:blipFill>
+                    <a:blip r:embed="rId12"/>
+                    <a:stretch>
+                      <a:fillRect/>
+                    </a:stretch>
+                  </pic:blipFill>
+                  <pic:spPr>
+                    <a:xfrm>
+                      <a:off x="0" y="0"/>
+                      <a:ext cx="5580000" cy="3138750"/>
+                    </a:xfrm>
+                    <a:prstGeom prst="rect">
+                      <a:avLst/>
+                    </a:prstGeom>
+                  </pic:spPr>
+                </pic:pic>
+              </a:graphicData>
+            </a:graphic>
+          </wp:inline>
+        </w:drawing>
+      </w:r>
+    </w:p>
+    <w:p>
+      <w:pPr>
+        <w:jc w:val="center"/>
+      </w:pPr>
+      <w:r>
+        <w:rPr>
+          <w:i/>
+          <w:color w:val="5D6575"/>
+          <w:sz w:val="18"/>
+        </w:rPr>
+        <w:t>Figura 6. Rondas 2 a 4 con composer regresion: DEF-01 y DEF-02 inyectados y código corregido.</w:t>
+      </w:r>
+    </w:p>
+    <w:p>
+      <w:r>
+        <w:t>La ronda 1 tardó 4.600 s. La Figura 7 suma el tiempo de los casos de cada nivel: los de sistema (2.737 s) y aceptación (1.850 s) levantan su propio servidor php -S y tardan cerca de 0.9 s cada uno; los unitarios (0.004 s) y de integración (0.009 s) tardan milisegundos.</w:t>
+      </w:r>
+    </w:p>
+    <w:p>
+      <w:pPr>
+        <w:keepNext/>
+        <w:jc w:val="center"/>
+      </w:pPr>
+      <w:r>
+        <w:rPr>
+          <w:noProof/>
+        </w:rPr>
+        <w:drawing>
+          <wp:inline distT="0" distB="0" distL="0" distR="0" wp14:anchorId="5D6DD85F" wp14:editId="5A12AC65">
+            <wp:extent cx="5580000" cy="3138750"/>
+            <wp:effectExtent l="0" t="0" r="0" b="0"/>
+            <wp:docPr id="7" name="Picture 7"/>
+            <wp:cNvGraphicFramePr>
+              <a:graphicFrameLocks xmlns:a="http://schemas.openxmlformats.org/drawingml/2006/main" noChangeAspect="1"/>
+            </wp:cNvGraphicFramePr>
+            <a:graphic xmlns:a="http://schemas.openxmlformats.org/drawingml/2006/main">
+              <a:graphicData uri="http://schemas.openxmlformats.org/drawingml/2006/picture">
+                <pic:pic xmlns:pic="http://schemas.openxmlformats.org/drawingml/2006/picture">
+                  <pic:nvPicPr>
+                    <pic:cNvPr id="0" name="sp-graf-tiempos.png"/>
+                    <pic:cNvPicPr/>
+                  </pic:nvPicPr>
+                  <pic:blipFill>
+                    <a:blip r:embed="rId13"/>
+                    <a:stretch>
+                      <a:fillRect/>
+                    </a:stretch>
+                  </pic:blipFill>
+                  <pic:spPr>
+                    <a:xfrm>
+                      <a:off x="0" y="0"/>
+                      <a:ext cx="5580000" cy="3138750"/>
+                    </a:xfrm>
+                    <a:prstGeom prst="rect">
+                      <a:avLst/>
+                    </a:prstGeom>
+                  </pic:spPr>
+                </pic:pic>
+              </a:graphicData>
+            </a:graphic>
+          </wp:inline>
+        </w:drawing>
+      </w:r>
+    </w:p>
+    <w:p>
+      <w:pPr>
+        <w:jc w:val="center"/>
+      </w:pPr>
+      <w:r>
+        <w:rPr>
+          <w:i/>
+          <w:color w:val="5D6575"/>
+          <w:sz w:val="18"/>
+        </w:rPr>
+        <w:t>Figura 7. Tiempo de ejecución de la ronda 1 por nivel de prueba.</w:t>
       </w:r>
     </w:p>
     <w:p>
@@ -10775,7 +12783,7 @@
               <w:rPr>
                 <w:sz w:val="19"/>
               </w:rPr>
-              <w:t>10</w:t>
+              <w:t>13</w:t>
             </w:r>
           </w:p>
         </w:tc>
@@ -10792,7 +12800,7 @@
               <w:rPr>
                 <w:sz w:val="19"/>
               </w:rPr>
-              <w:t>10</w:t>
+              <w:t>13</w:t>
             </w:r>
           </w:p>
         </w:tc>
@@ -10826,7 +12834,7 @@
               <w:rPr>
                 <w:sz w:val="19"/>
               </w:rPr>
-              <w:t>10 / 10 × 100</w:t>
+              <w:t>13 / 13 × 100</w:t>
             </w:r>
           </w:p>
         </w:tc>
@@ -10884,13 +12892,30 @@
               <w:rPr>
                 <w:sz w:val="19"/>
               </w:rPr>
+              <w:t>13</w:t>
+            </w:r>
+          </w:p>
+        </w:tc>
+        <w:tc>
+          <w:tcPr>
+            <w:tcW w:w="1191" w:type="dxa"/>
+          </w:tcPr>
+          <w:p>
+            <w:pPr>
+              <w:keepNext/>
+              <w:spacing w:after="20"/>
+            </w:pPr>
+            <w:r>
+              <w:rPr>
+                <w:sz w:val="19"/>
+              </w:rPr>
               <w:t>10</w:t>
             </w:r>
           </w:p>
         </w:tc>
         <w:tc>
           <w:tcPr>
-            <w:tcW w:w="1191" w:type="dxa"/>
+            <w:tcW w:w="1077" w:type="dxa"/>
           </w:tcPr>
           <w:p>
             <w:pPr>
@@ -10901,13 +12926,13 @@
               <w:rPr>
                 <w:sz w:val="19"/>
               </w:rPr>
-              <w:t>7</w:t>
-            </w:r>
-          </w:p>
-        </w:tc>
-        <w:tc>
-          <w:tcPr>
-            <w:tcW w:w="1077" w:type="dxa"/>
+              <w:t>3</w:t>
+            </w:r>
+          </w:p>
+        </w:tc>
+        <w:tc>
+          <w:tcPr>
+            <w:tcW w:w="2041" w:type="dxa"/>
           </w:tcPr>
           <w:p>
             <w:pPr>
@@ -10918,13 +12943,13 @@
               <w:rPr>
                 <w:sz w:val="19"/>
               </w:rPr>
-              <w:t>3</w:t>
-            </w:r>
-          </w:p>
-        </w:tc>
-        <w:tc>
-          <w:tcPr>
-            <w:tcW w:w="2041" w:type="dxa"/>
+              <w:t>10 / 13 × 100</w:t>
+            </w:r>
+          </w:p>
+        </w:tc>
+        <w:tc>
+          <w:tcPr>
+            <w:tcW w:w="1361" w:type="dxa"/>
           </w:tcPr>
           <w:p>
             <w:pPr>
@@ -10935,24 +12960,7 @@
               <w:rPr>
                 <w:sz w:val="19"/>
               </w:rPr>
-              <w:t>7 / 10 × 100</w:t>
-            </w:r>
-          </w:p>
-        </w:tc>
-        <w:tc>
-          <w:tcPr>
-            <w:tcW w:w="1361" w:type="dxa"/>
-          </w:tcPr>
-          <w:p>
-            <w:pPr>
-              <w:keepNext/>
-              <w:spacing w:after="20"/>
-            </w:pPr>
-            <w:r>
-              <w:rPr>
-                <w:sz w:val="19"/>
-              </w:rPr>
-              <w:t>70 %</w:t>
+              <w:t>76.9 %</w:t>
             </w:r>
           </w:p>
         </w:tc>
@@ -10993,7 +13001,7 @@
               <w:rPr>
                 <w:sz w:val="19"/>
               </w:rPr>
-              <w:t>10</w:t>
+              <w:t>13</w:t>
             </w:r>
           </w:p>
         </w:tc>
@@ -11010,7 +13018,7 @@
               <w:rPr>
                 <w:sz w:val="19"/>
               </w:rPr>
-              <w:t>9</w:t>
+              <w:t>12</w:t>
             </w:r>
           </w:p>
         </w:tc>
@@ -11044,7 +13052,7 @@
               <w:rPr>
                 <w:sz w:val="19"/>
               </w:rPr>
-              <w:t>9 / 10 × 100</w:t>
+              <w:t>12 / 13 × 100</w:t>
             </w:r>
           </w:p>
         </w:tc>
@@ -11061,7 +13069,7 @@
               <w:rPr>
                 <w:sz w:val="19"/>
               </w:rPr>
-              <w:t>90 %</w:t>
+              <w:t>92.3 %</w:t>
             </w:r>
           </w:p>
         </w:tc>
@@ -11100,7 +13108,7 @@
               <w:rPr>
                 <w:sz w:val="19"/>
               </w:rPr>
-              <w:t>10</w:t>
+              <w:t>13</w:t>
             </w:r>
           </w:p>
         </w:tc>
@@ -11116,7 +13124,7 @@
               <w:rPr>
                 <w:sz w:val="19"/>
               </w:rPr>
-              <w:t>10</w:t>
+              <w:t>13</w:t>
             </w:r>
           </w:p>
         </w:tc>
@@ -11148,7 +13156,7 @@
               <w:rPr>
                 <w:sz w:val="19"/>
               </w:rPr>
-              <w:t>10 / 10 × 100</w:t>
+              <w:t>13 / 13 × 100</w:t>
             </w:r>
           </w:p>
         </w:tc>
@@ -11185,10 +13193,10 @@
           <w:noProof/>
         </w:rPr>
         <w:drawing>
-          <wp:inline distT="0" distB="0" distL="0" distR="0" wp14:anchorId="2A6D14C1" wp14:editId="35C1F6B2">
+          <wp:inline distT="0" distB="0" distL="0" distR="0" wp14:anchorId="196C9083" wp14:editId="74F0A1B1">
             <wp:extent cx="5580000" cy="3138750"/>
             <wp:effectExtent l="0" t="0" r="0" b="0"/>
-            <wp:docPr id="5" name="Picture 5"/>
+            <wp:docPr id="8" name="Picture 8"/>
             <wp:cNvGraphicFramePr>
               <a:graphicFrameLocks xmlns:a="http://schemas.openxmlformats.org/drawingml/2006/main" noChangeAspect="1"/>
             </wp:cNvGraphicFramePr>
@@ -11200,7 +13208,7 @@
                     <pic:cNvPicPr/>
                   </pic:nvPicPr>
                   <pic:blipFill>
-                    <a:blip r:embed="rId11"/>
+                    <a:blip r:embed="rId14"/>
                     <a:stretch>
                       <a:fillRect/>
                     </a:stretch>
@@ -11231,7 +13239,7 @@
           <w:color w:val="5D6575"/>
           <w:sz w:val="18"/>
         </w:rPr>
-        <w:t>Figura 5. Porcentaje de casos aprobados en cada ronda.</w:t>
+        <w:t>Figura 8. Porcentaje de casos aprobados en cada ronda.</w:t>
       </w:r>
     </w:p>
     <w:p>
@@ -11242,10 +13250,10 @@
         <w:t xml:space="preserve">Interpretación. </w:t>
       </w:r>
       <w:r>
-        <w:t>Con el código actual pasan los diez casos (100 %) y se cumple el criterio de salida. Con DEF-01 la aprobación cae a 70 %: fallan CP-04, CP-06 y CP-08, que prueban la misma regla (no vender más de lo que hay) en tres niveles distintos. Con DEF-02 queda en 90 %, ya que solo CP-09 revisa el resurtido. En ambas rondas fallan justo las pruebas ligadas al requisito afectado, lo que confirma que detectan el error en el lugar correcto. Ese 90 % deja ver un riesgo: un porcentaje alto no basta para liberar, porque la</w:t>
+        <w:t>Con el código actual pasan los trece casos (100 %) y se cumple el criterio de salida. Con DEF-01 la aprobación cae a 76.9 %: fallan CP-04, CP-06 y CP-08, que prueban la misma regla (no vender más de lo que hay) en tres niveles distintos. Con DEF-02 queda en 92.3 %, ya que solo CP-09 revisa el resurtido. En ambas rondas fallan justo las pruebas ligadas al requisito afectado, lo que confirma que detectan el error en el lugar correcto. Ese 92.3 % deja ver un riesgo: un porcentaje alto no basta para liberar, po</w:t>
       </w:r>
       <w:r>
-        <w:t xml:space="preserve"> prueba fallida corresponde a un defecto de prioridad media que provocaría faltantes en la tienda. Al corregir el código, la aprobación vuelve a 100 %.</w:t>
+        <w:t>rque la prueba fallida corresponde a un defecto de prioridad media que provocaría faltantes en la tienda. Al corregir el código, la aprobación vuelve a 100 %.</w:t>
       </w:r>
     </w:p>
     <w:p>
@@ -11258,7 +13266,7 @@
     </w:p>
     <w:p>
       <w:r>
-        <w:t>Levantamos el sistema con php -S y lo usamos por HTTP con el producto del ejemplo de clase (TEC-020, Teclado USB, $250.00, 20 piezas). La Figura 6 muestra el alta, la consulta, una venta válida y tres operaciones que el sistema rechaza: vender 50 piezas cuando hay 16, vender una cantidad negativa y registrar un código repetido.</w:t>
+        <w:t>Levantamos el sistema con php -S y lo usamos por HTTP con el producto del ejemplo de clase (TEC-020, Teclado USB, $250.00, 20 piezas). La Figura 9 muestra el alta, la consulta, una venta válida y tres operaciones que el sistema rechaza: vender 50 piezas cuando hay 16, vender una cantidad negativa y registrar un código repetido.</w:t>
       </w:r>
     </w:p>
     <w:p>
@@ -11271,10 +13279,10 @@
           <w:noProof/>
         </w:rPr>
         <w:drawing>
-          <wp:inline distT="0" distB="0" distL="0" distR="0" wp14:anchorId="6D21E88C" wp14:editId="48E3338D">
+          <wp:inline distT="0" distB="0" distL="0" distR="0" wp14:anchorId="4E77F4AB" wp14:editId="6AF21737">
             <wp:extent cx="5580000" cy="3138750"/>
             <wp:effectExtent l="0" t="0" r="0" b="0"/>
-            <wp:docPr id="6" name="Picture 6"/>
+            <wp:docPr id="9" name="Picture 9"/>
             <wp:cNvGraphicFramePr>
               <a:graphicFrameLocks xmlns:a="http://schemas.openxmlformats.org/drawingml/2006/main" noChangeAspect="1"/>
             </wp:cNvGraphicFramePr>
@@ -11286,7 +13294,7 @@
                     <pic:cNvPicPr/>
                   </pic:nvPicPr>
                   <pic:blipFill>
-                    <a:blip r:embed="rId12"/>
+                    <a:blip r:embed="rId15"/>
                     <a:stretch>
                       <a:fillRect/>
                     </a:stretch>
@@ -11317,7 +13325,7 @@
           <w:color w:val="5D6575"/>
           <w:sz w:val="18"/>
         </w:rPr>
-        <w:t>Figura 6. Peticiones al sistema en ejecución y sus respuestas (201, 422 y 409).</w:t>
+        <w:t>Figura 9. Peticiones al sistema en ejecución y sus respuestas (201, 422 y 409).</w:t>
       </w:r>
     </w:p>
     <w:tbl>
@@ -11749,6 +13757,11 @@
       </w:pPr>
     </w:p>
     <w:p>
+      <w:r>
+        <w:t>Con el mismo servidor y los mismos datos seguimos con las operaciones de los casos CP-11 a CP-13 (Figura 10): consulta de un código que no existe, tres intentos de registrar un monitor con datos inválidos y una entrada de 10 piezas de TEC-020.</w:t>
+      </w:r>
+    </w:p>
+    <w:p>
       <w:pPr>
         <w:keepNext/>
         <w:jc w:val="center"/>
@@ -11758,10 +13771,10 @@
           <w:noProof/>
         </w:rPr>
         <w:drawing>
-          <wp:inline distT="0" distB="0" distL="0" distR="0" wp14:anchorId="4F3D8941" wp14:editId="06C76513">
+          <wp:inline distT="0" distB="0" distL="0" distR="0" wp14:anchorId="647183AD" wp14:editId="71D576DC">
             <wp:extent cx="5580000" cy="3138750"/>
             <wp:effectExtent l="0" t="0" r="0" b="0"/>
-            <wp:docPr id="7" name="Picture 7"/>
+            <wp:docPr id="10" name="Picture 10"/>
             <wp:cNvGraphicFramePr>
               <a:graphicFrameLocks xmlns:a="http://schemas.openxmlformats.org/drawingml/2006/main" noChangeAspect="1"/>
             </wp:cNvGraphicFramePr>
@@ -11769,11 +13782,11 @@
               <a:graphicData uri="http://schemas.openxmlformats.org/drawingml/2006/picture">
                 <pic:pic xmlns:pic="http://schemas.openxmlformats.org/drawingml/2006/picture">
                   <pic:nvPicPr>
-                    <pic:cNvPr id="0" name="sp-sistema-reporte.png"/>
+                    <pic:cNvPr id="0" name="sp-sistema-terminal2.png"/>
                     <pic:cNvPicPr/>
                   </pic:nvPicPr>
                   <pic:blipFill>
-                    <a:blip r:embed="rId13"/>
+                    <a:blip r:embed="rId16"/>
                     <a:stretch>
                       <a:fillRect/>
                     </a:stretch>
@@ -11804,7 +13817,611 @@
           <w:color w:val="5D6575"/>
           <w:sz w:val="18"/>
         </w:rPr>
-        <w:t>Figura 7. Reporte de inventario (/api/reporte) con los datos de la Figura 6: totales, productos por resurtir (ACC-002, COM-003 y LAP-002) y datos de cada producto.</w:t>
+        <w:t>Figura 10. Consulta inexistente, registros rechazados, entrada de mercancía e historial (404, 422, 201 y 200).</w:t>
+      </w:r>
+    </w:p>
+    <w:tbl>
+      <w:tblPr>
+        <w:tblStyle w:val="Tablaconcuadrcula"/>
+        <w:tblW w:w="0" w:type="auto"/>
+        <w:jc w:val="center"/>
+        <w:tblLayout w:type="fixed"/>
+        <w:tblLook w:val="04A0" w:firstRow="1" w:lastRow="0" w:firstColumn="1" w:lastColumn="0" w:noHBand="0" w:noVBand="1"/>
+      </w:tblPr>
+      <w:tblGrid>
+        <w:gridCol w:w="2835"/>
+        <w:gridCol w:w="4762"/>
+        <w:gridCol w:w="1814"/>
+      </w:tblGrid>
+      <w:tr>
+        <w:trPr>
+          <w:cantSplit/>
+          <w:tblHeader/>
+          <w:jc w:val="center"/>
+        </w:trPr>
+        <w:tc>
+          <w:tcPr>
+            <w:tcW w:w="2835" w:type="dxa"/>
+            <w:shd w:val="clear" w:color="auto" w:fill="1F4E8C"/>
+          </w:tcPr>
+          <w:p>
+            <w:pPr>
+              <w:keepNext/>
+            </w:pPr>
+            <w:r>
+              <w:rPr>
+                <w:b/>
+                <w:color w:val="FFFFFF"/>
+                <w:sz w:val="19"/>
+              </w:rPr>
+              <w:t>Operación</w:t>
+            </w:r>
+          </w:p>
+        </w:tc>
+        <w:tc>
+          <w:tcPr>
+            <w:tcW w:w="4762" w:type="dxa"/>
+            <w:shd w:val="clear" w:color="auto" w:fill="1F4E8C"/>
+          </w:tcPr>
+          <w:p>
+            <w:pPr>
+              <w:keepNext/>
+            </w:pPr>
+            <w:r>
+              <w:rPr>
+                <w:b/>
+                <w:color w:val="FFFFFF"/>
+                <w:sz w:val="19"/>
+              </w:rPr>
+              <w:t>Respuesta</w:t>
+            </w:r>
+          </w:p>
+        </w:tc>
+        <w:tc>
+          <w:tcPr>
+            <w:tcW w:w="1814" w:type="dxa"/>
+            <w:shd w:val="clear" w:color="auto" w:fill="1F4E8C"/>
+          </w:tcPr>
+          <w:p>
+            <w:pPr>
+              <w:keepNext/>
+            </w:pPr>
+            <w:r>
+              <w:rPr>
+                <w:b/>
+                <w:color w:val="FFFFFF"/>
+                <w:sz w:val="19"/>
+              </w:rPr>
+              <w:t>Caso relacionado</w:t>
+            </w:r>
+          </w:p>
+        </w:tc>
+      </w:tr>
+      <w:tr>
+        <w:trPr>
+          <w:cantSplit/>
+          <w:jc w:val="center"/>
+        </w:trPr>
+        <w:tc>
+          <w:tcPr>
+            <w:tcW w:w="2835" w:type="dxa"/>
+          </w:tcPr>
+          <w:p>
+            <w:pPr>
+              <w:keepNext/>
+              <w:spacing w:after="20"/>
+            </w:pPr>
+            <w:r>
+              <w:rPr>
+                <w:b/>
+                <w:sz w:val="19"/>
+              </w:rPr>
+              <w:t>Consulta de «xyz-999»</w:t>
+            </w:r>
+          </w:p>
+        </w:tc>
+        <w:tc>
+          <w:tcPr>
+            <w:tcW w:w="4762" w:type="dxa"/>
+          </w:tcPr>
+          <w:p>
+            <w:pPr>
+              <w:keepNext/>
+              <w:spacing w:after="20"/>
+            </w:pPr>
+            <w:r>
+              <w:rPr>
+                <w:sz w:val="19"/>
+              </w:rPr>
+              <w:t>404 · «No existe un producto con el código XYZ-999.»</w:t>
+            </w:r>
+          </w:p>
+        </w:tc>
+        <w:tc>
+          <w:tcPr>
+            <w:tcW w:w="1814" w:type="dxa"/>
+          </w:tcPr>
+          <w:p>
+            <w:pPr>
+              <w:keepNext/>
+              <w:spacing w:after="20"/>
+            </w:pPr>
+            <w:r>
+              <w:rPr>
+                <w:sz w:val="19"/>
+              </w:rPr>
+              <w:t>CP-11</w:t>
+            </w:r>
+          </w:p>
+        </w:tc>
+      </w:tr>
+      <w:tr>
+        <w:trPr>
+          <w:cantSplit/>
+          <w:jc w:val="center"/>
+        </w:trPr>
+        <w:tc>
+          <w:tcPr>
+            <w:tcW w:w="2835" w:type="dxa"/>
+          </w:tcPr>
+          <w:p>
+            <w:pPr>
+              <w:keepNext/>
+              <w:spacing w:after="20"/>
+            </w:pPr>
+            <w:r>
+              <w:rPr>
+                <w:b/>
+                <w:sz w:val="19"/>
+              </w:rPr>
+              <w:t>Alta de MON-030 con precio −3200</w:t>
+            </w:r>
+          </w:p>
+        </w:tc>
+        <w:tc>
+          <w:tcPr>
+            <w:tcW w:w="4762" w:type="dxa"/>
+          </w:tcPr>
+          <w:p>
+            <w:pPr>
+              <w:keepNext/>
+              <w:spacing w:after="20"/>
+            </w:pPr>
+            <w:r>
+              <w:rPr>
+                <w:sz w:val="19"/>
+              </w:rPr>
+              <w:t>422 · «El precio no puede ser negativo.»</w:t>
+            </w:r>
+          </w:p>
+        </w:tc>
+        <w:tc>
+          <w:tcPr>
+            <w:tcW w:w="1814" w:type="dxa"/>
+          </w:tcPr>
+          <w:p>
+            <w:pPr>
+              <w:keepNext/>
+              <w:spacing w:after="20"/>
+            </w:pPr>
+            <w:r>
+              <w:rPr>
+                <w:sz w:val="19"/>
+              </w:rPr>
+              <w:t>CP-12</w:t>
+            </w:r>
+          </w:p>
+        </w:tc>
+      </w:tr>
+      <w:tr>
+        <w:trPr>
+          <w:cantSplit/>
+          <w:jc w:val="center"/>
+        </w:trPr>
+        <w:tc>
+          <w:tcPr>
+            <w:tcW w:w="2835" w:type="dxa"/>
+          </w:tcPr>
+          <w:p>
+            <w:pPr>
+              <w:keepNext/>
+              <w:spacing w:after="20"/>
+            </w:pPr>
+            <w:r>
+              <w:rPr>
+                <w:b/>
+                <w:sz w:val="19"/>
+              </w:rPr>
+              <w:t>Alta de MON-030 con existencia −5</w:t>
+            </w:r>
+          </w:p>
+        </w:tc>
+        <w:tc>
+          <w:tcPr>
+            <w:tcW w:w="4762" w:type="dxa"/>
+          </w:tcPr>
+          <w:p>
+            <w:pPr>
+              <w:keepNext/>
+              <w:spacing w:after="20"/>
+            </w:pPr>
+            <w:r>
+              <w:rPr>
+                <w:sz w:val="19"/>
+              </w:rPr>
+              <w:t>422 · «La existencia y el stock mínimo no pueden ser negativos.»</w:t>
+            </w:r>
+          </w:p>
+        </w:tc>
+        <w:tc>
+          <w:tcPr>
+            <w:tcW w:w="1814" w:type="dxa"/>
+          </w:tcPr>
+          <w:p>
+            <w:pPr>
+              <w:keepNext/>
+              <w:spacing w:after="20"/>
+            </w:pPr>
+            <w:r>
+              <w:rPr>
+                <w:sz w:val="19"/>
+              </w:rPr>
+              <w:t>CP-12</w:t>
+            </w:r>
+          </w:p>
+        </w:tc>
+      </w:tr>
+      <w:tr>
+        <w:trPr>
+          <w:cantSplit/>
+          <w:jc w:val="center"/>
+        </w:trPr>
+        <w:tc>
+          <w:tcPr>
+            <w:tcW w:w="2835" w:type="dxa"/>
+          </w:tcPr>
+          <w:p>
+            <w:pPr>
+              <w:keepNext/>
+              <w:spacing w:after="20"/>
+            </w:pPr>
+            <w:r>
+              <w:rPr>
+                <w:b/>
+                <w:sz w:val="19"/>
+              </w:rPr>
+              <w:t>Alta con código «M#1»</w:t>
+            </w:r>
+          </w:p>
+        </w:tc>
+        <w:tc>
+          <w:tcPr>
+            <w:tcW w:w="4762" w:type="dxa"/>
+          </w:tcPr>
+          <w:p>
+            <w:pPr>
+              <w:keepNext/>
+              <w:spacing w:after="20"/>
+            </w:pPr>
+            <w:r>
+              <w:rPr>
+                <w:sz w:val="19"/>
+              </w:rPr>
+              <w:t>422 · «El código debe tener de 3 a 20 caracteres (A-Z, 0-9 o guion).»</w:t>
+            </w:r>
+          </w:p>
+        </w:tc>
+        <w:tc>
+          <w:tcPr>
+            <w:tcW w:w="1814" w:type="dxa"/>
+          </w:tcPr>
+          <w:p>
+            <w:pPr>
+              <w:keepNext/>
+              <w:spacing w:after="20"/>
+            </w:pPr>
+            <w:r>
+              <w:rPr>
+                <w:sz w:val="19"/>
+              </w:rPr>
+              <w:t>CP-12</w:t>
+            </w:r>
+          </w:p>
+        </w:tc>
+      </w:tr>
+      <w:tr>
+        <w:trPr>
+          <w:cantSplit/>
+          <w:jc w:val="center"/>
+        </w:trPr>
+        <w:tc>
+          <w:tcPr>
+            <w:tcW w:w="2835" w:type="dxa"/>
+          </w:tcPr>
+          <w:p>
+            <w:pPr>
+              <w:keepNext/>
+              <w:spacing w:after="20"/>
+            </w:pPr>
+            <w:r>
+              <w:rPr>
+                <w:b/>
+                <w:sz w:val="19"/>
+              </w:rPr>
+              <w:t>Consulta de MON-030</w:t>
+            </w:r>
+          </w:p>
+        </w:tc>
+        <w:tc>
+          <w:tcPr>
+            <w:tcW w:w="4762" w:type="dxa"/>
+          </w:tcPr>
+          <w:p>
+            <w:pPr>
+              <w:keepNext/>
+              <w:spacing w:after="20"/>
+            </w:pPr>
+            <w:r>
+              <w:rPr>
+                <w:sz w:val="19"/>
+              </w:rPr>
+              <w:t>404 · ninguno de los tres intentos se guardó</w:t>
+            </w:r>
+          </w:p>
+        </w:tc>
+        <w:tc>
+          <w:tcPr>
+            <w:tcW w:w="1814" w:type="dxa"/>
+          </w:tcPr>
+          <w:p>
+            <w:pPr>
+              <w:keepNext/>
+              <w:spacing w:after="20"/>
+            </w:pPr>
+            <w:r>
+              <w:rPr>
+                <w:sz w:val="19"/>
+              </w:rPr>
+              <w:t>CP-11, CP-12</w:t>
+            </w:r>
+          </w:p>
+        </w:tc>
+      </w:tr>
+      <w:tr>
+        <w:trPr>
+          <w:cantSplit/>
+          <w:jc w:val="center"/>
+        </w:trPr>
+        <w:tc>
+          <w:tcPr>
+            <w:tcW w:w="2835" w:type="dxa"/>
+          </w:tcPr>
+          <w:p>
+            <w:pPr>
+              <w:keepNext/>
+              <w:spacing w:after="20"/>
+            </w:pPr>
+            <w:r>
+              <w:rPr>
+                <w:b/>
+                <w:sz w:val="19"/>
+              </w:rPr>
+              <w:t>Entrada de 10 piezas de TEC-020</w:t>
+            </w:r>
+          </w:p>
+        </w:tc>
+        <w:tc>
+          <w:tcPr>
+            <w:tcW w:w="4762" w:type="dxa"/>
+          </w:tcPr>
+          <w:p>
+            <w:pPr>
+              <w:keepNext/>
+              <w:spacing w:after="20"/>
+            </w:pPr>
+            <w:r>
+              <w:rPr>
+                <w:sz w:val="19"/>
+              </w:rPr>
+              <w:t>201 · existencia resultante 26, motivo «Compra a proveedor»</w:t>
+            </w:r>
+          </w:p>
+        </w:tc>
+        <w:tc>
+          <w:tcPr>
+            <w:tcW w:w="1814" w:type="dxa"/>
+          </w:tcPr>
+          <w:p>
+            <w:pPr>
+              <w:keepNext/>
+              <w:spacing w:after="20"/>
+            </w:pPr>
+            <w:r>
+              <w:rPr>
+                <w:sz w:val="19"/>
+              </w:rPr>
+              <w:t>CP-13, CP-10</w:t>
+            </w:r>
+          </w:p>
+        </w:tc>
+      </w:tr>
+      <w:tr>
+        <w:trPr>
+          <w:cantSplit/>
+          <w:jc w:val="center"/>
+        </w:trPr>
+        <w:tc>
+          <w:tcPr>
+            <w:tcW w:w="2835" w:type="dxa"/>
+          </w:tcPr>
+          <w:p>
+            <w:pPr>
+              <w:spacing w:after="20"/>
+            </w:pPr>
+            <w:r>
+              <w:rPr>
+                <w:b/>
+                <w:sz w:val="19"/>
+              </w:rPr>
+              <w:t>Historial de movimientos</w:t>
+            </w:r>
+          </w:p>
+        </w:tc>
+        <w:tc>
+          <w:tcPr>
+            <w:tcW w:w="4762" w:type="dxa"/>
+          </w:tcPr>
+          <w:p>
+            <w:pPr>
+              <w:spacing w:after="20"/>
+            </w:pPr>
+            <w:r>
+              <w:rPr>
+                <w:sz w:val="19"/>
+              </w:rPr>
+              <w:t>200 · la entrada (26) y la venta de 4 piezas (16) encabezan la lista</w:t>
+            </w:r>
+          </w:p>
+        </w:tc>
+        <w:tc>
+          <w:tcPr>
+            <w:tcW w:w="1814" w:type="dxa"/>
+          </w:tcPr>
+          <w:p>
+            <w:pPr>
+              <w:spacing w:after="20"/>
+            </w:pPr>
+            <w:r>
+              <w:rPr>
+                <w:sz w:val="19"/>
+              </w:rPr>
+              <w:t>CP-13</w:t>
+            </w:r>
+          </w:p>
+        </w:tc>
+      </w:tr>
+    </w:tbl>
+    <w:p>
+      <w:pPr>
+        <w:spacing w:after="40"/>
+      </w:pPr>
+    </w:p>
+    <w:p>
+      <w:pPr>
+        <w:keepNext/>
+        <w:jc w:val="center"/>
+      </w:pPr>
+      <w:r>
+        <w:rPr>
+          <w:noProof/>
+        </w:rPr>
+        <w:drawing>
+          <wp:inline distT="0" distB="0" distL="0" distR="0" wp14:anchorId="253DCF28" wp14:editId="4F410779">
+            <wp:extent cx="5580000" cy="3138750"/>
+            <wp:effectExtent l="0" t="0" r="0" b="0"/>
+            <wp:docPr id="11" name="Picture 11"/>
+            <wp:cNvGraphicFramePr>
+              <a:graphicFrameLocks xmlns:a="http://schemas.openxmlformats.org/drawingml/2006/main" noChangeAspect="1"/>
+            </wp:cNvGraphicFramePr>
+            <a:graphic xmlns:a="http://schemas.openxmlformats.org/drawingml/2006/main">
+              <a:graphicData uri="http://schemas.openxmlformats.org/drawingml/2006/picture">
+                <pic:pic xmlns:pic="http://schemas.openxmlformats.org/drawingml/2006/picture">
+                  <pic:nvPicPr>
+                    <pic:cNvPr id="0" name="sp-sistema-movimientos.png"/>
+                    <pic:cNvPicPr/>
+                  </pic:nvPicPr>
+                  <pic:blipFill>
+                    <a:blip r:embed="rId17"/>
+                    <a:stretch>
+                      <a:fillRect/>
+                    </a:stretch>
+                  </pic:blipFill>
+                  <pic:spPr>
+                    <a:xfrm>
+                      <a:off x="0" y="0"/>
+                      <a:ext cx="5580000" cy="3138750"/>
+                    </a:xfrm>
+                    <a:prstGeom prst="rect">
+                      <a:avLst/>
+                    </a:prstGeom>
+                  </pic:spPr>
+                </pic:pic>
+              </a:graphicData>
+            </a:graphic>
+          </wp:inline>
+        </w:drawing>
+      </w:r>
+    </w:p>
+    <w:p>
+      <w:pPr>
+        <w:jc w:val="center"/>
+      </w:pPr>
+      <w:r>
+        <w:rPr>
+          <w:i/>
+          <w:color w:val="5D6575"/>
+          <w:sz w:val="18"/>
+        </w:rPr>
+        <w:t>Figura 11. Historial de movimientos (/api/movimientos): la entrada de 10 piezas y la venta de 4 piezas de TEC-020 encabezan la lista.</w:t>
+      </w:r>
+    </w:p>
+    <w:p>
+      <w:pPr>
+        <w:keepNext/>
+        <w:jc w:val="center"/>
+      </w:pPr>
+      <w:r>
+        <w:rPr>
+          <w:noProof/>
+        </w:rPr>
+        <w:drawing>
+          <wp:inline distT="0" distB="0" distL="0" distR="0" wp14:anchorId="0CC893E9" wp14:editId="05DF1B27">
+            <wp:extent cx="5580000" cy="3138750"/>
+            <wp:effectExtent l="0" t="0" r="0" b="0"/>
+            <wp:docPr id="12" name="Picture 12"/>
+            <wp:cNvGraphicFramePr>
+              <a:graphicFrameLocks xmlns:a="http://schemas.openxmlformats.org/drawingml/2006/main" noChangeAspect="1"/>
+            </wp:cNvGraphicFramePr>
+            <a:graphic xmlns:a="http://schemas.openxmlformats.org/drawingml/2006/main">
+              <a:graphicData uri="http://schemas.openxmlformats.org/drawingml/2006/picture">
+                <pic:pic xmlns:pic="http://schemas.openxmlformats.org/drawingml/2006/picture">
+                  <pic:nvPicPr>
+                    <pic:cNvPr id="0" name="sp-sistema-reporte.png"/>
+                    <pic:cNvPicPr/>
+                  </pic:nvPicPr>
+                  <pic:blipFill>
+                    <a:blip r:embed="rId18"/>
+                    <a:stretch>
+                      <a:fillRect/>
+                    </a:stretch>
+                  </pic:blipFill>
+                  <pic:spPr>
+                    <a:xfrm>
+                      <a:off x="0" y="0"/>
+                      <a:ext cx="5580000" cy="3138750"/>
+                    </a:xfrm>
+                    <a:prstGeom prst="rect">
+                      <a:avLst/>
+                    </a:prstGeom>
+                  </pic:spPr>
+                </pic:pic>
+              </a:graphicData>
+            </a:graphic>
+          </wp:inline>
+        </w:drawing>
+      </w:r>
+    </w:p>
+    <w:p>
+      <w:pPr>
+        <w:jc w:val="center"/>
+      </w:pPr>
+      <w:r>
+        <w:rPr>
+          <w:i/>
+          <w:color w:val="5D6575"/>
+          <w:sz w:val="18"/>
+        </w:rPr>
+        <w:t>Figura 12. Reporte de inventario (/api/reporte) con los datos de las Figuras 9 y 10: totales, productos por resurtir (ACC-002, COM-003 y LAP-002) y datos de cada producto.</w:t>
       </w:r>
     </w:p>
     <w:p>
@@ -13216,10 +15833,10 @@
           <w:noProof/>
         </w:rPr>
         <w:drawing>
-          <wp:inline distT="0" distB="0" distL="0" distR="0" wp14:anchorId="2A7D30F1" wp14:editId="1FCB5961">
+          <wp:inline distT="0" distB="0" distL="0" distR="0" wp14:anchorId="5B2161E9" wp14:editId="2AB61112">
             <wp:extent cx="5580000" cy="3138750"/>
             <wp:effectExtent l="0" t="0" r="0" b="0"/>
-            <wp:docPr id="8" name="Picture 8"/>
+            <wp:docPr id="13" name="Picture 13"/>
             <wp:cNvGraphicFramePr>
               <a:graphicFrameLocks xmlns:a="http://schemas.openxmlformats.org/drawingml/2006/main" noChangeAspect="1"/>
             </wp:cNvGraphicFramePr>
@@ -13231,7 +15848,7 @@
                     <pic:cNvPicPr/>
                   </pic:nvPicPr>
                   <pic:blipFill>
-                    <a:blip r:embed="rId14"/>
+                    <a:blip r:embed="rId19"/>
                     <a:stretch>
                       <a:fillRect/>
                     </a:stretch>
@@ -13262,7 +15879,7 @@
           <w:color w:val="5D6575"/>
           <w:sz w:val="18"/>
         </w:rPr>
-        <w:t>Figura 8. Ciclo para repetir las pruebas al corregir un defecto.</w:t>
+        <w:t>Figura 13. Ciclo para repetir las pruebas al corregir un defecto.</w:t>
       </w:r>
     </w:p>
     <w:p>
@@ -13322,7 +15939,7 @@
         <w:t xml:space="preserve">Regresión. </w:t>
       </w:r>
       <w:r>
-        <w:t>Al abrir el Pull Request, GitHub Actions ejecuta los diez casos y el job que inyecta DEF-01 y DEF-02.</w:t>
+        <w:t>Al abrir el Pull Request, GitHub Actions ejecuta los trece casos y el job que inyecta DEF-01 y DEF-02.</w:t>
       </w:r>
     </w:p>
     <w:p>
@@ -13362,7 +15979,7 @@
         <w:spacing w:after="40"/>
       </w:pPr>
       <w:r>
-        <w:t>CP-01 y CP-02, para verificar que se siguen registrando productos válidos y rechazando duplicados.</w:t>
+        <w:t>CP-01, CP-02 y CP-12, para verificar que se siguen registrando productos válidos y rechazando duplicados y datos inválidos.</w:t>
       </w:r>
     </w:p>
     <w:p>
@@ -13380,7 +15997,7 @@
         <w:spacing w:after="40"/>
       </w:pPr>
       <w:r>
-        <w:t>CP-05 y CP-06, para verificar la persistencia de los datos en el archivo.</w:t>
+        <w:t>CP-05, CP-06 y CP-13, para verificar la persistencia de ventas y entradas en el archivo.</w:t>
       </w:r>
     </w:p>
     <w:p>
@@ -13389,7 +16006,7 @@
         <w:spacing w:after="40"/>
       </w:pPr>
       <w:r>
-        <w:t>CP-07 y CP-08, para comprobar la API completa y sus validaciones.</w:t>
+        <w:t>CP-07, CP-08 y CP-11, para comprobar la API completa, sus validaciones y la consulta de productos que no existen.</w:t>
       </w:r>
     </w:p>
     <w:p>
@@ -13606,7 +16223,7 @@
               <w:rPr>
                 <w:sz w:val="19"/>
               </w:rPr>
-              <w:t>Commit 5068771 (rama main)</w:t>
+              <w:t>Commit 1dba0bd (rama main)</w:t>
             </w:r>
           </w:p>
         </w:tc>
@@ -13623,7 +16240,7 @@
               <w:rPr>
                 <w:sz w:val="19"/>
               </w:rPr>
-              <w:t>Commit 5068771 (rama main)</w:t>
+              <w:t>Commit 1dba0bd (rama main)</w:t>
             </w:r>
           </w:p>
         </w:tc>
@@ -13664,7 +16281,7 @@
               <w:rPr>
                 <w:sz w:val="19"/>
               </w:rPr>
-              <w:t>30 de octubre de 2026</w:t>
+              <w:t>31 de octubre de 2026</w:t>
             </w:r>
           </w:p>
         </w:tc>
@@ -13681,7 +16298,7 @@
               <w:rPr>
                 <w:sz w:val="19"/>
               </w:rPr>
-              <w:t>30 de octubre de 2026</w:t>
+              <w:t>31 de octubre de 2026</w:t>
             </w:r>
           </w:p>
         </w:tc>
@@ -13780,7 +16397,7 @@
               <w:rPr>
                 <w:sz w:val="19"/>
               </w:rPr>
-              <w:t>Aprobado: CP-04, CP-06 y CP-08 pasan; regresión 10 de 10</w:t>
+              <w:t>Aprobado: CP-04, CP-06 y CP-08 pasan; regresión 13 de 13</w:t>
             </w:r>
           </w:p>
         </w:tc>
@@ -13797,7 +16414,7 @@
               <w:rPr>
                 <w:sz w:val="19"/>
               </w:rPr>
-              <w:t>Aprobado: CP-09 pasa; regresión 10 de 10</w:t>
+              <w:t>Aprobado: CP-09 pasa; regresión 13 de 13</w:t>
             </w:r>
           </w:p>
         </w:tc>
@@ -13838,7 +16455,7 @@
               <w:rPr>
                 <w:sz w:val="19"/>
               </w:rPr>
-              <w:t>evidencias/regresion/DEF-01 y corregido (JUnit), Figuras 4 y 6, ejecución del CI</w:t>
+              <w:t>evidencias/regresion/DEF-01 y corregido (JUnit), Figuras 6 y 9, ejecución del CI</w:t>
             </w:r>
           </w:p>
         </w:tc>
@@ -13855,7 +16472,7 @@
               <w:rPr>
                 <w:sz w:val="19"/>
               </w:rPr>
-              <w:t>evidencias/regresion/DEF-02 y corregido (JUnit), Figura 4, ejecución del CI</w:t>
+              <w:t>evidencias/regresion/DEF-02 y corregido (JUnit), Figuras 6 y 12, ejecución del CI</w:t>
             </w:r>
           </w:p>
         </w:tc>
@@ -13947,7 +16564,7 @@
         </w:rPr>
         <w:t xml:space="preserve">Repositorio: </w:t>
       </w:r>
-      <w:hyperlink r:id="rId15">
+      <w:hyperlink r:id="rId20">
         <w:r>
           <w:rPr>
             <w:color w:val="1F4E8C"/>
@@ -13967,13 +16584,13 @@
         </w:rPr>
         <w:t xml:space="preserve">Ejecución del CI: </w:t>
       </w:r>
-      <w:hyperlink r:id="rId16">
+      <w:hyperlink r:id="rId21">
         <w:r>
           <w:rPr>
             <w:color w:val="1F4E8C"/>
             <w:u w:val="single"/>
           </w:rPr>
-          <w:t>https://github.com/azharsonix/sistema-inventario-actividad-2/actions/runs/41169506352</w:t>
+          <w:t>https://github.com/azharsonix/sistema-inventario-actividad-2/actions/runs/41176035399</w:t>
         </w:r>
       </w:hyperlink>
       <w:r>
@@ -13990,7 +16607,7 @@
         </w:rPr>
         <w:t xml:space="preserve">Pull Requests: </w:t>
       </w:r>
-      <w:hyperlink r:id="rId17">
+      <w:hyperlink r:id="rId22">
         <w:r>
           <w:rPr>
             <w:color w:val="1F4E8C"/>
@@ -14454,10 +17071,10 @@
           <w:noProof/>
         </w:rPr>
         <w:drawing>
-          <wp:inline distT="0" distB="0" distL="0" distR="0" wp14:anchorId="5730B12F" wp14:editId="020A34D7">
+          <wp:inline distT="0" distB="0" distL="0" distR="0" wp14:anchorId="25B9A8D2" wp14:editId="5E8E4C7D">
             <wp:extent cx="5580000" cy="3138750"/>
             <wp:effectExtent l="0" t="0" r="0" b="0"/>
-            <wp:docPr id="9" name="Picture 9"/>
+            <wp:docPr id="14" name="Picture 14"/>
             <wp:cNvGraphicFramePr>
               <a:graphicFrameLocks xmlns:a="http://schemas.openxmlformats.org/drawingml/2006/main" noChangeAspect="1"/>
             </wp:cNvGraphicFramePr>
@@ -14469,7 +17086,7 @@
                     <pic:cNvPicPr/>
                   </pic:nvPicPr>
                   <pic:blipFill>
-                    <a:blip r:embed="rId18"/>
+                    <a:blip r:embed="rId23"/>
                     <a:stretch>
                       <a:fillRect/>
                     </a:stretch>
@@ -14500,7 +17117,7 @@
           <w:color w:val="5D6575"/>
           <w:sz w:val="18"/>
         </w:rPr>
-        <w:t>Figura 9. Flujo de trabajo: del cambio en el código a la integración (pasos 1 a 5A/5B).</w:t>
+        <w:t>Figura 14. Flujo de trabajo: del cambio en el código a la integración (pasos 1 a 5A/5B).</w:t>
       </w:r>
     </w:p>
     <w:p>
@@ -14513,10 +17130,10 @@
           <w:noProof/>
         </w:rPr>
         <w:drawing>
-          <wp:inline distT="0" distB="0" distL="0" distR="0" wp14:anchorId="5C99CAA2" wp14:editId="12FFA157">
+          <wp:inline distT="0" distB="0" distL="0" distR="0" wp14:anchorId="14194D33" wp14:editId="29B365AF">
             <wp:extent cx="5580000" cy="3138750"/>
             <wp:effectExtent l="0" t="0" r="0" b="0"/>
-            <wp:docPr id="10" name="Picture 10"/>
+            <wp:docPr id="15" name="Picture 15"/>
             <wp:cNvGraphicFramePr>
               <a:graphicFrameLocks xmlns:a="http://schemas.openxmlformats.org/drawingml/2006/main" noChangeAspect="1"/>
             </wp:cNvGraphicFramePr>
@@ -14528,7 +17145,7 @@
                     <pic:cNvPicPr/>
                   </pic:nvPicPr>
                   <pic:blipFill>
-                    <a:blip r:embed="rId19"/>
+                    <a:blip r:embed="rId24"/>
                     <a:stretch>
                       <a:fillRect/>
                     </a:stretch>
@@ -14559,7 +17176,7 @@
           <w:color w:val="5D6575"/>
           <w:sz w:val="18"/>
         </w:rPr>
-        <w:t>Figura 10. Jobs del pipeline y orden de ejecución.</w:t>
+        <w:t>Figura 15. Jobs del pipeline y orden de ejecución.</w:t>
       </w:r>
     </w:p>
     <w:p>
@@ -14572,10 +17189,10 @@
           <w:noProof/>
         </w:rPr>
         <w:drawing>
-          <wp:inline distT="0" distB="0" distL="0" distR="0" wp14:anchorId="73DD5414" wp14:editId="0CEF7C6E">
+          <wp:inline distT="0" distB="0" distL="0" distR="0" wp14:anchorId="6250C157" wp14:editId="4F160D7B">
             <wp:extent cx="5580000" cy="3138750"/>
             <wp:effectExtent l="0" t="0" r="0" b="0"/>
-            <wp:docPr id="11" name="Picture 11"/>
+            <wp:docPr id="16" name="Picture 16"/>
             <wp:cNvGraphicFramePr>
               <a:graphicFrameLocks xmlns:a="http://schemas.openxmlformats.org/drawingml/2006/main" noChangeAspect="1"/>
             </wp:cNvGraphicFramePr>
@@ -14587,7 +17204,7 @@
                     <pic:cNvPicPr/>
                   </pic:nvPicPr>
                   <pic:blipFill>
-                    <a:blip r:embed="rId20"/>
+                    <a:blip r:embed="rId25"/>
                     <a:stretch>
                       <a:fillRect/>
                     </a:stretch>
@@ -14618,7 +17235,7 @@
           <w:color w:val="5D6575"/>
           <w:sz w:val="18"/>
         </w:rPr>
-        <w:t>Figura 11. Ejecución del CI en GitHub Actions con los 8 jobs en verde.</w:t>
+        <w:t>Figura 16. Ejecución del CI en GitHub Actions con los 8 jobs en verde.</w:t>
       </w:r>
     </w:p>
     <w:p>
@@ -14732,6 +17349,12 @@
           <w:sz w:val="17"/>
         </w:rPr>
         <w:br/>
+      </w:r>
+      <w:r>
+        <w:rPr>
+          <w:rFonts w:ascii="Consolas" w:eastAsia="Consolas" w:hAnsi="Consolas"/>
+          <w:sz w:val="17"/>
+        </w:rPr>
         <w:t>concurrency:</w:t>
       </w:r>
       <w:r>
@@ -14810,12 +17433,6 @@
           <w:sz w:val="17"/>
         </w:rPr>
         <w:br/>
-      </w:r>
-      <w:r>
-        <w:rPr>
-          <w:rFonts w:ascii="Consolas" w:eastAsia="Consolas" w:hAnsi="Consolas"/>
-          <w:sz w:val="17"/>
-        </w:rPr>
         <w:t xml:space="preserve">    runs-on: ubuntu-latest</w:t>
       </w:r>
       <w:r>
@@ -14911,7 +17528,7 @@
           <w:sz w:val="17"/>
         </w:rPr>
         <w:br/>
-        <w:t xml:space="preserve">      - name: CP-01 a CP-04</w:t>
+        <w:t xml:space="preserve">      - name: CP-01 a CP-04 y CP-12</w:t>
       </w:r>
       <w:r>
         <w:rPr>
@@ -14919,6 +17536,12 @@
           <w:sz w:val="17"/>
         </w:rPr>
         <w:br/>
+      </w:r>
+      <w:r>
+        <w:rPr>
+          <w:rFonts w:ascii="Consolas" w:eastAsia="Consolas" w:hAnsi="Consolas"/>
+          <w:sz w:val="17"/>
+        </w:rPr>
         <w:t xml:space="preserve">        run: php scripts/ejecutar-pruebas.php --suite=Unitarias</w:t>
       </w:r>
       <w:r>
@@ -14966,12 +17589,6 @@
           <w:sz w:val="17"/>
         </w:rPr>
         <w:br/>
-      </w:r>
-      <w:r>
-        <w:rPr>
-          <w:rFonts w:ascii="Consolas" w:eastAsia="Consolas" w:hAnsi="Consolas"/>
-          <w:sz w:val="17"/>
-        </w:rPr>
         <w:t xml:space="preserve">          path: evidencias/junit-Unitarias.xml</w:t>
       </w:r>
     </w:p>
@@ -15099,7 +17716,7 @@
                 <w:b/>
                 <w:sz w:val="19"/>
               </w:rPr>
-              <w:t>CP-01 y CP-02: registro y duplicados</w:t>
+              <w:t>CP-01, CP-02 y CP-12: registro, duplicados y datos inválidos</w:t>
             </w:r>
           </w:p>
         </w:tc>
@@ -15249,7 +17866,7 @@
                 <w:b/>
                 <w:sz w:val="19"/>
               </w:rPr>
-              <w:t>CP-05 y CP-06: persistencia</w:t>
+              <w:t>CP-05, CP-06 y CP-13: persistencia de ventas y entradas</w:t>
             </w:r>
           </w:p>
         </w:tc>
@@ -15324,7 +17941,7 @@
                 <w:b/>
                 <w:sz w:val="19"/>
               </w:rPr>
-              <w:t>CP-07 y CP-08: API por HTTP</w:t>
+              <w:t>CP-07, CP-08 y CP-11: API por HTTP</w:t>
             </w:r>
           </w:p>
         </w:tc>
@@ -15790,7 +18407,7 @@
               <w:rPr>
                 <w:sz w:val="19"/>
               </w:rPr>
-              <w:t>Los diez casos más el job que inyecta DEF-01 y DEF-02.</w:t>
+              <w:t>Los trece casos más el job que inyecta DEF-01 y DEF-02.</w:t>
             </w:r>
           </w:p>
         </w:tc>
@@ -15932,12 +18549,12 @@
     </w:p>
     <w:p>
       <w:r>
-        <w:t>Escribimos cinco requisitos con criterios verificables, y cada uno quedó cubierto por al menos un caso. Las diez pruebas están automatizadas en cuatro niveles y la ronda 1 terminó con todas aprobadas.</w:t>
+        <w:t>Escribimos cinco requisitos con criterios verificables, y cada uno quedó cubierto por al menos un caso. Los trece casos están automatizados en cuatro niveles y la ronda 1 terminó con todos aprobados. La gráfica de cobertura muestra que RF-05 solo tiene un caso (CP-09), así que es el primer requisito que conviene reforzar.</w:t>
       </w:r>
     </w:p>
     <w:p>
       <w:r>
-        <w:t>Al inyectar los defectos comprobamos que las pruebas los detectan: DEF-01 provocó fallos en tres niveles distintos y DEF-02 en CP-09. La ronda 3 mostró que el porcentaje de aprobación debe leerse junto con la prioridad de lo que falla: un 90 % puede esconder un defecto que afecta a la tienda.</w:t>
+        <w:t>Al inyectar los defectos comprobamos que las pruebas los detectan: DEF-01 provocó fallos en tres niveles distintos y DEF-02 en CP-09. La ronda 3 mostró que el porcentaje de aprobación debe leerse junto con la prioridad de lo que falla: un 92.3 % puede esconder un defecto que afecta a la tienda.</w:t>
       </w:r>
     </w:p>
     <w:p>
@@ -16054,7 +18671,7 @@
               <w:rPr>
                 <w:sz w:val="19"/>
               </w:rPr>
-              <w:t>Ejecuta los 10 casos en la consola.</w:t>
+              <w:t>Ejecuta los 13 casos en la consola.</w:t>
             </w:r>
           </w:p>
         </w:tc>
@@ -16489,31 +19106,31 @@
       </w:rPr>
     </w:lvl>
   </w:abstractNum>
-  <w:num w:numId="1" w16cid:durableId="113866692">
+  <w:num w:numId="1" w16cid:durableId="1343780019">
     <w:abstractNumId w:val="8"/>
   </w:num>
-  <w:num w:numId="2" w16cid:durableId="992173121">
+  <w:num w:numId="2" w16cid:durableId="1332637944">
     <w:abstractNumId w:val="6"/>
   </w:num>
-  <w:num w:numId="3" w16cid:durableId="2004893293">
+  <w:num w:numId="3" w16cid:durableId="780757036">
     <w:abstractNumId w:val="5"/>
   </w:num>
-  <w:num w:numId="4" w16cid:durableId="1229459788">
+  <w:num w:numId="4" w16cid:durableId="1599635426">
     <w:abstractNumId w:val="4"/>
   </w:num>
-  <w:num w:numId="5" w16cid:durableId="753169254">
+  <w:num w:numId="5" w16cid:durableId="111486729">
     <w:abstractNumId w:val="7"/>
   </w:num>
-  <w:num w:numId="6" w16cid:durableId="456678761">
+  <w:num w:numId="6" w16cid:durableId="1738279681">
     <w:abstractNumId w:val="3"/>
   </w:num>
-  <w:num w:numId="7" w16cid:durableId="1818108997">
+  <w:num w:numId="7" w16cid:durableId="1959294850">
     <w:abstractNumId w:val="2"/>
   </w:num>
-  <w:num w:numId="8" w16cid:durableId="2080250563">
+  <w:num w:numId="8" w16cid:durableId="918829384">
     <w:abstractNumId w:val="1"/>
   </w:num>
-  <w:num w:numId="9" w16cid:durableId="1913276362">
+  <w:num w:numId="9" w16cid:durableId="592667260">
     <w:abstractNumId w:val="0"/>
   </w:num>
 </w:numbering>

</xml_diff>

<commit_message>
docs: segunda parte con 15 casos (CP-14 consulta existente y CP-15 proceso completo), gráficas y capturas actualizadas
</commit_message>
<xml_diff>
--- a/docs/Segunda parte/Actividad 2 - Segunda parte - Documento técnico.docx
+++ b/docs/Segunda parte/Actividad 2 - Segunda parte - Documento técnico.docx
@@ -194,7 +194,7 @@
     </w:p>
     <w:p>
       <w:r>
-        <w:t>Trabajamos sobre el sistema que el equipo ya tiene (PHP 8, API JSON y archivo de datos JSON). Escribimos cinco requisitos funcionales, el plan de pruebas, trece casos clasificados por nivel, la bitácora con el porcentaje de aprobación, dos defectos documentados, la propuesta para repetir las pruebas al corregirlos y el flujo de integración continua en GitHub Actions.</w:t>
+        <w:t>Trabajamos sobre el sistema que el equipo ya tiene (PHP 8, API JSON y archivo de datos JSON). Escribimos cinco requisitos funcionales, el plan de pruebas, quince casos clasificados por nivel, la bitácora con el porcentaje de aprobación, dos defectos documentados, la propuesta para repetir las pruebas al corregirlos y el flujo de integración continua en GitHub Actions.</w:t>
       </w:r>
     </w:p>
     <w:p>
@@ -777,7 +777,7 @@
         <w:t xml:space="preserve">Relación entre requisitos y pruebas: </w:t>
       </w:r>
       <w:r>
-        <w:t>cada requisito tiene al menos un caso de prueba que verifica su cumplimiento; a esta relación se le llama trazabilidad. La matriz indica qué casos cubren cada requisito: RF-01 y RF-02 tienen cuatro, RF-03 seis, RF-04 dos y RF-05 uno (Figura 1).</w:t>
+        <w:t>cada requisito tiene al menos un caso de prueba que verifica su cumplimiento; a esta relación se le llama trazabilidad. La matriz indica qué casos cubren cada requisito: RF-01 tiene cinco, RF-02 seis, RF-03 siete, RF-04 tres y RF-05 dos (Figura 1).</w:t>
       </w:r>
     </w:p>
     <w:tbl>
@@ -788,20 +788,22 @@
         <w:tblLook w:val="04A0" w:firstRow="1" w:lastRow="0" w:firstColumn="1" w:lastColumn="0" w:noHBand="0" w:noVBand="1"/>
       </w:tblPr>
       <w:tblGrid>
-        <w:gridCol w:w="696"/>
-        <w:gridCol w:w="696"/>
-        <w:gridCol w:w="696"/>
-        <w:gridCol w:w="696"/>
-        <w:gridCol w:w="696"/>
-        <w:gridCol w:w="696"/>
-        <w:gridCol w:w="696"/>
-        <w:gridCol w:w="696"/>
-        <w:gridCol w:w="696"/>
-        <w:gridCol w:w="696"/>
-        <w:gridCol w:w="696"/>
-        <w:gridCol w:w="696"/>
-        <w:gridCol w:w="696"/>
-        <w:gridCol w:w="696"/>
+        <w:gridCol w:w="609"/>
+        <w:gridCol w:w="609"/>
+        <w:gridCol w:w="609"/>
+        <w:gridCol w:w="609"/>
+        <w:gridCol w:w="609"/>
+        <w:gridCol w:w="609"/>
+        <w:gridCol w:w="609"/>
+        <w:gridCol w:w="609"/>
+        <w:gridCol w:w="609"/>
+        <w:gridCol w:w="609"/>
+        <w:gridCol w:w="609"/>
+        <w:gridCol w:w="609"/>
+        <w:gridCol w:w="609"/>
+        <w:gridCol w:w="609"/>
+        <w:gridCol w:w="609"/>
+        <w:gridCol w:w="609"/>
       </w:tblGrid>
       <w:tr>
         <w:trPr>
@@ -811,7 +813,7 @@
         </w:trPr>
         <w:tc>
           <w:tcPr>
-            <w:tcW w:w="696" w:type="dxa"/>
+            <w:tcW w:w="609" w:type="dxa"/>
             <w:shd w:val="clear" w:color="auto" w:fill="1F4E8C"/>
           </w:tcPr>
           <w:p>
@@ -822,7 +824,7 @@
               <w:rPr>
                 <w:b/>
                 <w:color w:val="FFFFFF"/>
-                <w:sz w:val="18"/>
+                <w:sz w:val="17"/>
               </w:rPr>
               <w:lastRenderedPageBreak/>
               <w:t>RF</w:t>
@@ -831,7 +833,7 @@
         </w:tc>
         <w:tc>
           <w:tcPr>
-            <w:tcW w:w="696" w:type="dxa"/>
+            <w:tcW w:w="609" w:type="dxa"/>
             <w:shd w:val="clear" w:color="auto" w:fill="1F4E8C"/>
           </w:tcPr>
           <w:p>
@@ -842,7 +844,7 @@
               <w:rPr>
                 <w:b/>
                 <w:color w:val="FFFFFF"/>
-                <w:sz w:val="18"/>
+                <w:sz w:val="17"/>
               </w:rPr>
               <w:t>CP</w:t>
             </w:r>
@@ -850,16 +852,23 @@
               <w:rPr>
                 <w:b/>
                 <w:color w:val="FFFFFF"/>
-                <w:sz w:val="18"/>
+                <w:sz w:val="17"/>
               </w:rPr>
               <w:br/>
+            </w:r>
+            <w:r>
+              <w:rPr>
+                <w:b/>
+                <w:color w:val="FFFFFF"/>
+                <w:sz w:val="17"/>
+              </w:rPr>
               <w:t>01</w:t>
             </w:r>
           </w:p>
         </w:tc>
         <w:tc>
           <w:tcPr>
-            <w:tcW w:w="696" w:type="dxa"/>
+            <w:tcW w:w="609" w:type="dxa"/>
             <w:shd w:val="clear" w:color="auto" w:fill="1F4E8C"/>
           </w:tcPr>
           <w:p>
@@ -870,7 +879,7 @@
               <w:rPr>
                 <w:b/>
                 <w:color w:val="FFFFFF"/>
-                <w:sz w:val="18"/>
+                <w:sz w:val="17"/>
               </w:rPr>
               <w:t>CP</w:t>
             </w:r>
@@ -878,7 +887,7 @@
               <w:rPr>
                 <w:b/>
                 <w:color w:val="FFFFFF"/>
-                <w:sz w:val="18"/>
+                <w:sz w:val="17"/>
               </w:rPr>
               <w:br/>
               <w:t>02</w:t>
@@ -887,7 +896,7 @@
         </w:tc>
         <w:tc>
           <w:tcPr>
-            <w:tcW w:w="696" w:type="dxa"/>
+            <w:tcW w:w="609" w:type="dxa"/>
             <w:shd w:val="clear" w:color="auto" w:fill="1F4E8C"/>
           </w:tcPr>
           <w:p>
@@ -898,7 +907,7 @@
               <w:rPr>
                 <w:b/>
                 <w:color w:val="FFFFFF"/>
-                <w:sz w:val="18"/>
+                <w:sz w:val="17"/>
               </w:rPr>
               <w:t>CP</w:t>
             </w:r>
@@ -906,7 +915,7 @@
               <w:rPr>
                 <w:b/>
                 <w:color w:val="FFFFFF"/>
-                <w:sz w:val="18"/>
+                <w:sz w:val="17"/>
               </w:rPr>
               <w:br/>
               <w:t>03</w:t>
@@ -915,7 +924,7 @@
         </w:tc>
         <w:tc>
           <w:tcPr>
-            <w:tcW w:w="696" w:type="dxa"/>
+            <w:tcW w:w="609" w:type="dxa"/>
             <w:shd w:val="clear" w:color="auto" w:fill="1F4E8C"/>
           </w:tcPr>
           <w:p>
@@ -926,7 +935,7 @@
               <w:rPr>
                 <w:b/>
                 <w:color w:val="FFFFFF"/>
-                <w:sz w:val="18"/>
+                <w:sz w:val="17"/>
               </w:rPr>
               <w:t>CP</w:t>
             </w:r>
@@ -934,7 +943,7 @@
               <w:rPr>
                 <w:b/>
                 <w:color w:val="FFFFFF"/>
-                <w:sz w:val="18"/>
+                <w:sz w:val="17"/>
               </w:rPr>
               <w:br/>
               <w:t>04</w:t>
@@ -943,7 +952,7 @@
         </w:tc>
         <w:tc>
           <w:tcPr>
-            <w:tcW w:w="696" w:type="dxa"/>
+            <w:tcW w:w="609" w:type="dxa"/>
             <w:shd w:val="clear" w:color="auto" w:fill="1F4E8C"/>
           </w:tcPr>
           <w:p>
@@ -954,7 +963,7 @@
               <w:rPr>
                 <w:b/>
                 <w:color w:val="FFFFFF"/>
-                <w:sz w:val="18"/>
+                <w:sz w:val="17"/>
               </w:rPr>
               <w:t>CP</w:t>
             </w:r>
@@ -962,7 +971,7 @@
               <w:rPr>
                 <w:b/>
                 <w:color w:val="FFFFFF"/>
-                <w:sz w:val="18"/>
+                <w:sz w:val="17"/>
               </w:rPr>
               <w:br/>
               <w:t>05</w:t>
@@ -971,7 +980,7 @@
         </w:tc>
         <w:tc>
           <w:tcPr>
-            <w:tcW w:w="696" w:type="dxa"/>
+            <w:tcW w:w="609" w:type="dxa"/>
             <w:shd w:val="clear" w:color="auto" w:fill="1F4E8C"/>
           </w:tcPr>
           <w:p>
@@ -982,7 +991,7 @@
               <w:rPr>
                 <w:b/>
                 <w:color w:val="FFFFFF"/>
-                <w:sz w:val="18"/>
+                <w:sz w:val="17"/>
               </w:rPr>
               <w:t>CP</w:t>
             </w:r>
@@ -990,7 +999,7 @@
               <w:rPr>
                 <w:b/>
                 <w:color w:val="FFFFFF"/>
-                <w:sz w:val="18"/>
+                <w:sz w:val="17"/>
               </w:rPr>
               <w:br/>
               <w:t>06</w:t>
@@ -999,7 +1008,7 @@
         </w:tc>
         <w:tc>
           <w:tcPr>
-            <w:tcW w:w="696" w:type="dxa"/>
+            <w:tcW w:w="609" w:type="dxa"/>
             <w:shd w:val="clear" w:color="auto" w:fill="1F4E8C"/>
           </w:tcPr>
           <w:p>
@@ -1010,7 +1019,7 @@
               <w:rPr>
                 <w:b/>
                 <w:color w:val="FFFFFF"/>
-                <w:sz w:val="18"/>
+                <w:sz w:val="17"/>
               </w:rPr>
               <w:t>CP</w:t>
             </w:r>
@@ -1018,7 +1027,7 @@
               <w:rPr>
                 <w:b/>
                 <w:color w:val="FFFFFF"/>
-                <w:sz w:val="18"/>
+                <w:sz w:val="17"/>
               </w:rPr>
               <w:br/>
               <w:t>07</w:t>
@@ -1027,7 +1036,7 @@
         </w:tc>
         <w:tc>
           <w:tcPr>
-            <w:tcW w:w="696" w:type="dxa"/>
+            <w:tcW w:w="609" w:type="dxa"/>
             <w:shd w:val="clear" w:color="auto" w:fill="1F4E8C"/>
           </w:tcPr>
           <w:p>
@@ -1038,7 +1047,7 @@
               <w:rPr>
                 <w:b/>
                 <w:color w:val="FFFFFF"/>
-                <w:sz w:val="18"/>
+                <w:sz w:val="17"/>
               </w:rPr>
               <w:t>CP</w:t>
             </w:r>
@@ -1046,7 +1055,7 @@
               <w:rPr>
                 <w:b/>
                 <w:color w:val="FFFFFF"/>
-                <w:sz w:val="18"/>
+                <w:sz w:val="17"/>
               </w:rPr>
               <w:br/>
               <w:t>08</w:t>
@@ -1055,7 +1064,7 @@
         </w:tc>
         <w:tc>
           <w:tcPr>
-            <w:tcW w:w="696" w:type="dxa"/>
+            <w:tcW w:w="609" w:type="dxa"/>
             <w:shd w:val="clear" w:color="auto" w:fill="1F4E8C"/>
           </w:tcPr>
           <w:p>
@@ -1066,7 +1075,7 @@
               <w:rPr>
                 <w:b/>
                 <w:color w:val="FFFFFF"/>
-                <w:sz w:val="18"/>
+                <w:sz w:val="17"/>
               </w:rPr>
               <w:t>CP</w:t>
             </w:r>
@@ -1074,7 +1083,7 @@
               <w:rPr>
                 <w:b/>
                 <w:color w:val="FFFFFF"/>
-                <w:sz w:val="18"/>
+                <w:sz w:val="17"/>
               </w:rPr>
               <w:br/>
               <w:t>09</w:t>
@@ -1083,7 +1092,7 @@
         </w:tc>
         <w:tc>
           <w:tcPr>
-            <w:tcW w:w="696" w:type="dxa"/>
+            <w:tcW w:w="609" w:type="dxa"/>
             <w:shd w:val="clear" w:color="auto" w:fill="1F4E8C"/>
           </w:tcPr>
           <w:p>
@@ -1094,7 +1103,7 @@
               <w:rPr>
                 <w:b/>
                 <w:color w:val="FFFFFF"/>
-                <w:sz w:val="18"/>
+                <w:sz w:val="17"/>
               </w:rPr>
               <w:t>CP</w:t>
             </w:r>
@@ -1102,7 +1111,7 @@
               <w:rPr>
                 <w:b/>
                 <w:color w:val="FFFFFF"/>
-                <w:sz w:val="18"/>
+                <w:sz w:val="17"/>
               </w:rPr>
               <w:br/>
               <w:t>10</w:t>
@@ -1111,7 +1120,7 @@
         </w:tc>
         <w:tc>
           <w:tcPr>
-            <w:tcW w:w="696" w:type="dxa"/>
+            <w:tcW w:w="609" w:type="dxa"/>
             <w:shd w:val="clear" w:color="auto" w:fill="1F4E8C"/>
           </w:tcPr>
           <w:p>
@@ -1122,7 +1131,7 @@
               <w:rPr>
                 <w:b/>
                 <w:color w:val="FFFFFF"/>
-                <w:sz w:val="18"/>
+                <w:sz w:val="17"/>
               </w:rPr>
               <w:t>CP</w:t>
             </w:r>
@@ -1130,7 +1139,7 @@
               <w:rPr>
                 <w:b/>
                 <w:color w:val="FFFFFF"/>
-                <w:sz w:val="18"/>
+                <w:sz w:val="17"/>
               </w:rPr>
               <w:br/>
               <w:t>11</w:t>
@@ -1139,7 +1148,7 @@
         </w:tc>
         <w:tc>
           <w:tcPr>
-            <w:tcW w:w="696" w:type="dxa"/>
+            <w:tcW w:w="609" w:type="dxa"/>
             <w:shd w:val="clear" w:color="auto" w:fill="1F4E8C"/>
           </w:tcPr>
           <w:p>
@@ -1150,7 +1159,7 @@
               <w:rPr>
                 <w:b/>
                 <w:color w:val="FFFFFF"/>
-                <w:sz w:val="18"/>
+                <w:sz w:val="17"/>
               </w:rPr>
               <w:t>CP</w:t>
             </w:r>
@@ -1158,7 +1167,7 @@
               <w:rPr>
                 <w:b/>
                 <w:color w:val="FFFFFF"/>
-                <w:sz w:val="18"/>
+                <w:sz w:val="17"/>
               </w:rPr>
               <w:br/>
               <w:t>12</w:t>
@@ -1167,7 +1176,7 @@
         </w:tc>
         <w:tc>
           <w:tcPr>
-            <w:tcW w:w="696" w:type="dxa"/>
+            <w:tcW w:w="609" w:type="dxa"/>
             <w:shd w:val="clear" w:color="auto" w:fill="1F4E8C"/>
           </w:tcPr>
           <w:p>
@@ -1178,7 +1187,7 @@
               <w:rPr>
                 <w:b/>
                 <w:color w:val="FFFFFF"/>
-                <w:sz w:val="18"/>
+                <w:sz w:val="17"/>
               </w:rPr>
               <w:t>CP</w:t>
             </w:r>
@@ -1186,10 +1195,66 @@
               <w:rPr>
                 <w:b/>
                 <w:color w:val="FFFFFF"/>
-                <w:sz w:val="18"/>
+                <w:sz w:val="17"/>
               </w:rPr>
               <w:br/>
               <w:t>13</w:t>
+            </w:r>
+          </w:p>
+        </w:tc>
+        <w:tc>
+          <w:tcPr>
+            <w:tcW w:w="609" w:type="dxa"/>
+            <w:shd w:val="clear" w:color="auto" w:fill="1F4E8C"/>
+          </w:tcPr>
+          <w:p>
+            <w:pPr>
+              <w:keepNext/>
+            </w:pPr>
+            <w:r>
+              <w:rPr>
+                <w:b/>
+                <w:color w:val="FFFFFF"/>
+                <w:sz w:val="17"/>
+              </w:rPr>
+              <w:t>CP</w:t>
+            </w:r>
+            <w:r>
+              <w:rPr>
+                <w:b/>
+                <w:color w:val="FFFFFF"/>
+                <w:sz w:val="17"/>
+              </w:rPr>
+              <w:br/>
+              <w:t>14</w:t>
+            </w:r>
+          </w:p>
+        </w:tc>
+        <w:tc>
+          <w:tcPr>
+            <w:tcW w:w="609" w:type="dxa"/>
+            <w:shd w:val="clear" w:color="auto" w:fill="1F4E8C"/>
+          </w:tcPr>
+          <w:p>
+            <w:pPr>
+              <w:keepNext/>
+            </w:pPr>
+            <w:r>
+              <w:rPr>
+                <w:b/>
+                <w:color w:val="FFFFFF"/>
+                <w:sz w:val="17"/>
+              </w:rPr>
+              <w:t>CP</w:t>
+            </w:r>
+            <w:r>
+              <w:rPr>
+                <w:b/>
+                <w:color w:val="FFFFFF"/>
+                <w:sz w:val="17"/>
+              </w:rPr>
+              <w:br/>
+              <w:t>15</w:t>
             </w:r>
           </w:p>
         </w:tc>
@@ -1201,17 +1266,17 @@
         </w:trPr>
         <w:tc>
           <w:tcPr>
-            <w:tcW w:w="696" w:type="dxa"/>
-          </w:tcPr>
-          <w:p>
-            <w:pPr>
-              <w:keepNext/>
-              <w:spacing w:after="20"/>
-            </w:pPr>
-            <w:r>
-              <w:rPr>
-                <w:b/>
-                <w:sz w:val="18"/>
+            <w:tcW w:w="609" w:type="dxa"/>
+          </w:tcPr>
+          <w:p>
+            <w:pPr>
+              <w:keepNext/>
+              <w:spacing w:after="20"/>
+            </w:pPr>
+            <w:r>
+              <w:rPr>
+                <w:b/>
+                <w:sz w:val="17"/>
               </w:rPr>
               <w:t>RF-01</w:t>
             </w:r>
@@ -1219,7 +1284,7 @@
         </w:tc>
         <w:tc>
           <w:tcPr>
-            <w:tcW w:w="696" w:type="dxa"/>
+            <w:tcW w:w="609" w:type="dxa"/>
           </w:tcPr>
           <w:p>
             <w:pPr>
@@ -1229,7 +1294,7 @@
             </w:pPr>
             <w:r>
               <w:rPr>
-                <w:sz w:val="18"/>
+                <w:sz w:val="17"/>
               </w:rPr>
               <w:t>✔</w:t>
             </w:r>
@@ -1237,7 +1302,7 @@
         </w:tc>
         <w:tc>
           <w:tcPr>
-            <w:tcW w:w="696" w:type="dxa"/>
+            <w:tcW w:w="609" w:type="dxa"/>
           </w:tcPr>
           <w:p>
             <w:pPr>
@@ -1247,7 +1312,7 @@
             </w:pPr>
             <w:r>
               <w:rPr>
-                <w:sz w:val="18"/>
+                <w:sz w:val="17"/>
               </w:rPr>
               <w:t>✔</w:t>
             </w:r>
@@ -1255,7 +1320,7 @@
         </w:tc>
         <w:tc>
           <w:tcPr>
-            <w:tcW w:w="696" w:type="dxa"/>
+            <w:tcW w:w="609" w:type="dxa"/>
           </w:tcPr>
           <w:p>
             <w:pPr>
@@ -1267,7 +1332,7 @@
         </w:tc>
         <w:tc>
           <w:tcPr>
-            <w:tcW w:w="696" w:type="dxa"/>
+            <w:tcW w:w="609" w:type="dxa"/>
           </w:tcPr>
           <w:p>
             <w:pPr>
@@ -1279,7 +1344,7 @@
         </w:tc>
         <w:tc>
           <w:tcPr>
-            <w:tcW w:w="696" w:type="dxa"/>
+            <w:tcW w:w="609" w:type="dxa"/>
           </w:tcPr>
           <w:p>
             <w:pPr>
@@ -1291,7 +1356,7 @@
         </w:tc>
         <w:tc>
           <w:tcPr>
-            <w:tcW w:w="696" w:type="dxa"/>
+            <w:tcW w:w="609" w:type="dxa"/>
           </w:tcPr>
           <w:p>
             <w:pPr>
@@ -1303,7 +1368,7 @@
         </w:tc>
         <w:tc>
           <w:tcPr>
-            <w:tcW w:w="696" w:type="dxa"/>
+            <w:tcW w:w="609" w:type="dxa"/>
           </w:tcPr>
           <w:p>
             <w:pPr>
@@ -1313,7 +1378,7 @@
             </w:pPr>
             <w:r>
               <w:rPr>
-                <w:sz w:val="18"/>
+                <w:sz w:val="17"/>
               </w:rPr>
               <w:t>✔</w:t>
             </w:r>
@@ -1321,7 +1386,7 @@
         </w:tc>
         <w:tc>
           <w:tcPr>
-            <w:tcW w:w="696" w:type="dxa"/>
+            <w:tcW w:w="609" w:type="dxa"/>
           </w:tcPr>
           <w:p>
             <w:pPr>
@@ -1333,7 +1398,7 @@
         </w:tc>
         <w:tc>
           <w:tcPr>
-            <w:tcW w:w="696" w:type="dxa"/>
+            <w:tcW w:w="609" w:type="dxa"/>
           </w:tcPr>
           <w:p>
             <w:pPr>
@@ -1345,7 +1410,7 @@
         </w:tc>
         <w:tc>
           <w:tcPr>
-            <w:tcW w:w="696" w:type="dxa"/>
+            <w:tcW w:w="609" w:type="dxa"/>
           </w:tcPr>
           <w:p>
             <w:pPr>
@@ -1357,7 +1422,7 @@
         </w:tc>
         <w:tc>
           <w:tcPr>
-            <w:tcW w:w="696" w:type="dxa"/>
+            <w:tcW w:w="609" w:type="dxa"/>
           </w:tcPr>
           <w:p>
             <w:pPr>
@@ -1369,7 +1434,7 @@
         </w:tc>
         <w:tc>
           <w:tcPr>
-            <w:tcW w:w="696" w:type="dxa"/>
+            <w:tcW w:w="609" w:type="dxa"/>
           </w:tcPr>
           <w:p>
             <w:pPr>
@@ -1379,7 +1444,7 @@
             </w:pPr>
             <w:r>
               <w:rPr>
-                <w:sz w:val="18"/>
+                <w:sz w:val="17"/>
               </w:rPr>
               <w:t>✔</w:t>
             </w:r>
@@ -1387,7 +1452,7 @@
         </w:tc>
         <w:tc>
           <w:tcPr>
-            <w:tcW w:w="696" w:type="dxa"/>
+            <w:tcW w:w="609" w:type="dxa"/>
           </w:tcPr>
           <w:p>
             <w:pPr>
@@ -1395,6 +1460,36 @@
               <w:spacing w:after="20"/>
               <w:jc w:val="center"/>
             </w:pPr>
+          </w:p>
+        </w:tc>
+        <w:tc>
+          <w:tcPr>
+            <w:tcW w:w="609" w:type="dxa"/>
+          </w:tcPr>
+          <w:p>
+            <w:pPr>
+              <w:keepNext/>
+              <w:spacing w:after="20"/>
+              <w:jc w:val="center"/>
+            </w:pPr>
+          </w:p>
+        </w:tc>
+        <w:tc>
+          <w:tcPr>
+            <w:tcW w:w="609" w:type="dxa"/>
+          </w:tcPr>
+          <w:p>
+            <w:pPr>
+              <w:keepNext/>
+              <w:spacing w:after="20"/>
+              <w:jc w:val="center"/>
+            </w:pPr>
+            <w:r>
+              <w:rPr>
+                <w:sz w:val="17"/>
+              </w:rPr>
+              <w:t>✔</w:t>
+            </w:r>
           </w:p>
         </w:tc>
       </w:tr>
@@ -1405,17 +1500,17 @@
         </w:trPr>
         <w:tc>
           <w:tcPr>
-            <w:tcW w:w="696" w:type="dxa"/>
-          </w:tcPr>
-          <w:p>
-            <w:pPr>
-              <w:keepNext/>
-              <w:spacing w:after="20"/>
-            </w:pPr>
-            <w:r>
-              <w:rPr>
-                <w:b/>
-                <w:sz w:val="18"/>
+            <w:tcW w:w="609" w:type="dxa"/>
+          </w:tcPr>
+          <w:p>
+            <w:pPr>
+              <w:keepNext/>
+              <w:spacing w:after="20"/>
+            </w:pPr>
+            <w:r>
+              <w:rPr>
+                <w:b/>
+                <w:sz w:val="17"/>
               </w:rPr>
               <w:t>RF-02</w:t>
             </w:r>
@@ -1423,7 +1518,7 @@
         </w:tc>
         <w:tc>
           <w:tcPr>
-            <w:tcW w:w="696" w:type="dxa"/>
+            <w:tcW w:w="609" w:type="dxa"/>
           </w:tcPr>
           <w:p>
             <w:pPr>
@@ -1435,7 +1530,7 @@
         </w:tc>
         <w:tc>
           <w:tcPr>
-            <w:tcW w:w="696" w:type="dxa"/>
+            <w:tcW w:w="609" w:type="dxa"/>
           </w:tcPr>
           <w:p>
             <w:pPr>
@@ -1447,7 +1542,7 @@
         </w:tc>
         <w:tc>
           <w:tcPr>
-            <w:tcW w:w="696" w:type="dxa"/>
+            <w:tcW w:w="609" w:type="dxa"/>
           </w:tcPr>
           <w:p>
             <w:pPr>
@@ -1459,7 +1554,7 @@
         </w:tc>
         <w:tc>
           <w:tcPr>
-            <w:tcW w:w="696" w:type="dxa"/>
+            <w:tcW w:w="609" w:type="dxa"/>
           </w:tcPr>
           <w:p>
             <w:pPr>
@@ -1471,7 +1566,7 @@
         </w:tc>
         <w:tc>
           <w:tcPr>
-            <w:tcW w:w="696" w:type="dxa"/>
+            <w:tcW w:w="609" w:type="dxa"/>
           </w:tcPr>
           <w:p>
             <w:pPr>
@@ -1481,7 +1576,7 @@
             </w:pPr>
             <w:r>
               <w:rPr>
-                <w:sz w:val="18"/>
+                <w:sz w:val="17"/>
               </w:rPr>
               <w:t>✔</w:t>
             </w:r>
@@ -1489,7 +1584,7 @@
         </w:tc>
         <w:tc>
           <w:tcPr>
-            <w:tcW w:w="696" w:type="dxa"/>
+            <w:tcW w:w="609" w:type="dxa"/>
           </w:tcPr>
           <w:p>
             <w:pPr>
@@ -1501,7 +1596,7 @@
         </w:tc>
         <w:tc>
           <w:tcPr>
-            <w:tcW w:w="696" w:type="dxa"/>
+            <w:tcW w:w="609" w:type="dxa"/>
           </w:tcPr>
           <w:p>
             <w:pPr>
@@ -1511,7 +1606,7 @@
             </w:pPr>
             <w:r>
               <w:rPr>
-                <w:sz w:val="18"/>
+                <w:sz w:val="17"/>
               </w:rPr>
               <w:t>✔</w:t>
             </w:r>
@@ -1519,7 +1614,7 @@
         </w:tc>
         <w:tc>
           <w:tcPr>
-            <w:tcW w:w="696" w:type="dxa"/>
+            <w:tcW w:w="609" w:type="dxa"/>
           </w:tcPr>
           <w:p>
             <w:pPr>
@@ -1531,7 +1626,7 @@
         </w:tc>
         <w:tc>
           <w:tcPr>
-            <w:tcW w:w="696" w:type="dxa"/>
+            <w:tcW w:w="609" w:type="dxa"/>
           </w:tcPr>
           <w:p>
             <w:pPr>
@@ -1543,7 +1638,7 @@
         </w:tc>
         <w:tc>
           <w:tcPr>
-            <w:tcW w:w="696" w:type="dxa"/>
+            <w:tcW w:w="609" w:type="dxa"/>
           </w:tcPr>
           <w:p>
             <w:pPr>
@@ -1553,7 +1648,7 @@
             </w:pPr>
             <w:r>
               <w:rPr>
-                <w:sz w:val="18"/>
+                <w:sz w:val="17"/>
               </w:rPr>
               <w:t>✔</w:t>
             </w:r>
@@ -1561,7 +1656,7 @@
         </w:tc>
         <w:tc>
           <w:tcPr>
-            <w:tcW w:w="696" w:type="dxa"/>
+            <w:tcW w:w="609" w:type="dxa"/>
           </w:tcPr>
           <w:p>
             <w:pPr>
@@ -1571,7 +1666,7 @@
             </w:pPr>
             <w:r>
               <w:rPr>
-                <w:sz w:val="18"/>
+                <w:sz w:val="17"/>
               </w:rPr>
               <w:t>✔</w:t>
             </w:r>
@@ -1579,7 +1674,7 @@
         </w:tc>
         <w:tc>
           <w:tcPr>
-            <w:tcW w:w="696" w:type="dxa"/>
+            <w:tcW w:w="609" w:type="dxa"/>
           </w:tcPr>
           <w:p>
             <w:pPr>
@@ -1591,7 +1686,7 @@
         </w:tc>
         <w:tc>
           <w:tcPr>
-            <w:tcW w:w="696" w:type="dxa"/>
+            <w:tcW w:w="609" w:type="dxa"/>
           </w:tcPr>
           <w:p>
             <w:pPr>
@@ -1599,6 +1694,42 @@
               <w:spacing w:after="20"/>
               <w:jc w:val="center"/>
             </w:pPr>
+          </w:p>
+        </w:tc>
+        <w:tc>
+          <w:tcPr>
+            <w:tcW w:w="609" w:type="dxa"/>
+          </w:tcPr>
+          <w:p>
+            <w:pPr>
+              <w:keepNext/>
+              <w:spacing w:after="20"/>
+              <w:jc w:val="center"/>
+            </w:pPr>
+            <w:r>
+              <w:rPr>
+                <w:sz w:val="17"/>
+              </w:rPr>
+              <w:t>✔</w:t>
+            </w:r>
+          </w:p>
+        </w:tc>
+        <w:tc>
+          <w:tcPr>
+            <w:tcW w:w="609" w:type="dxa"/>
+          </w:tcPr>
+          <w:p>
+            <w:pPr>
+              <w:keepNext/>
+              <w:spacing w:after="20"/>
+              <w:jc w:val="center"/>
+            </w:pPr>
+            <w:r>
+              <w:rPr>
+                <w:sz w:val="17"/>
+              </w:rPr>
+              <w:t>✔</w:t>
+            </w:r>
           </w:p>
         </w:tc>
       </w:tr>
@@ -1609,17 +1740,17 @@
         </w:trPr>
         <w:tc>
           <w:tcPr>
-            <w:tcW w:w="696" w:type="dxa"/>
-          </w:tcPr>
-          <w:p>
-            <w:pPr>
-              <w:keepNext/>
-              <w:spacing w:after="20"/>
-            </w:pPr>
-            <w:r>
-              <w:rPr>
-                <w:b/>
-                <w:sz w:val="18"/>
+            <w:tcW w:w="609" w:type="dxa"/>
+          </w:tcPr>
+          <w:p>
+            <w:pPr>
+              <w:keepNext/>
+              <w:spacing w:after="20"/>
+            </w:pPr>
+            <w:r>
+              <w:rPr>
+                <w:b/>
+                <w:sz w:val="17"/>
               </w:rPr>
               <w:t>RF-03</w:t>
             </w:r>
@@ -1627,7 +1758,7 @@
         </w:tc>
         <w:tc>
           <w:tcPr>
-            <w:tcW w:w="696" w:type="dxa"/>
+            <w:tcW w:w="609" w:type="dxa"/>
           </w:tcPr>
           <w:p>
             <w:pPr>
@@ -1639,7 +1770,7 @@
         </w:tc>
         <w:tc>
           <w:tcPr>
-            <w:tcW w:w="696" w:type="dxa"/>
+            <w:tcW w:w="609" w:type="dxa"/>
           </w:tcPr>
           <w:p>
             <w:pPr>
@@ -1651,7 +1782,7 @@
         </w:tc>
         <w:tc>
           <w:tcPr>
-            <w:tcW w:w="696" w:type="dxa"/>
+            <w:tcW w:w="609" w:type="dxa"/>
           </w:tcPr>
           <w:p>
             <w:pPr>
@@ -1661,7 +1792,7 @@
             </w:pPr>
             <w:r>
               <w:rPr>
-                <w:sz w:val="18"/>
+                <w:sz w:val="17"/>
               </w:rPr>
               <w:t>✔</w:t>
             </w:r>
@@ -1669,7 +1800,7 @@
         </w:tc>
         <w:tc>
           <w:tcPr>
-            <w:tcW w:w="696" w:type="dxa"/>
+            <w:tcW w:w="609" w:type="dxa"/>
           </w:tcPr>
           <w:p>
             <w:pPr>
@@ -1679,7 +1810,7 @@
             </w:pPr>
             <w:r>
               <w:rPr>
-                <w:sz w:val="18"/>
+                <w:sz w:val="17"/>
               </w:rPr>
               <w:t>✔</w:t>
             </w:r>
@@ -1687,7 +1818,7 @@
         </w:tc>
         <w:tc>
           <w:tcPr>
-            <w:tcW w:w="696" w:type="dxa"/>
+            <w:tcW w:w="609" w:type="dxa"/>
           </w:tcPr>
           <w:p>
             <w:pPr>
@@ -1697,7 +1828,7 @@
             </w:pPr>
             <w:r>
               <w:rPr>
-                <w:sz w:val="18"/>
+                <w:sz w:val="17"/>
               </w:rPr>
               <w:t>✔</w:t>
             </w:r>
@@ -1705,7 +1836,7 @@
         </w:tc>
         <w:tc>
           <w:tcPr>
-            <w:tcW w:w="696" w:type="dxa"/>
+            <w:tcW w:w="609" w:type="dxa"/>
           </w:tcPr>
           <w:p>
             <w:pPr>
@@ -1715,7 +1846,7 @@
             </w:pPr>
             <w:r>
               <w:rPr>
-                <w:sz w:val="18"/>
+                <w:sz w:val="17"/>
               </w:rPr>
               <w:t>✔</w:t>
             </w:r>
@@ -1723,7 +1854,7 @@
         </w:tc>
         <w:tc>
           <w:tcPr>
-            <w:tcW w:w="696" w:type="dxa"/>
+            <w:tcW w:w="609" w:type="dxa"/>
           </w:tcPr>
           <w:p>
             <w:pPr>
@@ -1733,7 +1864,7 @@
             </w:pPr>
             <w:r>
               <w:rPr>
-                <w:sz w:val="18"/>
+                <w:sz w:val="17"/>
               </w:rPr>
               <w:t>✔</w:t>
             </w:r>
@@ -1741,7 +1872,7 @@
         </w:tc>
         <w:tc>
           <w:tcPr>
-            <w:tcW w:w="696" w:type="dxa"/>
+            <w:tcW w:w="609" w:type="dxa"/>
           </w:tcPr>
           <w:p>
             <w:pPr>
@@ -1751,7 +1882,7 @@
             </w:pPr>
             <w:r>
               <w:rPr>
-                <w:sz w:val="18"/>
+                <w:sz w:val="17"/>
               </w:rPr>
               <w:t>✔</w:t>
             </w:r>
@@ -1759,7 +1890,7 @@
         </w:tc>
         <w:tc>
           <w:tcPr>
-            <w:tcW w:w="696" w:type="dxa"/>
+            <w:tcW w:w="609" w:type="dxa"/>
           </w:tcPr>
           <w:p>
             <w:pPr>
@@ -1771,7 +1902,7 @@
         </w:tc>
         <w:tc>
           <w:tcPr>
-            <w:tcW w:w="696" w:type="dxa"/>
+            <w:tcW w:w="609" w:type="dxa"/>
           </w:tcPr>
           <w:p>
             <w:pPr>
@@ -1783,7 +1914,7 @@
         </w:tc>
         <w:tc>
           <w:tcPr>
-            <w:tcW w:w="696" w:type="dxa"/>
+            <w:tcW w:w="609" w:type="dxa"/>
           </w:tcPr>
           <w:p>
             <w:pPr>
@@ -1795,7 +1926,7 @@
         </w:tc>
         <w:tc>
           <w:tcPr>
-            <w:tcW w:w="696" w:type="dxa"/>
+            <w:tcW w:w="609" w:type="dxa"/>
           </w:tcPr>
           <w:p>
             <w:pPr>
@@ -1807,7 +1938,7 @@
         </w:tc>
         <w:tc>
           <w:tcPr>
-            <w:tcW w:w="696" w:type="dxa"/>
+            <w:tcW w:w="609" w:type="dxa"/>
           </w:tcPr>
           <w:p>
             <w:pPr>
@@ -1815,6 +1946,36 @@
               <w:spacing w:after="20"/>
               <w:jc w:val="center"/>
             </w:pPr>
+          </w:p>
+        </w:tc>
+        <w:tc>
+          <w:tcPr>
+            <w:tcW w:w="609" w:type="dxa"/>
+          </w:tcPr>
+          <w:p>
+            <w:pPr>
+              <w:keepNext/>
+              <w:spacing w:after="20"/>
+              <w:jc w:val="center"/>
+            </w:pPr>
+          </w:p>
+        </w:tc>
+        <w:tc>
+          <w:tcPr>
+            <w:tcW w:w="609" w:type="dxa"/>
+          </w:tcPr>
+          <w:p>
+            <w:pPr>
+              <w:keepNext/>
+              <w:spacing w:after="20"/>
+              <w:jc w:val="center"/>
+            </w:pPr>
+            <w:r>
+              <w:rPr>
+                <w:sz w:val="17"/>
+              </w:rPr>
+              <w:t>✔</w:t>
+            </w:r>
           </w:p>
         </w:tc>
       </w:tr>
@@ -1825,17 +1986,17 @@
         </w:trPr>
         <w:tc>
           <w:tcPr>
-            <w:tcW w:w="696" w:type="dxa"/>
-          </w:tcPr>
-          <w:p>
-            <w:pPr>
-              <w:keepNext/>
-              <w:spacing w:after="20"/>
-            </w:pPr>
-            <w:r>
-              <w:rPr>
-                <w:b/>
-                <w:sz w:val="18"/>
+            <w:tcW w:w="609" w:type="dxa"/>
+          </w:tcPr>
+          <w:p>
+            <w:pPr>
+              <w:keepNext/>
+              <w:spacing w:after="20"/>
+            </w:pPr>
+            <w:r>
+              <w:rPr>
+                <w:b/>
+                <w:sz w:val="17"/>
               </w:rPr>
               <w:t>RF-04</w:t>
             </w:r>
@@ -1843,7 +2004,7 @@
         </w:tc>
         <w:tc>
           <w:tcPr>
-            <w:tcW w:w="696" w:type="dxa"/>
+            <w:tcW w:w="609" w:type="dxa"/>
           </w:tcPr>
           <w:p>
             <w:pPr>
@@ -1855,7 +2016,7 @@
         </w:tc>
         <w:tc>
           <w:tcPr>
-            <w:tcW w:w="696" w:type="dxa"/>
+            <w:tcW w:w="609" w:type="dxa"/>
           </w:tcPr>
           <w:p>
             <w:pPr>
@@ -1867,7 +2028,7 @@
         </w:tc>
         <w:tc>
           <w:tcPr>
-            <w:tcW w:w="696" w:type="dxa"/>
+            <w:tcW w:w="609" w:type="dxa"/>
           </w:tcPr>
           <w:p>
             <w:pPr>
@@ -1879,7 +2040,7 @@
         </w:tc>
         <w:tc>
           <w:tcPr>
-            <w:tcW w:w="696" w:type="dxa"/>
+            <w:tcW w:w="609" w:type="dxa"/>
           </w:tcPr>
           <w:p>
             <w:pPr>
@@ -1891,7 +2052,7 @@
         </w:tc>
         <w:tc>
           <w:tcPr>
-            <w:tcW w:w="696" w:type="dxa"/>
+            <w:tcW w:w="609" w:type="dxa"/>
           </w:tcPr>
           <w:p>
             <w:pPr>
@@ -1903,7 +2064,7 @@
         </w:tc>
         <w:tc>
           <w:tcPr>
-            <w:tcW w:w="696" w:type="dxa"/>
+            <w:tcW w:w="609" w:type="dxa"/>
           </w:tcPr>
           <w:p>
             <w:pPr>
@@ -1915,7 +2076,7 @@
         </w:tc>
         <w:tc>
           <w:tcPr>
-            <w:tcW w:w="696" w:type="dxa"/>
+            <w:tcW w:w="609" w:type="dxa"/>
           </w:tcPr>
           <w:p>
             <w:pPr>
@@ -1927,7 +2088,7 @@
         </w:tc>
         <w:tc>
           <w:tcPr>
-            <w:tcW w:w="696" w:type="dxa"/>
+            <w:tcW w:w="609" w:type="dxa"/>
           </w:tcPr>
           <w:p>
             <w:pPr>
@@ -1939,7 +2100,7 @@
         </w:tc>
         <w:tc>
           <w:tcPr>
-            <w:tcW w:w="696" w:type="dxa"/>
+            <w:tcW w:w="609" w:type="dxa"/>
           </w:tcPr>
           <w:p>
             <w:pPr>
@@ -1951,7 +2112,7 @@
         </w:tc>
         <w:tc>
           <w:tcPr>
-            <w:tcW w:w="696" w:type="dxa"/>
+            <w:tcW w:w="609" w:type="dxa"/>
           </w:tcPr>
           <w:p>
             <w:pPr>
@@ -1961,7 +2122,7 @@
             </w:pPr>
             <w:r>
               <w:rPr>
-                <w:sz w:val="18"/>
+                <w:sz w:val="17"/>
               </w:rPr>
               <w:t>✔</w:t>
             </w:r>
@@ -1969,7 +2130,7 @@
         </w:tc>
         <w:tc>
           <w:tcPr>
-            <w:tcW w:w="696" w:type="dxa"/>
+            <w:tcW w:w="609" w:type="dxa"/>
           </w:tcPr>
           <w:p>
             <w:pPr>
@@ -1981,7 +2142,7 @@
         </w:tc>
         <w:tc>
           <w:tcPr>
-            <w:tcW w:w="696" w:type="dxa"/>
+            <w:tcW w:w="609" w:type="dxa"/>
           </w:tcPr>
           <w:p>
             <w:pPr>
@@ -1993,7 +2154,7 @@
         </w:tc>
         <w:tc>
           <w:tcPr>
-            <w:tcW w:w="696" w:type="dxa"/>
+            <w:tcW w:w="609" w:type="dxa"/>
           </w:tcPr>
           <w:p>
             <w:pPr>
@@ -2003,7 +2164,37 @@
             </w:pPr>
             <w:r>
               <w:rPr>
-                <w:sz w:val="18"/>
+                <w:sz w:val="17"/>
+              </w:rPr>
+              <w:t>✔</w:t>
+            </w:r>
+          </w:p>
+        </w:tc>
+        <w:tc>
+          <w:tcPr>
+            <w:tcW w:w="609" w:type="dxa"/>
+          </w:tcPr>
+          <w:p>
+            <w:pPr>
+              <w:keepNext/>
+              <w:spacing w:after="20"/>
+              <w:jc w:val="center"/>
+            </w:pPr>
+          </w:p>
+        </w:tc>
+        <w:tc>
+          <w:tcPr>
+            <w:tcW w:w="609" w:type="dxa"/>
+          </w:tcPr>
+          <w:p>
+            <w:pPr>
+              <w:keepNext/>
+              <w:spacing w:after="20"/>
+              <w:jc w:val="center"/>
+            </w:pPr>
+            <w:r>
+              <w:rPr>
+                <w:sz w:val="17"/>
               </w:rPr>
               <w:t>✔</w:t>
             </w:r>
@@ -2017,16 +2208,16 @@
         </w:trPr>
         <w:tc>
           <w:tcPr>
-            <w:tcW w:w="696" w:type="dxa"/>
-          </w:tcPr>
-          <w:p>
-            <w:pPr>
-              <w:spacing w:after="20"/>
-            </w:pPr>
-            <w:r>
-              <w:rPr>
-                <w:b/>
-                <w:sz w:val="18"/>
+            <w:tcW w:w="609" w:type="dxa"/>
+          </w:tcPr>
+          <w:p>
+            <w:pPr>
+              <w:spacing w:after="20"/>
+            </w:pPr>
+            <w:r>
+              <w:rPr>
+                <w:b/>
+                <w:sz w:val="17"/>
               </w:rPr>
               <w:t>RF-05</w:t>
             </w:r>
@@ -2034,7 +2225,7 @@
         </w:tc>
         <w:tc>
           <w:tcPr>
-            <w:tcW w:w="696" w:type="dxa"/>
+            <w:tcW w:w="609" w:type="dxa"/>
           </w:tcPr>
           <w:p>
             <w:pPr>
@@ -2045,7 +2236,7 @@
         </w:tc>
         <w:tc>
           <w:tcPr>
-            <w:tcW w:w="696" w:type="dxa"/>
+            <w:tcW w:w="609" w:type="dxa"/>
           </w:tcPr>
           <w:p>
             <w:pPr>
@@ -2056,7 +2247,7 @@
         </w:tc>
         <w:tc>
           <w:tcPr>
-            <w:tcW w:w="696" w:type="dxa"/>
+            <w:tcW w:w="609" w:type="dxa"/>
           </w:tcPr>
           <w:p>
             <w:pPr>
@@ -2067,7 +2258,7 @@
         </w:tc>
         <w:tc>
           <w:tcPr>
-            <w:tcW w:w="696" w:type="dxa"/>
+            <w:tcW w:w="609" w:type="dxa"/>
           </w:tcPr>
           <w:p>
             <w:pPr>
@@ -2078,7 +2269,7 @@
         </w:tc>
         <w:tc>
           <w:tcPr>
-            <w:tcW w:w="696" w:type="dxa"/>
+            <w:tcW w:w="609" w:type="dxa"/>
           </w:tcPr>
           <w:p>
             <w:pPr>
@@ -2089,7 +2280,7 @@
         </w:tc>
         <w:tc>
           <w:tcPr>
-            <w:tcW w:w="696" w:type="dxa"/>
+            <w:tcW w:w="609" w:type="dxa"/>
           </w:tcPr>
           <w:p>
             <w:pPr>
@@ -2100,7 +2291,7 @@
         </w:tc>
         <w:tc>
           <w:tcPr>
-            <w:tcW w:w="696" w:type="dxa"/>
+            <w:tcW w:w="609" w:type="dxa"/>
           </w:tcPr>
           <w:p>
             <w:pPr>
@@ -2111,7 +2302,7 @@
         </w:tc>
         <w:tc>
           <w:tcPr>
-            <w:tcW w:w="696" w:type="dxa"/>
+            <w:tcW w:w="609" w:type="dxa"/>
           </w:tcPr>
           <w:p>
             <w:pPr>
@@ -2122,7 +2313,7 @@
         </w:tc>
         <w:tc>
           <w:tcPr>
-            <w:tcW w:w="696" w:type="dxa"/>
+            <w:tcW w:w="609" w:type="dxa"/>
           </w:tcPr>
           <w:p>
             <w:pPr>
@@ -2131,7 +2322,7 @@
             </w:pPr>
             <w:r>
               <w:rPr>
-                <w:sz w:val="18"/>
+                <w:sz w:val="17"/>
               </w:rPr>
               <w:t>✔</w:t>
             </w:r>
@@ -2139,7 +2330,7 @@
         </w:tc>
         <w:tc>
           <w:tcPr>
-            <w:tcW w:w="696" w:type="dxa"/>
+            <w:tcW w:w="609" w:type="dxa"/>
           </w:tcPr>
           <w:p>
             <w:pPr>
@@ -2150,7 +2341,7 @@
         </w:tc>
         <w:tc>
           <w:tcPr>
-            <w:tcW w:w="696" w:type="dxa"/>
+            <w:tcW w:w="609" w:type="dxa"/>
           </w:tcPr>
           <w:p>
             <w:pPr>
@@ -2161,7 +2352,7 @@
         </w:tc>
         <w:tc>
           <w:tcPr>
-            <w:tcW w:w="696" w:type="dxa"/>
+            <w:tcW w:w="609" w:type="dxa"/>
           </w:tcPr>
           <w:p>
             <w:pPr>
@@ -2172,13 +2363,41 @@
         </w:tc>
         <w:tc>
           <w:tcPr>
-            <w:tcW w:w="696" w:type="dxa"/>
+            <w:tcW w:w="609" w:type="dxa"/>
           </w:tcPr>
           <w:p>
             <w:pPr>
               <w:spacing w:after="20"/>
               <w:jc w:val="center"/>
             </w:pPr>
+          </w:p>
+        </w:tc>
+        <w:tc>
+          <w:tcPr>
+            <w:tcW w:w="609" w:type="dxa"/>
+          </w:tcPr>
+          <w:p>
+            <w:pPr>
+              <w:spacing w:after="20"/>
+              <w:jc w:val="center"/>
+            </w:pPr>
+          </w:p>
+        </w:tc>
+        <w:tc>
+          <w:tcPr>
+            <w:tcW w:w="609" w:type="dxa"/>
+          </w:tcPr>
+          <w:p>
+            <w:pPr>
+              <w:spacing w:after="20"/>
+              <w:jc w:val="center"/>
+            </w:pPr>
+            <w:r>
+              <w:rPr>
+                <w:sz w:val="17"/>
+              </w:rPr>
+              <w:t>✔</w:t>
+            </w:r>
           </w:p>
         </w:tc>
       </w:tr>
@@ -2198,7 +2417,7 @@
           <w:noProof/>
         </w:rPr>
         <w:drawing>
-          <wp:inline distT="0" distB="0" distL="0" distR="0" wp14:anchorId="22CFB850" wp14:editId="15DE8758">
+          <wp:inline distT="0" distB="0" distL="0" distR="0" wp14:anchorId="5E59B249" wp14:editId="32197077">
             <wp:extent cx="5580000" cy="3138750"/>
             <wp:effectExtent l="0" t="0" r="0" b="0"/>
             <wp:docPr id="1" name="Picture 1"/>
@@ -3087,7 +3306,7 @@
               <w:rPr>
                 <w:sz w:val="19"/>
               </w:rPr>
-              <w:t>Valida que el sistema cumpla lo que necesita la tienda (CP-09 y CP-10).</w:t>
+              <w:t>Valida que el sistema cumpla lo que necesita la tienda (CP-09, CP-10 y CP-15).</w:t>
             </w:r>
           </w:p>
         </w:tc>
@@ -4910,7 +5129,7 @@
         <w:spacing w:after="40"/>
       </w:pPr>
       <w:r>
-        <w:t>Los trece casos planificados se ejecutaron.</w:t>
+        <w:t>Los quince casos planificados se ejecutaron.</w:t>
       </w:r>
     </w:p>
     <w:p>
@@ -4959,7 +5178,7 @@
     </w:p>
     <w:p>
       <w:r>
-        <w:t>Diseñamos trece casos (la práctica pide al menos seis). Cada uno está automatizado y lleva su ID en el nombre de la prueba, por lo que el reporte y GitHub Actions muestran la misma clave que este documento.</w:t>
+        <w:t>Diseñamos quince casos (la práctica pide al menos seis). Cada uno está automatizado y lleva su ID en el nombre de la prueba, por lo que el reporte y GitHub Actions muestran la misma clave que este documento.</w:t>
       </w:r>
     </w:p>
     <w:p>
@@ -9720,6 +9939,782 @@
     </w:p>
     <w:p>
       <w:pPr>
+        <w:pStyle w:val="Ttulo3"/>
+      </w:pPr>
+      <w:r>
+        <w:t>Caso de prueba CP-14: Consulta de producto existente</w:t>
+      </w:r>
+    </w:p>
+    <w:tbl>
+      <w:tblPr>
+        <w:tblStyle w:val="Tablaconcuadrcula"/>
+        <w:tblW w:w="0" w:type="auto"/>
+        <w:tblLook w:val="04A0" w:firstRow="1" w:lastRow="0" w:firstColumn="1" w:lastColumn="0" w:noHBand="0" w:noVBand="1"/>
+      </w:tblPr>
+      <w:tblGrid>
+        <w:gridCol w:w="2154"/>
+        <w:gridCol w:w="7257"/>
+      </w:tblGrid>
+      <w:tr>
+        <w:trPr>
+          <w:cantSplit/>
+        </w:trPr>
+        <w:tc>
+          <w:tcPr>
+            <w:tcW w:w="2154" w:type="dxa"/>
+            <w:shd w:val="clear" w:color="auto" w:fill="E8F0FB"/>
+          </w:tcPr>
+          <w:p>
+            <w:pPr>
+              <w:keepNext/>
+            </w:pPr>
+            <w:r>
+              <w:rPr>
+                <w:b/>
+                <w:sz w:val="20"/>
+              </w:rPr>
+              <w:t>Caso</w:t>
+            </w:r>
+          </w:p>
+        </w:tc>
+        <w:tc>
+          <w:tcPr>
+            <w:tcW w:w="7257" w:type="dxa"/>
+          </w:tcPr>
+          <w:p>
+            <w:pPr>
+              <w:keepNext/>
+              <w:spacing w:after="20"/>
+            </w:pPr>
+            <w:r>
+              <w:rPr>
+                <w:sz w:val="20"/>
+              </w:rPr>
+              <w:t>CP-14 – Consulta válida (integración)</w:t>
+            </w:r>
+          </w:p>
+        </w:tc>
+      </w:tr>
+      <w:tr>
+        <w:trPr>
+          <w:cantSplit/>
+        </w:trPr>
+        <w:tc>
+          <w:tcPr>
+            <w:tcW w:w="2154" w:type="dxa"/>
+            <w:shd w:val="clear" w:color="auto" w:fill="E8F0FB"/>
+          </w:tcPr>
+          <w:p>
+            <w:pPr>
+              <w:keepNext/>
+            </w:pPr>
+            <w:r>
+              <w:rPr>
+                <w:b/>
+                <w:sz w:val="20"/>
+              </w:rPr>
+              <w:t>Requisito asociado</w:t>
+            </w:r>
+          </w:p>
+        </w:tc>
+        <w:tc>
+          <w:tcPr>
+            <w:tcW w:w="7257" w:type="dxa"/>
+          </w:tcPr>
+          <w:p>
+            <w:pPr>
+              <w:keepNext/>
+              <w:spacing w:after="20"/>
+            </w:pPr>
+            <w:r>
+              <w:rPr>
+                <w:sz w:val="20"/>
+              </w:rPr>
+              <w:t>RF-02</w:t>
+            </w:r>
+          </w:p>
+        </w:tc>
+      </w:tr>
+      <w:tr>
+        <w:trPr>
+          <w:cantSplit/>
+        </w:trPr>
+        <w:tc>
+          <w:tcPr>
+            <w:tcW w:w="2154" w:type="dxa"/>
+            <w:shd w:val="clear" w:color="auto" w:fill="E8F0FB"/>
+          </w:tcPr>
+          <w:p>
+            <w:pPr>
+              <w:keepNext/>
+            </w:pPr>
+            <w:r>
+              <w:rPr>
+                <w:b/>
+                <w:sz w:val="20"/>
+              </w:rPr>
+              <w:t>Objetivo</w:t>
+            </w:r>
+          </w:p>
+        </w:tc>
+        <w:tc>
+          <w:tcPr>
+            <w:tcW w:w="7257" w:type="dxa"/>
+          </w:tcPr>
+          <w:p>
+            <w:pPr>
+              <w:keepNext/>
+              <w:spacing w:after="20"/>
+            </w:pPr>
+            <w:r>
+              <w:rPr>
+                <w:sz w:val="20"/>
+              </w:rPr>
+              <w:t>Comprobar que al consultar un producto guardado en el archivo se obtienen sus datos y su existencia, sin modificar el archivo.</w:t>
+            </w:r>
+          </w:p>
+        </w:tc>
+      </w:tr>
+      <w:tr>
+        <w:trPr>
+          <w:cantSplit/>
+        </w:trPr>
+        <w:tc>
+          <w:tcPr>
+            <w:tcW w:w="2154" w:type="dxa"/>
+            <w:shd w:val="clear" w:color="auto" w:fill="E8F0FB"/>
+          </w:tcPr>
+          <w:p>
+            <w:pPr>
+              <w:keepNext/>
+            </w:pPr>
+            <w:r>
+              <w:rPr>
+                <w:b/>
+                <w:sz w:val="20"/>
+              </w:rPr>
+              <w:t>Precondición</w:t>
+            </w:r>
+          </w:p>
+        </w:tc>
+        <w:tc>
+          <w:tcPr>
+            <w:tcW w:w="7257" w:type="dxa"/>
+          </w:tcPr>
+          <w:p>
+            <w:pPr>
+              <w:keepNext/>
+              <w:spacing w:after="20"/>
+            </w:pPr>
+            <w:r>
+              <w:rPr>
+                <w:sz w:val="20"/>
+              </w:rPr>
+              <w:t>Archivo JSON con LAP-001 (10), MOU-010 (30) y TEC-020 (Teclado USB, 20, mín. 5).</w:t>
+            </w:r>
+          </w:p>
+        </w:tc>
+      </w:tr>
+      <w:tr>
+        <w:trPr>
+          <w:cantSplit/>
+        </w:trPr>
+        <w:tc>
+          <w:tcPr>
+            <w:tcW w:w="2154" w:type="dxa"/>
+            <w:shd w:val="clear" w:color="auto" w:fill="E8F0FB"/>
+          </w:tcPr>
+          <w:p>
+            <w:pPr>
+              <w:keepNext/>
+            </w:pPr>
+            <w:r>
+              <w:rPr>
+                <w:b/>
+                <w:sz w:val="20"/>
+              </w:rPr>
+              <w:t>Datos de entrada</w:t>
+            </w:r>
+          </w:p>
+        </w:tc>
+        <w:tc>
+          <w:tcPr>
+            <w:tcW w:w="7257" w:type="dxa"/>
+          </w:tcPr>
+          <w:p>
+            <w:pPr>
+              <w:keepNext/>
+              <w:spacing w:after="20"/>
+            </w:pPr>
+            <w:r>
+              <w:rPr>
+                <w:sz w:val="20"/>
+              </w:rPr>
+              <w:t>Código: « tec-020 » (con espacios y en minúsculas).</w:t>
+            </w:r>
+          </w:p>
+        </w:tc>
+      </w:tr>
+      <w:tr>
+        <w:trPr>
+          <w:cantSplit/>
+        </w:trPr>
+        <w:tc>
+          <w:tcPr>
+            <w:tcW w:w="2154" w:type="dxa"/>
+            <w:shd w:val="clear" w:color="auto" w:fill="E8F0FB"/>
+          </w:tcPr>
+          <w:p>
+            <w:pPr>
+              <w:keepNext/>
+            </w:pPr>
+            <w:r>
+              <w:rPr>
+                <w:b/>
+                <w:sz w:val="20"/>
+              </w:rPr>
+              <w:t>Procedimiento</w:t>
+            </w:r>
+          </w:p>
+        </w:tc>
+        <w:tc>
+          <w:tcPr>
+            <w:tcW w:w="7257" w:type="dxa"/>
+          </w:tcPr>
+          <w:p>
+            <w:pPr>
+              <w:keepNext/>
+              <w:spacing w:after="20"/>
+            </w:pPr>
+            <w:r>
+              <w:rPr>
+                <w:sz w:val="20"/>
+              </w:rPr>
+              <w:t>1. Guardar una copia del archivo.</w:t>
+            </w:r>
+          </w:p>
+          <w:p>
+            <w:pPr>
+              <w:keepNext/>
+              <w:spacing w:after="20"/>
+            </w:pPr>
+            <w:r>
+              <w:rPr>
+                <w:sz w:val="20"/>
+              </w:rPr>
+              <w:t>2. Abrir el archivo con un repositorio nuevo.</w:t>
+            </w:r>
+          </w:p>
+          <w:p>
+            <w:pPr>
+              <w:keepNext/>
+              <w:spacing w:after="20"/>
+            </w:pPr>
+            <w:r>
+              <w:rPr>
+                <w:sz w:val="20"/>
+              </w:rPr>
+              <w:t>3. Consultar TEC-020 y la existencia de todos.</w:t>
+            </w:r>
+          </w:p>
+          <w:p>
+            <w:pPr>
+              <w:keepNext/>
+              <w:spacing w:after="20"/>
+            </w:pPr>
+            <w:r>
+              <w:rPr>
+                <w:sz w:val="20"/>
+              </w:rPr>
+              <w:t>4. Comparar el archivo con la copia.</w:t>
+            </w:r>
+          </w:p>
+        </w:tc>
+      </w:tr>
+      <w:tr>
+        <w:trPr>
+          <w:cantSplit/>
+        </w:trPr>
+        <w:tc>
+          <w:tcPr>
+            <w:tcW w:w="2154" w:type="dxa"/>
+            <w:shd w:val="clear" w:color="auto" w:fill="E8F0FB"/>
+          </w:tcPr>
+          <w:p>
+            <w:pPr>
+              <w:keepNext/>
+            </w:pPr>
+            <w:r>
+              <w:rPr>
+                <w:b/>
+                <w:sz w:val="20"/>
+              </w:rPr>
+              <w:t>Resultado esperado</w:t>
+            </w:r>
+          </w:p>
+        </w:tc>
+        <w:tc>
+          <w:tcPr>
+            <w:tcW w:w="7257" w:type="dxa"/>
+          </w:tcPr>
+          <w:p>
+            <w:pPr>
+              <w:keepNext/>
+              <w:spacing w:after="20"/>
+            </w:pPr>
+            <w:r>
+              <w:rPr>
+                <w:sz w:val="20"/>
+              </w:rPr>
+              <w:t>TEC-020: Teclado USB, Periféricos, $250.00, existencia 20, mínimo 5. Existencias: LAP-001 10, MOU-010 30, TEC-020 20. El archivo queda idéntico.</w:t>
+            </w:r>
+          </w:p>
+        </w:tc>
+      </w:tr>
+      <w:tr>
+        <w:trPr>
+          <w:cantSplit/>
+        </w:trPr>
+        <w:tc>
+          <w:tcPr>
+            <w:tcW w:w="2154" w:type="dxa"/>
+            <w:shd w:val="clear" w:color="auto" w:fill="E8F0FB"/>
+          </w:tcPr>
+          <w:p>
+            <w:r>
+              <w:rPr>
+                <w:b/>
+                <w:sz w:val="20"/>
+              </w:rPr>
+              <w:t>Prueba automatizada</w:t>
+            </w:r>
+          </w:p>
+        </w:tc>
+        <w:tc>
+          <w:tcPr>
+            <w:tcW w:w="7257" w:type="dxa"/>
+          </w:tcPr>
+          <w:p>
+            <w:pPr>
+              <w:spacing w:after="20"/>
+            </w:pPr>
+            <w:r>
+              <w:rPr>
+                <w:sz w:val="20"/>
+              </w:rPr>
+              <w:t>tests/Integracion/ConsultaPersistidaTest.php</w:t>
+            </w:r>
+          </w:p>
+        </w:tc>
+      </w:tr>
+    </w:tbl>
+    <w:p>
+      <w:pPr>
+        <w:spacing w:after="40"/>
+      </w:pPr>
+    </w:p>
+    <w:p>
+      <w:pPr>
+        <w:pStyle w:val="Ttulo3"/>
+      </w:pPr>
+      <w:r>
+        <w:t>Caso de prueba CP-15: Aceptación del proceso completo</w:t>
+      </w:r>
+    </w:p>
+    <w:tbl>
+      <w:tblPr>
+        <w:tblStyle w:val="Tablaconcuadrcula"/>
+        <w:tblW w:w="0" w:type="auto"/>
+        <w:tblLook w:val="04A0" w:firstRow="1" w:lastRow="0" w:firstColumn="1" w:lastColumn="0" w:noHBand="0" w:noVBand="1"/>
+      </w:tblPr>
+      <w:tblGrid>
+        <w:gridCol w:w="2154"/>
+        <w:gridCol w:w="7257"/>
+      </w:tblGrid>
+      <w:tr>
+        <w:trPr>
+          <w:cantSplit/>
+        </w:trPr>
+        <w:tc>
+          <w:tcPr>
+            <w:tcW w:w="2154" w:type="dxa"/>
+            <w:shd w:val="clear" w:color="auto" w:fill="E8F0FB"/>
+          </w:tcPr>
+          <w:p>
+            <w:pPr>
+              <w:keepNext/>
+            </w:pPr>
+            <w:r>
+              <w:rPr>
+                <w:b/>
+                <w:sz w:val="20"/>
+              </w:rPr>
+              <w:t>Caso</w:t>
+            </w:r>
+          </w:p>
+        </w:tc>
+        <w:tc>
+          <w:tcPr>
+            <w:tcW w:w="7257" w:type="dxa"/>
+          </w:tcPr>
+          <w:p>
+            <w:pPr>
+              <w:keepNext/>
+              <w:spacing w:after="20"/>
+            </w:pPr>
+            <w:r>
+              <w:rPr>
+                <w:sz w:val="20"/>
+              </w:rPr>
+              <w:t>CP-15 – Flujo completo (aceptación)</w:t>
+            </w:r>
+          </w:p>
+        </w:tc>
+      </w:tr>
+      <w:tr>
+        <w:trPr>
+          <w:cantSplit/>
+        </w:trPr>
+        <w:tc>
+          <w:tcPr>
+            <w:tcW w:w="2154" w:type="dxa"/>
+            <w:shd w:val="clear" w:color="auto" w:fill="E8F0FB"/>
+          </w:tcPr>
+          <w:p>
+            <w:pPr>
+              <w:keepNext/>
+            </w:pPr>
+            <w:r>
+              <w:rPr>
+                <w:b/>
+                <w:sz w:val="20"/>
+              </w:rPr>
+              <w:t>Requisito asociado</w:t>
+            </w:r>
+          </w:p>
+        </w:tc>
+        <w:tc>
+          <w:tcPr>
+            <w:tcW w:w="7257" w:type="dxa"/>
+          </w:tcPr>
+          <w:p>
+            <w:pPr>
+              <w:keepNext/>
+              <w:spacing w:after="20"/>
+            </w:pPr>
+            <w:r>
+              <w:rPr>
+                <w:sz w:val="20"/>
+              </w:rPr>
+              <w:t>RF-01, RF-02, RF-03, RF-04, RF-05</w:t>
+            </w:r>
+          </w:p>
+        </w:tc>
+      </w:tr>
+      <w:tr>
+        <w:trPr>
+          <w:cantSplit/>
+        </w:trPr>
+        <w:tc>
+          <w:tcPr>
+            <w:tcW w:w="2154" w:type="dxa"/>
+            <w:shd w:val="clear" w:color="auto" w:fill="E8F0FB"/>
+          </w:tcPr>
+          <w:p>
+            <w:pPr>
+              <w:keepNext/>
+            </w:pPr>
+            <w:r>
+              <w:rPr>
+                <w:b/>
+                <w:sz w:val="20"/>
+              </w:rPr>
+              <w:t>Objetivo</w:t>
+            </w:r>
+          </w:p>
+        </w:tc>
+        <w:tc>
+          <w:tcPr>
+            <w:tcW w:w="7257" w:type="dxa"/>
+          </w:tcPr>
+          <w:p>
+            <w:pPr>
+              <w:keepNext/>
+              <w:spacing w:after="20"/>
+            </w:pPr>
+            <w:r>
+              <w:rPr>
+                <w:sz w:val="20"/>
+              </w:rPr>
+              <w:t>Comprobar con la cliente el proceso completo de un producto nuevo: alta, consulta, entrada, venta y reporte de resurtido.</w:t>
+            </w:r>
+          </w:p>
+        </w:tc>
+      </w:tr>
+      <w:tr>
+        <w:trPr>
+          <w:cantSplit/>
+        </w:trPr>
+        <w:tc>
+          <w:tcPr>
+            <w:tcW w:w="2154" w:type="dxa"/>
+            <w:shd w:val="clear" w:color="auto" w:fill="E8F0FB"/>
+          </w:tcPr>
+          <w:p>
+            <w:pPr>
+              <w:keepNext/>
+            </w:pPr>
+            <w:r>
+              <w:rPr>
+                <w:b/>
+                <w:sz w:val="20"/>
+              </w:rPr>
+              <w:t>Precondición</w:t>
+            </w:r>
+          </w:p>
+        </w:tc>
+        <w:tc>
+          <w:tcPr>
+            <w:tcW w:w="7257" w:type="dxa"/>
+          </w:tcPr>
+          <w:p>
+            <w:pPr>
+              <w:keepNext/>
+              <w:spacing w:after="20"/>
+            </w:pPr>
+            <w:r>
+              <w:rPr>
+                <w:sz w:val="20"/>
+              </w:rPr>
+              <w:t>Servidor de pruebas con ACC-002 (12, mín. 5), MOU-010 (30, mín. 10) y RED-001 (6, mín. 4).</w:t>
+            </w:r>
+          </w:p>
+        </w:tc>
+      </w:tr>
+      <w:tr>
+        <w:trPr>
+          <w:cantSplit/>
+        </w:trPr>
+        <w:tc>
+          <w:tcPr>
+            <w:tcW w:w="2154" w:type="dxa"/>
+            <w:shd w:val="clear" w:color="auto" w:fill="E8F0FB"/>
+          </w:tcPr>
+          <w:p>
+            <w:pPr>
+              <w:keepNext/>
+            </w:pPr>
+            <w:r>
+              <w:rPr>
+                <w:b/>
+                <w:sz w:val="20"/>
+              </w:rPr>
+              <w:t>Datos de entrada</w:t>
+            </w:r>
+          </w:p>
+        </w:tc>
+        <w:tc>
+          <w:tcPr>
+            <w:tcW w:w="7257" w:type="dxa"/>
+          </w:tcPr>
+          <w:p>
+            <w:pPr>
+              <w:keepNext/>
+              <w:spacing w:after="20"/>
+            </w:pPr>
+            <w:r>
+              <w:rPr>
+                <w:sz w:val="20"/>
+              </w:rPr>
+              <w:t>Alta de TEC-020 (Teclado USB, $250.00, 20 piezas, mín. 5) y de TEC-021 con precio −250</w:t>
+            </w:r>
+          </w:p>
+          <w:p>
+            <w:pPr>
+              <w:keepNext/>
+              <w:spacing w:after="20"/>
+            </w:pPr>
+            <w:r>
+              <w:rPr>
+                <w:sz w:val="20"/>
+              </w:rPr>
+              <w:t>Entrada de 5 piezas; una venta de 20 piezas y otra de 6</w:t>
+            </w:r>
+          </w:p>
+        </w:tc>
+      </w:tr>
+      <w:tr>
+        <w:trPr>
+          <w:cantSplit/>
+        </w:trPr>
+        <w:tc>
+          <w:tcPr>
+            <w:tcW w:w="2154" w:type="dxa"/>
+            <w:shd w:val="clear" w:color="auto" w:fill="E8F0FB"/>
+          </w:tcPr>
+          <w:p>
+            <w:pPr>
+              <w:keepNext/>
+            </w:pPr>
+            <w:r>
+              <w:rPr>
+                <w:b/>
+                <w:sz w:val="20"/>
+              </w:rPr>
+              <w:t>Procedimiento</w:t>
+            </w:r>
+          </w:p>
+        </w:tc>
+        <w:tc>
+          <w:tcPr>
+            <w:tcW w:w="7257" w:type="dxa"/>
+          </w:tcPr>
+          <w:p>
+            <w:pPr>
+              <w:keepNext/>
+              <w:spacing w:after="20"/>
+            </w:pPr>
+            <w:r>
+              <w:rPr>
+                <w:sz w:val="20"/>
+              </w:rPr>
+              <w:t>1. POST /api/productos con TEC-020 y con TEC-021.</w:t>
+            </w:r>
+          </w:p>
+          <w:p>
+            <w:pPr>
+              <w:keepNext/>
+              <w:spacing w:after="20"/>
+            </w:pPr>
+            <w:r>
+              <w:rPr>
+                <w:sz w:val="20"/>
+              </w:rPr>
+              <w:t>2. GET /api/productos/tec-020.</w:t>
+            </w:r>
+          </w:p>
+          <w:p>
+            <w:pPr>
+              <w:keepNext/>
+              <w:spacing w:after="20"/>
+            </w:pPr>
+            <w:r>
+              <w:rPr>
+                <w:sz w:val="20"/>
+              </w:rPr>
+              <w:t>3. POST /api/productos/TEC-020/entradas con cantidad 5.</w:t>
+            </w:r>
+          </w:p>
+          <w:p>
+            <w:pPr>
+              <w:keepNext/>
+              <w:spacing w:after="20"/>
+            </w:pPr>
+            <w:r>
+              <w:rPr>
+                <w:sz w:val="20"/>
+              </w:rPr>
+              <w:t>4. POST /api/productos/TEC-020/salidas con cantidad 20 y otra con cantidad 6.</w:t>
+            </w:r>
+          </w:p>
+          <w:p>
+            <w:pPr>
+              <w:keepNext/>
+              <w:spacing w:after="20"/>
+            </w:pPr>
+            <w:r>
+              <w:rPr>
+                <w:sz w:val="20"/>
+              </w:rPr>
+              <w:t>5. GET /api/reporte y GET /api/movimientos?codigo=TEC-020.</w:t>
+            </w:r>
+          </w:p>
+        </w:tc>
+      </w:tr>
+      <w:tr>
+        <w:trPr>
+          <w:cantSplit/>
+        </w:trPr>
+        <w:tc>
+          <w:tcPr>
+            <w:tcW w:w="2154" w:type="dxa"/>
+            <w:shd w:val="clear" w:color="auto" w:fill="E8F0FB"/>
+          </w:tcPr>
+          <w:p>
+            <w:pPr>
+              <w:keepNext/>
+            </w:pPr>
+            <w:r>
+              <w:rPr>
+                <w:b/>
+                <w:sz w:val="20"/>
+              </w:rPr>
+              <w:t>Resultado esperado</w:t>
+            </w:r>
+          </w:p>
+        </w:tc>
+        <w:tc>
+          <w:tcPr>
+            <w:tcW w:w="7257" w:type="dxa"/>
+          </w:tcPr>
+          <w:p>
+            <w:pPr>
+              <w:keepNext/>
+              <w:spacing w:after="20"/>
+            </w:pPr>
+            <w:r>
+              <w:rPr>
+                <w:sz w:val="20"/>
+              </w:rPr>
+              <w:t>Alta 201 y 422 por el precio negativo; consulta con 20; entrada → 25; venta de 20 → 5; venta de 6 → 422. Por resurtir: TEC-020. 4 productos, 53 unidades, valor $15,392.00. Historial: salida 20 → 5 y entrada 5 → 25.</w:t>
+            </w:r>
+          </w:p>
+        </w:tc>
+      </w:tr>
+      <w:tr>
+        <w:trPr>
+          <w:cantSplit/>
+        </w:trPr>
+        <w:tc>
+          <w:tcPr>
+            <w:tcW w:w="2154" w:type="dxa"/>
+            <w:shd w:val="clear" w:color="auto" w:fill="E8F0FB"/>
+          </w:tcPr>
+          <w:p>
+            <w:r>
+              <w:rPr>
+                <w:b/>
+                <w:sz w:val="20"/>
+              </w:rPr>
+              <w:t>Prueba automatizada</w:t>
+            </w:r>
+          </w:p>
+        </w:tc>
+        <w:tc>
+          <w:tcPr>
+            <w:tcW w:w="7257" w:type="dxa"/>
+          </w:tcPr>
+          <w:p>
+            <w:pPr>
+              <w:spacing w:after="20"/>
+            </w:pPr>
+            <w:r>
+              <w:rPr>
+                <w:sz w:val="20"/>
+              </w:rPr>
+              <w:t>tests/Aceptacion/EscenariosTiendaTest.php</w:t>
+            </w:r>
+          </w:p>
+        </w:tc>
+      </w:tr>
+    </w:tbl>
+    <w:p>
+      <w:pPr>
+        <w:spacing w:after="40"/>
+      </w:pPr>
+    </w:p>
+    <w:p>
+      <w:pPr>
         <w:pStyle w:val="Ttulo1"/>
       </w:pPr>
       <w:r>
@@ -9736,7 +10731,7 @@
           <w:noProof/>
         </w:rPr>
         <w:drawing>
-          <wp:inline distT="0" distB="0" distL="0" distR="0" wp14:anchorId="14FAE9E0" wp14:editId="78EB04F9">
+          <wp:inline distT="0" distB="0" distL="0" distR="0" wp14:anchorId="14FC45D2" wp14:editId="2D0F52CC">
             <wp:extent cx="5580000" cy="3138750"/>
             <wp:effectExtent l="0" t="0" r="0" b="0"/>
             <wp:docPr id="2" name="Picture 2"/>
@@ -10569,6 +11564,7 @@
           </w:tcPr>
           <w:p>
             <w:pPr>
+              <w:keepNext/>
               <w:spacing w:after="20"/>
             </w:pPr>
             <w:r>
@@ -10586,6 +11582,7 @@
           </w:tcPr>
           <w:p>
             <w:pPr>
+              <w:keepNext/>
               <w:spacing w:after="20"/>
             </w:pPr>
             <w:r>
@@ -10602,6 +11599,7 @@
           </w:tcPr>
           <w:p>
             <w:pPr>
+              <w:keepNext/>
               <w:spacing w:after="20"/>
             </w:pPr>
             <w:r>
@@ -10609,6 +11607,119 @@
                 <w:sz w:val="19"/>
               </w:rPr>
               <w:t>Junta Inventario, RepositorioInventario y el archivo JSON: la entrada se guarda y se vuelve a leer.</w:t>
+            </w:r>
+          </w:p>
+        </w:tc>
+      </w:tr>
+      <w:tr>
+        <w:trPr>
+          <w:cantSplit/>
+          <w:jc w:val="center"/>
+        </w:trPr>
+        <w:tc>
+          <w:tcPr>
+            <w:tcW w:w="907" w:type="dxa"/>
+          </w:tcPr>
+          <w:p>
+            <w:pPr>
+              <w:keepNext/>
+              <w:spacing w:after="20"/>
+            </w:pPr>
+            <w:r>
+              <w:rPr>
+                <w:b/>
+                <w:sz w:val="19"/>
+              </w:rPr>
+              <w:t>CP-14</w:t>
+            </w:r>
+          </w:p>
+        </w:tc>
+        <w:tc>
+          <w:tcPr>
+            <w:tcW w:w="1587" w:type="dxa"/>
+          </w:tcPr>
+          <w:p>
+            <w:pPr>
+              <w:keepNext/>
+              <w:spacing w:after="20"/>
+            </w:pPr>
+            <w:r>
+              <w:rPr>
+                <w:sz w:val="19"/>
+              </w:rPr>
+              <w:t>Integración</w:t>
+            </w:r>
+          </w:p>
+        </w:tc>
+        <w:tc>
+          <w:tcPr>
+            <w:tcW w:w="6917" w:type="dxa"/>
+          </w:tcPr>
+          <w:p>
+            <w:pPr>
+              <w:keepNext/>
+              <w:spacing w:after="20"/>
+            </w:pPr>
+            <w:r>
+              <w:rPr>
+                <w:sz w:val="19"/>
+              </w:rPr>
+              <w:t>Junta RepositorioInventario, Inventario y el archivo JSON: el producto se lee del archivo con sus datos y la consulta no escribe nada.</w:t>
+            </w:r>
+          </w:p>
+        </w:tc>
+      </w:tr>
+      <w:tr>
+        <w:trPr>
+          <w:cantSplit/>
+          <w:jc w:val="center"/>
+        </w:trPr>
+        <w:tc>
+          <w:tcPr>
+            <w:tcW w:w="907" w:type="dxa"/>
+          </w:tcPr>
+          <w:p>
+            <w:pPr>
+              <w:spacing w:after="20"/>
+            </w:pPr>
+            <w:r>
+              <w:rPr>
+                <w:b/>
+                <w:sz w:val="19"/>
+              </w:rPr>
+              <w:t>CP-15</w:t>
+            </w:r>
+          </w:p>
+        </w:tc>
+        <w:tc>
+          <w:tcPr>
+            <w:tcW w:w="1587" w:type="dxa"/>
+          </w:tcPr>
+          <w:p>
+            <w:pPr>
+              <w:spacing w:after="20"/>
+            </w:pPr>
+            <w:r>
+              <w:rPr>
+                <w:sz w:val="19"/>
+              </w:rPr>
+              <w:t>Aceptación</w:t>
+            </w:r>
+          </w:p>
+        </w:tc>
+        <w:tc>
+          <w:tcPr>
+            <w:tcW w:w="6917" w:type="dxa"/>
+          </w:tcPr>
+          <w:p>
+            <w:pPr>
+              <w:spacing w:after="20"/>
+            </w:pPr>
+            <w:r>
+              <w:rPr>
+                <w:sz w:val="19"/>
+              </w:rPr>
+              <w:t>Escenario de la cliente que recorre RF-01 a RF-05 por HTTP, del alta al reporte de resurtido; Ana Edith revisa y aprueba el resultado.</w:t>
             </w:r>
           </w:p>
         </w:tc>
@@ -10629,7 +11740,7 @@
           <w:noProof/>
         </w:rPr>
         <w:drawing>
-          <wp:inline distT="0" distB="0" distL="0" distR="0" wp14:anchorId="6B2AB30D" wp14:editId="6023D775">
+          <wp:inline distT="0" distB="0" distL="0" distR="0" wp14:anchorId="3FE816DA" wp14:editId="45C1929F">
             <wp:extent cx="5580000" cy="3138750"/>
             <wp:effectExtent l="0" t="0" r="0" b="0"/>
             <wp:docPr id="3" name="Picture 3"/>
@@ -10688,7 +11799,7 @@
     </w:p>
     <w:p>
       <w:r>
-        <w:t>Registramos la ejecución en una bitácora de pruebas. Las cuatro suites se ejecutaron con scripts/ejecutar-pruebas.php el 31 de octubre de 2026 (Windows NT 10.0, PHP 8.4.27, PHPUnit 11.5.56, versión 1dba0bd del repositorio).</w:t>
+        <w:t>Registramos la ejecución en una bitácora de pruebas. Las cuatro suites se ejecutaron con scripts/ejecutar-pruebas.php el 31 de octubre de 2026 (Windows NT 10.0, PHP 8.4.27, PHPUnit 11.5.56, versión 7108e1e del repositorio).</w:t>
       </w:r>
     </w:p>
     <w:p>
@@ -10708,13 +11819,7 @@
           <w:sz w:val="17"/>
         </w:rPr>
         <w:br/>
-      </w:r>
-      <w:r>
-        <w:rPr>
-          <w:rFonts w:ascii="Consolas" w:eastAsia="Consolas" w:hAnsi="Consolas"/>
-          <w:sz w:val="17"/>
-        </w:rPr>
-        <w:t>composer evidencia     # ronda 1: los 13 casos con el código actual</w:t>
+        <w:t>composer evidencia     # ronda 1: los 15 casos con el código actual</w:t>
       </w:r>
       <w:r>
         <w:rPr>
@@ -10927,7 +12032,7 @@
               <w:rPr>
                 <w:sz w:val="18"/>
               </w:rPr>
-              <w:t>0.004 s</w:t>
+              <w:t>0.005 s</w:t>
             </w:r>
           </w:p>
         </w:tc>
@@ -11275,7 +12380,7 @@
               <w:rPr>
                 <w:sz w:val="18"/>
               </w:rPr>
-              <w:t>0.001 s</w:t>
+              <w:t>0.002 s</w:t>
             </w:r>
           </w:p>
         </w:tc>
@@ -11449,7 +12554,7 @@
               <w:rPr>
                 <w:sz w:val="18"/>
               </w:rPr>
-              <w:t>0.906 s</w:t>
+              <w:t>0.855 s</w:t>
             </w:r>
           </w:p>
         </w:tc>
@@ -11536,7 +12641,7 @@
               <w:rPr>
                 <w:sz w:val="18"/>
               </w:rPr>
-              <w:t>0.938 s</w:t>
+              <w:t>0.897 s</w:t>
             </w:r>
           </w:p>
         </w:tc>
@@ -11623,7 +12728,7 @@
               <w:rPr>
                 <w:sz w:val="18"/>
               </w:rPr>
-              <w:t>0.930 s</w:t>
+              <w:t>0.875 s</w:t>
             </w:r>
           </w:p>
         </w:tc>
@@ -11710,7 +12815,7 @@
               <w:rPr>
                 <w:sz w:val="18"/>
               </w:rPr>
-              <w:t>0.920 s</w:t>
+              <w:t>0.857 s</w:t>
             </w:r>
           </w:p>
         </w:tc>
@@ -11797,7 +12902,7 @@
               <w:rPr>
                 <w:sz w:val="18"/>
               </w:rPr>
-              <w:t>0.893 s</w:t>
+              <w:t>0.874 s</w:t>
             </w:r>
           </w:p>
         </w:tc>
@@ -11971,7 +13076,181 @@
               <w:rPr>
                 <w:sz w:val="18"/>
               </w:rPr>
-              <w:t>0.007 s</w:t>
+              <w:t>0.003 s</w:t>
+            </w:r>
+          </w:p>
+        </w:tc>
+      </w:tr>
+      <w:tr>
+        <w:trPr>
+          <w:jc w:val="center"/>
+        </w:trPr>
+        <w:tc>
+          <w:tcPr>
+            <w:tcW w:w="794" w:type="dxa"/>
+          </w:tcPr>
+          <w:p>
+            <w:pPr>
+              <w:spacing w:after="20"/>
+            </w:pPr>
+            <w:r>
+              <w:rPr>
+                <w:b/>
+                <w:sz w:val="18"/>
+              </w:rPr>
+              <w:t>CP-14</w:t>
+            </w:r>
+          </w:p>
+        </w:tc>
+        <w:tc>
+          <w:tcPr>
+            <w:tcW w:w="2154" w:type="dxa"/>
+          </w:tcPr>
+          <w:p>
+            <w:pPr>
+              <w:spacing w:after="20"/>
+            </w:pPr>
+            <w:r>
+              <w:rPr>
+                <w:sz w:val="18"/>
+              </w:rPr>
+              <w:t>Producto consultado con sus datos</w:t>
+            </w:r>
+          </w:p>
+        </w:tc>
+        <w:tc>
+          <w:tcPr>
+            <w:tcW w:w="4535" w:type="dxa"/>
+          </w:tcPr>
+          <w:p>
+            <w:pPr>
+              <w:spacing w:after="20"/>
+            </w:pPr>
+            <w:r>
+              <w:rPr>
+                <w:sz w:val="18"/>
+              </w:rPr>
+              <w:t>TEC-020: Teclado USB, $250.00, existencia 20, mínimo 5; existencias LAP-001 10, MOU-010 30, TEC-020 20; archivo sin cambios.</w:t>
+            </w:r>
+          </w:p>
+        </w:tc>
+        <w:tc>
+          <w:tcPr>
+            <w:tcW w:w="1077" w:type="dxa"/>
+            <w:shd w:val="clear" w:color="auto" w:fill="E3F4EA"/>
+          </w:tcPr>
+          <w:p>
+            <w:pPr>
+              <w:spacing w:after="20"/>
+            </w:pPr>
+            <w:r>
+              <w:rPr>
+                <w:sz w:val="18"/>
+              </w:rPr>
+              <w:t>Aprobado</w:t>
+            </w:r>
+          </w:p>
+        </w:tc>
+        <w:tc>
+          <w:tcPr>
+            <w:tcW w:w="850" w:type="dxa"/>
+          </w:tcPr>
+          <w:p>
+            <w:pPr>
+              <w:spacing w:after="20"/>
+            </w:pPr>
+            <w:r>
+              <w:rPr>
+                <w:sz w:val="18"/>
+              </w:rPr>
+              <w:t>0.008 s</w:t>
+            </w:r>
+          </w:p>
+        </w:tc>
+      </w:tr>
+      <w:tr>
+        <w:trPr>
+          <w:jc w:val="center"/>
+        </w:trPr>
+        <w:tc>
+          <w:tcPr>
+            <w:tcW w:w="794" w:type="dxa"/>
+          </w:tcPr>
+          <w:p>
+            <w:pPr>
+              <w:spacing w:after="20"/>
+            </w:pPr>
+            <w:r>
+              <w:rPr>
+                <w:b/>
+                <w:sz w:val="18"/>
+              </w:rPr>
+              <w:t>CP-15</w:t>
+            </w:r>
+          </w:p>
+        </w:tc>
+        <w:tc>
+          <w:tcPr>
+            <w:tcW w:w="2154" w:type="dxa"/>
+          </w:tcPr>
+          <w:p>
+            <w:pPr>
+              <w:spacing w:after="20"/>
+            </w:pPr>
+            <w:r>
+              <w:rPr>
+                <w:sz w:val="18"/>
+              </w:rPr>
+              <w:t>Proceso completo de RF-01 a RF-05</w:t>
+            </w:r>
+          </w:p>
+        </w:tc>
+        <w:tc>
+          <w:tcPr>
+            <w:tcW w:w="4535" w:type="dxa"/>
+          </w:tcPr>
+          <w:p>
+            <w:pPr>
+              <w:spacing w:after="20"/>
+            </w:pPr>
+            <w:r>
+              <w:rPr>
+                <w:sz w:val="18"/>
+              </w:rPr>
+              <w:t>201 y 422 en las altas → consulta 20 → entrada 25 → venta 5 → 422; por resurtir TEC-020; 4 productos, 53 unidades, $15,392.00.</w:t>
+            </w:r>
+          </w:p>
+        </w:tc>
+        <w:tc>
+          <w:tcPr>
+            <w:tcW w:w="1077" w:type="dxa"/>
+            <w:shd w:val="clear" w:color="auto" w:fill="E3F4EA"/>
+          </w:tcPr>
+          <w:p>
+            <w:pPr>
+              <w:spacing w:after="20"/>
+            </w:pPr>
+            <w:r>
+              <w:rPr>
+                <w:sz w:val="18"/>
+              </w:rPr>
+              <w:t>Aprobado</w:t>
+            </w:r>
+          </w:p>
+        </w:tc>
+        <w:tc>
+          <w:tcPr>
+            <w:tcW w:w="850" w:type="dxa"/>
+          </w:tcPr>
+          <w:p>
+            <w:pPr>
+              <w:spacing w:after="20"/>
+            </w:pPr>
+            <w:r>
+              <w:rPr>
+                <w:sz w:val="18"/>
+              </w:rPr>
+              <w:t>0.880 s</w:t>
             </w:r>
           </w:p>
         </w:tc>
@@ -11996,7 +13275,7 @@
     </w:p>
     <w:p>
       <w:r>
-        <w:t>El script scripts/simular-defectos.php introduce DEF-01 y DEF-02 (sección 6) en una copia de src/, ejecuta los trece casos sobre esa copia y repite la ronda con el código corregido. Los archivos originales no se modifican.</w:t>
+        <w:t>El script scripts/simular-defectos.php introduce DEF-01 y DEF-02 (sección 6) en una copia de src/, ejecuta los quince casos sobre esa copia y repite la ronda con el código corregido. Los archivos originales no se modifican.</w:t>
       </w:r>
     </w:p>
     <w:tbl>
@@ -12132,7 +13411,7 @@
               <w:rPr>
                 <w:sz w:val="18"/>
               </w:rPr>
-              <w:t>CP-04, CP-06, CP-08</w:t>
+              <w:t>CP-04, CP-06, CP-08, CP-15</w:t>
             </w:r>
           </w:p>
         </w:tc>
@@ -12174,6 +13453,18 @@
                 <w:sz w:val="18"/>
               </w:rPr>
               <w:t>CP-08: La venta de 11 unidades de LAP-001 (existencia 10) debía responder 422.</w:t>
+            </w:r>
+          </w:p>
+          <w:p>
+            <w:pPr>
+              <w:keepNext/>
+              <w:spacing w:after="20"/>
+            </w:pPr>
+            <w:r>
+              <w:rPr>
+                <w:sz w:val="18"/>
+              </w:rPr>
+              <w:t>CP-15: Productos a resurtir: se esperaba TEC-020 (5 de mínimo 5).</w:t>
             </w:r>
           </w:p>
         </w:tc>
@@ -12191,7 +13482,7 @@
               <w:rPr>
                 <w:sz w:val="18"/>
               </w:rPr>
-              <w:t>Fallido (10 de 13)</w:t>
+              <w:t>Fallido (11 de 15)</w:t>
             </w:r>
           </w:p>
         </w:tc>
@@ -12232,7 +13523,7 @@
               <w:rPr>
                 <w:sz w:val="18"/>
               </w:rPr>
-              <w:t>CP-09</w:t>
+              <w:t>CP-09, CP-15</w:t>
             </w:r>
           </w:p>
         </w:tc>
@@ -12250,6 +13541,18 @@
                 <w:sz w:val="18"/>
               </w:rPr>
               <w:t>CP-09: Productos a resurtir: se esperaban ACC-002 (5 de mínimo 5) y RED-001 (4 de mínimo 4).</w:t>
+            </w:r>
+          </w:p>
+          <w:p>
+            <w:pPr>
+              <w:keepNext/>
+              <w:spacing w:after="20"/>
+            </w:pPr>
+            <w:r>
+              <w:rPr>
+                <w:sz w:val="18"/>
+              </w:rPr>
+              <w:t>CP-15: Productos a resurtir: se esperaba TEC-020 (5 de mínimo 5).</w:t>
             </w:r>
           </w:p>
         </w:tc>
@@ -12267,7 +13570,7 @@
               <w:rPr>
                 <w:sz w:val="18"/>
               </w:rPr>
-              <w:t>Fallido (12 de 13)</w:t>
+              <w:t>Fallido (13 de 15)</w:t>
             </w:r>
           </w:p>
         </w:tc>
@@ -12322,7 +13625,7 @@
               <w:rPr>
                 <w:sz w:val="18"/>
               </w:rPr>
-              <w:t>Los trece casos pasan.</w:t>
+              <w:t>Los quince casos pasan.</w:t>
             </w:r>
           </w:p>
         </w:tc>
@@ -12339,7 +13642,7 @@
               <w:rPr>
                 <w:sz w:val="18"/>
               </w:rPr>
-              <w:t>Aprobado (13 de 13)</w:t>
+              <w:t>Aprobado (15 de 15)</w:t>
             </w:r>
           </w:p>
         </w:tc>
@@ -12360,7 +13663,7 @@
           <w:noProof/>
         </w:rPr>
         <w:drawing>
-          <wp:inline distT="0" distB="0" distL="0" distR="0" wp14:anchorId="5A0D8655" wp14:editId="53E75B1F">
+          <wp:inline distT="0" distB="0" distL="0" distR="0" wp14:anchorId="2E22A70B" wp14:editId="026F1D34">
             <wp:extent cx="5580000" cy="3138750"/>
             <wp:effectExtent l="0" t="0" r="0" b="0"/>
             <wp:docPr id="4" name="Picture 4"/>
@@ -12419,7 +13722,7 @@
           <w:noProof/>
         </w:rPr>
         <w:drawing>
-          <wp:inline distT="0" distB="0" distL="0" distR="0" wp14:anchorId="6D9F91D8" wp14:editId="1DAB06A7">
+          <wp:inline distT="0" distB="0" distL="0" distR="0" wp14:anchorId="7BBFFCF3" wp14:editId="0F57E4CD">
             <wp:extent cx="5580000" cy="3138750"/>
             <wp:effectExtent l="0" t="0" r="0" b="0"/>
             <wp:docPr id="5" name="Picture 5"/>
@@ -12478,7 +13781,7 @@
           <w:noProof/>
         </w:rPr>
         <w:drawing>
-          <wp:inline distT="0" distB="0" distL="0" distR="0" wp14:anchorId="452AFFD2" wp14:editId="1DA4FC40">
+          <wp:inline distT="0" distB="0" distL="0" distR="0" wp14:anchorId="39F153E1" wp14:editId="7A2BBC8C">
             <wp:extent cx="5580000" cy="3138750"/>
             <wp:effectExtent l="0" t="0" r="0" b="0"/>
             <wp:docPr id="6" name="Picture 6"/>
@@ -12529,7 +13832,7 @@
     </w:p>
     <w:p>
       <w:r>
-        <w:t>La ronda 1 tardó 4.600 s. La Figura 7 suma el tiempo de los casos de cada nivel: los de sistema (2.737 s) y aceptación (1.850 s) levantan su propio servidor php -S y tardan cerca de 0.9 s cada uno; los unitarios (0.004 s) y de integración (0.009 s) tardan milisegundos.</w:t>
+        <w:t>La ronda 1 tardó 5.257 s. La Figura 7 suma el tiempo de los casos de cada nivel: los de sistema (2.626 s) y aceptación (2.612 s) levantan su propio servidor php -S y tardan cerca de 0.9 s cada uno; los unitarios (0.005 s) y de integración (0.014 s) tardan milisegundos.</w:t>
       </w:r>
     </w:p>
     <w:p>
@@ -12542,7 +13845,7 @@
           <w:noProof/>
         </w:rPr>
         <w:drawing>
-          <wp:inline distT="0" distB="0" distL="0" distR="0" wp14:anchorId="5D6DD85F" wp14:editId="5A12AC65">
+          <wp:inline distT="0" distB="0" distL="0" distR="0" wp14:anchorId="7AED3094" wp14:editId="786DA95B">
             <wp:extent cx="5580000" cy="3138750"/>
             <wp:effectExtent l="0" t="0" r="0" b="0"/>
             <wp:docPr id="7" name="Picture 7"/>
@@ -12783,7 +14086,7 @@
               <w:rPr>
                 <w:sz w:val="19"/>
               </w:rPr>
-              <w:t>13</w:t>
+              <w:t>15</w:t>
             </w:r>
           </w:p>
         </w:tc>
@@ -12800,7 +14103,7 @@
               <w:rPr>
                 <w:sz w:val="19"/>
               </w:rPr>
-              <w:t>13</w:t>
+              <w:t>15</w:t>
             </w:r>
           </w:p>
         </w:tc>
@@ -12834,7 +14137,7 @@
               <w:rPr>
                 <w:sz w:val="19"/>
               </w:rPr>
-              <w:t>13 / 13 × 100</w:t>
+              <w:t>15 / 15 × 100</w:t>
             </w:r>
           </w:p>
         </w:tc>
@@ -12892,7 +14195,7 @@
               <w:rPr>
                 <w:sz w:val="19"/>
               </w:rPr>
-              <w:t>13</w:t>
+              <w:t>15</w:t>
             </w:r>
           </w:p>
         </w:tc>
@@ -12909,7 +14212,7 @@
               <w:rPr>
                 <w:sz w:val="19"/>
               </w:rPr>
-              <w:t>10</w:t>
+              <w:t>11</w:t>
             </w:r>
           </w:p>
         </w:tc>
@@ -12926,7 +14229,7 @@
               <w:rPr>
                 <w:sz w:val="19"/>
               </w:rPr>
-              <w:t>3</w:t>
+              <w:t>4</w:t>
             </w:r>
           </w:p>
         </w:tc>
@@ -12943,7 +14246,7 @@
               <w:rPr>
                 <w:sz w:val="19"/>
               </w:rPr>
-              <w:t>10 / 13 × 100</w:t>
+              <w:t>11 / 15 × 100</w:t>
             </w:r>
           </w:p>
         </w:tc>
@@ -12960,7 +14263,7 @@
               <w:rPr>
                 <w:sz w:val="19"/>
               </w:rPr>
-              <w:t>76.9 %</w:t>
+              <w:t>73.3 %</w:t>
             </w:r>
           </w:p>
         </w:tc>
@@ -13001,13 +14304,30 @@
               <w:rPr>
                 <w:sz w:val="19"/>
               </w:rPr>
+              <w:t>15</w:t>
+            </w:r>
+          </w:p>
+        </w:tc>
+        <w:tc>
+          <w:tcPr>
+            <w:tcW w:w="1191" w:type="dxa"/>
+          </w:tcPr>
+          <w:p>
+            <w:pPr>
+              <w:keepNext/>
+              <w:spacing w:after="20"/>
+            </w:pPr>
+            <w:r>
+              <w:rPr>
+                <w:sz w:val="19"/>
+              </w:rPr>
               <w:t>13</w:t>
             </w:r>
           </w:p>
         </w:tc>
         <w:tc>
           <w:tcPr>
-            <w:tcW w:w="1191" w:type="dxa"/>
+            <w:tcW w:w="1077" w:type="dxa"/>
           </w:tcPr>
           <w:p>
             <w:pPr>
@@ -13018,13 +14338,13 @@
               <w:rPr>
                 <w:sz w:val="19"/>
               </w:rPr>
-              <w:t>12</w:t>
-            </w:r>
-          </w:p>
-        </w:tc>
-        <w:tc>
-          <w:tcPr>
-            <w:tcW w:w="1077" w:type="dxa"/>
+              <w:t>2</w:t>
+            </w:r>
+          </w:p>
+        </w:tc>
+        <w:tc>
+          <w:tcPr>
+            <w:tcW w:w="2041" w:type="dxa"/>
           </w:tcPr>
           <w:p>
             <w:pPr>
@@ -13035,13 +14355,13 @@
               <w:rPr>
                 <w:sz w:val="19"/>
               </w:rPr>
-              <w:t>1</w:t>
-            </w:r>
-          </w:p>
-        </w:tc>
-        <w:tc>
-          <w:tcPr>
-            <w:tcW w:w="2041" w:type="dxa"/>
+              <w:t>13 / 15 × 100</w:t>
+            </w:r>
+          </w:p>
+        </w:tc>
+        <w:tc>
+          <w:tcPr>
+            <w:tcW w:w="1361" w:type="dxa"/>
           </w:tcPr>
           <w:p>
             <w:pPr>
@@ -13052,24 +14372,7 @@
               <w:rPr>
                 <w:sz w:val="19"/>
               </w:rPr>
-              <w:t>12 / 13 × 100</w:t>
-            </w:r>
-          </w:p>
-        </w:tc>
-        <w:tc>
-          <w:tcPr>
-            <w:tcW w:w="1361" w:type="dxa"/>
-          </w:tcPr>
-          <w:p>
-            <w:pPr>
-              <w:keepNext/>
-              <w:spacing w:after="20"/>
-            </w:pPr>
-            <w:r>
-              <w:rPr>
-                <w:sz w:val="19"/>
-              </w:rPr>
-              <w:t>92.3 %</w:t>
+              <w:t>86.7 %</w:t>
             </w:r>
           </w:p>
         </w:tc>
@@ -13108,7 +14411,7 @@
               <w:rPr>
                 <w:sz w:val="19"/>
               </w:rPr>
-              <w:t>13</w:t>
+              <w:t>15</w:t>
             </w:r>
           </w:p>
         </w:tc>
@@ -13124,7 +14427,7 @@
               <w:rPr>
                 <w:sz w:val="19"/>
               </w:rPr>
-              <w:t>13</w:t>
+              <w:t>15</w:t>
             </w:r>
           </w:p>
         </w:tc>
@@ -13156,7 +14459,7 @@
               <w:rPr>
                 <w:sz w:val="19"/>
               </w:rPr>
-              <w:t>13 / 13 × 100</w:t>
+              <w:t>15 / 15 × 100</w:t>
             </w:r>
           </w:p>
         </w:tc>
@@ -13193,7 +14496,7 @@
           <w:noProof/>
         </w:rPr>
         <w:drawing>
-          <wp:inline distT="0" distB="0" distL="0" distR="0" wp14:anchorId="196C9083" wp14:editId="74F0A1B1">
+          <wp:inline distT="0" distB="0" distL="0" distR="0" wp14:anchorId="2206F12F" wp14:editId="7F5F6BEA">
             <wp:extent cx="5580000" cy="3138750"/>
             <wp:effectExtent l="0" t="0" r="0" b="0"/>
             <wp:docPr id="8" name="Picture 8"/>
@@ -13250,10 +14553,10 @@
         <w:t xml:space="preserve">Interpretación. </w:t>
       </w:r>
       <w:r>
-        <w:t>Con el código actual pasan los trece casos (100 %) y se cumple el criterio de salida. Con DEF-01 la aprobación cae a 76.9 %: fallan CP-04, CP-06 y CP-08, que prueban la misma regla (no vender más de lo que hay) en tres niveles distintos. Con DEF-02 queda en 92.3 %, ya que solo CP-09 revisa el resurtido. En ambas rondas fallan justo las pruebas ligadas al requisito afectado, lo que confirma que detectan el error en el lugar correcto. Ese 92.3 % deja ver un riesgo: un porcentaje alto no basta para liberar, po</w:t>
+        <w:t>Con el código actual pasan los quince casos (100 %) y se cumple el criterio de salida. Con DEF-01 la aprobación cae a 73.3 %: fallan CP-04, CP-06, CP-08 y CP-15, que prueban la misma regla (no vender más de lo que hay) en los cuatro niveles. Con DEF-02 queda en 86.7 %, ya que solo CP-09 y CP-15 revisan el resurtido. En ambas rondas fallan justo las pruebas ligadas al requisito afectado, lo que confirma que detectan el error en el lugar correcto. Ese 86.7 % deja ver un riesgo: un porcentaje alto no basta par</w:t>
       </w:r>
       <w:r>
-        <w:t>rque la prueba fallida corresponde a un defecto de prioridad media que provocaría faltantes en la tienda. Al corregir el código, la aprobación vuelve a 100 %.</w:t>
+        <w:t>a liberar, porque las pruebas fallidas corresponden a un defecto de prioridad media que provocaría faltantes en la tienda. Al corregir el código, la aprobación vuelve a 100 %.</w:t>
       </w:r>
     </w:p>
     <w:p>
@@ -13279,7 +14582,7 @@
           <w:noProof/>
         </w:rPr>
         <w:drawing>
-          <wp:inline distT="0" distB="0" distL="0" distR="0" wp14:anchorId="4E77F4AB" wp14:editId="6AF21737">
+          <wp:inline distT="0" distB="0" distL="0" distR="0" wp14:anchorId="0ABBFA08" wp14:editId="6873A87F">
             <wp:extent cx="5580000" cy="3138750"/>
             <wp:effectExtent l="0" t="0" r="0" b="0"/>
             <wp:docPr id="9" name="Picture 9"/>
@@ -13771,7 +15074,7 @@
           <w:noProof/>
         </w:rPr>
         <w:drawing>
-          <wp:inline distT="0" distB="0" distL="0" distR="0" wp14:anchorId="647183AD" wp14:editId="71D576DC">
+          <wp:inline distT="0" distB="0" distL="0" distR="0" wp14:anchorId="3813F4B1" wp14:editId="709EFAFF">
             <wp:extent cx="5580000" cy="3138750"/>
             <wp:effectExtent l="0" t="0" r="0" b="0"/>
             <wp:docPr id="10" name="Picture 10"/>
@@ -14316,7 +15619,7 @@
           <w:noProof/>
         </w:rPr>
         <w:drawing>
-          <wp:inline distT="0" distB="0" distL="0" distR="0" wp14:anchorId="253DCF28" wp14:editId="4F410779">
+          <wp:inline distT="0" distB="0" distL="0" distR="0" wp14:anchorId="1E0FFA88" wp14:editId="660AEA7A">
             <wp:extent cx="5580000" cy="3138750"/>
             <wp:effectExtent l="0" t="0" r="0" b="0"/>
             <wp:docPr id="11" name="Picture 11"/>
@@ -14375,7 +15678,7 @@
           <w:noProof/>
         </w:rPr>
         <w:drawing>
-          <wp:inline distT="0" distB="0" distL="0" distR="0" wp14:anchorId="0CC893E9" wp14:editId="05DF1B27">
+          <wp:inline distT="0" distB="0" distL="0" distR="0" wp14:anchorId="4BD23791" wp14:editId="5AAA8912">
             <wp:extent cx="5580000" cy="3138750"/>
             <wp:effectExtent l="0" t="0" r="0" b="0"/>
             <wp:docPr id="12" name="Picture 12"/>
@@ -14802,7 +16105,7 @@
               <w:rPr>
                 <w:sz w:val="20"/>
               </w:rPr>
-              <w:t>CP-04 (unitaria), CP-06 (integración) y CP-08 (sistema).</w:t>
+              <w:t>CP-04 (unitaria), CP-06 (integración), CP-08 (sistema) y CP-15 (aceptación).</w:t>
             </w:r>
           </w:p>
         </w:tc>
@@ -14854,7 +16157,7 @@
               <w:rPr>
                 <w:sz w:val="20"/>
               </w:rPr>
-              <w:t>CP-04, CP-06 y CP-08 fallidos en evidencias/regresion/DEF-01/junit.xml.</w:t>
+              <w:t>CP-04, CP-06, CP-08 y CP-15 fallidos en evidencias/regresion/DEF-01/junit.xml.</w:t>
             </w:r>
           </w:p>
           <w:p>
@@ -14931,6 +16234,18 @@
                 <w:sz w:val="20"/>
               </w:rPr>
               <w:t>CP-08: La venta de 11 unidades de LAP-001 (existencia 10) debía responder 422.</w:t>
+            </w:r>
+          </w:p>
+          <w:p>
+            <w:pPr>
+              <w:keepNext/>
+              <w:spacing w:after="20"/>
+            </w:pPr>
+            <w:r>
+              <w:rPr>
+                <w:sz w:val="20"/>
+              </w:rPr>
+              <w:t>CP-15: Productos a resurtir: se esperaba TEC-020 (5 de mínimo 5).</w:t>
             </w:r>
           </w:p>
         </w:tc>
@@ -15342,7 +16657,7 @@
               <w:rPr>
                 <w:sz w:val="20"/>
               </w:rPr>
-              <w:t>CP-09 (aceptación).</w:t>
+              <w:t>CP-09 y CP-15 (aceptación).</w:t>
             </w:r>
           </w:p>
         </w:tc>
@@ -15394,7 +16709,7 @@
               <w:rPr>
                 <w:sz w:val="20"/>
               </w:rPr>
-              <w:t>CP-09 fallido en evidencias/regresion/DEF-02/junit.xml.</w:t>
+              <w:t>CP-09 y CP-15 fallidos en evidencias/regresion/DEF-02/junit.xml.</w:t>
             </w:r>
           </w:p>
           <w:p>
@@ -15449,6 +16764,18 @@
               <w:t>CP-09: Productos a resurtir: se esperaban ACC-002 (5 de mínimo 5) y RED-001 (4 de mínimo 4).</w:t>
             </w:r>
           </w:p>
+          <w:p>
+            <w:pPr>
+              <w:keepNext/>
+              <w:spacing w:after="20"/>
+            </w:pPr>
+            <w:r>
+              <w:rPr>
+                <w:sz w:val="20"/>
+              </w:rPr>
+              <w:t>CP-15: Productos a resurtir: se esperaba TEC-020 (5 de mínimo 5).</w:t>
+            </w:r>
+          </w:p>
         </w:tc>
       </w:tr>
       <w:tr>
@@ -15482,7 +16809,7 @@
               <w:rPr>
                 <w:sz w:val="20"/>
               </w:rPr>
-              <w:t>Pablo Magaña (desarrollador del módulo de reportes). Revalida: Ana Rodríguez (CP-09).</w:t>
+              <w:t>Pablo Magaña (desarrollador del módulo de reportes). Revalida: Ana Rodríguez (CP-09 y CP-15).</w:t>
             </w:r>
           </w:p>
         </w:tc>
@@ -15674,7 +17001,7 @@
               <w:rPr>
                 <w:sz w:val="18"/>
               </w:rPr>
-              <w:t>(y CP-06, CP-08)</w:t>
+              <w:t>(y CP-06, CP-08, CP-15)</w:t>
             </w:r>
           </w:p>
         </w:tc>
@@ -15708,7 +17035,7 @@
               <w:rPr>
                 <w:sz w:val="18"/>
               </w:rPr>
-              <w:t>phpunit --filter con testVentaMayorALaExistencia (CP-04), testVentaRechazadaNoGuarda (CP-06) y testVentasInvalidas (CP-08); prueba manual con POST de 11 piezas.</w:t>
+              <w:t>phpunit --filter con testVentaMayorALaExistencia (CP-04), testVentaRechazadaNoGuarda (CP-06), testVentasInvalidas (CP-08) y testProcesoCompleto (CP-15); prueba manual con POST de 11 piezas.</w:t>
             </w:r>
           </w:p>
         </w:tc>
@@ -15725,7 +17052,7 @@
               <w:rPr>
                 <w:sz w:val="18"/>
               </w:rPr>
-              <w:t>Los tres casos aprobados, respuesta 422 y existencia sin cambios en 10.</w:t>
+              <w:t>Los cuatro casos aprobados, respuesta 422 y existencia sin cambios en 10.</w:t>
             </w:r>
           </w:p>
         </w:tc>
@@ -15767,6 +17094,17 @@
               <w:t>CP-09</w:t>
             </w:r>
           </w:p>
+          <w:p>
+            <w:pPr>
+              <w:spacing w:after="20"/>
+            </w:pPr>
+            <w:r>
+              <w:rPr>
+                <w:sz w:val="18"/>
+              </w:rPr>
+              <w:t>(y CP-15)</w:t>
+            </w:r>
+          </w:p>
         </w:tc>
         <w:tc>
           <w:tcPr>
@@ -15796,7 +17134,7 @@
               <w:rPr>
                 <w:sz w:val="18"/>
               </w:rPr>
-              <w:t>phpunit --filter testReporteDeResurtido (CP-09); Ana revisa el reporte en /api/reporte.</w:t>
+              <w:t>phpunit --filter con testReporteDeResurtido (CP-09) y testProcesoCompleto (CP-15); Ana revisa el reporte en /api/reporte.</w:t>
             </w:r>
           </w:p>
         </w:tc>
@@ -15812,7 +17150,7 @@
               <w:rPr>
                 <w:sz w:val="18"/>
               </w:rPr>
-              <w:t>CP-09 aprobado: ACC-002 y RED-001 aparecen por resurtir y MOU-010 no.</w:t>
+              <w:t>CP-09 y CP-15 aprobados: ACC-002, RED-001 y TEC-020 aparecen por resurtir y MOU-010 no.</w:t>
             </w:r>
           </w:p>
         </w:tc>
@@ -15833,7 +17171,7 @@
           <w:noProof/>
         </w:rPr>
         <w:drawing>
-          <wp:inline distT="0" distB="0" distL="0" distR="0" wp14:anchorId="5B2161E9" wp14:editId="2AB61112">
+          <wp:inline distT="0" distB="0" distL="0" distR="0" wp14:anchorId="5B5957BF" wp14:editId="0D881CEC">
             <wp:extent cx="5580000" cy="3138750"/>
             <wp:effectExtent l="0" t="0" r="0" b="0"/>
             <wp:docPr id="13" name="Picture 13"/>
@@ -15939,7 +17277,7 @@
         <w:t xml:space="preserve">Regresión. </w:t>
       </w:r>
       <w:r>
-        <w:t>Al abrir el Pull Request, GitHub Actions ejecuta los trece casos y el job que inyecta DEF-01 y DEF-02.</w:t>
+        <w:t>Al abrir el Pull Request, GitHub Actions ejecuta los quince casos y el job que inyecta DEF-01 y DEF-02.</w:t>
       </w:r>
     </w:p>
     <w:p>
@@ -15970,7 +17308,7 @@
         <w:spacing w:after="40"/>
       </w:pPr>
       <w:r>
-        <w:t>Al corregir un defecto repetimos la suite completa, porque tarda menos de cinco segundos:</w:t>
+        <w:t>Al corregir un defecto repetimos la suite completa, porque tarda alrededor de cinco segundos:</w:t>
       </w:r>
     </w:p>
     <w:p>
@@ -15997,7 +17335,7 @@
         <w:spacing w:after="40"/>
       </w:pPr>
       <w:r>
-        <w:t>CP-05, CP-06 y CP-13, para verificar la persistencia de ventas y entradas en el archivo.</w:t>
+        <w:t>CP-05, CP-06, CP-13 y CP-14, para verificar que las ventas, las entradas y las consultas leen y guardan bien el archivo.</w:t>
       </w:r>
     </w:p>
     <w:p>
@@ -16015,7 +17353,7 @@
         <w:spacing w:after="40"/>
       </w:pPr>
       <w:r>
-        <w:t>CP-09 y CP-10, para validar el proceso completo desde el punto de vista de la cliente.</w:t>
+        <w:t>CP-09, CP-10 y CP-15, para validar el proceso completo desde el punto de vista de la cliente.</w:t>
       </w:r>
     </w:p>
     <w:p>
@@ -16223,7 +17561,7 @@
               <w:rPr>
                 <w:sz w:val="19"/>
               </w:rPr>
-              <w:t>Commit 1dba0bd (rama main)</w:t>
+              <w:t>Commit 7108e1e</w:t>
             </w:r>
           </w:p>
         </w:tc>
@@ -16240,7 +17578,7 @@
               <w:rPr>
                 <w:sz w:val="19"/>
               </w:rPr>
-              <w:t>Commit 1dba0bd (rama main)</w:t>
+              <w:t>Commit 7108e1e</w:t>
             </w:r>
           </w:p>
         </w:tc>
@@ -16397,7 +17735,7 @@
               <w:rPr>
                 <w:sz w:val="19"/>
               </w:rPr>
-              <w:t>Aprobado: CP-04, CP-06 y CP-08 pasan; regresión 13 de 13</w:t>
+              <w:t>Aprobado: CP-04, CP-06, CP-08 y CP-15 pasan; regresión 15 de 15</w:t>
             </w:r>
           </w:p>
         </w:tc>
@@ -16414,7 +17752,7 @@
               <w:rPr>
                 <w:sz w:val="19"/>
               </w:rPr>
-              <w:t>Aprobado: CP-09 pasa; regresión 13 de 13</w:t>
+              <w:t>Aprobado: CP-09 y CP-15 pasan; regresión 15 de 15</w:t>
             </w:r>
           </w:p>
         </w:tc>
@@ -16590,7 +17928,7 @@
             <w:color w:val="1F4E8C"/>
             <w:u w:val="single"/>
           </w:rPr>
-          <w:t>https://github.com/azharsonix/sistema-inventario-actividad-2/actions/runs/41176035399</w:t>
+          <w:t>https://github.com/azharsonix/sistema-inventario-actividad-2/actions/runs/41243288499</w:t>
         </w:r>
       </w:hyperlink>
       <w:r>
@@ -17071,7 +18409,7 @@
           <w:noProof/>
         </w:rPr>
         <w:drawing>
-          <wp:inline distT="0" distB="0" distL="0" distR="0" wp14:anchorId="25B9A8D2" wp14:editId="5E8E4C7D">
+          <wp:inline distT="0" distB="0" distL="0" distR="0" wp14:anchorId="39CA37BE" wp14:editId="1DC93BBB">
             <wp:extent cx="5580000" cy="3138750"/>
             <wp:effectExtent l="0" t="0" r="0" b="0"/>
             <wp:docPr id="14" name="Picture 14"/>
@@ -17130,7 +18468,7 @@
           <w:noProof/>
         </w:rPr>
         <w:drawing>
-          <wp:inline distT="0" distB="0" distL="0" distR="0" wp14:anchorId="14194D33" wp14:editId="29B365AF">
+          <wp:inline distT="0" distB="0" distL="0" distR="0" wp14:anchorId="4C054841" wp14:editId="01B1BEDB">
             <wp:extent cx="5580000" cy="3138750"/>
             <wp:effectExtent l="0" t="0" r="0" b="0"/>
             <wp:docPr id="15" name="Picture 15"/>
@@ -17189,7 +18527,7 @@
           <w:noProof/>
         </w:rPr>
         <w:drawing>
-          <wp:inline distT="0" distB="0" distL="0" distR="0" wp14:anchorId="6250C157" wp14:editId="4F160D7B">
+          <wp:inline distT="0" distB="0" distL="0" distR="0" wp14:anchorId="1AF397DA" wp14:editId="0E1533D5">
             <wp:extent cx="5580000" cy="3138750"/>
             <wp:effectExtent l="0" t="0" r="0" b="0"/>
             <wp:docPr id="16" name="Picture 16"/>
@@ -17866,7 +19204,7 @@
                 <w:b/>
                 <w:sz w:val="19"/>
               </w:rPr>
-              <w:t>CP-05, CP-06 y CP-13: persistencia de ventas y entradas</w:t>
+              <w:t>CP-05, CP-06, CP-13 y CP-14: persistencia y consulta en el archivo</w:t>
             </w:r>
           </w:p>
         </w:tc>
@@ -18016,7 +19354,7 @@
                 <w:b/>
                 <w:sz w:val="19"/>
               </w:rPr>
-              <w:t>CP-09 y CP-10: escenarios de la cliente</w:t>
+              <w:t>CP-09, CP-10 y CP-15: escenarios de la cliente</w:t>
             </w:r>
           </w:p>
         </w:tc>
@@ -18407,7 +19745,7 @@
               <w:rPr>
                 <w:sz w:val="19"/>
               </w:rPr>
-              <w:t>Los trece casos más el job que inyecta DEF-01 y DEF-02.</w:t>
+              <w:t>Los quince casos más el job que inyecta DEF-01 y DEF-02.</w:t>
             </w:r>
           </w:p>
         </w:tc>
@@ -18549,12 +19887,12 @@
     </w:p>
     <w:p>
       <w:r>
-        <w:t>Escribimos cinco requisitos con criterios verificables, y cada uno quedó cubierto por al menos un caso. Los trece casos están automatizados en cuatro niveles y la ronda 1 terminó con todos aprobados. La gráfica de cobertura muestra que RF-05 solo tiene un caso (CP-09), así que es el primer requisito que conviene reforzar.</w:t>
+        <w:t>Escribimos cinco requisitos con criterios verificables, y cada uno quedó cubierto por al menos dos casos. Los quince casos están automatizados en cuatro niveles y la ronda 1 terminó con todos aprobados. CP-15 recorre los cinco requisitos de principio a fin, y la gráfica de cobertura muestra que RF-05 es el que tiene menos casos (CP-09 y CP-15), así que es el que conviene reforzar.</w:t>
       </w:r>
     </w:p>
     <w:p>
       <w:r>
-        <w:t>Al inyectar los defectos comprobamos que las pruebas los detectan: DEF-01 provocó fallos en tres niveles distintos y DEF-02 en CP-09. La ronda 3 mostró que el porcentaje de aprobación debe leerse junto con la prioridad de lo que falla: un 92.3 % puede esconder un defecto que afecta a la tienda.</w:t>
+        <w:t>Al inyectar los defectos comprobamos que las pruebas los detectan: DEF-01 provocó fallos en los cuatro niveles y DEF-02 en CP-09 y CP-15. La ronda 3 mostró que el porcentaje de aprobación debe leerse junto con la prioridad de lo que falla: un 86.7 % puede esconder un defecto que afecta a la tienda.</w:t>
       </w:r>
     </w:p>
     <w:p>
@@ -18671,7 +20009,7 @@
               <w:rPr>
                 <w:sz w:val="19"/>
               </w:rPr>
-              <w:t>Ejecuta los 13 casos en la consola.</w:t>
+              <w:t>Ejecuta los 15 casos en la consola.</w:t>
             </w:r>
           </w:p>
         </w:tc>
@@ -19106,31 +20444,31 @@
       </w:rPr>
     </w:lvl>
   </w:abstractNum>
-  <w:num w:numId="1" w16cid:durableId="1343780019">
+  <w:num w:numId="1" w16cid:durableId="855847686">
     <w:abstractNumId w:val="8"/>
   </w:num>
-  <w:num w:numId="2" w16cid:durableId="1332637944">
+  <w:num w:numId="2" w16cid:durableId="250508710">
     <w:abstractNumId w:val="6"/>
   </w:num>
-  <w:num w:numId="3" w16cid:durableId="780757036">
+  <w:num w:numId="3" w16cid:durableId="1963419316">
     <w:abstractNumId w:val="5"/>
   </w:num>
-  <w:num w:numId="4" w16cid:durableId="1599635426">
+  <w:num w:numId="4" w16cid:durableId="1939630523">
     <w:abstractNumId w:val="4"/>
   </w:num>
-  <w:num w:numId="5" w16cid:durableId="111486729">
+  <w:num w:numId="5" w16cid:durableId="907306849">
     <w:abstractNumId w:val="7"/>
   </w:num>
-  <w:num w:numId="6" w16cid:durableId="1738279681">
+  <w:num w:numId="6" w16cid:durableId="1088698947">
     <w:abstractNumId w:val="3"/>
   </w:num>
-  <w:num w:numId="7" w16cid:durableId="1959294850">
+  <w:num w:numId="7" w16cid:durableId="482236001">
     <w:abstractNumId w:val="2"/>
   </w:num>
-  <w:num w:numId="8" w16cid:durableId="918829384">
+  <w:num w:numId="8" w16cid:durableId="858541309">
     <w:abstractNumId w:val="1"/>
   </w:num>
-  <w:num w:numId="9" w16cid:durableId="592667260">
+  <w:num w:numId="9" w16cid:durableId="1702899507">
     <w:abstractNumId w:val="0"/>
   </w:num>
 </w:numbering>

</xml_diff>

<commit_message>
interfaz web TecnoStock en public/ (la misma del sistema original) y documento con la sección 5.4 y sus capturas
</commit_message>
<xml_diff>
--- a/docs/Segunda parte/Actividad 2 - Segunda parte - Documento técnico.docx
+++ b/docs/Segunda parte/Actividad 2 - Segunda parte - Documento técnico.docx
@@ -226,6 +226,21 @@
         <w:rPr>
           <w:b/>
         </w:rPr>
+        <w:t xml:space="preserve">Interfaz web: </w:t>
+      </w:r>
+      <w:r>
+        <w:t>sistema/public/app.html (TecnoStock), que usa la misma API</w:t>
+      </w:r>
+    </w:p>
+    <w:p>
+      <w:pPr>
+        <w:pStyle w:val="Listaconvietas"/>
+        <w:spacing w:after="40"/>
+      </w:pPr>
+      <w:r>
+        <w:rPr>
+          <w:b/>
+        </w:rPr>
         <w:t xml:space="preserve">Evidencia: </w:t>
       </w:r>
       <w:r>
@@ -774,6 +789,7 @@
         <w:rPr>
           <w:b/>
         </w:rPr>
+        <w:lastRenderedPageBreak/>
         <w:t xml:space="preserve">Relación entre requisitos y pruebas: </w:t>
       </w:r>
       <w:r>
@@ -826,7 +842,6 @@
                 <w:color w:val="FFFFFF"/>
                 <w:sz w:val="17"/>
               </w:rPr>
-              <w:lastRenderedPageBreak/>
               <w:t>RF</w:t>
             </w:r>
           </w:p>
@@ -2417,7 +2432,7 @@
           <w:noProof/>
         </w:rPr>
         <w:drawing>
-          <wp:inline distT="0" distB="0" distL="0" distR="0" wp14:anchorId="5E59B249" wp14:editId="32197077">
+          <wp:inline distT="0" distB="0" distL="0" distR="0" wp14:anchorId="61F623F8" wp14:editId="3ACED828">
             <wp:extent cx="5580000" cy="3138750"/>
             <wp:effectExtent l="0" t="0" r="0" b="0"/>
             <wp:docPr id="1" name="Picture 1"/>
@@ -2527,6 +2542,7 @@
         <w:spacing w:after="40"/>
       </w:pPr>
       <w:r>
+        <w:lastRenderedPageBreak/>
         <w:t>Consulta de productos existentes e inexistentes.</w:t>
       </w:r>
     </w:p>
@@ -2577,7 +2593,7 @@
     </w:p>
     <w:p>
       <w:r>
-        <w:t>Quedan fuera del alcance la interfaz gráfica, usuarios y permisos, facturación fiscal, pagos electrónicos, contabilidad, administración de proveedores y pruebas de carga.</w:t>
+        <w:t>Quedan fuera del alcance las pruebas automatizadas de la interfaz web (su uso se muestra en la sección 5.4), usuarios y permisos, facturación fiscal, pagos electrónicos, contabilidad, administración de proveedores y pruebas de carga.</w:t>
       </w:r>
     </w:p>
     <w:p>
@@ -2722,7 +2738,7 @@
               <w:rPr>
                 <w:sz w:val="19"/>
               </w:rPr>
-              <w:t>Sistema de inventario (PHP 8.4.27), archivo de datos JSON y servidor integrado de PHP (php -S) para las pruebas por HTTP.</w:t>
+              <w:t>Sistema de inventario (PHP 8.4.27) con su interfaz web TecnoStock, archivo de datos JSON y servidor integrado de PHP (php -S) para las pruebas por HTTP.</w:t>
             </w:r>
           </w:p>
         </w:tc>
@@ -3447,6 +3463,7 @@
         <w:rPr>
           <w:b/>
         </w:rPr>
+        <w:lastRenderedPageBreak/>
         <w:t>Matriz RACI</w:t>
       </w:r>
     </w:p>
@@ -3608,6 +3625,13 @@
                 <w:sz w:val="18"/>
               </w:rPr>
               <w:br/>
+            </w:r>
+            <w:r>
+              <w:rPr>
+                <w:b/>
+                <w:color w:val="FFFFFF"/>
+                <w:sz w:val="18"/>
+              </w:rPr>
               <w:t>Diseñador</w:t>
             </w:r>
           </w:p>
@@ -5186,6 +5210,7 @@
         <w:pStyle w:val="Ttulo3"/>
       </w:pPr>
       <w:r>
+        <w:lastRenderedPageBreak/>
         <w:t>Caso de prueba CP-01: Registro correcto de producto</w:t>
       </w:r>
     </w:p>
@@ -10731,7 +10756,7 @@
           <w:noProof/>
         </w:rPr>
         <w:drawing>
-          <wp:inline distT="0" distB="0" distL="0" distR="0" wp14:anchorId="14FC45D2" wp14:editId="2D0F52CC">
+          <wp:inline distT="0" distB="0" distL="0" distR="0" wp14:anchorId="2C47420F" wp14:editId="44BE16E3">
             <wp:extent cx="5580000" cy="3138750"/>
             <wp:effectExtent l="0" t="0" r="0" b="0"/>
             <wp:docPr id="2" name="Picture 2"/>
@@ -11740,7 +11765,7 @@
           <w:noProof/>
         </w:rPr>
         <w:drawing>
-          <wp:inline distT="0" distB="0" distL="0" distR="0" wp14:anchorId="3FE816DA" wp14:editId="45C1929F">
+          <wp:inline distT="0" distB="0" distL="0" distR="0" wp14:anchorId="4B80C959" wp14:editId="26B92EBB">
             <wp:extent cx="5580000" cy="3138750"/>
             <wp:effectExtent l="0" t="0" r="0" b="0"/>
             <wp:docPr id="3" name="Picture 3"/>
@@ -13663,7 +13688,7 @@
           <w:noProof/>
         </w:rPr>
         <w:drawing>
-          <wp:inline distT="0" distB="0" distL="0" distR="0" wp14:anchorId="2E22A70B" wp14:editId="026F1D34">
+          <wp:inline distT="0" distB="0" distL="0" distR="0" wp14:anchorId="294275C8" wp14:editId="75AD35D2">
             <wp:extent cx="5580000" cy="3138750"/>
             <wp:effectExtent l="0" t="0" r="0" b="0"/>
             <wp:docPr id="4" name="Picture 4"/>
@@ -13722,7 +13747,7 @@
           <w:noProof/>
         </w:rPr>
         <w:drawing>
-          <wp:inline distT="0" distB="0" distL="0" distR="0" wp14:anchorId="7BBFFCF3" wp14:editId="0F57E4CD">
+          <wp:inline distT="0" distB="0" distL="0" distR="0" wp14:anchorId="10F6B406" wp14:editId="63651209">
             <wp:extent cx="5580000" cy="3138750"/>
             <wp:effectExtent l="0" t="0" r="0" b="0"/>
             <wp:docPr id="5" name="Picture 5"/>
@@ -13781,7 +13806,7 @@
           <w:noProof/>
         </w:rPr>
         <w:drawing>
-          <wp:inline distT="0" distB="0" distL="0" distR="0" wp14:anchorId="39F153E1" wp14:editId="7A2BBC8C">
+          <wp:inline distT="0" distB="0" distL="0" distR="0" wp14:anchorId="3771C487" wp14:editId="228D400B">
             <wp:extent cx="5580000" cy="3138750"/>
             <wp:effectExtent l="0" t="0" r="0" b="0"/>
             <wp:docPr id="6" name="Picture 6"/>
@@ -13845,7 +13870,7 @@
           <w:noProof/>
         </w:rPr>
         <w:drawing>
-          <wp:inline distT="0" distB="0" distL="0" distR="0" wp14:anchorId="7AED3094" wp14:editId="786DA95B">
+          <wp:inline distT="0" distB="0" distL="0" distR="0" wp14:anchorId="1FDEA709" wp14:editId="3BBAD139">
             <wp:extent cx="5580000" cy="3138750"/>
             <wp:effectExtent l="0" t="0" r="0" b="0"/>
             <wp:docPr id="7" name="Picture 7"/>
@@ -14496,7 +14521,7 @@
           <w:noProof/>
         </w:rPr>
         <w:drawing>
-          <wp:inline distT="0" distB="0" distL="0" distR="0" wp14:anchorId="2206F12F" wp14:editId="7F5F6BEA">
+          <wp:inline distT="0" distB="0" distL="0" distR="0" wp14:anchorId="08F94017" wp14:editId="5D1C77AA">
             <wp:extent cx="5580000" cy="3138750"/>
             <wp:effectExtent l="0" t="0" r="0" b="0"/>
             <wp:docPr id="8" name="Picture 8"/>
@@ -14582,7 +14607,7 @@
           <w:noProof/>
         </w:rPr>
         <w:drawing>
-          <wp:inline distT="0" distB="0" distL="0" distR="0" wp14:anchorId="0ABBFA08" wp14:editId="6873A87F">
+          <wp:inline distT="0" distB="0" distL="0" distR="0" wp14:anchorId="28278F46" wp14:editId="10B03418">
             <wp:extent cx="5580000" cy="3138750"/>
             <wp:effectExtent l="0" t="0" r="0" b="0"/>
             <wp:docPr id="9" name="Picture 9"/>
@@ -15074,7 +15099,7 @@
           <w:noProof/>
         </w:rPr>
         <w:drawing>
-          <wp:inline distT="0" distB="0" distL="0" distR="0" wp14:anchorId="3813F4B1" wp14:editId="709EFAFF">
+          <wp:inline distT="0" distB="0" distL="0" distR="0" wp14:anchorId="52CB3105" wp14:editId="58245E6A">
             <wp:extent cx="5580000" cy="3138750"/>
             <wp:effectExtent l="0" t="0" r="0" b="0"/>
             <wp:docPr id="10" name="Picture 10"/>
@@ -15619,7 +15644,7 @@
           <w:noProof/>
         </w:rPr>
         <w:drawing>
-          <wp:inline distT="0" distB="0" distL="0" distR="0" wp14:anchorId="1E0FFA88" wp14:editId="660AEA7A">
+          <wp:inline distT="0" distB="0" distL="0" distR="0" wp14:anchorId="0646DAEF" wp14:editId="6749AECE">
             <wp:extent cx="5580000" cy="3138750"/>
             <wp:effectExtent l="0" t="0" r="0" b="0"/>
             <wp:docPr id="11" name="Picture 11"/>
@@ -15678,7 +15703,7 @@
           <w:noProof/>
         </w:rPr>
         <w:drawing>
-          <wp:inline distT="0" distB="0" distL="0" distR="0" wp14:anchorId="4BD23791" wp14:editId="5AAA8912">
+          <wp:inline distT="0" distB="0" distL="0" distR="0" wp14:anchorId="10C40695" wp14:editId="4B3D2B44">
             <wp:extent cx="5580000" cy="3138750"/>
             <wp:effectExtent l="0" t="0" r="0" b="0"/>
             <wp:docPr id="12" name="Picture 12"/>
@@ -15729,6 +15754,802 @@
     </w:p>
     <w:p>
       <w:pPr>
+        <w:pStyle w:val="Ttulo2"/>
+      </w:pPr>
+      <w:r>
+        <w:t>5.4 Interfaz web del sistema</w:t>
+      </w:r>
+    </w:p>
+    <w:p>
+      <w:r>
+        <w:t>El sistema tiene una interfaz web (TecnoStock) que trabaja sobre la misma API de las pruebas. En ella repetimos las operaciones de las Figuras 9 y 10 con los mismos datos de ejemplo: alta de TEC-020, venta de 4 piezas, venta de 50 piezas rechazada y entrada de 10 piezas. Las capturas se tomaron en Chrome con Playwright.</w:t>
+      </w:r>
+    </w:p>
+    <w:p>
+      <w:pPr>
+        <w:keepNext/>
+        <w:jc w:val="center"/>
+      </w:pPr>
+      <w:r>
+        <w:rPr>
+          <w:noProof/>
+        </w:rPr>
+        <w:drawing>
+          <wp:inline distT="0" distB="0" distL="0" distR="0" wp14:anchorId="04B19ED5" wp14:editId="2D26FDAA">
+            <wp:extent cx="5580000" cy="3138750"/>
+            <wp:effectExtent l="0" t="0" r="0" b="0"/>
+            <wp:docPr id="13" name="Picture 13"/>
+            <wp:cNvGraphicFramePr>
+              <a:graphicFrameLocks xmlns:a="http://schemas.openxmlformats.org/drawingml/2006/main" noChangeAspect="1"/>
+            </wp:cNvGraphicFramePr>
+            <a:graphic xmlns:a="http://schemas.openxmlformats.org/drawingml/2006/main">
+              <a:graphicData uri="http://schemas.openxmlformats.org/drawingml/2006/picture">
+                <pic:pic xmlns:pic="http://schemas.openxmlformats.org/drawingml/2006/picture">
+                  <pic:nvPicPr>
+                    <pic:cNvPr id="0" name="ui-panel.png"/>
+                    <pic:cNvPicPr/>
+                  </pic:nvPicPr>
+                  <pic:blipFill>
+                    <a:blip r:embed="rId19"/>
+                    <a:stretch>
+                      <a:fillRect/>
+                    </a:stretch>
+                  </pic:blipFill>
+                  <pic:spPr>
+                    <a:xfrm>
+                      <a:off x="0" y="0"/>
+                      <a:ext cx="5580000" cy="3138750"/>
+                    </a:xfrm>
+                    <a:prstGeom prst="rect">
+                      <a:avLst/>
+                    </a:prstGeom>
+                  </pic:spPr>
+                </pic:pic>
+              </a:graphicData>
+            </a:graphic>
+          </wp:inline>
+        </w:drawing>
+      </w:r>
+    </w:p>
+    <w:p>
+      <w:pPr>
+        <w:jc w:val="center"/>
+      </w:pPr>
+      <w:r>
+        <w:rPr>
+          <w:i/>
+          <w:color w:val="5D6575"/>
+          <w:sz w:val="18"/>
+        </w:rPr>
+        <w:t>Figura 13. Panel de inicio: totales del inventario, productos por resurtir y últimos movimientos.</w:t>
+      </w:r>
+    </w:p>
+    <w:p>
+      <w:pPr>
+        <w:keepNext/>
+        <w:jc w:val="center"/>
+      </w:pPr>
+      <w:r>
+        <w:rPr>
+          <w:noProof/>
+        </w:rPr>
+        <w:drawing>
+          <wp:inline distT="0" distB="0" distL="0" distR="0" wp14:anchorId="4BDE23A5" wp14:editId="240A5652">
+            <wp:extent cx="5580000" cy="3138750"/>
+            <wp:effectExtent l="0" t="0" r="0" b="0"/>
+            <wp:docPr id="14" name="Picture 14"/>
+            <wp:cNvGraphicFramePr>
+              <a:graphicFrameLocks xmlns:a="http://schemas.openxmlformats.org/drawingml/2006/main" noChangeAspect="1"/>
+            </wp:cNvGraphicFramePr>
+            <a:graphic xmlns:a="http://schemas.openxmlformats.org/drawingml/2006/main">
+              <a:graphicData uri="http://schemas.openxmlformats.org/drawingml/2006/picture">
+                <pic:pic xmlns:pic="http://schemas.openxmlformats.org/drawingml/2006/picture">
+                  <pic:nvPicPr>
+                    <pic:cNvPr id="0" name="ui-alta.png"/>
+                    <pic:cNvPicPr/>
+                  </pic:nvPicPr>
+                  <pic:blipFill>
+                    <a:blip r:embed="rId20"/>
+                    <a:stretch>
+                      <a:fillRect/>
+                    </a:stretch>
+                  </pic:blipFill>
+                  <pic:spPr>
+                    <a:xfrm>
+                      <a:off x="0" y="0"/>
+                      <a:ext cx="5580000" cy="3138750"/>
+                    </a:xfrm>
+                    <a:prstGeom prst="rect">
+                      <a:avLst/>
+                    </a:prstGeom>
+                  </pic:spPr>
+                </pic:pic>
+              </a:graphicData>
+            </a:graphic>
+          </wp:inline>
+        </w:drawing>
+      </w:r>
+    </w:p>
+    <w:p>
+      <w:pPr>
+        <w:jc w:val="center"/>
+      </w:pPr>
+      <w:r>
+        <w:rPr>
+          <w:i/>
+          <w:color w:val="5D6575"/>
+          <w:sz w:val="18"/>
+        </w:rPr>
+        <w:t>Figura 14. Alta de TEC-020 (Teclado USB, $250.00, 20 piezas, mínimo 5).</w:t>
+      </w:r>
+    </w:p>
+    <w:p>
+      <w:pPr>
+        <w:keepNext/>
+        <w:jc w:val="center"/>
+      </w:pPr>
+      <w:r>
+        <w:rPr>
+          <w:noProof/>
+        </w:rPr>
+        <w:drawing>
+          <wp:inline distT="0" distB="0" distL="0" distR="0" wp14:anchorId="3B9E586A" wp14:editId="44B29F11">
+            <wp:extent cx="5580000" cy="3138750"/>
+            <wp:effectExtent l="0" t="0" r="0" b="0"/>
+            <wp:docPr id="15" name="Picture 15"/>
+            <wp:cNvGraphicFramePr>
+              <a:graphicFrameLocks xmlns:a="http://schemas.openxmlformats.org/drawingml/2006/main" noChangeAspect="1"/>
+            </wp:cNvGraphicFramePr>
+            <a:graphic xmlns:a="http://schemas.openxmlformats.org/drawingml/2006/main">
+              <a:graphicData uri="http://schemas.openxmlformats.org/drawingml/2006/picture">
+                <pic:pic xmlns:pic="http://schemas.openxmlformats.org/drawingml/2006/picture">
+                  <pic:nvPicPr>
+                    <pic:cNvPr id="0" name="ui-venta.png"/>
+                    <pic:cNvPicPr/>
+                  </pic:nvPicPr>
+                  <pic:blipFill>
+                    <a:blip r:embed="rId21"/>
+                    <a:stretch>
+                      <a:fillRect/>
+                    </a:stretch>
+                  </pic:blipFill>
+                  <pic:spPr>
+                    <a:xfrm>
+                      <a:off x="0" y="0"/>
+                      <a:ext cx="5580000" cy="3138750"/>
+                    </a:xfrm>
+                    <a:prstGeom prst="rect">
+                      <a:avLst/>
+                    </a:prstGeom>
+                  </pic:spPr>
+                </pic:pic>
+              </a:graphicData>
+            </a:graphic>
+          </wp:inline>
+        </w:drawing>
+      </w:r>
+    </w:p>
+    <w:p>
+      <w:pPr>
+        <w:jc w:val="center"/>
+      </w:pPr>
+      <w:r>
+        <w:rPr>
+          <w:i/>
+          <w:color w:val="5D6575"/>
+          <w:sz w:val="18"/>
+        </w:rPr>
+        <w:t>Figura 15. Registro de la venta de 4 piezas: la ventana muestra la existencia disponible (20) y la resultante (16).</w:t>
+      </w:r>
+    </w:p>
+    <w:p>
+      <w:pPr>
+        <w:keepNext/>
+        <w:jc w:val="center"/>
+      </w:pPr>
+      <w:r>
+        <w:rPr>
+          <w:noProof/>
+        </w:rPr>
+        <w:drawing>
+          <wp:inline distT="0" distB="0" distL="0" distR="0" wp14:anchorId="138D30BC" wp14:editId="2A9362CE">
+            <wp:extent cx="5580000" cy="3138750"/>
+            <wp:effectExtent l="0" t="0" r="0" b="0"/>
+            <wp:docPr id="16" name="Picture 16"/>
+            <wp:cNvGraphicFramePr>
+              <a:graphicFrameLocks xmlns:a="http://schemas.openxmlformats.org/drawingml/2006/main" noChangeAspect="1"/>
+            </wp:cNvGraphicFramePr>
+            <a:graphic xmlns:a="http://schemas.openxmlformats.org/drawingml/2006/main">
+              <a:graphicData uri="http://schemas.openxmlformats.org/drawingml/2006/picture">
+                <pic:pic xmlns:pic="http://schemas.openxmlformats.org/drawingml/2006/picture">
+                  <pic:nvPicPr>
+                    <pic:cNvPr id="0" name="ui-venta-ok.png"/>
+                    <pic:cNvPicPr/>
+                  </pic:nvPicPr>
+                  <pic:blipFill>
+                    <a:blip r:embed="rId22"/>
+                    <a:stretch>
+                      <a:fillRect/>
+                    </a:stretch>
+                  </pic:blipFill>
+                  <pic:spPr>
+                    <a:xfrm>
+                      <a:off x="0" y="0"/>
+                      <a:ext cx="5580000" cy="3138750"/>
+                    </a:xfrm>
+                    <a:prstGeom prst="rect">
+                      <a:avLst/>
+                    </a:prstGeom>
+                  </pic:spPr>
+                </pic:pic>
+              </a:graphicData>
+            </a:graphic>
+          </wp:inline>
+        </w:drawing>
+      </w:r>
+    </w:p>
+    <w:p>
+      <w:pPr>
+        <w:jc w:val="center"/>
+      </w:pPr>
+      <w:r>
+        <w:rPr>
+          <w:i/>
+          <w:color w:val="5D6575"/>
+          <w:sz w:val="18"/>
+        </w:rPr>
+        <w:t>Figura 16. Venta registrada: el aviso confirma «quedan 16» y la tabla muestra TEC-020 con 16 piezas.</w:t>
+      </w:r>
+    </w:p>
+    <w:p>
+      <w:pPr>
+        <w:keepNext/>
+        <w:jc w:val="center"/>
+      </w:pPr>
+      <w:r>
+        <w:rPr>
+          <w:noProof/>
+        </w:rPr>
+        <w:drawing>
+          <wp:inline distT="0" distB="0" distL="0" distR="0" wp14:anchorId="73424FC0" wp14:editId="51FA6D90">
+            <wp:extent cx="5580000" cy="3138750"/>
+            <wp:effectExtent l="0" t="0" r="0" b="0"/>
+            <wp:docPr id="17" name="Picture 17"/>
+            <wp:cNvGraphicFramePr>
+              <a:graphicFrameLocks xmlns:a="http://schemas.openxmlformats.org/drawingml/2006/main" noChangeAspect="1"/>
+            </wp:cNvGraphicFramePr>
+            <a:graphic xmlns:a="http://schemas.openxmlformats.org/drawingml/2006/main">
+              <a:graphicData uri="http://schemas.openxmlformats.org/drawingml/2006/picture">
+                <pic:pic xmlns:pic="http://schemas.openxmlformats.org/drawingml/2006/picture">
+                  <pic:nvPicPr>
+                    <pic:cNvPr id="0" name="ui-venta-rechazada.png"/>
+                    <pic:cNvPicPr/>
+                  </pic:nvPicPr>
+                  <pic:blipFill>
+                    <a:blip r:embed="rId23"/>
+                    <a:stretch>
+                      <a:fillRect/>
+                    </a:stretch>
+                  </pic:blipFill>
+                  <pic:spPr>
+                    <a:xfrm>
+                      <a:off x="0" y="0"/>
+                      <a:ext cx="5580000" cy="3138750"/>
+                    </a:xfrm>
+                    <a:prstGeom prst="rect">
+                      <a:avLst/>
+                    </a:prstGeom>
+                  </pic:spPr>
+                </pic:pic>
+              </a:graphicData>
+            </a:graphic>
+          </wp:inline>
+        </w:drawing>
+      </w:r>
+    </w:p>
+    <w:p>
+      <w:pPr>
+        <w:jc w:val="center"/>
+      </w:pPr>
+      <w:r>
+        <w:rPr>
+          <w:i/>
+          <w:color w:val="5D6575"/>
+          <w:sz w:val="18"/>
+        </w:rPr>
+        <w:t>Figura 17. Venta de 50 piezas rechazada: «Existencia insuficiente: hay 16 y se pidieron 50.»; la existencia sigue en 16.</w:t>
+      </w:r>
+    </w:p>
+    <w:p>
+      <w:pPr>
+        <w:keepNext/>
+        <w:jc w:val="center"/>
+      </w:pPr>
+      <w:r>
+        <w:rPr>
+          <w:noProof/>
+        </w:rPr>
+        <w:drawing>
+          <wp:inline distT="0" distB="0" distL="0" distR="0" wp14:anchorId="0F4A0E0C" wp14:editId="2709A8F2">
+            <wp:extent cx="5580000" cy="3138750"/>
+            <wp:effectExtent l="0" t="0" r="0" b="0"/>
+            <wp:docPr id="18" name="Picture 18"/>
+            <wp:cNvGraphicFramePr>
+              <a:graphicFrameLocks xmlns:a="http://schemas.openxmlformats.org/drawingml/2006/main" noChangeAspect="1"/>
+            </wp:cNvGraphicFramePr>
+            <a:graphic xmlns:a="http://schemas.openxmlformats.org/drawingml/2006/main">
+              <a:graphicData uri="http://schemas.openxmlformats.org/drawingml/2006/picture">
+                <pic:pic xmlns:pic="http://schemas.openxmlformats.org/drawingml/2006/picture">
+                  <pic:nvPicPr>
+                    <pic:cNvPr id="0" name="ui-movimientos.png"/>
+                    <pic:cNvPicPr/>
+                  </pic:nvPicPr>
+                  <pic:blipFill>
+                    <a:blip r:embed="rId24"/>
+                    <a:stretch>
+                      <a:fillRect/>
+                    </a:stretch>
+                  </pic:blipFill>
+                  <pic:spPr>
+                    <a:xfrm>
+                      <a:off x="0" y="0"/>
+                      <a:ext cx="5580000" cy="3138750"/>
+                    </a:xfrm>
+                    <a:prstGeom prst="rect">
+                      <a:avLst/>
+                    </a:prstGeom>
+                  </pic:spPr>
+                </pic:pic>
+              </a:graphicData>
+            </a:graphic>
+          </wp:inline>
+        </w:drawing>
+      </w:r>
+    </w:p>
+    <w:p>
+      <w:pPr>
+        <w:jc w:val="center"/>
+      </w:pPr>
+      <w:r>
+        <w:rPr>
+          <w:i/>
+          <w:color w:val="5D6575"/>
+          <w:sz w:val="18"/>
+        </w:rPr>
+        <w:t>Figura 18. Historial de movimientos: la entrada de 10 piezas (quedan 26) y la venta de 4 piezas (quedan 16) encabezan la lista.</w:t>
+      </w:r>
+    </w:p>
+    <w:p>
+      <w:pPr>
+        <w:keepNext/>
+        <w:jc w:val="center"/>
+      </w:pPr>
+      <w:r>
+        <w:rPr>
+          <w:noProof/>
+        </w:rPr>
+        <w:drawing>
+          <wp:inline distT="0" distB="0" distL="0" distR="0" wp14:anchorId="38A30370" wp14:editId="60C7AA04">
+            <wp:extent cx="5580000" cy="3138750"/>
+            <wp:effectExtent l="0" t="0" r="0" b="0"/>
+            <wp:docPr id="19" name="Picture 19"/>
+            <wp:cNvGraphicFramePr>
+              <a:graphicFrameLocks xmlns:a="http://schemas.openxmlformats.org/drawingml/2006/main" noChangeAspect="1"/>
+            </wp:cNvGraphicFramePr>
+            <a:graphic xmlns:a="http://schemas.openxmlformats.org/drawingml/2006/main">
+              <a:graphicData uri="http://schemas.openxmlformats.org/drawingml/2006/picture">
+                <pic:pic xmlns:pic="http://schemas.openxmlformats.org/drawingml/2006/picture">
+                  <pic:nvPicPr>
+                    <pic:cNvPr id="0" name="ui-reporte.png"/>
+                    <pic:cNvPicPr/>
+                  </pic:nvPicPr>
+                  <pic:blipFill>
+                    <a:blip r:embed="rId25"/>
+                    <a:stretch>
+                      <a:fillRect/>
+                    </a:stretch>
+                  </pic:blipFill>
+                  <pic:spPr>
+                    <a:xfrm>
+                      <a:off x="0" y="0"/>
+                      <a:ext cx="5580000" cy="3138750"/>
+                    </a:xfrm>
+                    <a:prstGeom prst="rect">
+                      <a:avLst/>
+                    </a:prstGeom>
+                  </pic:spPr>
+                </pic:pic>
+              </a:graphicData>
+            </a:graphic>
+          </wp:inline>
+        </w:drawing>
+      </w:r>
+    </w:p>
+    <w:p>
+      <w:pPr>
+        <w:jc w:val="center"/>
+      </w:pPr>
+      <w:r>
+        <w:rPr>
+          <w:i/>
+          <w:color w:val="5D6575"/>
+          <w:sz w:val="18"/>
+        </w:rPr>
+        <w:t>Figura 19. Reporte de inventario en la interfaz: totales, valor por categoría y productos a resurtir.</w:t>
+      </w:r>
+    </w:p>
+    <w:tbl>
+      <w:tblPr>
+        <w:tblStyle w:val="Tablaconcuadrcula"/>
+        <w:tblW w:w="0" w:type="auto"/>
+        <w:jc w:val="center"/>
+        <w:tblLayout w:type="fixed"/>
+        <w:tblLook w:val="04A0" w:firstRow="1" w:lastRow="0" w:firstColumn="1" w:lastColumn="0" w:noHBand="0" w:noVBand="1"/>
+      </w:tblPr>
+      <w:tblGrid>
+        <w:gridCol w:w="2608"/>
+        <w:gridCol w:w="4989"/>
+        <w:gridCol w:w="1814"/>
+      </w:tblGrid>
+      <w:tr>
+        <w:trPr>
+          <w:cantSplit/>
+          <w:tblHeader/>
+          <w:jc w:val="center"/>
+        </w:trPr>
+        <w:tc>
+          <w:tcPr>
+            <w:tcW w:w="2608" w:type="dxa"/>
+            <w:shd w:val="clear" w:color="auto" w:fill="1F4E8C"/>
+          </w:tcPr>
+          <w:p>
+            <w:pPr>
+              <w:keepNext/>
+            </w:pPr>
+            <w:r>
+              <w:rPr>
+                <w:b/>
+                <w:color w:val="FFFFFF"/>
+                <w:sz w:val="19"/>
+              </w:rPr>
+              <w:t>Pantalla</w:t>
+            </w:r>
+          </w:p>
+        </w:tc>
+        <w:tc>
+          <w:tcPr>
+            <w:tcW w:w="4989" w:type="dxa"/>
+            <w:shd w:val="clear" w:color="auto" w:fill="1F4E8C"/>
+          </w:tcPr>
+          <w:p>
+            <w:pPr>
+              <w:keepNext/>
+            </w:pPr>
+            <w:r>
+              <w:rPr>
+                <w:b/>
+                <w:color w:val="FFFFFF"/>
+                <w:sz w:val="19"/>
+              </w:rPr>
+              <w:t>Qué comprueba</w:t>
+            </w:r>
+          </w:p>
+        </w:tc>
+        <w:tc>
+          <w:tcPr>
+            <w:tcW w:w="1814" w:type="dxa"/>
+            <w:shd w:val="clear" w:color="auto" w:fill="1F4E8C"/>
+          </w:tcPr>
+          <w:p>
+            <w:pPr>
+              <w:keepNext/>
+            </w:pPr>
+            <w:r>
+              <w:rPr>
+                <w:b/>
+                <w:color w:val="FFFFFF"/>
+                <w:sz w:val="19"/>
+              </w:rPr>
+              <w:t>Caso relacionado</w:t>
+            </w:r>
+          </w:p>
+        </w:tc>
+      </w:tr>
+      <w:tr>
+        <w:trPr>
+          <w:cantSplit/>
+          <w:jc w:val="center"/>
+        </w:trPr>
+        <w:tc>
+          <w:tcPr>
+            <w:tcW w:w="2608" w:type="dxa"/>
+          </w:tcPr>
+          <w:p>
+            <w:pPr>
+              <w:keepNext/>
+              <w:spacing w:after="20"/>
+            </w:pPr>
+            <w:r>
+              <w:rPr>
+                <w:b/>
+                <w:sz w:val="19"/>
+              </w:rPr>
+              <w:t>Figura 14 · alta de producto</w:t>
+            </w:r>
+          </w:p>
+        </w:tc>
+        <w:tc>
+          <w:tcPr>
+            <w:tcW w:w="4989" w:type="dxa"/>
+          </w:tcPr>
+          <w:p>
+            <w:pPr>
+              <w:keepNext/>
+              <w:spacing w:after="20"/>
+            </w:pPr>
+            <w:r>
+              <w:rPr>
+                <w:sz w:val="19"/>
+              </w:rPr>
+              <w:t>El formulario valida los datos y registra TEC-020</w:t>
+            </w:r>
+          </w:p>
+        </w:tc>
+        <w:tc>
+          <w:tcPr>
+            <w:tcW w:w="1814" w:type="dxa"/>
+          </w:tcPr>
+          <w:p>
+            <w:pPr>
+              <w:keepNext/>
+              <w:spacing w:after="20"/>
+            </w:pPr>
+            <w:r>
+              <w:rPr>
+                <w:sz w:val="19"/>
+              </w:rPr>
+              <w:t>CP-01, CP-15</w:t>
+            </w:r>
+          </w:p>
+        </w:tc>
+      </w:tr>
+      <w:tr>
+        <w:trPr>
+          <w:cantSplit/>
+          <w:jc w:val="center"/>
+        </w:trPr>
+        <w:tc>
+          <w:tcPr>
+            <w:tcW w:w="2608" w:type="dxa"/>
+          </w:tcPr>
+          <w:p>
+            <w:pPr>
+              <w:keepNext/>
+              <w:spacing w:after="20"/>
+            </w:pPr>
+            <w:r>
+              <w:rPr>
+                <w:b/>
+                <w:sz w:val="19"/>
+              </w:rPr>
+              <w:t>Figuras 15 y 16 · venta</w:t>
+            </w:r>
+          </w:p>
+        </w:tc>
+        <w:tc>
+          <w:tcPr>
+            <w:tcW w:w="4989" w:type="dxa"/>
+          </w:tcPr>
+          <w:p>
+            <w:pPr>
+              <w:keepNext/>
+              <w:spacing w:after="20"/>
+            </w:pPr>
+            <w:r>
+              <w:rPr>
+                <w:sz w:val="19"/>
+              </w:rPr>
+              <w:t>La venta descuenta 4 piezas y queda en el historial</w:t>
+            </w:r>
+          </w:p>
+        </w:tc>
+        <w:tc>
+          <w:tcPr>
+            <w:tcW w:w="1814" w:type="dxa"/>
+          </w:tcPr>
+          <w:p>
+            <w:pPr>
+              <w:keepNext/>
+              <w:spacing w:after="20"/>
+            </w:pPr>
+            <w:r>
+              <w:rPr>
+                <w:sz w:val="19"/>
+              </w:rPr>
+              <w:t>CP-03, CP-07</w:t>
+            </w:r>
+          </w:p>
+        </w:tc>
+      </w:tr>
+      <w:tr>
+        <w:trPr>
+          <w:cantSplit/>
+          <w:jc w:val="center"/>
+        </w:trPr>
+        <w:tc>
+          <w:tcPr>
+            <w:tcW w:w="2608" w:type="dxa"/>
+          </w:tcPr>
+          <w:p>
+            <w:pPr>
+              <w:keepNext/>
+              <w:spacing w:after="20"/>
+            </w:pPr>
+            <w:r>
+              <w:rPr>
+                <w:b/>
+                <w:sz w:val="19"/>
+              </w:rPr>
+              <w:t>Figura 17 · venta rechazada</w:t>
+            </w:r>
+          </w:p>
+        </w:tc>
+        <w:tc>
+          <w:tcPr>
+            <w:tcW w:w="4989" w:type="dxa"/>
+          </w:tcPr>
+          <w:p>
+            <w:pPr>
+              <w:keepNext/>
+              <w:spacing w:after="20"/>
+            </w:pPr>
+            <w:r>
+              <w:rPr>
+                <w:sz w:val="19"/>
+              </w:rPr>
+              <w:t>El sistema no vende más de lo que hay y muestra el mismo error de la respuesta 422</w:t>
+            </w:r>
+          </w:p>
+        </w:tc>
+        <w:tc>
+          <w:tcPr>
+            <w:tcW w:w="1814" w:type="dxa"/>
+          </w:tcPr>
+          <w:p>
+            <w:pPr>
+              <w:keepNext/>
+              <w:spacing w:after="20"/>
+            </w:pPr>
+            <w:r>
+              <w:rPr>
+                <w:sz w:val="19"/>
+              </w:rPr>
+              <w:t>CP-04, CP-08</w:t>
+            </w:r>
+          </w:p>
+        </w:tc>
+      </w:tr>
+      <w:tr>
+        <w:trPr>
+          <w:cantSplit/>
+          <w:jc w:val="center"/>
+        </w:trPr>
+        <w:tc>
+          <w:tcPr>
+            <w:tcW w:w="2608" w:type="dxa"/>
+          </w:tcPr>
+          <w:p>
+            <w:pPr>
+              <w:keepNext/>
+              <w:spacing w:after="20"/>
+            </w:pPr>
+            <w:r>
+              <w:rPr>
+                <w:b/>
+                <w:sz w:val="19"/>
+              </w:rPr>
+              <w:t>Figura 18 · historial</w:t>
+            </w:r>
+          </w:p>
+        </w:tc>
+        <w:tc>
+          <w:tcPr>
+            <w:tcW w:w="4989" w:type="dxa"/>
+          </w:tcPr>
+          <w:p>
+            <w:pPr>
+              <w:keepNext/>
+              <w:spacing w:after="20"/>
+            </w:pPr>
+            <w:r>
+              <w:rPr>
+                <w:sz w:val="19"/>
+              </w:rPr>
+              <w:t>Entradas y ventas aparecen con la existencia resultante</w:t>
+            </w:r>
+          </w:p>
+        </w:tc>
+        <w:tc>
+          <w:tcPr>
+            <w:tcW w:w="1814" w:type="dxa"/>
+          </w:tcPr>
+          <w:p>
+            <w:pPr>
+              <w:keepNext/>
+              <w:spacing w:after="20"/>
+            </w:pPr>
+            <w:r>
+              <w:rPr>
+                <w:sz w:val="19"/>
+              </w:rPr>
+              <w:t>CP-10, CP-13</w:t>
+            </w:r>
+          </w:p>
+        </w:tc>
+      </w:tr>
+      <w:tr>
+        <w:trPr>
+          <w:cantSplit/>
+          <w:jc w:val="center"/>
+        </w:trPr>
+        <w:tc>
+          <w:tcPr>
+            <w:tcW w:w="2608" w:type="dxa"/>
+          </w:tcPr>
+          <w:p>
+            <w:pPr>
+              <w:spacing w:after="20"/>
+            </w:pPr>
+            <w:r>
+              <w:rPr>
+                <w:b/>
+                <w:sz w:val="19"/>
+              </w:rPr>
+              <w:t>Figura 19 · reporte</w:t>
+            </w:r>
+          </w:p>
+        </w:tc>
+        <w:tc>
+          <w:tcPr>
+            <w:tcW w:w="4989" w:type="dxa"/>
+          </w:tcPr>
+          <w:p>
+            <w:pPr>
+              <w:spacing w:after="20"/>
+            </w:pPr>
+            <w:r>
+              <w:rPr>
+                <w:sz w:val="19"/>
+              </w:rPr>
+              <w:t>Lista por resurtir ACC-002, COM-003 y LAP-002, igual que la Figura 12</w:t>
+            </w:r>
+          </w:p>
+        </w:tc>
+        <w:tc>
+          <w:tcPr>
+            <w:tcW w:w="1814" w:type="dxa"/>
+          </w:tcPr>
+          <w:p>
+            <w:pPr>
+              <w:spacing w:after="20"/>
+            </w:pPr>
+            <w:r>
+              <w:rPr>
+                <w:sz w:val="19"/>
+              </w:rPr>
+              <w:t>CP-09, CP-15</w:t>
+            </w:r>
+          </w:p>
+        </w:tc>
+      </w:tr>
+    </w:tbl>
+    <w:p>
+      <w:pPr>
+        <w:spacing w:after="40"/>
+      </w:pPr>
+    </w:p>
+    <w:p>
+      <w:pPr>
         <w:pStyle w:val="Ttulo1"/>
       </w:pPr>
       <w:r>
@@ -17171,10 +17992,10 @@
           <w:noProof/>
         </w:rPr>
         <w:drawing>
-          <wp:inline distT="0" distB="0" distL="0" distR="0" wp14:anchorId="5B5957BF" wp14:editId="0D881CEC">
+          <wp:inline distT="0" distB="0" distL="0" distR="0" wp14:anchorId="66D23C7C" wp14:editId="2A674381">
             <wp:extent cx="5580000" cy="3138750"/>
             <wp:effectExtent l="0" t="0" r="0" b="0"/>
-            <wp:docPr id="13" name="Picture 13"/>
+            <wp:docPr id="20" name="Picture 20"/>
             <wp:cNvGraphicFramePr>
               <a:graphicFrameLocks xmlns:a="http://schemas.openxmlformats.org/drawingml/2006/main" noChangeAspect="1"/>
             </wp:cNvGraphicFramePr>
@@ -17186,7 +18007,7 @@
                     <pic:cNvPicPr/>
                   </pic:nvPicPr>
                   <pic:blipFill>
-                    <a:blip r:embed="rId19"/>
+                    <a:blip r:embed="rId26"/>
                     <a:stretch>
                       <a:fillRect/>
                     </a:stretch>
@@ -17217,7 +18038,7 @@
           <w:color w:val="5D6575"/>
           <w:sz w:val="18"/>
         </w:rPr>
-        <w:t>Figura 13. Ciclo para repetir las pruebas al corregir un defecto.</w:t>
+        <w:t>Figura 20. Ciclo para repetir las pruebas al corregir un defecto.</w:t>
       </w:r>
     </w:p>
     <w:p>
@@ -17902,7 +18723,7 @@
         </w:rPr>
         <w:t xml:space="preserve">Repositorio: </w:t>
       </w:r>
-      <w:hyperlink r:id="rId20">
+      <w:hyperlink r:id="rId27">
         <w:r>
           <w:rPr>
             <w:color w:val="1F4E8C"/>
@@ -17922,7 +18743,7 @@
         </w:rPr>
         <w:t xml:space="preserve">Ejecución del CI: </w:t>
       </w:r>
-      <w:hyperlink r:id="rId21">
+      <w:hyperlink r:id="rId28">
         <w:r>
           <w:rPr>
             <w:color w:val="1F4E8C"/>
@@ -17945,7 +18766,7 @@
         </w:rPr>
         <w:t xml:space="preserve">Pull Requests: </w:t>
       </w:r>
-      <w:hyperlink r:id="rId22">
+      <w:hyperlink r:id="rId29">
         <w:r>
           <w:rPr>
             <w:color w:val="1F4E8C"/>
@@ -18409,10 +19230,10 @@
           <w:noProof/>
         </w:rPr>
         <w:drawing>
-          <wp:inline distT="0" distB="0" distL="0" distR="0" wp14:anchorId="39CA37BE" wp14:editId="1DC93BBB">
+          <wp:inline distT="0" distB="0" distL="0" distR="0" wp14:anchorId="56957943" wp14:editId="3F59F188">
             <wp:extent cx="5580000" cy="3138750"/>
             <wp:effectExtent l="0" t="0" r="0" b="0"/>
-            <wp:docPr id="14" name="Picture 14"/>
+            <wp:docPr id="21" name="Picture 21"/>
             <wp:cNvGraphicFramePr>
               <a:graphicFrameLocks xmlns:a="http://schemas.openxmlformats.org/drawingml/2006/main" noChangeAspect="1"/>
             </wp:cNvGraphicFramePr>
@@ -18424,7 +19245,7 @@
                     <pic:cNvPicPr/>
                   </pic:nvPicPr>
                   <pic:blipFill>
-                    <a:blip r:embed="rId23"/>
+                    <a:blip r:embed="rId30"/>
                     <a:stretch>
                       <a:fillRect/>
                     </a:stretch>
@@ -18455,7 +19276,7 @@
           <w:color w:val="5D6575"/>
           <w:sz w:val="18"/>
         </w:rPr>
-        <w:t>Figura 14. Flujo de trabajo: del cambio en el código a la integración (pasos 1 a 5A/5B).</w:t>
+        <w:t>Figura 21. Flujo de trabajo: del cambio en el código a la integración (pasos 1 a 5A/5B).</w:t>
       </w:r>
     </w:p>
     <w:p>
@@ -18468,10 +19289,10 @@
           <w:noProof/>
         </w:rPr>
         <w:drawing>
-          <wp:inline distT="0" distB="0" distL="0" distR="0" wp14:anchorId="4C054841" wp14:editId="01B1BEDB">
+          <wp:inline distT="0" distB="0" distL="0" distR="0" wp14:anchorId="7893C159" wp14:editId="576D7675">
             <wp:extent cx="5580000" cy="3138750"/>
             <wp:effectExtent l="0" t="0" r="0" b="0"/>
-            <wp:docPr id="15" name="Picture 15"/>
+            <wp:docPr id="22" name="Picture 22"/>
             <wp:cNvGraphicFramePr>
               <a:graphicFrameLocks xmlns:a="http://schemas.openxmlformats.org/drawingml/2006/main" noChangeAspect="1"/>
             </wp:cNvGraphicFramePr>
@@ -18483,7 +19304,7 @@
                     <pic:cNvPicPr/>
                   </pic:nvPicPr>
                   <pic:blipFill>
-                    <a:blip r:embed="rId24"/>
+                    <a:blip r:embed="rId31"/>
                     <a:stretch>
                       <a:fillRect/>
                     </a:stretch>
@@ -18514,7 +19335,7 @@
           <w:color w:val="5D6575"/>
           <w:sz w:val="18"/>
         </w:rPr>
-        <w:t>Figura 15. Jobs del pipeline y orden de ejecución.</w:t>
+        <w:t>Figura 22. Jobs del pipeline y orden de ejecución.</w:t>
       </w:r>
     </w:p>
     <w:p>
@@ -18527,10 +19348,10 @@
           <w:noProof/>
         </w:rPr>
         <w:drawing>
-          <wp:inline distT="0" distB="0" distL="0" distR="0" wp14:anchorId="1AF397DA" wp14:editId="0E1533D5">
+          <wp:inline distT="0" distB="0" distL="0" distR="0" wp14:anchorId="1D663B8D" wp14:editId="760749EA">
             <wp:extent cx="5580000" cy="3138750"/>
             <wp:effectExtent l="0" t="0" r="0" b="0"/>
-            <wp:docPr id="16" name="Picture 16"/>
+            <wp:docPr id="23" name="Picture 23"/>
             <wp:cNvGraphicFramePr>
               <a:graphicFrameLocks xmlns:a="http://schemas.openxmlformats.org/drawingml/2006/main" noChangeAspect="1"/>
             </wp:cNvGraphicFramePr>
@@ -18542,7 +19363,7 @@
                     <pic:cNvPicPr/>
                   </pic:nvPicPr>
                   <pic:blipFill>
-                    <a:blip r:embed="rId25"/>
+                    <a:blip r:embed="rId32"/>
                     <a:stretch>
                       <a:fillRect/>
                     </a:stretch>
@@ -18573,7 +19394,7 @@
           <w:color w:val="5D6575"/>
           <w:sz w:val="18"/>
         </w:rPr>
-        <w:t>Figura 16. Ejecución del CI en GitHub Actions con los 8 jobs en verde.</w:t>
+        <w:t>Figura 23. Ejecución del CI en GitHub Actions con los 8 jobs en verde.</w:t>
       </w:r>
     </w:p>
     <w:p>
@@ -20444,31 +21265,31 @@
       </w:rPr>
     </w:lvl>
   </w:abstractNum>
-  <w:num w:numId="1" w16cid:durableId="855847686">
+  <w:num w:numId="1" w16cid:durableId="62604621">
     <w:abstractNumId w:val="8"/>
   </w:num>
-  <w:num w:numId="2" w16cid:durableId="250508710">
+  <w:num w:numId="2" w16cid:durableId="308558877">
     <w:abstractNumId w:val="6"/>
   </w:num>
-  <w:num w:numId="3" w16cid:durableId="1963419316">
+  <w:num w:numId="3" w16cid:durableId="1082291714">
     <w:abstractNumId w:val="5"/>
   </w:num>
-  <w:num w:numId="4" w16cid:durableId="1939630523">
+  <w:num w:numId="4" w16cid:durableId="862328942">
     <w:abstractNumId w:val="4"/>
   </w:num>
-  <w:num w:numId="5" w16cid:durableId="907306849">
+  <w:num w:numId="5" w16cid:durableId="687366861">
     <w:abstractNumId w:val="7"/>
   </w:num>
-  <w:num w:numId="6" w16cid:durableId="1088698947">
+  <w:num w:numId="6" w16cid:durableId="1652445953">
     <w:abstractNumId w:val="3"/>
   </w:num>
-  <w:num w:numId="7" w16cid:durableId="482236001">
+  <w:num w:numId="7" w16cid:durableId="578289705">
     <w:abstractNumId w:val="2"/>
   </w:num>
-  <w:num w:numId="8" w16cid:durableId="858541309">
+  <w:num w:numId="8" w16cid:durableId="1086272241">
     <w:abstractNumId w:val="1"/>
   </w:num>
-  <w:num w:numId="9" w16cid:durableId="1702899507">
+  <w:num w:numId="9" w16cid:durableId="237904271">
     <w:abstractNumId w:val="0"/>
   </w:num>
 </w:numbering>

</xml_diff>